<commit_message>
paper: retarget to J. Appl. Cryst. after Digital Discovery desk reject — retitle + synopsis, IUCr author-date refs (full author lists, MatterGen->Nature), 600dpi figures, docx step in build.sh, JAC cover letter
</commit_message>
<xml_diff>
--- a/paper/paper.docx
+++ b/paper/paper.docx
@@ -2,13 +2,12 @@
 <file path=word/document.xml><?xml version="1.0" encoding="utf-8"?>
 <w:document xmlns:w="http://schemas.openxmlformats.org/wordprocessingml/2006/main" xmlns:m="http://schemas.openxmlformats.org/officeDocument/2006/math" xmlns:r="http://schemas.openxmlformats.org/officeDocument/2006/relationships" xmlns:o="urn:schemas-microsoft-com:office:office" xmlns:v="urn:schemas-microsoft-com:vml" xmlns:w10="urn:schemas-microsoft-com:office:word" xmlns:a="http://schemas.openxmlformats.org/drawingml/2006/main" xmlns:pic="http://schemas.openxmlformats.org/drawingml/2006/picture" xmlns:wp="http://schemas.openxmlformats.org/drawingml/2006/wordprocessingDrawing">
   <w:body>
-    <w:bookmarkStart w:id="63" w:name="X2ddac61a38ed9c25ada36f223803948c7dd92e7"/>
-    <w:p>
-      <w:pPr>
-        <w:pStyle w:val="Heading1"/>
-      </w:pPr>
-      <w:r>
-        <w:t xml:space="preserve">PXRD-Diff: Conditional Diffusion for Powder-Diffraction Inversion: an Encoder-Bottleneck Diagnosis and Shared-Harness Reproduction</w:t>
+    <w:p>
+      <w:pPr>
+        <w:pStyle w:val="Title"/>
+      </w:pPr>
+      <w:r>
+        <w:t xml:space="preserve">PXRD-Diff: diagnosing the encoder bottleneck in diffusion-based powder-diffraction structure inversion, with classical autoindexing as a drop-in remedy</w:t>
       </w:r>
     </w:p>
     <w:p>
@@ -48,7 +47,25 @@
           <w:i/>
           <w:iCs/>
         </w:rPr>
-        <w:t xml:space="preserve">Manuscript type: Article, a methodological study with reproduction and negative results.</w:t>
+        <w:t xml:space="preserve">Manuscript type: Research Paper (Journal of Applied Crystallography).</w:t>
+      </w:r>
+    </w:p>
+    <w:p>
+      <w:pPr>
+        <w:pStyle w:val="BodyText"/>
+      </w:pPr>
+      <w:r>
+        <w:rPr>
+          <w:b/>
+          <w:bCs/>
+        </w:rPr>
+        <w:t xml:space="preserve">Synopsis:</w:t>
+      </w:r>
+      <w:r>
+        <w:t xml:space="preserve"> </w:t>
+      </w:r>
+      <w:r>
+        <w:t xml:space="preserve">A conditional diffusion model for powder-diffraction structure inversion is diagnosed: global pooling in the pattern encoder destroys the absolute d-spacing information that lattice recovery requires, and substituting a classical Q-space autoindexer for the learned lattice head yields a statistically significant improvement. Three external generative baselines are re-scored on a single shared evaluation harness.</w:t>
       </w:r>
     </w:p>
     <w:p>
@@ -61,7 +78,7 @@
     <w:bookmarkStart w:id="9" w:name="abstract"/>
     <w:p>
       <w:pPr>
-        <w:pStyle w:val="Heading2"/>
+        <w:pStyle w:val="Heading1"/>
       </w:pPr>
       <w:r>
         <w:t xml:space="preserve">Abstract</w:t>
@@ -72,95 +89,25 @@
         <w:pStyle w:val="FirstParagraph"/>
       </w:pPr>
       <w:r>
-        <w:t xml:space="preserve">Inverting a 1D powder X-ray diffraction (PXRD) pattern to a 3D crystal structure remains open, and recent generative approaches report numbers under mutually incompatible protocols with failure modes seldom catalogued. We present</w:t>
-      </w:r>
-      <w:r>
-        <w:t xml:space="preserve"> </w:t>
-      </w:r>
+        <w:t xml:space="preserve">Inverting a one-dimensional powder X-ray diffraction (PXRD) pattern to a three-dimensional crystal structure remains an open problem, and recent generative approaches report results under mutually incompatible protocols with failure modes seldom catalogued. PXRD-Diff, a 3.7 M-parameter conditional diffusion model trained on the CDVAE MP-20 split, is presented, and DiffractGPT, PXRDnet and deCIFer are reproduced through the same pymatgen StructureMatcher harness. The central, statistically robust finding is mechanistic: the learned PXRD encoder reaches a 0.007 normalised auxiliary lattice-regression loss in isolation, yet substituting that head’s own lattice into the sampler recovers only 1.2 % of structures, because its ~1.1 Å length error shifts every Bragg peak by ~15 %. The limiter is the global pooling that discards absolute peak positions, not the denoiser alone. A perturbation study locates a sharp sensitivity knee at ~0.5 Å cell error, and a true-lattice oracle lifts match to 4.5 % at n = 1000 (three seeds; 95 % Wilson confidence interval [3.8, 5.3]), disjoint from the no-true-lattice indexer’s 1.5 % [1.2, 2.0]. Replacing the learned lattice head with a classical Q-space autoindexer raises no-true-lattice match to 1.5 % from a learned head that recovers essentially nothing; a three-seed paired McNemar test confirms the gain is significant (p &lt; 10⁻⁴; 27 fixed, none broken), concentrated in the high-symmetry systems below the sensitivity knee. Reproduced on one harness, deCIFer reaches 73.8 % match, DiffractGPT 18.9 % and PXRDnet 30.0 %, leaving PXRD-Diff 12–46 times behind. The contributions are the encoder-bottleneck diagnosis, the classical-indexer drop-in, a four-item failure catalogue and the shared evaluation harness; code, checkpoints and the differentiable Bragg simulator are released.</w:t>
+      </w:r>
+    </w:p>
+    <w:p>
+      <w:pPr>
+        <w:pStyle w:val="BodyText"/>
+      </w:pPr>
       <w:r>
         <w:rPr>
           <w:b/>
           <w:bCs/>
         </w:rPr>
-        <w:t xml:space="preserve">PXRD-Diff</w:t>
-      </w:r>
-      <w:r>
-        <w:t xml:space="preserve">, a 3.7 M-parameter conditional diffusion model on the CDVAE MP-20 split, and reproduce DiffractGPT [1], PXRDnet [2], and deCIFer [3] through the</w:t>
-      </w:r>
-      <w:r>
-        <w:t xml:space="preserve"> </w:t>
-      </w:r>
-      <w:r>
-        <w:rPr>
-          <w:i/>
-          <w:iCs/>
-        </w:rPr>
-        <w:t xml:space="preserve">same</w:t>
-      </w:r>
-      <w:r>
-        <w:t xml:space="preserve"> </w:t>
-      </w:r>
-      <w:r>
-        <w:rPr>
-          <w:rStyle w:val="VerbatimChar"/>
-        </w:rPr>
-        <w:t xml:space="preserve">pymatgen.StructureMatcher</w:t>
-      </w:r>
-      <w:r>
-        <w:t xml:space="preserve"> </w:t>
-      </w:r>
-      <w:r>
-        <w:t xml:space="preserve">harness. Our central, statistically robust finding is mechanistic: the learned PXRD encoder reaches a 0.007</w:t>
-      </w:r>
-      <w:r>
-        <w:t xml:space="preserve"> </w:t>
-      </w:r>
-      <w:r>
-        <w:rPr>
-          <w:i/>
-          <w:iCs/>
-        </w:rPr>
-        <w:t xml:space="preserve">normalised</w:t>
-      </w:r>
-      <w:r>
-        <w:t xml:space="preserve"> </w:t>
-      </w:r>
-      <w:r>
-        <w:t xml:space="preserve">auxiliary lattice-regression loss in isolation, yet substituting that head’s own lattice into the sampler recovers only 1.2 %, because its ~1.1 Å length error shifts every Bragg peak by ~15 %. The limiter is the global pooling that discards absolute peak positions, not the denoiser alone. A perturbation study locates a sharp sensitivity knee at ~0.5 Å cell error, and a true-lattice oracle lifts match to</w:t>
-      </w:r>
-      <w:r>
-        <w:t xml:space="preserve"> </w:t>
-      </w:r>
-      <w:r>
-        <w:rPr>
-          <w:b/>
-          <w:bCs/>
-        </w:rPr>
-        <w:t xml:space="preserve">4.5 %</w:t>
-      </w:r>
-      <w:r>
-        <w:t xml:space="preserve"> </w:t>
-      </w:r>
-      <w:r>
-        <w:t xml:space="preserve">at n = 1000 (three seeds; 95 % Wilson CI [3.8, 5.3]), disjoint from the no-true-lattice indexer’s 1.5 % [1.2, 2.0]. Replacing the learned lattice head with a classical Q-space autoindexer raises no-true-lattice match to 1.5 % from a learned head that recovers essentially nothing; a three-seed paired McNemar test confirms the gain is significant (p &lt; 10⁻⁴; 27 fixed, none broken), concentrated in the high-symmetry systems below the knee. Reproduced on one harness, deCIFer reaches 73.8 % match, DiffractGPT 18.9 %, and PXRDnet 30.0 %, leaving PXRD-Diff 12–46× behind. The contributions are the encoder-bottleneck diagnosis, the classical-indexer drop-in, a four-item failure catalogue, and the shared evaluation harness; code, checkpoints, and the differentiable Bragg simulator are released.</w:t>
-      </w:r>
-    </w:p>
-    <w:p>
-      <w:pPr>
-        <w:pStyle w:val="BodyText"/>
-      </w:pPr>
-      <w:r>
-        <w:rPr>
-          <w:b/>
-          <w:bCs/>
-        </w:rPr>
         <w:t xml:space="preserve">Keywords:</w:t>
       </w:r>
       <w:r>
         <w:t xml:space="preserve"> </w:t>
       </w:r>
       <w:r>
-        <w:t xml:space="preserve">machine learning for materials discovery; generative models; denoising diffusion; crystal structure prediction; powder X-ray diffraction; differentiable simulation; benchmarking and reproducibility</w:t>
+        <w:t xml:space="preserve">powder diffraction; autoindexing; crystal structure determination; conditional diffusion models; machine learning; differentiable simulation; reproducibility</w:t>
       </w:r>
     </w:p>
     <w:p>
@@ -174,7 +121,7 @@
     <w:bookmarkStart w:id="10" w:name="introduction"/>
     <w:p>
       <w:pPr>
-        <w:pStyle w:val="Heading2"/>
+        <w:pStyle w:val="Heading1"/>
       </w:pPr>
       <w:r>
         <w:t xml:space="preserve">1. Introduction</w:t>
@@ -208,7 +155,33 @@
         <w:pStyle w:val="BodyText"/>
       </w:pPr>
       <w:r>
-        <w:t xml:space="preserve">Three recent generative approaches (DiffractGPT [1], Crystalyze [4], PXRDnet [2]) argue neural networks can shortcut this pipeline. They report match rates in the tens of percent, but under mutually incompatible evaluation protocols, and failure modes are seldom catalogued. A practitioner cannot easily form a calibrated expectation of</w:t>
+        <w:t xml:space="preserve">Three recent generative approaches (DiffractGPT: Choudhary, 2025; Crystalyze: Riesel</w:t>
+      </w:r>
+      <w:r>
+        <w:t xml:space="preserve"> </w:t>
+      </w:r>
+      <w:r>
+        <w:rPr>
+          <w:i/>
+          <w:iCs/>
+        </w:rPr>
+        <w:t xml:space="preserve">et al.</w:t>
+      </w:r>
+      <w:r>
+        <w:t xml:space="preserve">, 2024; PXRDnet: Guo</w:t>
+      </w:r>
+      <w:r>
+        <w:t xml:space="preserve"> </w:t>
+      </w:r>
+      <w:r>
+        <w:rPr>
+          <w:i/>
+          <w:iCs/>
+        </w:rPr>
+        <w:t xml:space="preserve">et al.</w:t>
+      </w:r>
+      <w:r>
+        <w:t xml:space="preserve">, 2025) argue neural networks can shortcut this pipeline. They report match rates in the tens of percent, but under mutually incompatible evaluation protocols, and failure modes are seldom catalogued. A practitioner cannot easily form a calibrated expectation of</w:t>
       </w:r>
       <w:r>
         <w:t xml:space="preserve"> </w:t>
@@ -408,7 +381,20 @@
         <w:t xml:space="preserve"> </w:t>
       </w:r>
       <w:r>
-        <w:t xml:space="preserve">Top-K Debye rerank, Debye-gradient DDIM guidance, Wyckoff-site embeddings, and distance-matrix aux loss all fail at n ≥ 200; the latter two combined (v14) underperform the bare ε baseline. The gradient-guidance failure is corroborated independently by concurrent work showing the PXRD loss landscape is too rough for gradient descent [5].</w:t>
+        <w:t xml:space="preserve">Top-K Debye rerank, Debye-gradient DDIM guidance, Wyckoff-site embeddings, and distance-matrix aux loss all fail at n ≥ 200; the latter two combined (v14) underperform the bare ε baseline. The gradient-guidance failure is corroborated independently by concurrent work showing the PXRD loss landscape is too rough for gradient descent (Segal</w:t>
+      </w:r>
+      <w:r>
+        <w:t xml:space="preserve"> </w:t>
+      </w:r>
+      <w:r>
+        <w:rPr>
+          <w:i/>
+          <w:iCs/>
+        </w:rPr>
+        <w:t xml:space="preserve">et al.</w:t>
+      </w:r>
+      <w:r>
+        <w:t xml:space="preserve">, 2025).</w:t>
       </w:r>
     </w:p>
     <w:p>
@@ -492,7 +478,7 @@
     <w:bookmarkStart w:id="11" w:name="related-work"/>
     <w:p>
       <w:pPr>
-        <w:pStyle w:val="Heading2"/>
+        <w:pStyle w:val="Heading1"/>
       </w:pPr>
       <w:r>
         <w:t xml:space="preserve">2. Related work</w:t>
@@ -513,7 +499,46 @@
         <w:t xml:space="preserve"> </w:t>
       </w:r>
       <w:r>
-        <w:t xml:space="preserve">CDVAE [6] introduced the MP-20 protocol; DiffCSP [7] used joint coord+lattice diffusion; MatterGen [8] scaled to millions of structures. PXRD-Diff borrows DiffCSP’s joint diffusion, restricted to the conditional setting where a 1D pattern conditions generation.</w:t>
+        <w:t xml:space="preserve">CDVAE (Xie</w:t>
+      </w:r>
+      <w:r>
+        <w:t xml:space="preserve"> </w:t>
+      </w:r>
+      <w:r>
+        <w:rPr>
+          <w:i/>
+          <w:iCs/>
+        </w:rPr>
+        <w:t xml:space="preserve">et al.</w:t>
+      </w:r>
+      <w:r>
+        <w:t xml:space="preserve">, 2022) introduced the MP-20 protocol; DiffCSP (Jiao</w:t>
+      </w:r>
+      <w:r>
+        <w:t xml:space="preserve"> </w:t>
+      </w:r>
+      <w:r>
+        <w:rPr>
+          <w:i/>
+          <w:iCs/>
+        </w:rPr>
+        <w:t xml:space="preserve">et al.</w:t>
+      </w:r>
+      <w:r>
+        <w:t xml:space="preserve">, 2023) used joint coord+lattice diffusion; MatterGen (Zeni</w:t>
+      </w:r>
+      <w:r>
+        <w:t xml:space="preserve"> </w:t>
+      </w:r>
+      <w:r>
+        <w:rPr>
+          <w:i/>
+          <w:iCs/>
+        </w:rPr>
+        <w:t xml:space="preserve">et al.</w:t>
+      </w:r>
+      <w:r>
+        <w:t xml:space="preserve">, 2025) scaled to millions of structures. PXRD-Diff borrows DiffCSP’s joint diffusion, restricted to the conditional setting where a 1D pattern conditions generation.</w:t>
       </w:r>
     </w:p>
     <w:p>
@@ -531,7 +556,7 @@
         <w:t xml:space="preserve"> </w:t>
       </w:r>
       <w:r>
-        <w:t xml:space="preserve">DiffractGPT [1] is a fine-tuned Mistral-7B that decodes peak list + formula → CIF tokens. Crystalyze [4] uses CDVAE conditioned on an XRD transformer encoder with post-hoc symmetry filtering. PXRDnet [2] is a CDVAE variant with</w:t>
+        <w:t xml:space="preserve">DiffractGPT (Choudhary, 2025) is a fine-tuned Mistral-7B that decodes peak list + formula → CIF tokens. Crystalyze (Riesel</w:t>
       </w:r>
       <w:r>
         <w:t xml:space="preserve"> </w:t>
@@ -541,13 +566,10 @@
           <w:i/>
           <w:iCs/>
         </w:rPr>
-        <w:t xml:space="preserve">iterative latent-space gradient guidance</w:t>
-      </w:r>
-      <w:r>
-        <w:t xml:space="preserve"> </w:t>
-      </w:r>
-      <w:r>
-        <w:t xml:space="preserve">(~3.5 M decoder ops/material), published in</w:t>
+        <w:t xml:space="preserve">et al.</w:t>
+      </w:r>
+      <w:r>
+        <w:t xml:space="preserve">, 2024) uses CDVAE conditioned on an XRD transformer encoder with post-hoc symmetry filtering. PXRDnet (Guo</w:t>
       </w:r>
       <w:r>
         <w:t xml:space="preserve"> </w:t>
@@ -557,13 +579,55 @@
           <w:i/>
           <w:iCs/>
         </w:rPr>
+        <w:t xml:space="preserve">et al.</w:t>
+      </w:r>
+      <w:r>
+        <w:t xml:space="preserve">, 2025) is a CDVAE variant with</w:t>
+      </w:r>
+      <w:r>
+        <w:t xml:space="preserve"> </w:t>
+      </w:r>
+      <w:r>
+        <w:rPr>
+          <w:i/>
+          <w:iCs/>
+        </w:rPr>
+        <w:t xml:space="preserve">iterative latent-space gradient guidance</w:t>
+      </w:r>
+      <w:r>
+        <w:t xml:space="preserve"> </w:t>
+      </w:r>
+      <w:r>
+        <w:t xml:space="preserve">(~3.5 M decoder ops/material), published in</w:t>
+      </w:r>
+      <w:r>
+        <w:t xml:space="preserve"> </w:t>
+      </w:r>
+      <w:r>
+        <w:rPr>
+          <w:i/>
+          <w:iCs/>
+        </w:rPr>
         <w:t xml:space="preserve">Nature Materials</w:t>
       </w:r>
       <w:r>
         <w:t xml:space="preserve"> </w:t>
       </w:r>
       <w:r>
-        <w:t xml:space="preserve">in 2025. deCIFer [3] is a concurrent autoregressive-language-model approach that, like DiffractGPT, emits CIF tokens. All four are larger than PXRD-Diff and report results under bespoke evaluation pipelines; §5.3 re-scores DiffractGPT, PXRDnet, and deCIFer on a single shared</w:t>
+        <w:t xml:space="preserve">in 2025. deCIFer (Johansen</w:t>
+      </w:r>
+      <w:r>
+        <w:t xml:space="preserve"> </w:t>
+      </w:r>
+      <w:r>
+        <w:rPr>
+          <w:i/>
+          <w:iCs/>
+        </w:rPr>
+        <w:t xml:space="preserve">et al.</w:t>
+      </w:r>
+      <w:r>
+        <w:t xml:space="preserve">, 2025) is a concurrent autoregressive-language-model approach that, like DiffractGPT, emits CIF tokens. All four are larger than PXRD-Diff and report results under bespoke evaluation pipelines; §5.3 re-scores DiffractGPT, PXRDnet, and deCIFer on a single shared</w:t>
       </w:r>
       <w:r>
         <w:t xml:space="preserve"> </w:t>
@@ -608,7 +672,7 @@
         <w:t xml:space="preserve"> </w:t>
       </w:r>
       <w:r>
-        <w:t xml:space="preserve">Recovering a unit cell from peak positions is a solved sub-problem with a fifty-year toolchain: the de-Wolff dichotomy method, ITO, TREOR, and DICVOL [9] index high-symmetry powder patterns in CPU milliseconds, with the difficulty concentrated in low-symmetry (monoclinic/triclinic) cells. §3.5 reuses this machinery as a drop-in for the learned lattice head, and §5.2/§5.5 show the resulting lift tracks exactly the symmetry-dependent accuracy classical indexers have always had.</w:t>
+        <w:t xml:space="preserve">Recovering a unit cell from peak positions is a solved sub-problem with a fifty-year toolchain: the de-Wolff dichotomy method, ITO, TREOR, and DICVOL (Boultif &amp; Louër, 2004) index high-symmetry powder patterns in CPU milliseconds, with the difficulty concentrated in low-symmetry (monoclinic/triclinic) cells. §3.5 reuses this machinery as a drop-in for the learned lattice head, and §5.2/§5.5 show the resulting lift tracks exactly the symmetry-dependent accuracy classical indexers have always had.</w:t>
       </w:r>
     </w:p>
     <w:p>
@@ -626,7 +690,23 @@
         <w:t xml:space="preserve"> </w:t>
       </w:r>
       <w:r>
-        <w:t xml:space="preserve">Scattering-pattern losses date to Rietveld; the contribution here is full differentiability w.r.t. coordinates and lattice in PyTorch, usable as a diffusion-training loss term. Concurrent generative-inversion work conditions on differentiable spectral targets for amorphous and nanostructured systems [10]. Relevant to our negative results, Segal et al. [5] show the powder-XRD similarity loss landscape is</w:t>
+        <w:t xml:space="preserve">Scattering-pattern losses date to Rietveld; the contribution here is full differentiability w.r.t. coordinates and lattice in PyTorch, usable as a diffusion-training loss term. Concurrent generative-inversion work conditions on differentiable spectral targets for amorphous and nanostructured systems (Guo &amp; Schwalbe-Koda, 2026). Relevant to our negative results, Segal</w:t>
+      </w:r>
+      <w:r>
+        <w:t xml:space="preserve"> </w:t>
+      </w:r>
+      <w:r>
+        <w:rPr>
+          <w:i/>
+          <w:iCs/>
+        </w:rPr>
+        <w:t xml:space="preserve">et al.</w:t>
+      </w:r>
+      <w:r>
+        <w:t xml:space="preserve"> </w:t>
+      </w:r>
+      <w:r>
+        <w:t xml:space="preserve">(2025) show the powder-XRD similarity loss landscape is</w:t>
       </w:r>
       <w:r>
         <w:t xml:space="preserve"> </w:t>
@@ -653,7 +733,33 @@
         <w:t xml:space="preserve"> </w:t>
       </w:r>
       <w:r>
-        <w:t xml:space="preserve">Not strictly E(3)-equivariant: we use periodic-distance RBFs (SchNet-style [11]). A frozen MACE [12] encoder showed no measurable benefit at MP-20 scale in pilots and was deferred.</w:t>
+        <w:t xml:space="preserve">Not strictly E(3)-equivariant: we use periodic-distance RBFs (SchNet-style; Schütt</w:t>
+      </w:r>
+      <w:r>
+        <w:t xml:space="preserve"> </w:t>
+      </w:r>
+      <w:r>
+        <w:rPr>
+          <w:i/>
+          <w:iCs/>
+        </w:rPr>
+        <w:t xml:space="preserve">et al.</w:t>
+      </w:r>
+      <w:r>
+        <w:t xml:space="preserve">, 2017). A frozen MACE (Batatia</w:t>
+      </w:r>
+      <w:r>
+        <w:t xml:space="preserve"> </w:t>
+      </w:r>
+      <w:r>
+        <w:rPr>
+          <w:i/>
+          <w:iCs/>
+        </w:rPr>
+        <w:t xml:space="preserve">et al.</w:t>
+      </w:r>
+      <w:r>
+        <w:t xml:space="preserve">, 2022) encoder showed no measurable benefit at MP-20 scale in pilots and was deferred.</w:t>
       </w:r>
     </w:p>
     <w:p>
@@ -667,16 +773,16 @@
     <w:bookmarkStart w:id="22" w:name="method"/>
     <w:p>
       <w:pPr>
+        <w:pStyle w:val="Heading1"/>
+      </w:pPr>
+      <w:r>
+        <w:t xml:space="preserve">3. Method</w:t>
+      </w:r>
+    </w:p>
+    <w:bookmarkStart w:id="12" w:name="problem-formulation"/>
+    <w:p>
+      <w:pPr>
         <w:pStyle w:val="Heading2"/>
-      </w:pPr>
-      <w:r>
-        <w:t xml:space="preserve">3. Method</w:t>
-      </w:r>
-    </w:p>
-    <w:bookmarkStart w:id="12" w:name="problem-formulation"/>
-    <w:p>
-      <w:pPr>
-        <w:pStyle w:val="Heading3"/>
       </w:pPr>
       <w:r>
         <w:t xml:space="preserve">3.1 Problem formulation</w:t>
@@ -1229,7 +1335,7 @@
     <w:bookmarkStart w:id="13" w:name="architecture-overview"/>
     <w:p>
       <w:pPr>
-        <w:pStyle w:val="Heading3"/>
+        <w:pStyle w:val="Heading2"/>
       </w:pPr>
       <w:r>
         <w:t xml:space="preserve">3.2 Architecture overview</w:t>
@@ -2068,7 +2174,7 @@
     <w:bookmarkStart w:id="18" w:name="Xc917a453586cc10256448f63d6af218d81ba9bb"/>
     <w:p>
       <w:pPr>
-        <w:pStyle w:val="Heading3"/>
+        <w:pStyle w:val="Heading2"/>
       </w:pPr>
       <w:r>
         <w:t xml:space="preserve">3.3 Differentiable Bragg structure-factor loss</w:t>
@@ -2784,7 +2890,7 @@
       <w:r>
         <w:drawing>
           <wp:inline>
-            <wp:extent cx="4140794" cy="2672861"/>
+            <wp:extent cx="4135408" cy="2669925"/>
             <wp:effectExtent b="0" l="0" r="0" t="0"/>
             <wp:docPr descr="Figure 1. Differentiable-simulator validation. Distribution of Pearson correlation between the PyTorch DiffPXRD module and pymatgen.XRDCalculator over 50 random MP-20 test structures (mean 0.962). All 50 exceed 0.7; the lower tail is dominated by layered structures with strong texture in the reference." title="" id="15" name="Picture"/>
             <a:graphic>
@@ -2805,7 +2911,7 @@
                   <pic:spPr bwMode="auto">
                     <a:xfrm>
                       <a:off x="0" y="0"/>
-                      <a:ext cx="4140794" cy="2672861"/>
+                      <a:ext cx="4135408" cy="2669925"/>
                     </a:xfrm>
                     <a:prstGeom prst="rect">
                       <a:avLst/>
@@ -3083,7 +3189,7 @@
     <w:bookmarkStart w:id="19" w:name="training-objective"/>
     <w:p>
       <w:pPr>
-        <w:pStyle w:val="Heading3"/>
+        <w:pStyle w:val="Heading2"/>
       </w:pPr>
       <w:r>
         <w:t xml:space="preserve">3.4 Training objective</w:t>
@@ -3094,7 +3200,7 @@
         <w:pStyle w:val="FirstParagraph"/>
       </w:pPr>
       <w:r>
-        <w:t xml:space="preserve">We use a VP-SDE with cosine schedule [13] for both channels:</w:t>
+        <w:t xml:space="preserve">We use a VP-SDE with cosine schedule (Nichol &amp; Dhariwal, 2021) for both channels:</w:t>
       </w:r>
     </w:p>
     <w:p>
@@ -4322,7 +4428,7 @@
     <w:bookmarkStart w:id="20" w:name="X6e75ac1b115bab34c6f95946b56455b7789be55"/>
     <w:p>
       <w:pPr>
-        <w:pStyle w:val="Heading3"/>
+        <w:pStyle w:val="Heading2"/>
       </w:pPr>
       <w:r>
         <w:t xml:space="preserve">3.5 Classical indexing as a drop-in for the learned lattice head</w:t>
@@ -4391,7 +4497,7 @@
         <w:t xml:space="preserve"> </w:t>
       </w:r>
       <w:r>
-        <w:t xml:space="preserve">Native indexer overall: 48.8 % strict cell match, 1.45 Å mean cell-length MAE. Per crystal system: hexagonal 77.9 % / 0.53 Å, orthorhombic 59.8 % / 0.96 Å, trigonal 43.3 % / 4.62 Å, monoclinic 18.9 % / 1.76 Å, triclinic 0 %. The low-symmetry blowup (monoclinic and triclinic each have ≥ 4 free cell parameters and the de-Wolff search becomes hypothesis-capped) is the dominant remaining error. We ship a GSAS-II [14] adapter (</w:t>
+        <w:t xml:space="preserve">Native indexer overall: 48.8 % strict cell match, 1.45 Å mean cell-length MAE. Per crystal system: hexagonal 77.9 % / 0.53 Å, orthorhombic 59.8 % / 0.96 Å, trigonal 43.3 % / 4.62 Å, monoclinic 18.9 % / 1.76 Å, triclinic 0 %. The low-symmetry blowup (monoclinic and triclinic each have ≥ 4 free cell parameters and the de-Wolff search becomes hypothesis-capped) is the dominant remaining error. We ship a GSAS-II (Toby &amp; Von Dreele, 2013) adapter (</w:t>
       </w:r>
       <w:r>
         <w:rPr>
@@ -4476,7 +4582,7 @@
     <w:bookmarkStart w:id="21" w:name="sampling"/>
     <w:p>
       <w:pPr>
-        <w:pStyle w:val="Heading3"/>
+        <w:pStyle w:val="Heading2"/>
       </w:pPr>
       <w:r>
         <w:t xml:space="preserve">3.6 Sampling</w:t>
@@ -4487,7 +4593,20 @@
         <w:pStyle w:val="FirstParagraph"/>
       </w:pPr>
       <w:r>
-        <w:t xml:space="preserve">DDIM [15] with 50 steps and</w:t>
+        <w:t xml:space="preserve">DDIM (Song</w:t>
+      </w:r>
+      <w:r>
+        <w:t xml:space="preserve"> </w:t>
+      </w:r>
+      <w:r>
+        <w:rPr>
+          <w:i/>
+          <w:iCs/>
+        </w:rPr>
+        <w:t xml:space="preserve">et al.</w:t>
+      </w:r>
+      <w:r>
+        <w:t xml:space="preserve">, 2021) with 50 steps and</w:t>
       </w:r>
       <w:r>
         <w:t xml:space="preserve"> </w:t>
@@ -4810,7 +4929,7 @@
     <w:bookmarkStart w:id="23" w:name="experiments"/>
     <w:p>
       <w:pPr>
-        <w:pStyle w:val="Heading2"/>
+        <w:pStyle w:val="Heading1"/>
       </w:pPr>
       <w:r>
         <w:t xml:space="preserve">4. Experiments</w:t>
@@ -4831,7 +4950,20 @@
         <w:t xml:space="preserve"> </w:t>
       </w:r>
       <w:r>
-        <w:t xml:space="preserve">Canonical CDVAE [6] MP-20 split: 27 136 / 9 047 / 9 046 train/val/test, ≤ 20 atoms/conventional cell. Patterns simulated with</w:t>
+        <w:t xml:space="preserve">Canonical CDVAE (Xie</w:t>
+      </w:r>
+      <w:r>
+        <w:t xml:space="preserve"> </w:t>
+      </w:r>
+      <w:r>
+        <w:rPr>
+          <w:i/>
+          <w:iCs/>
+        </w:rPr>
+        <w:t xml:space="preserve">et al.</w:t>
+      </w:r>
+      <w:r>
+        <w:t xml:space="preserve">, 2022) MP-20 split: 27 136 / 9 047 / 9 046 train/val/test, ≤ 20 atoms/conventional cell. Patterns simulated with</w:t>
       </w:r>
       <w:r>
         <w:t xml:space="preserve"> </w:t>
@@ -5423,24 +5555,24 @@
     <w:bookmarkStart w:id="46" w:name="results"/>
     <w:p>
       <w:pPr>
+        <w:pStyle w:val="Heading1"/>
+      </w:pPr>
+      <w:r>
+        <w:t xml:space="preserve">5. Results</w:t>
+      </w:r>
+    </w:p>
+    <w:p>
+      <w:pPr>
+        <w:pStyle w:val="FirstParagraph"/>
+      </w:pPr>
+      <w:r>
+        <w:t xml:space="preserve">Order: Phase 4 architectural ablation (§5.1) → Phase 9 indexer drop-in (§5.2) → reproduced baselines (§5.3) → failure catalogue (§5.4) → encoder-bottleneck perturbation study (§5.5).</w:t>
+      </w:r>
+    </w:p>
+    <w:bookmarkStart w:id="28" w:name="Xadaaeed9a4d3d9b8a4dfaf721f122e0603fe773"/>
+    <w:p>
+      <w:pPr>
         <w:pStyle w:val="Heading2"/>
-      </w:pPr>
-      <w:r>
-        <w:t xml:space="preserve">5. Results</w:t>
-      </w:r>
-    </w:p>
-    <w:p>
-      <w:pPr>
-        <w:pStyle w:val="FirstParagraph"/>
-      </w:pPr>
-      <w:r>
-        <w:t xml:space="preserve">Order: Phase 4 architectural ablation (§5.1) → Phase 9 indexer drop-in (§5.2) → reproduced baselines (§5.3) → failure catalogue (§5.4) → encoder-bottleneck perturbation study (§5.5).</w:t>
-      </w:r>
-    </w:p>
-    <w:bookmarkStart w:id="28" w:name="Xadaaeed9a4d3d9b8a4dfaf721f122e0603fe773"/>
-    <w:p>
-      <w:pPr>
-        <w:pStyle w:val="Heading3"/>
       </w:pPr>
       <w:r>
         <w:t xml:space="preserve">5.1 Phase 4: architectural ablation (true-lattice setting)</w:t>
@@ -6159,7 +6291,7 @@
       <w:r>
         <w:drawing>
           <wp:inline>
-            <wp:extent cx="5334000" cy="2222893"/>
+            <wp:extent cx="5334000" cy="2223878"/>
             <wp:effectExtent b="0" l="0" r="0" t="0"/>
             <wp:docPr descr="Figure 2. Phase 4 architectural ablation. Match rate (a) and pattern Pearson (b) for the seven coordinate-only runs of Table 1 on MP-20 test (n = 1000, true lattice substituted). The ε → x₀-residual switch (v11 → v13) shows the largest single-seed match lift (panel a), but that match lift does not replicate across seeds; only the pattern-Pearson gain (panel b) does (§7); adding Wyckoff embeddings or a distance-matrix loss regresses below it." title="" id="25" name="Picture"/>
             <a:graphic>
@@ -6180,7 +6312,7 @@
                   <pic:spPr bwMode="auto">
                     <a:xfrm>
                       <a:off x="0" y="0"/>
-                      <a:ext cx="5334000" cy="2222893"/>
+                      <a:ext cx="5334000" cy="2223878"/>
                     </a:xfrm>
                     <a:prstGeom prst="rect">
                       <a:avLst/>
@@ -6381,7 +6513,7 @@
     <w:bookmarkStart w:id="33" w:name="phase-9-classical-indexer-drop-in"/>
     <w:p>
       <w:pPr>
-        <w:pStyle w:val="Heading3"/>
+        <w:pStyle w:val="Heading2"/>
       </w:pPr>
       <w:r>
         <w:t xml:space="preserve">5.2 Phase 9: classical indexer drop-in</w:t>
@@ -7286,7 +7418,7 @@
       <w:r>
         <w:drawing>
           <wp:inline>
-            <wp:extent cx="5334000" cy="2423254"/>
+            <wp:extent cx="5334000" cy="2423900"/>
             <wp:effectExtent b="0" l="0" r="0" t="0"/>
             <wp:docPr descr="Figure 3. Per-system indexer performance. Strict and consistent indexing rates (a) and length MAE (b) on n = 1 000. High-symmetry systems (hex, ortho) sit below the 0.5 Å knee; trig and mono blow up; triclinic is unindexable in this implementation. The overall 1.45 Å MAE hides two regimes, and explains why the indexer’s significant match-rate gain (§5.2) is concentrated entirely in the high-symmetry systems." title="" id="30" name="Picture"/>
             <a:graphic>
@@ -7307,7 +7439,7 @@
                   <pic:spPr bwMode="auto">
                     <a:xfrm>
                       <a:off x="0" y="0"/>
-                      <a:ext cx="5334000" cy="2423254"/>
+                      <a:ext cx="5334000" cy="2423900"/>
                     </a:xfrm>
                     <a:prstGeom prst="rect">
                       <a:avLst/>
@@ -7349,7 +7481,7 @@
     <w:bookmarkStart w:id="38" w:name="head-to-head-with-external-baselines"/>
     <w:p>
       <w:pPr>
-        <w:pStyle w:val="Heading3"/>
+        <w:pStyle w:val="Heading2"/>
       </w:pPr>
       <w:r>
         <w:t xml:space="preserve">5.3 Head-to-head with external baselines</w:t>
@@ -7586,7 +7718,7 @@
               <w:pStyle w:val="Compact"/>
             </w:pPr>
             <w:r>
-              <w:t xml:space="preserve">DiffractGPT [1]</w:t>
+              <w:t xml:space="preserve">DiffractGPT (Choudhary, 2025)</w:t>
             </w:r>
           </w:p>
         </w:tc>
@@ -7654,7 +7786,20 @@
               <w:pStyle w:val="Compact"/>
             </w:pPr>
             <w:r>
-              <w:t xml:space="preserve">PXRDnet sinc100 [2]</w:t>
+              <w:t xml:space="preserve">PXRDnet sinc100 (Guo</w:t>
+            </w:r>
+            <w:r>
+              <w:t xml:space="preserve"> </w:t>
+            </w:r>
+            <w:r>
+              <w:rPr>
+                <w:i/>
+                <w:iCs/>
+              </w:rPr>
+              <w:t xml:space="preserve">et al.</w:t>
+            </w:r>
+            <w:r>
+              <w:t xml:space="preserve">, 2025)</w:t>
             </w:r>
           </w:p>
         </w:tc>
@@ -7722,7 +7867,20 @@
               <w:pStyle w:val="Compact"/>
             </w:pPr>
             <w:r>
-              <w:t xml:space="preserve">deCIFer [3]</w:t>
+              <w:t xml:space="preserve">deCIFer (Johansen</w:t>
+            </w:r>
+            <w:r>
+              <w:t xml:space="preserve"> </w:t>
+            </w:r>
+            <w:r>
+              <w:rPr>
+                <w:i/>
+                <w:iCs/>
+              </w:rPr>
+              <w:t xml:space="preserve">et al.</w:t>
+            </w:r>
+            <w:r>
+              <w:t xml:space="preserve">, 2025)</w:t>
             </w:r>
           </w:p>
         </w:tc>
@@ -7988,7 +8146,7 @@
       <w:r>
         <w:drawing>
           <wp:inline>
-            <wp:extent cx="5334000" cy="2210273"/>
+            <wp:extent cx="5334000" cy="2210966"/>
             <wp:effectExtent b="0" l="0" r="0" t="0"/>
             <wp:docPr descr="Figure 4. Three-way headline comparison. Match rate, all-correct, and pattern-Pearson on the same MP-20 test materials scored through our StructureMatcher harness, with 95 % Wilson CIs. PXRD-Diff loses on match rate by 12–19× but wins on per-pattern Pearson. Note the wide PXRDnet (n = 20) intervals: the DGpt &gt; PXRDnet all-correct ordering is a hypothesis, not an established result (§5.3, §6)." title="" id="35" name="Picture"/>
             <a:graphic>
@@ -8009,7 +8167,7 @@
                   <pic:spPr bwMode="auto">
                     <a:xfrm>
                       <a:off x="0" y="0"/>
-                      <a:ext cx="5334000" cy="2210273"/>
+                      <a:ext cx="5334000" cy="2210966"/>
                     </a:xfrm>
                     <a:prstGeom prst="rect">
                       <a:avLst/>
@@ -8094,7 +8252,7 @@
     <w:bookmarkStart w:id="43" w:name="what-did-not-work"/>
     <w:p>
       <w:pPr>
-        <w:pStyle w:val="Heading3"/>
+        <w:pStyle w:val="Heading2"/>
       </w:pPr>
       <w:r>
         <w:t xml:space="preserve">5.4 What did</w:t>
@@ -8290,7 +8448,23 @@
         <w:t xml:space="preserve"> </w:t>
       </w:r>
       <w:r>
-        <w:t xml:space="preserve">on n = 200: flat 1.0–2.5 % within noise, all-correct 0 % throughout. Sampling-time Debye gradient is too noisy to steer the trajectory, consistent with Segal et al. [5], who show the powder-XRD similarity loss landscape is too non-convex for direct gradient descent.</w:t>
+        <w:t xml:space="preserve">on n = 200: flat 1.0–2.5 % within noise, all-correct 0 % throughout. Sampling-time Debye gradient is too noisy to steer the trajectory, consistent with Segal</w:t>
+      </w:r>
+      <w:r>
+        <w:t xml:space="preserve"> </w:t>
+      </w:r>
+      <w:r>
+        <w:rPr>
+          <w:i/>
+          <w:iCs/>
+        </w:rPr>
+        <w:t xml:space="preserve">et al.</w:t>
+      </w:r>
+      <w:r>
+        <w:t xml:space="preserve"> </w:t>
+      </w:r>
+      <w:r>
+        <w:t xml:space="preserve">(2025), who show the powder-XRD similarity loss landscape is too non-convex for direct gradient descent.</w:t>
       </w:r>
     </w:p>
     <w:p>
@@ -8340,7 +8514,7 @@
       <w:r>
         <w:drawing>
           <wp:inline>
-            <wp:extent cx="5334000" cy="2277073"/>
+            <wp:extent cx="5334000" cy="2276539"/>
             <wp:effectExtent b="0" l="0" r="0" t="0"/>
             <wp:docPr descr="Figure 5. Wyckoff embedding destabilises lattice prediction. Lattice (a) and coordinate (b) training-loss curves for the distance-aux run (v16) vs the Wyckoff-embedding run (v15). Adding the Wyckoff embedding inflates the lattice loss by an order of magnitude (~0.6 vs ~0.02) while leaving the coordinate loss largely unchanged; the failure is localised to the lattice channel." title="" id="40" name="Picture"/>
             <a:graphic>
@@ -8361,7 +8535,7 @@
                   <pic:spPr bwMode="auto">
                     <a:xfrm>
                       <a:off x="0" y="0"/>
-                      <a:ext cx="5334000" cy="2277073"/>
+                      <a:ext cx="5334000" cy="2276539"/>
                     </a:xfrm>
                     <a:prstGeom prst="rect">
                       <a:avLst/>
@@ -8475,7 +8649,7 @@
     <w:bookmarkStart w:id="44" w:name="encoder-bottleneck-perturbation-study"/>
     <w:p>
       <w:pPr>
-        <w:pStyle w:val="Heading3"/>
+        <w:pStyle w:val="Heading2"/>
       </w:pPr>
       <w:r>
         <w:t xml:space="preserve">5.5 Encoder-bottleneck perturbation study</w:t>
@@ -8579,7 +8753,7 @@
     <w:bookmarkStart w:id="45" w:name="Xe14ee5fe759b907ea0190421ae7272432ef5613"/>
     <w:p>
       <w:pPr>
-        <w:pStyle w:val="Heading3"/>
+        <w:pStyle w:val="Heading2"/>
       </w:pPr>
       <w:r>
         <w:t xml:space="preserve">5.6 Why the learned lattice fails: a pooling bottleneck, not a head bottleneck</w:t>
@@ -8881,7 +9055,7 @@
     <w:bookmarkStart w:id="47" w:name="discussion"/>
     <w:p>
       <w:pPr>
-        <w:pStyle w:val="Heading2"/>
+        <w:pStyle w:val="Heading1"/>
       </w:pPr>
       <w:r>
         <w:t xml:space="preserve">6. Discussion</w:t>
@@ -9119,7 +9293,7 @@
     <w:bookmarkStart w:id="48" w:name="limitations"/>
     <w:p>
       <w:pPr>
-        <w:pStyle w:val="Heading2"/>
+        <w:pStyle w:val="Heading1"/>
       </w:pPr>
       <w:r>
         <w:t xml:space="preserve">7. Limitations</w:t>
@@ -9393,7 +9567,7 @@
     <w:bookmarkStart w:id="49" w:name="conclusion"/>
     <w:p>
       <w:pPr>
-        <w:pStyle w:val="Heading2"/>
+        <w:pStyle w:val="Heading1"/>
       </w:pPr>
       <w:r>
         <w:t xml:space="preserve">8. Conclusion</w:t>
@@ -9433,7 +9607,7 @@
     <w:bookmarkStart w:id="50" w:name="acknowledgments"/>
     <w:p>
       <w:pPr>
-        <w:pStyle w:val="Heading2"/>
+        <w:pStyle w:val="Heading1"/>
       </w:pPr>
       <w:r>
         <w:t xml:space="preserve">Acknowledgments</w:t>
@@ -9493,7 +9667,7 @@
     <w:bookmarkStart w:id="51" w:name="author-contributions-credit"/>
     <w:p>
       <w:pPr>
-        <w:pStyle w:val="Heading2"/>
+        <w:pStyle w:val="Heading1"/>
       </w:pPr>
       <w:r>
         <w:t xml:space="preserve">Author Contributions (CRediT)</w:t>
@@ -9511,7 +9685,7 @@
     <w:bookmarkStart w:id="52" w:name="conflict-of-interest"/>
     <w:p>
       <w:pPr>
-        <w:pStyle w:val="Heading2"/>
+        <w:pStyle w:val="Heading1"/>
       </w:pPr>
       <w:r>
         <w:t xml:space="preserve">Conflict of Interest</w:t>
@@ -9529,7 +9703,7 @@
     <w:bookmarkStart w:id="53" w:name="funding"/>
     <w:p>
       <w:pPr>
-        <w:pStyle w:val="Heading2"/>
+        <w:pStyle w:val="Heading1"/>
       </w:pPr>
       <w:r>
         <w:t xml:space="preserve">Funding</w:t>
@@ -9547,7 +9721,7 @@
     <w:bookmarkStart w:id="55" w:name="data-and-code-availability"/>
     <w:p>
       <w:pPr>
-        <w:pStyle w:val="Heading2"/>
+        <w:pStyle w:val="Heading1"/>
       </w:pPr>
       <w:r>
         <w:t xml:space="preserve">Data and Code Availability</w:t>
@@ -9582,7 +9756,7 @@
     <w:bookmarkStart w:id="56" w:name="ethics-declaration"/>
     <w:p>
       <w:pPr>
-        <w:pStyle w:val="Heading2"/>
+        <w:pStyle w:val="Heading1"/>
       </w:pPr>
       <w:r>
         <w:t xml:space="preserve">Ethics Declaration</w:t>
@@ -9607,7 +9781,7 @@
     <w:bookmarkStart w:id="57" w:name="references"/>
     <w:p>
       <w:pPr>
-        <w:pStyle w:val="Heading2"/>
+        <w:pStyle w:val="Heading1"/>
       </w:pPr>
       <w:r>
         <w:t xml:space="preserve">References</w:t>
@@ -9615,14 +9789,10 @@
     </w:p>
     <w:p>
       <w:pPr>
-        <w:pStyle w:val="Compact"/>
-        <w:numPr>
-          <w:ilvl w:val="0"/>
-          <w:numId w:val="1003"/>
-        </w:numPr>
-      </w:pPr>
-      <w:r>
-        <w:t xml:space="preserve">Choudhary, K. (2025). DiffractGPT: Atomic Structure Determination from X-ray Diffraction Patterns using a Generative Pretrained Transformer.</w:t>
+        <w:pStyle w:val="FirstParagraph"/>
+      </w:pPr>
+      <w:r>
+        <w:t xml:space="preserve">Batatia, I., Kovács, D. P., Simm, G. N. C., Ortner, C. &amp; Csányi, G. (2022). MACE: higher order equivariant message passing neural networks for fast and accurate force fields.</w:t>
       </w:r>
       <w:r>
         <w:t xml:space="preserve"> </w:t>
@@ -9632,49 +9802,18 @@
           <w:i/>
           <w:iCs/>
         </w:rPr>
-        <w:t xml:space="preserve">The Journal of Physical Chemistry Letters</w:t>
-      </w:r>
-      <w:r>
-        <w:t xml:space="preserve">, 16(8), 2110–2119. DOI: 10.1021/acs.jpclett.4c03137. Reproduced from HF checkpoint</w:t>
-      </w:r>
-      <w:r>
-        <w:t xml:space="preserve"> </w:t>
-      </w:r>
-      <w:r>
-        <w:rPr>
-          <w:rStyle w:val="VerbatimChar"/>
-        </w:rPr>
-        <w:t xml:space="preserve">knc6/diffractgpt_mistral_chemical_formula</w:t>
-      </w:r>
-      <w:r>
-        <w:t xml:space="preserve"> </w:t>
-      </w:r>
-      <w:r>
-        <w:t xml:space="preserve">and code at</w:t>
-      </w:r>
-      <w:r>
-        <w:t xml:space="preserve"> </w:t>
-      </w:r>
-      <w:r>
-        <w:rPr>
-          <w:rStyle w:val="VerbatimChar"/>
-        </w:rPr>
-        <w:t xml:space="preserve">github.com/atomgptlab/atomgpt</w:t>
-      </w:r>
-      <w:r>
-        <w:t xml:space="preserve">.</w:t>
-      </w:r>
-    </w:p>
-    <w:p>
-      <w:pPr>
-        <w:pStyle w:val="Compact"/>
-        <w:numPr>
-          <w:ilvl w:val="0"/>
-          <w:numId w:val="1003"/>
-        </w:numPr>
-      </w:pPr>
-      <w:r>
-        <w:t xml:space="preserve">Guo, G., Saidi, T. L., Terban, M. W., Valsecchi, M., Billinge, S. J. L., &amp; Lipson, H. (2025). Ab initio structure solutions from nanocrystalline powder diffraction data via diffusion models.</w:t>
+        <w:t xml:space="preserve">Advances in Neural Information Processing Systems</w:t>
+      </w:r>
+      <w:r>
+        <w:t xml:space="preserve">, Vol. 35.</w:t>
+      </w:r>
+    </w:p>
+    <w:p>
+      <w:pPr>
+        <w:pStyle w:val="BodyText"/>
+      </w:pPr>
+      <w:r>
+        <w:t xml:space="preserve">Boultif, A. &amp; Louër, D. (2004).</w:t>
       </w:r>
       <w:r>
         <w:t xml:space="preserve"> </w:t>
@@ -9684,49 +9823,28 @@
           <w:i/>
           <w:iCs/>
         </w:rPr>
-        <w:t xml:space="preserve">Nature Materials</w:t>
-      </w:r>
-      <w:r>
-        <w:t xml:space="preserve">, 24, 1726–1734. DOI: 10.1038/s41563-025-02220-y (Author Correction: 10.1038/s41563-025-02301-y; preprint arXiv:2406.10796). Reproduced from HF checkpoint</w:t>
-      </w:r>
-      <w:r>
-        <w:t xml:space="preserve"> </w:t>
-      </w:r>
-      <w:r>
-        <w:rPr>
-          <w:rStyle w:val="VerbatimChar"/>
-        </w:rPr>
-        <w:t xml:space="preserve">therealgabeguo/cdvae_xrd_sinc100</w:t>
-      </w:r>
-      <w:r>
-        <w:t xml:space="preserve"> </w:t>
-      </w:r>
-      <w:r>
-        <w:t xml:space="preserve">and code at</w:t>
-      </w:r>
-      <w:r>
-        <w:t xml:space="preserve"> </w:t>
-      </w:r>
-      <w:r>
-        <w:rPr>
-          <w:rStyle w:val="VerbatimChar"/>
-        </w:rPr>
-        <w:t xml:space="preserve">github.com/gabeguo/cdvae_xrd</w:t>
-      </w:r>
-      <w:r>
-        <w:t xml:space="preserve">.</w:t>
-      </w:r>
-    </w:p>
-    <w:p>
-      <w:pPr>
-        <w:pStyle w:val="Compact"/>
-        <w:numPr>
-          <w:ilvl w:val="0"/>
-          <w:numId w:val="1003"/>
-        </w:numPr>
-      </w:pPr>
-      <w:r>
-        <w:t xml:space="preserve">Johansen, F. L., Friis-Jensen, U., Dam, E. B., Jensen, K. M. Ø., Mercado, R., &amp; Selvan, R. (2025). deCIFer: Crystal Structure Prediction from Powder Diffraction Data using Autoregressive Language Models.</w:t>
+        <w:t xml:space="preserve">J. Appl. Cryst.</w:t>
+      </w:r>
+      <w:r>
+        <w:t xml:space="preserve"> </w:t>
+      </w:r>
+      <w:r>
+        <w:rPr>
+          <w:b/>
+          <w:bCs/>
+        </w:rPr>
+        <w:t xml:space="preserve">37</w:t>
+      </w:r>
+      <w:r>
+        <w:t xml:space="preserve">, 724–731. DOI: 10.1107/S0021889804014876.</w:t>
+      </w:r>
+    </w:p>
+    <w:p>
+      <w:pPr>
+        <w:pStyle w:val="BodyText"/>
+      </w:pPr>
+      <w:r>
+        <w:t xml:space="preserve">Choudhary, K. (2025).</w:t>
       </w:r>
       <w:r>
         <w:t xml:space="preserve"> </w:t>
@@ -9736,25 +9854,55 @@
           <w:i/>
           <w:iCs/>
         </w:rPr>
-        <w:t xml:space="preserve">Transactions on Machine Learning Research</w:t>
-      </w:r>
-      <w:r>
-        <w:t xml:space="preserve"> </w:t>
-      </w:r>
-      <w:r>
-        <w:t xml:space="preserve">(arXiv:2502.02189).</w:t>
-      </w:r>
-    </w:p>
-    <w:p>
-      <w:pPr>
-        <w:pStyle w:val="Compact"/>
-        <w:numPr>
-          <w:ilvl w:val="0"/>
-          <w:numId w:val="1003"/>
-        </w:numPr>
-      </w:pPr>
-      <w:r>
-        <w:t xml:space="preserve">Riesel, E. A., Mackey, T., Nilforoshan, H., Xu, M., Badding, C. K., Altman, A. B., Leskovec, J., &amp; Freedman, D. E. (2024). Crystal Structure Determination from Powder Diffraction Patterns with Generative Machine Learning.</w:t>
+        <w:t xml:space="preserve">J. Phys. Chem. Lett.</w:t>
+      </w:r>
+      <w:r>
+        <w:t xml:space="preserve"> </w:t>
+      </w:r>
+      <w:r>
+        <w:rPr>
+          <w:b/>
+          <w:bCs/>
+        </w:rPr>
+        <w:t xml:space="preserve">16</w:t>
+      </w:r>
+      <w:r>
+        <w:t xml:space="preserve">, 2110–2119. DOI: 10.1021/acs.jpclett.4c03137. Reproduced from HF checkpoint</w:t>
+      </w:r>
+      <w:r>
+        <w:t xml:space="preserve"> </w:t>
+      </w:r>
+      <w:r>
+        <w:rPr>
+          <w:rStyle w:val="VerbatimChar"/>
+        </w:rPr>
+        <w:t xml:space="preserve">knc6/diffractgpt_mistral_chemical_formula</w:t>
+      </w:r>
+      <w:r>
+        <w:t xml:space="preserve"> </w:t>
+      </w:r>
+      <w:r>
+        <w:t xml:space="preserve">and code at</w:t>
+      </w:r>
+      <w:r>
+        <w:t xml:space="preserve"> </w:t>
+      </w:r>
+      <w:r>
+        <w:rPr>
+          <w:rStyle w:val="VerbatimChar"/>
+        </w:rPr>
+        <w:t xml:space="preserve">github.com/atomgptlab/atomgpt</w:t>
+      </w:r>
+      <w:r>
+        <w:t xml:space="preserve">.</w:t>
+      </w:r>
+    </w:p>
+    <w:p>
+      <w:pPr>
+        <w:pStyle w:val="BodyText"/>
+      </w:pPr>
+      <w:r>
+        <w:t xml:space="preserve">Guo, G., Saidi, T. L., Terban, M. W., Valsecchi, M., Billinge, S. J. L. &amp; Lipson, H. (2025).</w:t>
       </w:r>
       <w:r>
         <w:t xml:space="preserve"> </w:t>
@@ -9764,10 +9912,20 @@
           <w:i/>
           <w:iCs/>
         </w:rPr>
-        <w:t xml:space="preserve">Journal of the American Chemical Society</w:t>
-      </w:r>
-      <w:r>
-        <w:t xml:space="preserve">, 146(44), 30340–30348. DOI: 10.1021/jacs.4c10244. Code:</w:t>
+        <w:t xml:space="preserve">Nat. Mater.</w:t>
+      </w:r>
+      <w:r>
+        <w:t xml:space="preserve"> </w:t>
+      </w:r>
+      <w:r>
+        <w:rPr>
+          <w:b/>
+          <w:bCs/>
+        </w:rPr>
+        <w:t xml:space="preserve">24</w:t>
+      </w:r>
+      <w:r>
+        <w:t xml:space="preserve">, 1726–1734. DOI: 10.1038/s41563-025-02220-y (Author Correction: 10.1038/s41563-025-02301-y; preprint arXiv:2406.10796). Reproduced from HF checkpoint</w:t>
       </w:r>
       <w:r>
         <w:t xml:space="preserve"> </w:t>
@@ -9776,34 +9934,41 @@
         <w:rPr>
           <w:rStyle w:val="VerbatimChar"/>
         </w:rPr>
-        <w:t xml:space="preserve">github.com/ML-PXRD/Crystalyze</w:t>
-      </w:r>
-      <w:r>
-        <w:t xml:space="preserve">. We could not reproduce: the checkpoint download link is marked</w:t>
-      </w:r>
-      <w:r>
-        <w:t xml:space="preserve"> </w:t>
-      </w:r>
-      <w:r>
-        <w:t xml:space="preserve">“not yet active”</w:t>
-      </w:r>
-      <w:r>
-        <w:t xml:space="preserve"> </w:t>
-      </w:r>
-      <w:r>
-        <w:t xml:space="preserve">in the upstream README (verified 2026-06-01).</w:t>
-      </w:r>
-    </w:p>
-    <w:p>
-      <w:pPr>
-        <w:pStyle w:val="Compact"/>
-        <w:numPr>
-          <w:ilvl w:val="0"/>
-          <w:numId w:val="1003"/>
-        </w:numPr>
-      </w:pPr>
-      <w:r>
-        <w:t xml:space="preserve">Segal, N., Subramanian, A., Li, M., Miller, B. K., &amp; Gómez-Bombarelli, R. (2025). The Loss Landscape of Powder X-Ray Diffraction-Based Structure Optimization Is Too Rough for Gradient Descent.</w:t>
+        <w:t xml:space="preserve">therealgabeguo/cdvae_xrd_sinc100</w:t>
+      </w:r>
+      <w:r>
+        <w:t xml:space="preserve"> </w:t>
+      </w:r>
+      <w:r>
+        <w:t xml:space="preserve">and code at</w:t>
+      </w:r>
+      <w:r>
+        <w:t xml:space="preserve"> </w:t>
+      </w:r>
+      <w:r>
+        <w:rPr>
+          <w:rStyle w:val="VerbatimChar"/>
+        </w:rPr>
+        <w:t xml:space="preserve">github.com/gabeguo/cdvae_xrd</w:t>
+      </w:r>
+      <w:r>
+        <w:t xml:space="preserve">.</w:t>
+      </w:r>
+    </w:p>
+    <w:p>
+      <w:pPr>
+        <w:pStyle w:val="BodyText"/>
+      </w:pPr>
+      <w:r>
+        <w:t xml:space="preserve">Guo, J. &amp; Schwalbe-Koda, D. (2026). Generative inversion of spectroscopic data for amorphous structure elucidation. arXiv:2603.23210.</w:t>
+      </w:r>
+    </w:p>
+    <w:p>
+      <w:pPr>
+        <w:pStyle w:val="BodyText"/>
+      </w:pPr>
+      <w:r>
+        <w:t xml:space="preserve">Jiao, R., Huang, W., Lin, P., Han, J., Chen, P., Lu, Y. &amp; Liu, Y. (2023). Crystal structure prediction by joint equivariant diffusion.</w:t>
       </w:r>
       <w:r>
         <w:t xml:space="preserve"> </w:t>
@@ -9813,22 +9978,18 @@
           <w:i/>
           <w:iCs/>
         </w:rPr>
-        <w:t xml:space="preserve">arXiv:2512.04036</w:t>
-      </w:r>
-      <w:r>
-        <w:t xml:space="preserve">.</w:t>
-      </w:r>
-    </w:p>
-    <w:p>
-      <w:pPr>
-        <w:pStyle w:val="Compact"/>
-        <w:numPr>
-          <w:ilvl w:val="0"/>
-          <w:numId w:val="1003"/>
-        </w:numPr>
-      </w:pPr>
-      <w:r>
-        <w:t xml:space="preserve">Xie, T., Fu, X., Ganea, O.-E., Barzilay, R., &amp; Jaakkola, T. (2022). Crystal diffusion variational autoencoder for periodic material generation.</w:t>
+        <w:t xml:space="preserve">Advances in Neural Information Processing Systems</w:t>
+      </w:r>
+      <w:r>
+        <w:t xml:space="preserve">, Vol. 36.</w:t>
+      </w:r>
+    </w:p>
+    <w:p>
+      <w:pPr>
+        <w:pStyle w:val="BodyText"/>
+      </w:pPr>
+      <w:r>
+        <w:t xml:space="preserve">Johansen, F. L., Friis-Jensen, U., Dam, E. B., Jensen, K. M. Ø., Mercado, R. &amp; Selvan, R. (2025). deCIFer: crystal structure prediction from powder diffraction data using autoregressive language models.</w:t>
       </w:r>
       <w:r>
         <w:t xml:space="preserve"> </w:t>
@@ -9838,22 +9999,21 @@
           <w:i/>
           <w:iCs/>
         </w:rPr>
-        <w:t xml:space="preserve">International Conference on Learning Representations</w:t>
-      </w:r>
-      <w:r>
-        <w:t xml:space="preserve">.</w:t>
-      </w:r>
-    </w:p>
-    <w:p>
-      <w:pPr>
-        <w:pStyle w:val="Compact"/>
-        <w:numPr>
-          <w:ilvl w:val="0"/>
-          <w:numId w:val="1003"/>
-        </w:numPr>
-      </w:pPr>
-      <w:r>
-        <w:t xml:space="preserve">Jiao, R., et al. (2023). Crystal structure prediction by joint equivariant diffusion.</w:t>
+        <w:t xml:space="preserve">Transactions on Machine Learning Research</w:t>
+      </w:r>
+      <w:r>
+        <w:t xml:space="preserve"> </w:t>
+      </w:r>
+      <w:r>
+        <w:t xml:space="preserve">(arXiv:2502.02189).</w:t>
+      </w:r>
+    </w:p>
+    <w:p>
+      <w:pPr>
+        <w:pStyle w:val="BodyText"/>
+      </w:pPr>
+      <w:r>
+        <w:t xml:space="preserve">Nichol, A. &amp; Dhariwal, P. (2021). Improved denoising diffusion probabilistic models.</w:t>
       </w:r>
       <w:r>
         <w:t xml:space="preserve"> </w:t>
@@ -9863,25 +10023,31 @@
           <w:i/>
           <w:iCs/>
         </w:rPr>
-        <w:t xml:space="preserve">Advances in Neural Information Processing Systems</w:t>
-      </w:r>
-      <w:r>
-        <w:t xml:space="preserve"> </w:t>
-      </w:r>
-      <w:r>
-        <w:t xml:space="preserve">36.</w:t>
-      </w:r>
-    </w:p>
-    <w:p>
-      <w:pPr>
-        <w:pStyle w:val="Compact"/>
-        <w:numPr>
-          <w:ilvl w:val="0"/>
-          <w:numId w:val="1003"/>
-        </w:numPr>
-      </w:pPr>
-      <w:r>
-        <w:t xml:space="preserve">Zeni, C., et al. (2024). MatterGen: A generative model for inorganic materials design.</w:t>
+        <w:t xml:space="preserve">Proceedings of the 38th International Conference on Machine Learning</w:t>
+      </w:r>
+      <w:r>
+        <w:t xml:space="preserve">, PMLR</w:t>
+      </w:r>
+      <w:r>
+        <w:t xml:space="preserve"> </w:t>
+      </w:r>
+      <w:r>
+        <w:rPr>
+          <w:b/>
+          <w:bCs/>
+        </w:rPr>
+        <w:t xml:space="preserve">139</w:t>
+      </w:r>
+      <w:r>
+        <w:t xml:space="preserve">, 8162–8171.</w:t>
+      </w:r>
+    </w:p>
+    <w:p>
+      <w:pPr>
+        <w:pStyle w:val="BodyText"/>
+      </w:pPr>
+      <w:r>
+        <w:t xml:space="preserve">Riesel, E. A., Mackey, T., Nilforoshan, H., Xu, M., Badding, C. K., Altman, A. B., Leskovec, J. &amp; Freedman, D. E. (2024).</w:t>
       </w:r>
       <w:r>
         <w:t xml:space="preserve"> </w:t>
@@ -9891,22 +10057,52 @@
           <w:i/>
           <w:iCs/>
         </w:rPr>
-        <w:t xml:space="preserve">arXiv:2312.03687</w:t>
-      </w:r>
-      <w:r>
-        <w:t xml:space="preserve">.</w:t>
-      </w:r>
-    </w:p>
-    <w:p>
-      <w:pPr>
-        <w:pStyle w:val="Compact"/>
-        <w:numPr>
-          <w:ilvl w:val="0"/>
-          <w:numId w:val="1003"/>
-        </w:numPr>
-      </w:pPr>
-      <w:r>
-        <w:t xml:space="preserve">Boultif, A., &amp; Louër, D. (2004). Powder pattern indexing with the dichotomy method.</w:t>
+        <w:t xml:space="preserve">J. Am. Chem. Soc.</w:t>
+      </w:r>
+      <w:r>
+        <w:t xml:space="preserve"> </w:t>
+      </w:r>
+      <w:r>
+        <w:rPr>
+          <w:b/>
+          <w:bCs/>
+        </w:rPr>
+        <w:t xml:space="preserve">146</w:t>
+      </w:r>
+      <w:r>
+        <w:t xml:space="preserve">, 30340–30348. DOI: 10.1021/jacs.4c10244. Code:</w:t>
+      </w:r>
+      <w:r>
+        <w:t xml:space="preserve"> </w:t>
+      </w:r>
+      <w:r>
+        <w:rPr>
+          <w:rStyle w:val="VerbatimChar"/>
+        </w:rPr>
+        <w:t xml:space="preserve">github.com/ML-PXRD/Crystalyze</w:t>
+      </w:r>
+      <w:r>
+        <w:t xml:space="preserve">. We could not reproduce: the checkpoint download link is marked</w:t>
+      </w:r>
+      <w:r>
+        <w:t xml:space="preserve"> </w:t>
+      </w:r>
+      <w:r>
+        <w:t xml:space="preserve">“not yet active”</w:t>
+      </w:r>
+      <w:r>
+        <w:t xml:space="preserve"> </w:t>
+      </w:r>
+      <w:r>
+        <w:t xml:space="preserve">in the upstream README (verified 2026-06-01).</w:t>
+      </w:r>
+    </w:p>
+    <w:p>
+      <w:pPr>
+        <w:pStyle w:val="BodyText"/>
+      </w:pPr>
+      <w:r>
+        <w:t xml:space="preserve">Schütt, K. T., Kindermans, P.-J., Sauceda, H. E., Chmiela, S., Tkatchenko, A. &amp; Müller, K.-R. (2017). SchNet: a continuous-filter convolutional neural network for modeling quantum interactions.</w:t>
       </w:r>
       <w:r>
         <w:t xml:space="preserve"> </w:t>
@@ -9916,22 +10112,26 @@
           <w:i/>
           <w:iCs/>
         </w:rPr>
-        <w:t xml:space="preserve">Journal of Applied Crystallography</w:t>
-      </w:r>
-      <w:r>
-        <w:t xml:space="preserve">, 37(5), 724–731. DOI: 10.1107/S0021889804014876.</w:t>
-      </w:r>
-    </w:p>
-    <w:p>
-      <w:pPr>
-        <w:pStyle w:val="Compact"/>
-        <w:numPr>
-          <w:ilvl w:val="0"/>
-          <w:numId w:val="1003"/>
-        </w:numPr>
-      </w:pPr>
-      <w:r>
-        <w:t xml:space="preserve">Guo, J., &amp; Schwalbe-Koda, D. (2026). Generative Inversion of Spectroscopic Data for Amorphous Structure Elucidation.</w:t>
+        <w:t xml:space="preserve">Advances in Neural Information Processing Systems</w:t>
+      </w:r>
+      <w:r>
+        <w:t xml:space="preserve">, Vol. 30.</w:t>
+      </w:r>
+    </w:p>
+    <w:p>
+      <w:pPr>
+        <w:pStyle w:val="BodyText"/>
+      </w:pPr>
+      <w:r>
+        <w:t xml:space="preserve">Segal, N., Subramanian, A., Li, M., Miller, B. K. &amp; Gómez-Bombarelli, R. (2025). The loss landscape of powder X-ray diffraction-based structure optimization is too rough for gradient descent. arXiv:2512.04036.</w:t>
+      </w:r>
+    </w:p>
+    <w:p>
+      <w:pPr>
+        <w:pStyle w:val="BodyText"/>
+      </w:pPr>
+      <w:r>
+        <w:t xml:space="preserve">Song, J., Meng, C. &amp; Ermon, S. (2021). Denoising diffusion implicit models.</w:t>
       </w:r>
       <w:r>
         <w:t xml:space="preserve"> </w:t>
@@ -9941,7 +10141,7 @@
           <w:i/>
           <w:iCs/>
         </w:rPr>
-        <w:t xml:space="preserve">arXiv:2603.23210</w:t>
+        <w:t xml:space="preserve">International Conference on Learning Representations</w:t>
       </w:r>
       <w:r>
         <w:t xml:space="preserve">.</w:t>
@@ -9949,14 +10149,10 @@
     </w:p>
     <w:p>
       <w:pPr>
-        <w:pStyle w:val="Compact"/>
-        <w:numPr>
-          <w:ilvl w:val="0"/>
-          <w:numId w:val="1003"/>
-        </w:numPr>
-      </w:pPr>
-      <w:r>
-        <w:t xml:space="preserve">Schütt, K. T., et al. (2017). SchNet: A continuous-filter convolutional neural network for modeling quantum interactions.</w:t>
+        <w:pStyle w:val="BodyText"/>
+      </w:pPr>
+      <w:r>
+        <w:t xml:space="preserve">Toby, B. H. &amp; Von Dreele, R. B. (2013).</w:t>
       </w:r>
       <w:r>
         <w:t xml:space="preserve"> </w:t>
@@ -9966,25 +10162,40 @@
           <w:i/>
           <w:iCs/>
         </w:rPr>
-        <w:t xml:space="preserve">Advances in Neural Information Processing Systems</w:t>
-      </w:r>
-      <w:r>
-        <w:t xml:space="preserve"> </w:t>
-      </w:r>
-      <w:r>
-        <w:t xml:space="preserve">30.</w:t>
-      </w:r>
-    </w:p>
-    <w:p>
-      <w:pPr>
-        <w:pStyle w:val="Compact"/>
-        <w:numPr>
-          <w:ilvl w:val="0"/>
-          <w:numId w:val="1003"/>
-        </w:numPr>
-      </w:pPr>
-      <w:r>
-        <w:t xml:space="preserve">Batatia, I., Kovács, D. P., Simm, G. N. C., Ortner, C., &amp; Csányi, G. (2022). MACE: Higher order equivariant message passing neural networks for fast and accurate force fields.</w:t>
+        <w:t xml:space="preserve">J. Appl. Cryst.</w:t>
+      </w:r>
+      <w:r>
+        <w:t xml:space="preserve"> </w:t>
+      </w:r>
+      <w:r>
+        <w:rPr>
+          <w:b/>
+          <w:bCs/>
+        </w:rPr>
+        <w:t xml:space="preserve">46</w:t>
+      </w:r>
+      <w:r>
+        <w:t xml:space="preserve">, 544–549. Code:</w:t>
+      </w:r>
+      <w:r>
+        <w:t xml:space="preserve"> </w:t>
+      </w:r>
+      <w:r>
+        <w:rPr>
+          <w:rStyle w:val="VerbatimChar"/>
+        </w:rPr>
+        <w:t xml:space="preserve">github.com/AdvancedPhotonSource/GSAS-II</w:t>
+      </w:r>
+      <w:r>
+        <w:t xml:space="preserve">.</w:t>
+      </w:r>
+    </w:p>
+    <w:p>
+      <w:pPr>
+        <w:pStyle w:val="BodyText"/>
+      </w:pPr>
+      <w:r>
+        <w:t xml:space="preserve">Xie, T., Fu, X., Ganea, O.-E., Barzilay, R. &amp; Jaakkola, T. (2022). Crystal diffusion variational autoencoder for periodic material generation.</w:t>
       </w:r>
       <w:r>
         <w:t xml:space="preserve"> </w:t>
@@ -9994,25 +10205,18 @@
           <w:i/>
           <w:iCs/>
         </w:rPr>
-        <w:t xml:space="preserve">Advances in Neural Information Processing Systems</w:t>
-      </w:r>
-      <w:r>
-        <w:t xml:space="preserve"> </w:t>
-      </w:r>
-      <w:r>
-        <w:t xml:space="preserve">35.</w:t>
-      </w:r>
-    </w:p>
-    <w:p>
-      <w:pPr>
-        <w:pStyle w:val="Compact"/>
-        <w:numPr>
-          <w:ilvl w:val="0"/>
-          <w:numId w:val="1003"/>
-        </w:numPr>
-      </w:pPr>
-      <w:r>
-        <w:t xml:space="preserve">Nichol, A., &amp; Dhariwal, P. (2021). Improved denoising diffusion probabilistic models.</w:t>
+        <w:t xml:space="preserve">International Conference on Learning Representations</w:t>
+      </w:r>
+      <w:r>
+        <w:t xml:space="preserve">.</w:t>
+      </w:r>
+    </w:p>
+    <w:p>
+      <w:pPr>
+        <w:pStyle w:val="BodyText"/>
+      </w:pPr>
+      <w:r>
+        <w:t xml:space="preserve">Zeni, C., Pinsler, R., Zügner, D., Fowler, A., Horton, M., Fu, X., Wang, Z., Shysheya, A., Crabbé, J., Ueda, S., Sordillo, R., Sun, L., Smith, J., Nguyen, B., Schulz, H., Lewis, S., Huang, C.-W., Lu, Z., Zhou, Y., Yang, H., Hao, H., Li, J., Yang, C., Li, W., Tomioka, R. &amp; Xie, T. (2025).</w:t>
       </w:r>
       <w:r>
         <w:t xml:space="preserve"> </w:t>
@@ -10022,72 +10226,20 @@
           <w:i/>
           <w:iCs/>
         </w:rPr>
-        <w:t xml:space="preserve">International Conference on Machine Learning</w:t>
-      </w:r>
-      <w:r>
-        <w:t xml:space="preserve">.</w:t>
-      </w:r>
-    </w:p>
-    <w:p>
-      <w:pPr>
-        <w:pStyle w:val="Compact"/>
-        <w:numPr>
-          <w:ilvl w:val="0"/>
-          <w:numId w:val="1003"/>
-        </w:numPr>
-      </w:pPr>
-      <w:r>
-        <w:t xml:space="preserve">Toby, B. H., &amp; Von Dreele, R. B. (2013). GSAS-II: the genesis of a modern open-source all purpose crystallography software package.</w:t>
-      </w:r>
-      <w:r>
-        <w:t xml:space="preserve"> </w:t>
-      </w:r>
-      <w:r>
-        <w:rPr>
-          <w:i/>
-          <w:iCs/>
-        </w:rPr>
-        <w:t xml:space="preserve">Journal of Applied Crystallography</w:t>
-      </w:r>
-      <w:r>
-        <w:t xml:space="preserve">, 46(2), 544–549. Code:</w:t>
-      </w:r>
-      <w:r>
-        <w:t xml:space="preserve"> </w:t>
-      </w:r>
-      <w:r>
-        <w:rPr>
-          <w:rStyle w:val="VerbatimChar"/>
-        </w:rPr>
-        <w:t xml:space="preserve">github.com/AdvancedPhotonSource/GSAS-II</w:t>
-      </w:r>
-      <w:r>
-        <w:t xml:space="preserve">.</w:t>
-      </w:r>
-    </w:p>
-    <w:p>
-      <w:pPr>
-        <w:pStyle w:val="Compact"/>
-        <w:numPr>
-          <w:ilvl w:val="0"/>
-          <w:numId w:val="1003"/>
-        </w:numPr>
-      </w:pPr>
-      <w:r>
-        <w:t xml:space="preserve">Song, J., Meng, C., &amp; Ermon, S. (2021). Denoising diffusion implicit models.</w:t>
-      </w:r>
-      <w:r>
-        <w:t xml:space="preserve"> </w:t>
-      </w:r>
-      <w:r>
-        <w:rPr>
-          <w:i/>
-          <w:iCs/>
-        </w:rPr>
-        <w:t xml:space="preserve">International Conference on Learning Representations</w:t>
-      </w:r>
-      <w:r>
-        <w:t xml:space="preserve">.</w:t>
+        <w:t xml:space="preserve">Nature</w:t>
+      </w:r>
+      <w:r>
+        <w:t xml:space="preserve"> </w:t>
+      </w:r>
+      <w:r>
+        <w:rPr>
+          <w:b/>
+          <w:bCs/>
+        </w:rPr>
+        <w:t xml:space="preserve">639</w:t>
+      </w:r>
+      <w:r>
+        <w:t xml:space="preserve">, 624–632. DOI: 10.1038/s41586-025-08628-5.</w:t>
       </w:r>
     </w:p>
     <w:p>
@@ -10134,16 +10286,16 @@
     <w:bookmarkStart w:id="62" w:name="appendix"/>
     <w:p>
       <w:pPr>
+        <w:pStyle w:val="Heading1"/>
+      </w:pPr>
+      <w:r>
+        <w:t xml:space="preserve">Appendix</w:t>
+      </w:r>
+    </w:p>
+    <w:bookmarkStart w:id="58" w:name="a.-full-ablation-history"/>
+    <w:p>
+      <w:pPr>
         <w:pStyle w:val="Heading2"/>
-      </w:pPr>
-      <w:r>
-        <w:t xml:space="preserve">Appendix</w:t>
-      </w:r>
-    </w:p>
-    <w:bookmarkStart w:id="58" w:name="a.-full-ablation-history"/>
-    <w:p>
-      <w:pPr>
-        <w:pStyle w:val="Heading3"/>
       </w:pPr>
       <w:r>
         <w:t xml:space="preserve">A. Full ablation history</w:t>
@@ -11005,7 +11157,7 @@
     <w:bookmarkStart w:id="59" w:name="b.-hyperparameter-sensitivity"/>
     <w:p>
       <w:pPr>
-        <w:pStyle w:val="Heading3"/>
+        <w:pStyle w:val="Heading2"/>
       </w:pPr>
       <w:r>
         <w:t xml:space="preserve">B. Hyperparameter sensitivity</w:t>
@@ -11053,7 +11205,7 @@
     <w:bookmarkStart w:id="60" w:name="X984f5037fa8fa240d4e7791708ee54c226ae797"/>
     <w:p>
       <w:pPr>
-        <w:pStyle w:val="Heading3"/>
+        <w:pStyle w:val="Heading2"/>
       </w:pPr>
       <w:r>
         <w:t xml:space="preserve">C. Differentiable simulator validation details</w:t>
@@ -11080,6 +11232,153 @@
       </w:r>
       <w:r>
         <w:t xml:space="preserve">over a random 50-structure MP-20 test subset:</w:t>
+      </w:r>
+    </w:p>
+    <w:p>
+      <w:pPr>
+        <w:pStyle w:val="Compact"/>
+        <w:numPr>
+          <w:ilvl w:val="0"/>
+          <w:numId w:val="1003"/>
+        </w:numPr>
+      </w:pPr>
+      <w:r>
+        <w:t xml:space="preserve">Mean: 0.962</w:t>
+      </w:r>
+    </w:p>
+    <w:p>
+      <w:pPr>
+        <w:pStyle w:val="Compact"/>
+        <w:numPr>
+          <w:ilvl w:val="0"/>
+          <w:numId w:val="1003"/>
+        </w:numPr>
+      </w:pPr>
+      <w:r>
+        <w:t xml:space="preserve">Std: 0.027</w:t>
+      </w:r>
+    </w:p>
+    <w:p>
+      <w:pPr>
+        <w:pStyle w:val="Compact"/>
+        <w:numPr>
+          <w:ilvl w:val="0"/>
+          <w:numId w:val="1003"/>
+        </w:numPr>
+      </w:pPr>
+      <w:r>
+        <w:t xml:space="preserve">Min: 0.896 (mp-1213821, layered structure with strong texture in the reference)</w:t>
+      </w:r>
+    </w:p>
+    <w:p>
+      <w:pPr>
+        <w:pStyle w:val="Compact"/>
+        <w:numPr>
+          <w:ilvl w:val="0"/>
+          <w:numId w:val="1003"/>
+        </w:numPr>
+      </w:pPr>
+      <w:r>
+        <w:t xml:space="preserve">Max: 0.998 (mp-149, Si)</w:t>
+      </w:r>
+    </w:p>
+    <w:p>
+      <w:pPr>
+        <w:pStyle w:val="Compact"/>
+        <w:numPr>
+          <w:ilvl w:val="0"/>
+          <w:numId w:val="1003"/>
+        </w:numPr>
+      </w:pPr>
+      <w:r>
+        <w:t xml:space="preserve">Fraction &gt; 0.95: 33/50</w:t>
+      </w:r>
+    </w:p>
+    <w:p>
+      <w:pPr>
+        <w:pStyle w:val="Compact"/>
+        <w:numPr>
+          <w:ilvl w:val="0"/>
+          <w:numId w:val="1003"/>
+        </w:numPr>
+      </w:pPr>
+      <w:r>
+        <w:t xml:space="preserve">Fraction &gt; 0.9: 49/50</w:t>
+      </w:r>
+    </w:p>
+    <w:p>
+      <w:pPr>
+        <w:pStyle w:val="Compact"/>
+        <w:numPr>
+          <w:ilvl w:val="0"/>
+          <w:numId w:val="1003"/>
+        </w:numPr>
+      </w:pPr>
+      <w:r>
+        <w:t xml:space="preserve">Fraction &gt; 0.7: 50/50</w:t>
+      </w:r>
+    </w:p>
+    <w:p>
+      <w:pPr>
+        <w:pStyle w:val="FirstParagraph"/>
+      </w:pPr>
+      <w:r>
+        <w:t xml:space="preserve">Gradient sanity: for all 50 structures we confirmed</w:t>
+      </w:r>
+      <w:r>
+        <w:t xml:space="preserve"> </w:t>
+      </w:r>
+      <w:r>
+        <w:rPr>
+          <w:rStyle w:val="VerbatimChar"/>
+        </w:rPr>
+        <w:t xml:space="preserve">∂L/∂F</w:t>
+      </w:r>
+      <w:r>
+        <w:t xml:space="preserve"> </w:t>
+      </w:r>
+      <w:r>
+        <w:t xml:space="preserve">and</w:t>
+      </w:r>
+      <w:r>
+        <w:t xml:space="preserve"> </w:t>
+      </w:r>
+      <w:r>
+        <w:rPr>
+          <w:rStyle w:val="VerbatimChar"/>
+        </w:rPr>
+        <w:t xml:space="preserve">∂L/∂L</w:t>
+      </w:r>
+      <w:r>
+        <w:t xml:space="preserve"> </w:t>
+      </w:r>
+      <w:r>
+        <w:t xml:space="preserve">are non-zero and finite via</w:t>
+      </w:r>
+      <w:r>
+        <w:t xml:space="preserve"> </w:t>
+      </w:r>
+      <w:r>
+        <w:rPr>
+          <w:rStyle w:val="VerbatimChar"/>
+        </w:rPr>
+        <w:t xml:space="preserve">torch.autograd.gradcheck</w:t>
+      </w:r>
+      <w:r>
+        <w:t xml:space="preserve"> </w:t>
+      </w:r>
+      <w:r>
+        <w:t xml:space="preserve">on a 4-atom subset.</w:t>
+      </w:r>
+    </w:p>
+    <w:bookmarkEnd w:id="60"/>
+    <w:bookmarkStart w:id="61" w:name="d.-reproducibility-checklist"/>
+    <w:p>
+      <w:pPr>
+        <w:pStyle w:val="Heading2"/>
+      </w:pPr>
+      <w:r>
+        <w:t xml:space="preserve">D. Reproducibility checklist</w:t>
       </w:r>
     </w:p>
     <w:p>
@@ -11091,142 +11390,7 @@
         </w:numPr>
       </w:pPr>
       <w:r>
-        <w:t xml:space="preserve">Mean: 0.962</w:t>
-      </w:r>
-    </w:p>
-    <w:p>
-      <w:pPr>
-        <w:pStyle w:val="Compact"/>
-        <w:numPr>
-          <w:ilvl w:val="0"/>
-          <w:numId w:val="1004"/>
-        </w:numPr>
-      </w:pPr>
-      <w:r>
-        <w:t xml:space="preserve">Std: 0.027</w:t>
-      </w:r>
-    </w:p>
-    <w:p>
-      <w:pPr>
-        <w:pStyle w:val="Compact"/>
-        <w:numPr>
-          <w:ilvl w:val="0"/>
-          <w:numId w:val="1004"/>
-        </w:numPr>
-      </w:pPr>
-      <w:r>
-        <w:t xml:space="preserve">Min: 0.896 (mp-1213821, layered structure with strong texture in the reference)</w:t>
-      </w:r>
-    </w:p>
-    <w:p>
-      <w:pPr>
-        <w:pStyle w:val="Compact"/>
-        <w:numPr>
-          <w:ilvl w:val="0"/>
-          <w:numId w:val="1004"/>
-        </w:numPr>
-      </w:pPr>
-      <w:r>
-        <w:t xml:space="preserve">Max: 0.998 (mp-149, Si)</w:t>
-      </w:r>
-    </w:p>
-    <w:p>
-      <w:pPr>
-        <w:pStyle w:val="Compact"/>
-        <w:numPr>
-          <w:ilvl w:val="0"/>
-          <w:numId w:val="1004"/>
-        </w:numPr>
-      </w:pPr>
-      <w:r>
-        <w:t xml:space="preserve">Fraction &gt; 0.95: 33/50</w:t>
-      </w:r>
-    </w:p>
-    <w:p>
-      <w:pPr>
-        <w:pStyle w:val="Compact"/>
-        <w:numPr>
-          <w:ilvl w:val="0"/>
-          <w:numId w:val="1004"/>
-        </w:numPr>
-      </w:pPr>
-      <w:r>
-        <w:t xml:space="preserve">Fraction &gt; 0.9: 49/50</w:t>
-      </w:r>
-    </w:p>
-    <w:p>
-      <w:pPr>
-        <w:pStyle w:val="Compact"/>
-        <w:numPr>
-          <w:ilvl w:val="0"/>
-          <w:numId w:val="1004"/>
-        </w:numPr>
-      </w:pPr>
-      <w:r>
-        <w:t xml:space="preserve">Fraction &gt; 0.7: 50/50</w:t>
-      </w:r>
-    </w:p>
-    <w:p>
-      <w:pPr>
-        <w:pStyle w:val="FirstParagraph"/>
-      </w:pPr>
-      <w:r>
-        <w:t xml:space="preserve">Gradient sanity: for all 50 structures we confirmed</w:t>
-      </w:r>
-      <w:r>
-        <w:t xml:space="preserve"> </w:t>
-      </w:r>
-      <w:r>
-        <w:rPr>
-          <w:rStyle w:val="VerbatimChar"/>
-        </w:rPr>
-        <w:t xml:space="preserve">∂L/∂F</w:t>
-      </w:r>
-      <w:r>
-        <w:t xml:space="preserve"> </w:t>
-      </w:r>
-      <w:r>
-        <w:t xml:space="preserve">and</w:t>
-      </w:r>
-      <w:r>
-        <w:t xml:space="preserve"> </w:t>
-      </w:r>
-      <w:r>
-        <w:rPr>
-          <w:rStyle w:val="VerbatimChar"/>
-        </w:rPr>
-        <w:t xml:space="preserve">∂L/∂L</w:t>
-      </w:r>
-      <w:r>
-        <w:t xml:space="preserve"> </w:t>
-      </w:r>
-      <w:r>
-        <w:t xml:space="preserve">are non-zero and finite via</w:t>
-      </w:r>
-      <w:r>
-        <w:t xml:space="preserve"> </w:t>
-      </w:r>
-      <w:r>
-        <w:rPr>
-          <w:rStyle w:val="VerbatimChar"/>
-        </w:rPr>
-        <w:t xml:space="preserve">torch.autograd.gradcheck</w:t>
-      </w:r>
-      <w:r>
-        <w:t xml:space="preserve"> </w:t>
-      </w:r>
-      <w:r>
-        <w:t xml:space="preserve">on a 4-atom subset.</w:t>
-      </w:r>
-    </w:p>
-    <w:bookmarkEnd w:id="60"/>
-    <w:bookmarkStart w:id="61" w:name="d.-reproducibility-checklist"/>
-    <w:p>
-      <w:pPr>
-        <w:pStyle w:val="Heading3"/>
-      </w:pPr>
-      <w:r>
-        <w:t xml:space="preserve">D. Reproducibility checklist</w:t>
+        <w:t xml:space="preserve">Hyperparameters specified (§4.3)</w:t>
       </w:r>
     </w:p>
     <w:p>
@@ -11238,7 +11402,7 @@
         </w:numPr>
       </w:pPr>
       <w:r>
-        <w:t xml:space="preserve">Hyperparameters specified (§4.3)</w:t>
+        <w:t xml:space="preserve">Datasets and splits specified (§4.1; canonical CDVAE MP-20)</w:t>
       </w:r>
     </w:p>
     <w:p>
@@ -11250,7 +11414,7 @@
         </w:numPr>
       </w:pPr>
       <w:r>
-        <w:t xml:space="preserve">Datasets and splits specified (§4.1; canonical CDVAE MP-20)</w:t>
+        <w:t xml:space="preserve">Evaluation protocol specified (§4.2)</w:t>
       </w:r>
     </w:p>
     <w:p>
@@ -11262,7 +11426,7 @@
         </w:numPr>
       </w:pPr>
       <w:r>
-        <w:t xml:space="preserve">Evaluation protocol specified (§4.2)</w:t>
+        <w:t xml:space="preserve">Random seed: single seed (42) per run; pilot variance ≈ 0.5 % match-rate absolute</w:t>
       </w:r>
     </w:p>
     <w:p>
@@ -11274,7 +11438,7 @@
         </w:numPr>
       </w:pPr>
       <w:r>
-        <w:t xml:space="preserve">Random seed: single seed (42) per run; pilot variance ≈ 0.5 % match-rate absolute</w:t>
+        <w:t xml:space="preserve">Compute environment: PyTorch 2.x, CUDA 12.x, single RTX 5090; Python 3.12</w:t>
       </w:r>
     </w:p>
     <w:p>
@@ -11286,24 +11450,11 @@
         </w:numPr>
       </w:pPr>
       <w:r>
-        <w:t xml:space="preserve">Compute environment: PyTorch 2.x, CUDA 12.x, single RTX 5090; Python 3.12</w:t>
-      </w:r>
-    </w:p>
-    <w:p>
-      <w:pPr>
-        <w:pStyle w:val="Compact"/>
-        <w:numPr>
-          <w:ilvl w:val="0"/>
-          <w:numId w:val="1010"/>
-        </w:numPr>
-      </w:pPr>
-      <w:r>
         <w:t xml:space="preserve">Code, checkpoints, logs, and full training scripts released</w:t>
       </w:r>
     </w:p>
     <w:bookmarkEnd w:id="61"/>
     <w:bookmarkEnd w:id="62"/>
-    <w:bookmarkEnd w:id="63"/>
     <w:sectPr>
       <w:footnotePr>
         <w:numRestart w:val="eachSect"/>
@@ -11715,37 +11866,10 @@
     <w:abstractNumId w:val="991"/>
   </w:num>
   <w:num w:numId="1003">
-    <w:abstractNumId w:val="99411"/>
-    <w:lvlOverride w:ilvl="0">
-      <w:startOverride w:val="1"/>
-    </w:lvlOverride>
-    <w:lvlOverride w:ilvl="1">
-      <w:startOverride w:val="1"/>
-    </w:lvlOverride>
-    <w:lvlOverride w:ilvl="2">
-      <w:startOverride w:val="1"/>
-    </w:lvlOverride>
-    <w:lvlOverride w:ilvl="3">
-      <w:startOverride w:val="1"/>
-    </w:lvlOverride>
-    <w:lvlOverride w:ilvl="4">
-      <w:startOverride w:val="1"/>
-    </w:lvlOverride>
-    <w:lvlOverride w:ilvl="5">
-      <w:startOverride w:val="1"/>
-    </w:lvlOverride>
-    <w:lvlOverride w:ilvl="6">
-      <w:startOverride w:val="1"/>
-    </w:lvlOverride>
-    <w:lvlOverride w:ilvl="7">
-      <w:startOverride w:val="1"/>
-    </w:lvlOverride>
-    <w:lvlOverride w:ilvl="8">
-      <w:startOverride w:val="1"/>
-    </w:lvlOverride>
+    <w:abstractNumId w:val="991"/>
   </w:num>
   <w:num w:numId="1004">
-    <w:abstractNumId w:val="991"/>
+    <w:abstractNumId w:val="993"/>
   </w:num>
   <w:num w:numId="1005">
     <w:abstractNumId w:val="993"/>
@@ -11760,9 +11884,6 @@
     <w:abstractNumId w:val="993"/>
   </w:num>
   <w:num w:numId="1009">
-    <w:abstractNumId w:val="993"/>
-  </w:num>
-  <w:num w:numId="1010">
     <w:abstractNumId w:val="993"/>
   </w:num>
 </w:numbering>

</xml_diff>

<commit_message>
JAC R1: final pdf (28 pp) and docx from the completed revision; Phase 15 review (spend $2.87)
</commit_message>
<xml_diff>
--- a/paper/paper.docx
+++ b/paper/paper.docx
@@ -7,7 +7,7 @@
         <w:pStyle w:val="Title"/>
       </w:pPr>
       <w:r>
-        <w:t xml:space="preserve">PXRD-Diff: diagnosing the encoder bottleneck in diffusion-based powder-diffraction structure inversion</w:t>
+        <w:t xml:space="preserve">PXRD-Diff: diagnosing the lattice-recovery bottleneck in diffusion-based powder-diffraction structure inversion</w:t>
       </w:r>
     </w:p>
     <w:p>
@@ -65,7 +65,7 @@
         <w:t xml:space="preserve"> </w:t>
       </w:r>
       <w:r>
-        <w:t xml:space="preserve">A deliberately small conditional diffusion model for powder-diffraction structure inversion is used as a diagnostic instrument. The evidence points to global pooling in the pattern encoder as the stage that discards the absolute d-spacing information lattice recovery needs. A classical autoindexer, supplied with the true crystal system, serves as a control; three external generative models are re-scored on one shared evaluation harness; and a code audit prompted by review corrects three implementation errors.</w:t>
+        <w:t xml:space="preserve">A deliberately small conditional diffusion model for powder-diffraction structure inversion is used as a diagnostic instrument. A controlled ablation shows that restoring absolute peak positions to the lattice head, by position-aware pooling or by explicit d-spacings, does not reduce its ~1.3 Å cell error; the evidence points to the regression formulation of lattice recovery, not to the pooling stage. A classical autoindexer, supplied with the true crystal system, serves as a control; three external generative models are re-scored on one shared evaluation harness; and a code audit prompted by review corrects three implementation errors. Retraining with the corrected loss lifts the learned head from 0 to 1.9 %, level with the control, while the true-lattice oracle stays at 5.5 %, so the gap to the oracle is the effect that replicates.</w:t>
       </w:r>
     </w:p>
     <w:p>
@@ -89,7 +89,7 @@
         <w:pStyle w:val="FirstParagraph"/>
       </w:pPr>
       <w:r>
-        <w:t xml:space="preserve">Inverting a one-dimensional powder X-ray diffraction (PXRD) pattern to a three-dimensional crystal structure remains an open problem. Recent generative approaches report results under mutually incompatible protocols, and their failure modes are seldom catalogued. This paper is a diagnostic study. PXRD-Diff, a 3.7 M-parameter conditional diffusion model trained on the CDVAE MP-20 split, is kept deliberately small so that its failure modes are visible; it is not proposed as a competitive inversion tool. DiffractGPT, PXRDnet and deCIFer are re-scored through the same pymatgen StructureMatcher harness and reach 18.9 %, 30.0 % and 73.8 % match respectively; PXRD-Diff reaches 1.6 %. The central finding is mechanistic. The learned PXRD encoder reaches a 0.007 normalised auxiliary lattice-regression loss in isolation, yet substituting that head’s own lattice into the sampler recovers only 1.2 % of structures, because its ~1.1 Å length error shifts every Bragg peak by ~15 %. Stronger, constrained supervision of the head does not reduce that error. The evidence therefore points to the global pooling that discards absolute peak positions, rather than to the denoiser alone [PENDING C2: one sentence with the controlled pooling-ablation outcome]. A perturbation study locates a sharp sensitivity knee at ~0.5 Å cell error. A true-lattice oracle lifts match to 4.5 % at n = 1000 (three seeds; 95 % Wilson confidence interval [3.8, 5.3]). As a classical control, a Q-space autoindexer that is supplied with the true crystal system replaces the learned lattice head and reaches 1.6 % [1.2, 2.1]. A three-seed paired McNemar test shows the gain over the learned head is significant (p &lt; 10⁻⁴; 27 fixed, none broken) and confined to the high-symmetry systems below the knee. A code audit prompted by review found and corrected three implementation errors, including an atomic form factor evaluated in the wrong convention. The corrected simulator agrees with pymatgen at a median Pearson correlation of 0.999 over 1000 structures, and the affected runs were repeated [PENDING C1: one clause stating whether the retrained headline numbers changed]. The contributions are the encoder-bottleneck diagnosis, a four-item failure catalogue, the shared evaluation harness and the audited, released code.</w:t>
+        <w:t xml:space="preserve">Inverting a one-dimensional powder X-ray diffraction (PXRD) pattern to a three-dimensional crystal structure remains an open problem. Recent generative approaches report results under mutually incompatible protocols, and their failure modes are seldom catalogued. This paper is a diagnostic study. PXRD-Diff, a 3.7 M-parameter conditional diffusion model trained on the CDVAE MP-20 split, is kept deliberately small so that its failure modes are visible; it is not proposed as a competitive inversion tool. DiffractGPT, PXRDnet and deCIFer are re-scored through the same pymatgen StructureMatcher harness and reach 18.9 %, 30.0 % and 73.8 % match respectively; PXRD-Diff reaches 1.9 %. The central finding is mechanistic. The learned PXRD encoder reaches a 0.007 normalised auxiliary lattice-regression loss in isolation, yet substituting that head’s own lattice into the sampler recovers only 1.2 % of structures, because its ~1.1 Å length error shifts every Bragg peak by ~15 %. Stronger, constrained supervision of the head does not reduce that error. A controlled ablation on the frozen encoder shows that restoring absolute peak positions to the head, by position-aware attention pooling or by explicit d-spacing features, leaves the error unchanged (1.28–1.31 Å across three arms, against 1.32 Å for the checkpoint’s own head), so the earlier reading that global pooling discards the d-spacings is withdrawn. The evidence now points to the regression formulation itself: a head handed the same d-spacings the autoindexer reads does not perform the peak-to-index assignment that turns them into a cell. A perturbation study locates a sharp sensitivity knee at ~0.5 Å cell error. A true-lattice oracle lifts match to 5.5 % at n = 1000 (three seeds; 95 % Wilson confidence interval [4.7, 6.4]), against 1.9 % [1.5, 2.5] for the learned head (paired McNemar p &lt; 10⁻¹⁷). As a classical control, a Q-space autoindexer that is supplied with the true crystal system replaces the learned lattice head and reaches 1.6 % [1.2, 2.1] (1.4 % without the crystal system); its cells are far closer to the truth (pattern Pearson 0.41 against 0.18), yet at three seeds it ties the learned head on match rate (42 fixed, 52 broken, p = 0.35), fixing hexagonal and tetragonal structures and losing cubic ones. A code audit prompted by review found and corrected three implementation errors, including an atomic form factor evaluated in the wrong convention and a Debye loss evaluated on the wrong tensor. The corrected simulator agrees with pymatgen at a median Pearson correlation of 0.999 over 1000 structures. Retraining the production checkpoint with the corrections raised the learned head from 0 to 1.9 % and removed the indexer’s aggregate lead reported in the submitted version; the oracle gap is the result that replicates. The contributions are the lattice-recovery bottleneck diagnosis, a four-item failure catalogue, the shared evaluation harness and the audited, released code.</w:t>
       </w:r>
     </w:p>
     <w:p>
@@ -215,7 +215,7 @@
         <w:t xml:space="preserve">PXRD-Diff</w:t>
       </w:r>
       <w:r>
-        <w:t xml:space="preserve">) and use it as a diagnostic instrument. Its size is a design choice: a 3.7 M-parameter model exposes an encoder bottleneck that capacity would hide. It is not proposed as an alternative to the larger systems it is compared with. Contributions:</w:t>
+        <w:t xml:space="preserve">) and use it as a diagnostic instrument. Its size is a design choice: a 3.7 M-parameter model exposes a lattice-recovery bottleneck that capacity would hide. It is not proposed as an alternative to the larger systems it is compared with. Contributions:</w:t>
       </w:r>
     </w:p>
     <w:p>
@@ -268,7 +268,7 @@
           <w:b/>
           <w:bCs/>
         </w:rPr>
-        <w:t xml:space="preserve">Encoder-bottleneck diagnosis (the primary contribution).</w:t>
+        <w:t xml:space="preserve">Lattice-recovery bottleneck diagnosis (the primary contribution).</w:t>
       </w:r>
       <w:r>
         <w:t xml:space="preserve"> </w:t>
@@ -284,13 +284,13 @@
           <w:b/>
           <w:bCs/>
         </w:rPr>
-        <w:t xml:space="preserve">4.5 %</w:t>
-      </w:r>
-      <w:r>
-        <w:t xml:space="preserve"> </w:t>
-      </w:r>
-      <w:r>
-        <w:t xml:space="preserve">at n = 1000 (three seeds; Wilson 95 % CI [3.8, 5.3]). The encoder reaches a 0.007</w:t>
+        <w:t xml:space="preserve">5.5 %</w:t>
+      </w:r>
+      <w:r>
+        <w:t xml:space="preserve"> </w:t>
+      </w:r>
+      <w:r>
+        <w:t xml:space="preserve">at n = 1000 (three seeds; Wilson 95 % CI [4.7, 6.4]) from 1.9 % [1.5, 2.5] for the learned head (paired McNemar p &lt; 10⁻¹⁷). The encoder reaches a 0.007</w:t>
       </w:r>
       <w:r>
         <w:t xml:space="preserve"> </w:t>
@@ -306,7 +306,7 @@
         <w:t xml:space="preserve"> </w:t>
       </w:r>
       <w:r>
-        <w:t xml:space="preserve">aux lattice loss in isolation, but substituting that head’s lattice into the sampler recovers only 1.2 % (§5.6). Its ~1.1 Å error sits well above the knee. The evidence points to the pooled encoding, not merely the denoiser, as the stage that fails to deliver absolute d-spacings; a controlled pooling ablation tests this directly (§5.6) [PENDING C2: one-line outcome of the pooling ablation]. The 4.5 % oracle ceiling shows coordinates remain a co-bottleneck.</w:t>
+        <w:t xml:space="preserve">aux lattice loss, yet its head’s lattice recovers only 1.2 % end to end, a ~1.1 Å error well above the knee (§5.6). A controlled pooling ablation (§5.6) finds that neither position-aware pooling nor explicit peak-position features reduce that error, so the evidence points to the regression formulation rather than to the pooled encoding. The 5.5 % oracle ceiling shows coordinates remain a co-bottleneck.</w:t>
       </w:r>
     </w:p>
     <w:p>
@@ -328,7 +328,7 @@
         <w:t xml:space="preserve"> </w:t>
       </w:r>
       <w:r>
-        <w:t xml:space="preserve">A Q-space autoindexer, supplied with the true crystal system, replaces the learned lattice head at sampling time and reaches 1.6 % [1.2, 2.1] where the learned head recovers nothing. A three-seed paired McNemar test confirms the difference (p &lt; 10⁻⁴; 27 fixed, 0 broken). The gain appears only where the indexer’s cell error falls below the 0.5 Å knee, i.e. in the high-symmetry systems (§5.2, §5.5). We treat this as a sanity check on the diagnosis, not as a method: a fifty-year-old algorithm given extra prior information is expected to beat the learned head. An indexer run without the crystal system is reported alongside (§3.5) [PENDING C3: one-line outcome of the unknown-system run].</w:t>
+        <w:t xml:space="preserve">A Q-space autoindexer, supplied with the true crystal system, replaces the learned lattice head at sampling time and reaches 1.6 % [1.2, 2.1]. With the submitted checkpoint the learned head recovered nothing and the indexer’s lead was significant (27 fixed, 0 broken); with the checkpoint retrained under the corrected loss the two tie at three seeds (42 fixed, 52 broken, p = 0.35), the indexer winning the hexagonal and tetragonal structures below the 0.5 Å knee and the learned head the cubic ones (§5.2). This is a sanity check on the diagnosis, not a method: a fifty-year-old algorithm given extra prior information is expected to match or beat the learned head. Without the crystal system the indexer indexes 43.4 % of cells against 48.8 % and recovers 1.4 % [1.0, 1.9] downstream (§3.5).</w:t>
       </w:r>
     </w:p>
     <w:p>
@@ -433,7 +433,7 @@
         <w:t xml:space="preserve"> </w:t>
       </w:r>
       <w:r>
-        <w:t xml:space="preserve">(deCIFer, n = 298). These numbers set the scale of the diagnostic model; they are not a claim of competitiveness. A candidate divergence between match rate and space-group recovery across two baselines is raised in §5.3 and §6 as a hypothesis that the n = 20 PXRDnet sample cannot establish. Crystalyze’s checkpoint download link is inactive; we cite but cannot reproduce.</w:t>
+        <w:t xml:space="preserve">(deCIFer, n = 298). These numbers set the scale of the diagnostic model; they are not a claim of competitiveness. A candidate divergence between match rate and space-group recovery across two baselines is raised in §5.3 and §6 as a hypothesis that the n = 20 PXRDnet sample cannot establish.</w:t>
       </w:r>
     </w:p>
     <w:p>
@@ -734,7 +734,7 @@
         <w:t xml:space="preserve"> </w:t>
       </w:r>
       <w:r>
-        <w:t xml:space="preserve">(2021) regress lattice parameters from simulated patterns with a convolutional network and analyse how impurities, noise and broadening degrade the prediction, a diagnostic aim close to ours. None of these is reproduced here. They are cited to place PXRD-Diff, a diagnostic instrument rather than a competing solver, within the range of current designs.</w:t>
+        <w:t xml:space="preserve">(2021) regress lattice parameters from simulated patterns with a convolutional network and analyse how impurities, noise and broadening degrade the prediction, a diagnostic aim close to ours. None is reproduced here; they place PXRD-Diff, a diagnostic instrument rather than a competing solver, within the range of current designs.</w:t>
       </w:r>
     </w:p>
     <w:p>
@@ -752,7 +752,7 @@
         <w:t xml:space="preserve"> </w:t>
       </w:r>
       <w:r>
-        <w:t xml:space="preserve">Recovering a unit cell from peak positions is a solved sub-problem with a fifty-year toolchain: the de-Wolff dichotomy method, ITO, TREOR and DICVOL (Boultif &amp; Louër, 2004) index high-symmetry powder patterns in CPU milliseconds, with the difficulty concentrated in low-symmetry (monoclinic and triclinic) cells. Indexing is only the first stage of classical structure solution. Once the cell and space group are fixed, direct-space search, simulated annealing and charge flipping complete the structure, as implemented in programs such as FOX (Favre-Nicolin &amp; Černý, 2002) and EXPO (Cuocci</w:t>
+        <w:t xml:space="preserve">Recovering a unit cell from peak positions is a solved sub-problem with a fifty-year toolchain: ITO, TREOR (Werner</w:t>
       </w:r>
       <w:r>
         <w:t xml:space="preserve"> </w:t>
@@ -765,7 +765,20 @@
         <w:t xml:space="preserve">et al.</w:t>
       </w:r>
       <w:r>
-        <w:t xml:space="preserve">, 2022). §3.5 reuses only the indexing stage, as a control for the learned lattice head. The indexer is given the true crystal system, which classical practice must itself infer. §5.2 and §5.5 show the resulting lift tracks the symmetry-dependent accuracy classical indexers have always had.</w:t>
+        <w:t xml:space="preserve">, 1985) and DICVOL (Boultif &amp; Louër, 2004), ranking solutions with the de Wolff (1968) figure of merit M20, index high-symmetry powder patterns in CPU milliseconds, with the difficulty concentrated in low-symmetry (monoclinic and triclinic) cells. Indexing is only the first stage of classical structure solution. Once the cell and space group are fixed, direct-space search, simulated annealing and charge flipping complete the structure, as implemented in programs such as FOX (Favre-Nicolin &amp; Černý, 2002) and EXPO (Cuocci</w:t>
+      </w:r>
+      <w:r>
+        <w:t xml:space="preserve"> </w:t>
+      </w:r>
+      <w:r>
+        <w:rPr>
+          <w:i/>
+          <w:iCs/>
+        </w:rPr>
+        <w:t xml:space="preserve">et al.</w:t>
+      </w:r>
+      <w:r>
+        <w:t xml:space="preserve">, 2022). §3.5 reuses only the indexing stage, as a control for the learned lattice head. The indexer is given the true crystal system, which classical practice must itself infer; §3.5 also reports the run without it. §5.2 and §5.5 show the resulting lift tracks the symmetry-dependent accuracy classical indexers have always had.</w:t>
       </w:r>
     </w:p>
     <w:p>
@@ -3286,7 +3299,7 @@
         </m:r>
       </m:oMath>
       <w:r>
-        <w:t xml:space="preserve">. Both referees who inspected the code identified the discrepancy. The module was corrected to the expression above and re-validated (below). The training runs that used the Debye loss were repeated with the corrected module [PENDING C1: state which runs were retrained and whether the numbers in Tables 1 and 2 changed, and by how much].</w:t>
+        <w:t xml:space="preserve">. Both referees who inspected the code identified the discrepancy. The module was corrected to the expression above and re-validated (below). The production checkpoint (v21) was retrained from scratch with the corrected module and the corrected x₀-mode loss of §3.4, under otherwise identical settings; the retrained checkpoint (v22) is the one behind Tables 2, 2a and 3 and Figs 4 and 5, and §5.2 and §5.7 give the effect. The exploratory Phase-4 rows of Table 1 were not retrained (§5.1).</w:t>
       </w:r>
     </w:p>
     <w:p>
@@ -3390,7 +3403,10 @@
         </m:r>
       </m:oMath>
       <w:r>
-        <w:t xml:space="preserve">), which is wider than the training configuration (</w:t>
+        <w:t xml:space="preserve">), wider than the</w:t>
+      </w:r>
+      <w:r>
+        <w:t xml:space="preserve"> </w:t>
       </w:r>
       <m:oMath>
         <m:r>
@@ -3404,7 +3420,10 @@
         </m:r>
       </m:oMath>
       <w:r>
-        <w:t xml:space="preserve">) used for the numbers above. Re-running that wider range reproduces the submitted value for the submitted expression (0.963 on the first 50 structures, 0.960 on all 1000) and gives 0.999 for the corrected expression at both sizes (Appendix C). The wider range also removes most of the lower tail, which is therefore a truncation effect of the</w:t>
+        <w:t xml:space="preserve"> </w:t>
+      </w:r>
+      <w:r>
+        <w:t xml:space="preserve">training grid used above; Appendix C reproduces that value for the submitted expression (0.963 on the first 50, 0.960 on all 1000), gives 0.999 for the corrected expression at both sizes, and shows that the lower tail is a truncation effect of the</w:t>
       </w:r>
       <w:r>
         <w:t xml:space="preserve"> </w:t>
@@ -3424,7 +3443,7 @@
         <w:t xml:space="preserve"> </w:t>
       </w:r>
       <w:r>
-        <w:t xml:space="preserve">training grid on small cells rather than a property of the form factor. Gradients through the structure factor with respect to fractional coordinates were verified non-zero.</w:t>
+        <w:t xml:space="preserve">grid on small cells rather than a property of the form factor. Gradients through the structure factor with respect to fractional coordinates were verified non-zero.</w:t>
       </w:r>
     </w:p>
     <w:bookmarkStart w:id="17" w:name="fig:validation"/>
@@ -4958,7 +4977,7 @@
         <w:t xml:space="preserve"> </w:t>
       </w:r>
       <w:r>
-        <w:t xml:space="preserve">alone. For every x₀-residual run (v13, v14, v15, v16 and the Phase 9 checkpoint v21) the Debye term therefore compared the pattern of the wrong tensor with the target. The ε-mode runs v10 and v11 were unaffected, as were the coordinate and lattice losses and every evaluation-time number. The code is fixed. The affected runs were retrained with the corrected loss and the corrected simulator [PENDING C1: retrained numbers for the x₀-residual runs].</w:t>
+        <w:t xml:space="preserve">alone. For every x₀-residual run (v13, v14, v15, v16 and the Phase 9 checkpoint v21) the Debye term therefore compared the pattern of the wrong tensor with the target. The ε-mode runs v10 and v11 were unaffected, as were the coordinate and lattice losses and every evaluation-time number. The code is fixed. The production checkpoint was retrained with the corrected loss and the corrected simulator (v22, §3.3); its final EMA loss fell from 0.726 to 0.602, with the effect on the results in §5.2. The Phase-4 rows v13–v16 were not retrained and remain labelled exploratory single-seed runs carrying this defect (§5.1).</w:t>
       </w:r>
     </w:p>
     <w:p>
@@ -5160,7 +5179,7 @@
         <w:t xml:space="preserve"> </w:t>
       </w:r>
       <w:r>
-        <w:t xml:space="preserve">path by which the model encodes absolute d-spacings: every Bragg reflection 2θ position is set by the lattice through Bragg’s law, so the lattice parameters are the absolute reference frame against which all peak positions in the input pattern must be interpreted. As §5.5 shows, the encoder + denoiser learns</w:t>
+        <w:t xml:space="preserve">path by which the model encodes absolute d-spacings: every Bragg reflection 2θ position is set by the lattice through Bragg’s law, so the lattice parameters are the absolute reference frame for every peak position in the input pattern. As §5.5 shows, the encoder + denoiser learns</w:t>
       </w:r>
       <w:r>
         <w:t xml:space="preserve"> </w:t>
@@ -5184,7 +5203,7 @@
         <w:pStyle w:val="BodyText"/>
       </w:pPr>
       <w:r>
-        <w:t xml:space="preserve">We implement a from-scratch Q-space autoindexer that takes (i) the same simulated PXRD pattern fed to the encoder and (ii) the true crystal system of the target structure, supplied as a Bravais code, and returns a candidate (a, b, c, α, β, γ). Item (ii) is prior information beyond the composition that the learned head receives. It makes the indexer an optimistic control rather than a fair competitor, and every indexer number in this paper should be read with that in mind (see also §7 and the unknown-system run below). Peak picking uses a 1D local-maximum filter with a relative-intensity floor; the candidate Q-vector is fit by least squares to the de-Wolff dichotomy parameter form for each Bravais lattice. At sampling time we run the indexer first, substitute its output for the lattice channel of the diffusion sampler, and run DDIM only on the coordinate channel.</w:t>
+        <w:t xml:space="preserve">We implement a from-scratch Q-space autoindexer that takes (i) the same simulated PXRD pattern fed to the encoder and (ii) the true crystal system of the target structure, supplied as a Bravais code, and returns a candidate (a, b, c, α, β, γ). Item (ii) is prior information beyond the composition that the learned head receives; it makes the indexer an optimistic control rather than a fair competitor (§7; the unknown-system run below removes it). Peak picking uses a 1D local-maximum filter with a relative-intensity floor; the candidate Q-vector is fit by least squares to the de-Wolff dichotomy parameter form for each Bravais lattice. At sampling time we run the indexer first, substitute its output for the lattice channel of the diffusion sampler, and run DDIM only on the coordinate channel.</w:t>
       </w:r>
     </w:p>
     <w:p>
@@ -5202,7 +5221,7 @@
         <w:t xml:space="preserve"> </w:t>
       </w:r>
       <w:r>
-        <w:t xml:space="preserve">Native indexer overall: 48.8 % strict cell match, 1.45 Å mean cell-length MAE. Per crystal system: hexagonal 77.9 % / 0.53 Å, orthorhombic 59.8 % / 0.96 Å, trigonal 43.3 % / 4.62 Å, monoclinic 18.9 % / 1.76 Å, triclinic 0 %. The low-symmetry blowup (monoclinic and triclinic each have ≥ 4 free cell parameters and the de-Wolff search becomes hypothesis-capped) is the dominant remaining error. We ship a GSAS-II (Toby &amp; Von Dreele, 2013) adapter (</w:t>
+        <w:t xml:space="preserve">Native indexer overall: 48.8 % strict cell match, 1.45 Å mean cell-length MAE. Per crystal system: hexagonal 77.9 % / 0.53 Å, orthorhombic 59.8 % / 0.96 Å, trigonal 43.3 % / 4.62 Å, monoclinic 18.9 % / 1.76 Å, triclinic 0 %. The low-symmetry blowup (monoclinic and triclinic each have ≥ 4 free cell parameters and the de-Wolff search becomes hypothesis-capped) is the dominant remaining error. A GSAS-II (Toby &amp; Von Dreele, 2013) adapter (</w:t>
       </w:r>
       <w:r>
         <w:rPr>
@@ -5211,7 +5230,7 @@
         <w:t xml:space="preserve">src/pxrd_diff/indexer_gsas.py</w:t>
       </w:r>
       <w:r>
-        <w:t xml:space="preserve">) for the low-symmetry path behind a</w:t>
+        <w:t xml:space="preserve">) for the low-symmetry path ships behind a</w:t>
       </w:r>
       <w:r>
         <w:t xml:space="preserve"> </w:t>
@@ -5226,7 +5245,7 @@
         <w:t xml:space="preserve"> </w:t>
       </w:r>
       <w:r>
-        <w:t xml:space="preserve">opt-in flag; in practice</w:t>
+        <w:t xml:space="preserve">opt-in flag; it hangs on real MP-20 monoclinic/triclinic patterns inside</w:t>
       </w:r>
       <w:r>
         <w:t xml:space="preserve"> </w:t>
@@ -5235,28 +5254,13 @@
         <w:rPr>
           <w:rStyle w:val="VerbatimChar"/>
         </w:rPr>
-        <w:t xml:space="preserve">DoIndexPeaks</w:t>
-      </w:r>
-      <w:r>
-        <w:t xml:space="preserve"> </w:t>
-      </w:r>
-      <w:r>
-        <w:t xml:space="preserve">hangs on real MP-20 monoclinic/triclinic patterns inside</w:t>
-      </w:r>
-      <w:r>
-        <w:t xml:space="preserve"> </w:t>
-      </w:r>
-      <w:r>
-        <w:rPr>
-          <w:rStyle w:val="VerbatimChar"/>
-        </w:rPr>
         <w:t xml:space="preserve">findBestCell</w:t>
       </w:r>
       <w:r>
         <w:t xml:space="preserve"> </w:t>
       </w:r>
       <w:r>
-        <w:t xml:space="preserve">and is documented experimental rather than headline.</w:t>
+        <w:t xml:space="preserve">and is experimental (§7).</w:t>
       </w:r>
     </w:p>
     <w:p>
@@ -5274,7 +5278,45 @@
         <w:t xml:space="preserve"> </w:t>
       </w:r>
       <w:r>
-        <w:t xml:space="preserve">At a referee’s request the indexer was also run with no crystal system supplied. Cubic, tetragonal, hexagonal/trigonal, orthorhombic and monoclinic cells are all searched, and the candidate with the highest de-Wolff M20 figure of merit is kept. [PENDING B2: per-system strict % and length MAE, and the fraction of patterns whose lattice type is recovered, on the same n = 1000.] [PENDING C3: downstream match rate at three seeds when these cells replace the learned head.]</w:t>
+        <w:t xml:space="preserve">At a referee’s request the indexer was also run with no crystal system supplied. Cubic, tetragonal, hexagonal/trigonal, orthorhombic and monoclinic cells are searched in that order, highest symmetry first, and a lattice type is accepted by the rule the classical programs use (de Wolff, 1968; Werner</w:t>
+      </w:r>
+      <w:r>
+        <w:t xml:space="preserve"> </w:t>
+      </w:r>
+      <w:r>
+        <w:rPr>
+          <w:i/>
+          <w:iCs/>
+        </w:rPr>
+        <w:t xml:space="preserve">et al.</w:t>
+      </w:r>
+      <w:r>
+        <w:t xml:space="preserve">, 1985; Boultif &amp; Louër, 2004): the first type whose best cell indexes every observed line with M20 ≥ 10 is kept; if none does, the highest-M20 cell among those indexing every line; the reported system is the metric symmetry of the returned cell. On the same n = 1 000 this reaches</w:t>
+      </w:r>
+      <w:r>
+        <w:t xml:space="preserve"> </w:t>
+      </w:r>
+      <w:r>
+        <w:rPr>
+          <w:b/>
+          <w:bCs/>
+        </w:rPr>
+        <w:t xml:space="preserve">43.4 %</w:t>
+      </w:r>
+      <w:r>
+        <w:t xml:space="preserve"> </w:t>
+      </w:r>
+      <w:r>
+        <w:t xml:space="preserve">strict cell match [40.4, 46.5] with a 1.67 Å mean cell-length MAE, against 48.8 % [45.7, 51.9] and 1.45 Å with the system given, and it recovers the lattice type itself for 65.4 % of the patterns (68.1 % of the 961 that both modes index). Per crystal system, strict success with the system given → unknown: cubic 52.9 → 49.2 %, hexagonal 77.9 → 65.4 %, trigonal 43.3 → 30.9 %, tetragonal 52.8 → 46.7 %, orthorhombic 59.8 → 53.6 %, monoclinic 18.9 → 19.6 %. Paired on the same structures, removing the system loses 65 cells and gains 9 (McNemar p &lt; 10⁻¹⁰): under ideal peak positions the crystal-system prior is worth about five percentage points to the indexer, not the difference between working and failing. A first implementation that simply kept the highest M20 across lattice types reached only 24.3 %, choosing the correct system for 40.7 % of patterns and cubic for 12 of the 238 cubic structures. M20 carries no penalty for free parameters, so on a pattern with a handful of exactly placed lines a four-parameter monoclinic sub-cell out-scores the true cubic cell (ScAlRh₂, mp-867922: M20 = 2 182 against 1 231, both indexing every line). That run is released beside the final one (</w:t>
+      </w:r>
+      <w:r>
+        <w:rPr>
+          <w:rStyle w:val="VerbatimChar"/>
+        </w:rPr>
+        <w:t xml:space="preserve">--unknown-rule maxm20</w:t>
+      </w:r>
+      <w:r>
+        <w:t xml:space="preserve">) because the comparison is itself informative: the choice of acceptance rule (24.3 → 43.4 %) matters more than the prior it replaces (43.4 → 48.8 %). Substituted into the sampler at three seeds, these cells recover 1.4 % [1.0, 1.9] (42 / 3 000) against 1.6 % [1.2, 2.1] with the system given: six structures lost and none gained on the same seeds (McNemar p = 0.03), with identical pattern Pearson (0.41), and no significant difference from the learned head’s 1.9 % (36 fixed, 52 broken, p = 0.11). Table 2 carries this as its third row.</w:t>
       </w:r>
     </w:p>
     <w:p>
@@ -5282,7 +5324,7 @@
         <w:pStyle w:val="BodyText"/>
       </w:pPr>
       <w:r>
-        <w:t xml:space="preserve">The indexer is a drop-in in the mechanical sense: training is unchanged, and the diffusion sampler is unchanged except for the lattice-channel substitution at t = T. Patterns for which the indexer returns no cell (39 of the 1000 test patterns) are scored as misses. The submitted version had given them the true lattice; §5.7 reports the correction and its effect. The headline metric (§5.2) reports both with and without the indexer for direct comparison.</w:t>
+        <w:t xml:space="preserve">The indexer is a drop-in in the mechanical sense: training is unchanged, and the diffusion sampler is unchanged except for the lattice-channel substitution at t = T. Patterns for which the indexer returns no cell (39 of the 1000 test patterns) are scored as misses; the submitted version had given them the true lattice (§5.7). §5.2 reports both with and without the indexer.</w:t>
       </w:r>
     </w:p>
     <w:bookmarkEnd w:id="20"/>
@@ -6131,7 +6173,7 @@
         <w:t xml:space="preserve"> </w:t>
       </w:r>
       <w:r>
-        <w:t xml:space="preserve">(the value stored in the released v21 checkpoint; the submitted text gave</w:t>
+        <w:t xml:space="preserve">(the value stored in the released v21 checkpoint; §5.7(d) on the submitted text’s</w:t>
       </w:r>
       <w:r>
         <w:t xml:space="preserve"> </w:t>
@@ -6166,7 +6208,7 @@
         </m:sSup>
       </m:oMath>
       <w:r>
-        <w:t xml:space="preserve">, see §5.7(d)), cosine decay to zero over 100 k steps, WD</w:t>
+        <w:t xml:space="preserve">), cosine decay to zero over 100 k steps, WD</w:t>
       </w:r>
       <w:r>
         <w:t xml:space="preserve"> </w:t>
@@ -6302,7 +6344,7 @@
         <w:pStyle w:val="FirstParagraph"/>
       </w:pPr>
       <w:r>
-        <w:t xml:space="preserve">Order: Phase 4 architectural ablation (§5.1) → Phase 9 indexer drop-in (§5.2) → reproduced baselines (§5.3) → failure catalogue (§5.4) → encoder-bottleneck perturbation study (§5.5).</w:t>
+        <w:t xml:space="preserve">Order: Phase 4 architectural ablation (§5.1) → Phase 9 indexer drop-in (§5.2) → reproduced baselines (§5.3) → failure catalogue (§5.4) → lattice-perturbation study (§5.5).</w:t>
       </w:r>
     </w:p>
     <w:bookmarkStart w:id="28" w:name="Xadaaeed9a4d3d9b8a4dfaf721f122e0603fe773"/>
@@ -6319,7 +6361,7 @@
         <w:pStyle w:val="FirstParagraph"/>
       </w:pPr>
       <w:r>
-        <w:t xml:space="preserve">Table 1: seven runs sweeping the Debye loss, the lattice-input fix, x₀-residual, and two extensions (Wyckoff, distance loss), all on n = 1 000 MP-20 test with true lattice substituted. Every row is a single training seed. The table is exploratory: it guided the design, and only the ε-vs-x₀-residual contrast was later replicated across seeds (§7). Runs v11 and v13–v16 were trained with the submitted version’s simulator, and v13–v16 with the x₀-mode Debye defect (§3.3, §3.4) [PENDING C1: retrained rows, or a statement of which rows were retrained].</w:t>
+        <w:t xml:space="preserve">Table 1: seven runs sweeping the Debye loss, the lattice-input fix, x₀-residual, and two extensions (Wyckoff, distance loss), all on n = 1 000 MP-20 test with true lattice substituted. Every row is a single training seed. The table is exploratory: it guided the design, and only the ε-vs-x₀-residual contrast was later replicated across seeds (§7). Runs v11 and v13–v16 were trained with the submitted version’s simulator, and v13–v16 with the x₀-mode Debye defect (§3.3, §3.4). These rows were not retrained: only the production checkpoint was (v22, §5.2), and Table 1 is retained as the exploratory, single-seed record it always was, with the defects it carries stated here rather than corrected.</w:t>
       </w:r>
     </w:p>
     <w:p>
@@ -7193,7 +7235,7 @@
         <w:t xml:space="preserve"> </w:t>
       </w:r>
       <w:r>
-        <w:t xml:space="preserve">at fixed Debye λ = 1 (v11 → v13) lifted single-seed match 0.9 % → 2.5 %, but a multi-seed checkpoint sweep (two seeds × five checkpoints, 20k–100k) found ε and x₀-residual indistinguishable on match rate (1.20 % vs 1.35 % pooled; x₀ never exceeds 1.5 % at any checkpoint, including the 80 k one matching the original’s 79.5 k, §7), so the 3.5× match lift was a single-seed fluctuation. The x₀-residual parameterisation does, however, reproducibly improve pattern-Pearson (0.36 → 0.40), which is the part of the Phase-4 signal that survives. Capacity is not the bottleneck: a 10.1 M-parameter run (</w:t>
+        <w:t xml:space="preserve">at fixed Debye λ = 1 (v11 → v13) lifted single-seed match 0.9 % → 2.5 %, but a multi-seed checkpoint sweep (two seeds × five checkpoints, 20k–100k) found ε and x₀-residual indistinguishable on match rate (§7), so the 3.5× match lift was a single-seed fluctuation. The x₀-residual parameterisation does reproducibly improve pattern-Pearson (0.36 → 0.40), the part of the Phase-4 signal that survives. Capacity is not the bottleneck: a 10.1 M-parameter run (</w:t>
       </w:r>
       <m:oMath>
         <m:r>
@@ -7242,7 +7284,7 @@
         <w:t xml:space="preserve">gpu_v12</w:t>
       </w:r>
       <w:r>
-        <w:t xml:space="preserve">) stayed at the same ~1.0 coord-loss plateau as v10. Under the full pipeline (sampled lattice), v13 drops to 1.2 % at n = 256; the Phase 9 v21 checkpoint reaches 4.5 % under oracle (three seeds; an earlier single-seed snapshot read 5.6 %) but only 1.0 % under full pipeline. §5.2 attacks that gap.</w:t>
+        <w:t xml:space="preserve">) stayed at the same ~1.0 coord-loss plateau as v10. Under the full pipeline (sampled lattice), v13 drops to 1.2 % at n = 256; the Phase 9 checkpoint reaches 5.5 % under oracle (v22, three seeds; the submitted v21 gave 4.5 %) but only 1.9 % under the full pipeline. §5.2 attacks that gap.</w:t>
       </w:r>
     </w:p>
     <w:bookmarkEnd w:id="28"/>
@@ -7260,7 +7302,7 @@
         <w:pStyle w:val="FirstParagraph"/>
       </w:pPr>
       <w:r>
-        <w:t xml:space="preserve">Table 2: three rows on the same n = 1 000 with the v21 checkpoint (Phase 9 retrain, Phase 4 fixes + retuned encoder); they differ only in which lattice the sampler conditions on. The indexer row is a control with extra prior information: the indexer is supplied with the true crystal system (§3.5).</w:t>
+        <w:t xml:space="preserve">Table 2 compares four lattice sources on the same n = 1 000 at three seeds with the v22 checkpoint (the v21 configuration retrained under the corrected simulator and x₀-mode Debye loss, §3.3, §3.4, §5.7); the rows differ only in the lattice the sampler conditions on. The indexer rows are controls with extra prior information (§3.5). The submitted version’s v21 numbers are retained in §5.7.</w:t>
       </w:r>
     </w:p>
     <w:p>
@@ -7278,7 +7320,7 @@
         <w:t xml:space="preserve"> </w:t>
       </w:r>
       <w:r>
-        <w:t xml:space="preserve">Phase 9 lattice-source comparison (n = 1 000 MP-20 test, v21 checkpoint, single-seed snapshot). The indexer receives the true crystal system. Match % with 95 % Wilson CI; the three-seed paired analysis follows below. [PENDING C1: replace with the retrained-v21 snapshot if the retrain changes these rows.]</w:t>
+        <w:t xml:space="preserve">Phase 9 lattice-source comparison (n = 1 000 MP-20 test × three seeds, 3 000 structure-seeds pooled, v22 checkpoint). The indexer receives the true crystal system; the 117 structure-seeds it cannot index are scored as misses. Match % with 95 % Wilson CI; the other columns are means over seeds.</w:t>
       </w:r>
     </w:p>
     <w:tbl>
@@ -7289,12 +7331,13 @@
         <w:tblLook w:firstRow="1" w:lastRow="0" w:firstColumn="0" w:lastColumn="0" w:noHBand="0" w:noVBand="0" w:val="0020"/>
       </w:tblPr>
       <w:tblGrid>
-        <w:gridCol w:w="3353"/>
-        <w:gridCol w:w="1355"/>
-        <w:gridCol w:w="1070"/>
-        <w:gridCol w:w="713"/>
-        <w:gridCol w:w="998"/>
-        <w:gridCol w:w="428"/>
+        <w:gridCol w:w="3101"/>
+        <w:gridCol w:w="1253"/>
+        <w:gridCol w:w="989"/>
+        <w:gridCol w:w="659"/>
+        <w:gridCol w:w="923"/>
+        <w:gridCol w:w="395"/>
+        <w:gridCol w:w="593"/>
       </w:tblGrid>
       <w:tr>
         <w:trPr>
@@ -7366,6 +7409,17 @@
             </w:r>
           </w:p>
         </w:tc>
+        <w:tc>
+          <w:tcPr/>
+          <w:p>
+            <w:pPr>
+              <w:pStyle w:val="Compact"/>
+            </w:pPr>
+            <w:r>
+              <w:t xml:space="preserve">Pearson</w:t>
+            </w:r>
+          </w:p>
+        </w:tc>
       </w:tr>
       <w:tr>
         <w:tc>
@@ -7386,7 +7440,7 @@
               <w:pStyle w:val="Compact"/>
             </w:pPr>
             <w:r>
-              <w:t xml:space="preserve">1.0 [0.5, 1.8]</w:t>
+              <w:t xml:space="preserve">1.9 [1.5, 2.5]</w:t>
             </w:r>
           </w:p>
         </w:tc>
@@ -7419,18 +7473,29 @@
               <w:pStyle w:val="Compact"/>
             </w:pPr>
             <w:r>
-              <w:t xml:space="preserve">n/a</w:t>
-            </w:r>
-          </w:p>
-        </w:tc>
-        <w:tc>
-          <w:tcPr/>
-          <w:p>
-            <w:pPr>
-              <w:pStyle w:val="Compact"/>
-            </w:pPr>
-            <w:r>
-              <w:t xml:space="preserve">11.7</w:t>
+              <w:t xml:space="preserve">0.232</w:t>
+            </w:r>
+          </w:p>
+        </w:tc>
+        <w:tc>
+          <w:tcPr/>
+          <w:p>
+            <w:pPr>
+              <w:pStyle w:val="Compact"/>
+            </w:pPr>
+            <w:r>
+              <w:t xml:space="preserve">17.0</w:t>
+            </w:r>
+          </w:p>
+        </w:tc>
+        <w:tc>
+          <w:tcPr/>
+          <w:p>
+            <w:pPr>
+              <w:pStyle w:val="Compact"/>
+            </w:pPr>
+            <w:r>
+              <w:t xml:space="preserve">0.18</w:t>
             </w:r>
           </w:p>
         </w:tc>
@@ -7462,7 +7527,7 @@
                 <w:b/>
                 <w:bCs/>
               </w:rPr>
-              <w:t xml:space="preserve">1.6 [1.0, 2.6]</w:t>
+              <w:t xml:space="preserve">1.6 [1.2, 2.1]</w:t>
             </w:r>
           </w:p>
         </w:tc>
@@ -7477,7 +7542,7 @@
                 <w:b/>
                 <w:bCs/>
               </w:rPr>
-              <w:t xml:space="preserve">0.1</w:t>
+              <w:t xml:space="preserve">0.2</w:t>
             </w:r>
           </w:p>
         </w:tc>
@@ -7492,7 +7557,7 @@
                 <w:b/>
                 <w:bCs/>
               </w:rPr>
-              <w:t xml:space="preserve">1.4</w:t>
+              <w:t xml:space="preserve">0.3</w:t>
             </w:r>
           </w:p>
         </w:tc>
@@ -7507,18 +7572,29 @@
                 <w:b/>
                 <w:bCs/>
               </w:rPr>
-              <w:t xml:space="preserve">0.125</w:t>
-            </w:r>
-          </w:p>
-        </w:tc>
-        <w:tc>
-          <w:tcPr/>
-          <w:p>
-            <w:pPr>
-              <w:pStyle w:val="Compact"/>
-            </w:pPr>
-            <w:r>
-              <w:t xml:space="preserve">11.5</w:t>
+              <w:t xml:space="preserve">0.035</w:t>
+            </w:r>
+          </w:p>
+        </w:tc>
+        <w:tc>
+          <w:tcPr/>
+          <w:p>
+            <w:pPr>
+              <w:pStyle w:val="Compact"/>
+            </w:pPr>
+            <w:r>
+              <w:t xml:space="preserve">11.4</w:t>
+            </w:r>
+          </w:p>
+        </w:tc>
+        <w:tc>
+          <w:tcPr/>
+          <w:p>
+            <w:pPr>
+              <w:pStyle w:val="Compact"/>
+            </w:pPr>
+            <w:r>
+              <w:t xml:space="preserve">0.41</w:t>
             </w:r>
           </w:p>
         </w:tc>
@@ -7531,6 +7607,85 @@
               <w:pStyle w:val="Compact"/>
             </w:pPr>
             <w:r>
+              <w:t xml:space="preserve">Classical Q-space autoindexer, crystal system unknown</w:t>
+            </w:r>
+          </w:p>
+        </w:tc>
+        <w:tc>
+          <w:tcPr/>
+          <w:p>
+            <w:pPr>
+              <w:pStyle w:val="Compact"/>
+            </w:pPr>
+            <w:r>
+              <w:t xml:space="preserve">1.4 [1.0, 1.9]</w:t>
+            </w:r>
+          </w:p>
+        </w:tc>
+        <w:tc>
+          <w:tcPr/>
+          <w:p>
+            <w:pPr>
+              <w:pStyle w:val="Compact"/>
+            </w:pPr>
+            <w:r>
+              <w:t xml:space="preserve">0.2</w:t>
+            </w:r>
+          </w:p>
+        </w:tc>
+        <w:tc>
+          <w:tcPr/>
+          <w:p>
+            <w:pPr>
+              <w:pStyle w:val="Compact"/>
+            </w:pPr>
+            <w:r>
+              <w:t xml:space="preserve">1.6</w:t>
+            </w:r>
+          </w:p>
+        </w:tc>
+        <w:tc>
+          <w:tcPr/>
+          <w:p>
+            <w:pPr>
+              <w:pStyle w:val="Compact"/>
+            </w:pPr>
+            <w:r>
+              <w:t xml:space="preserve">0.038</w:t>
+            </w:r>
+          </w:p>
+        </w:tc>
+        <w:tc>
+          <w:tcPr/>
+          <w:p>
+            <w:pPr>
+              <w:pStyle w:val="Compact"/>
+            </w:pPr>
+            <w:r>
+              <w:t xml:space="preserve">12.2</w:t>
+            </w:r>
+          </w:p>
+        </w:tc>
+        <w:tc>
+          <w:tcPr/>
+          <w:p>
+            <w:pPr>
+              <w:pStyle w:val="Compact"/>
+            </w:pPr>
+            <w:r>
+              <w:t xml:space="preserve">0.41</w:t>
+            </w:r>
+          </w:p>
+        </w:tc>
+      </w:tr>
+      <w:tr>
+        <w:tc>
+          <w:tcPr/>
+          <w:p>
+            <w:pPr>
+              <w:pStyle w:val="Compact"/>
+            </w:pPr>
+            <w:r>
               <w:t xml:space="preserve">Ground-truth lattice (oracle)</w:t>
             </w:r>
           </w:p>
@@ -7542,51 +7697,62 @@
               <w:pStyle w:val="Compact"/>
             </w:pPr>
             <w:r>
-              <w:t xml:space="preserve">5.6 [4.3, 7.2]</w:t>
-            </w:r>
-          </w:p>
-        </w:tc>
-        <w:tc>
-          <w:tcPr/>
-          <w:p>
-            <w:pPr>
-              <w:pStyle w:val="Compact"/>
-            </w:pPr>
-            <w:r>
-              <w:t xml:space="preserve">0.6</w:t>
-            </w:r>
-          </w:p>
-        </w:tc>
-        <w:tc>
-          <w:tcPr/>
-          <w:p>
-            <w:pPr>
-              <w:pStyle w:val="Compact"/>
-            </w:pPr>
-            <w:r>
-              <w:t xml:space="preserve">1.7</w:t>
-            </w:r>
-          </w:p>
-        </w:tc>
-        <w:tc>
-          <w:tcPr/>
-          <w:p>
-            <w:pPr>
-              <w:pStyle w:val="Compact"/>
-            </w:pPr>
-            <w:r>
-              <w:t xml:space="preserve">0.106</w:t>
-            </w:r>
-          </w:p>
-        </w:tc>
-        <w:tc>
-          <w:tcPr/>
-          <w:p>
-            <w:pPr>
-              <w:pStyle w:val="Compact"/>
-            </w:pPr>
-            <w:r>
-              <w:t xml:space="preserve">5.6</w:t>
+              <w:t xml:space="preserve">5.5 [4.7, 6.4]</w:t>
+            </w:r>
+          </w:p>
+        </w:tc>
+        <w:tc>
+          <w:tcPr/>
+          <w:p>
+            <w:pPr>
+              <w:pStyle w:val="Compact"/>
+            </w:pPr>
+            <w:r>
+              <w:t xml:space="preserve">0.8</w:t>
+            </w:r>
+          </w:p>
+        </w:tc>
+        <w:tc>
+          <w:tcPr/>
+          <w:p>
+            <w:pPr>
+              <w:pStyle w:val="Compact"/>
+            </w:pPr>
+            <w:r>
+              <w:t xml:space="preserve">2.2</w:t>
+            </w:r>
+          </w:p>
+        </w:tc>
+        <w:tc>
+          <w:tcPr/>
+          <w:p>
+            <w:pPr>
+              <w:pStyle w:val="Compact"/>
+            </w:pPr>
+            <w:r>
+              <w:t xml:space="preserve">0.044</w:t>
+            </w:r>
+          </w:p>
+        </w:tc>
+        <w:tc>
+          <w:tcPr/>
+          <w:p>
+            <w:pPr>
+              <w:pStyle w:val="Compact"/>
+            </w:pPr>
+            <w:r>
+              <w:t xml:space="preserve">5.1</w:t>
+            </w:r>
+          </w:p>
+        </w:tc>
+        <w:tc>
+          <w:tcPr/>
+          <w:p>
+            <w:pPr>
+              <w:pStyle w:val="Compact"/>
+            </w:pPr>
+            <w:r>
+              <w:t xml:space="preserve">0.71</w:t>
             </w:r>
           </w:p>
         </w:tc>
@@ -7601,45 +7767,13 @@
           <w:b/>
           <w:bCs/>
         </w:rPr>
-        <w:t xml:space="preserve">The lift is real: a three-seed paired test.</w:t>
-      </w:r>
-      <w:r>
-        <w:t xml:space="preserve"> </w:t>
-      </w:r>
-      <w:r>
-        <w:t xml:space="preserve">The single-seed snapshot alone does not establish a genuine improvement: its Wilson CIs overlap and an unpaired two-proportion test gives p = 0.24. To resolve it we reran</w:t>
-      </w:r>
-      <w:r>
-        <w:t xml:space="preserve"> </w:t>
-      </w:r>
-      <w:r>
-        <w:rPr>
-          <w:i/>
-          <w:iCs/>
-        </w:rPr>
-        <w:t xml:space="preserve">both</w:t>
-      </w:r>
-      <w:r>
-        <w:t xml:space="preserve"> </w:t>
-      </w:r>
-      <w:r>
-        <w:t xml:space="preserve">lattice sources at three seeds (n = 1 000 each), differing only in the lattice channel, and applied a paired McNemar test on the per-structure outcomes, the correct test, because the two arms see the same materials. The result is unambiguous. The two arms are scored on the same materials per seed, but the learned-head arm yields fewer</w:t>
-      </w:r>
-      <w:r>
-        <w:t xml:space="preserve"> </w:t>
-      </w:r>
-      <w:r>
-        <w:rPr>
-          <w:i/>
-          <w:iCs/>
-        </w:rPr>
-        <w:t xml:space="preserve">evaluable</w:t>
-      </w:r>
-      <w:r>
-        <w:t xml:space="preserve"> </w:t>
-      </w:r>
-      <w:r>
-        <w:t xml:space="preserve">cells: its diffusion-sampled lattices are frequently degenerate and hang</w:t>
+        <w:t xml:space="preserve">A three-seed paired test.</w:t>
+      </w:r>
+      <w:r>
+        <w:t xml:space="preserve"> </w:t>
+      </w:r>
+      <w:r>
+        <w:t xml:space="preserve">Because both arms see the same materials, a paired McNemar test on per-structure outcomes, not overlapping Wilson intervals, decides whether two lattice sources differ. Every source was run at three seeds (n = 1 000 each), differing only in the lattice channel; with v22 every arm scores all 3 000 structure-seeds (the submitted v21 checkpoint sampled degenerate cells that hung</w:t>
       </w:r>
       <w:r>
         <w:t xml:space="preserve"> </w:t>
@@ -7660,10 +7794,7 @@
         <w:t xml:space="preserve">spglib</w:t>
       </w:r>
       <w:r>
-        <w:t xml:space="preserve"> </w:t>
-      </w:r>
-      <w:r>
-        <w:t xml:space="preserve">(C calls that a Python signal cannot interrupt), so we run structure-domain scoring in a spawn worker hard-killed at 30 s and count overruns as misses. This leaves</w:t>
+        <w:t xml:space="preserve">, leaving 1 949 scorable learned-head rows). The indexer recovers</w:t>
       </w:r>
       <w:r>
         <w:t xml:space="preserve"> </w:t>
@@ -7673,13 +7804,13 @@
           <w:b/>
           <w:bCs/>
         </w:rPr>
-        <w:t xml:space="preserve">1 949</w:t>
-      </w:r>
-      <w:r>
-        <w:t xml:space="preserve"> </w:t>
-      </w:r>
-      <w:r>
-        <w:t xml:space="preserve">learned-head structures scored across the three seeds. The indexer arm scores 2 883 structure-seeds: 39 patterns per seed, 117 in total, could not be indexed and are counted as misses (the submitted version had given them the true lattice; none of them matched under it, §5.7). The paired test runs on the 1 949-structure intersection (every learned-head row has a matched indexer row); 86 of these are unindexed patterns, which enter as concordant misses and do not affect the discordant cells. On that paired set the indexer recovers</w:t>
+        <w:t xml:space="preserve">42</w:t>
+      </w:r>
+      <w:r>
+        <w:t xml:space="preserve"> </w:t>
+      </w:r>
+      <w:r>
+        <w:t xml:space="preserve">structures the learned head misses and the learned head recovers</w:t>
       </w:r>
       <w:r>
         <w:t xml:space="preserve"> </w:t>
@@ -7689,47 +7820,31 @@
           <w:b/>
           <w:bCs/>
         </w:rPr>
-        <w:t xml:space="preserve">27</w:t>
-      </w:r>
-      <w:r>
-        <w:t xml:space="preserve"> </w:t>
-      </w:r>
-      <w:r>
-        <w:t xml:space="preserve">structures the learned head misses and the learned head recovers</w:t>
-      </w:r>
-      <w:r>
-        <w:t xml:space="preserve"> </w:t>
-      </w:r>
+        <w:t xml:space="preserve">52</w:t>
+      </w:r>
+      <w:r>
+        <w:t xml:space="preserve"> </w:t>
+      </w:r>
+      <w:r>
+        <w:t xml:space="preserve">the indexer misses (Table 2a).</w:t>
+      </w:r>
+    </w:p>
+    <w:p>
+      <w:pPr>
+        <w:pStyle w:val="BodyText"/>
+      </w:pPr>
       <w:r>
         <w:rPr>
           <w:b/>
           <w:bCs/>
         </w:rPr>
-        <w:t xml:space="preserve">none</w:t>
-      </w:r>
-      <w:r>
-        <w:t xml:space="preserve"> </w:t>
-      </w:r>
-      <w:r>
-        <w:t xml:space="preserve">the indexer misses (the explicit 2×2 below).</w:t>
-      </w:r>
-    </w:p>
-    <w:p>
-      <w:pPr>
-        <w:pStyle w:val="BodyText"/>
-      </w:pPr>
-      <w:r>
-        <w:rPr>
-          <w:b/>
-          <w:bCs/>
-        </w:rPr>
         <w:t xml:space="preserve">Table 2a.</w:t>
       </w:r>
       <w:r>
         <w:t xml:space="preserve"> </w:t>
       </w:r>
       <w:r>
-        <w:t xml:space="preserve">Paired per-structure outcomes, learned head vs indexer drop-in (three seeds pooled; match =</w:t>
+        <w:t xml:space="preserve">Paired per-structure outcomes, learned head vs indexer control (v22, three seeds pooled; match =</w:t>
       </w:r>
       <w:r>
         <w:t xml:space="preserve"> </w:t>
@@ -7848,29 +7963,29 @@
               <w:pStyle w:val="Compact"/>
             </w:pPr>
             <w:r>
-              <w:t xml:space="preserve">0</w:t>
-            </w:r>
-          </w:p>
-        </w:tc>
-        <w:tc>
-          <w:tcPr/>
-          <w:p>
-            <w:pPr>
-              <w:pStyle w:val="Compact"/>
-            </w:pPr>
-            <w:r>
-              <w:t xml:space="preserve">0</w:t>
-            </w:r>
-          </w:p>
-        </w:tc>
-        <w:tc>
-          <w:tcPr/>
-          <w:p>
-            <w:pPr>
-              <w:pStyle w:val="Compact"/>
-            </w:pPr>
-            <w:r>
-              <w:t xml:space="preserve">0</w:t>
+              <w:t xml:space="preserve">6</w:t>
+            </w:r>
+          </w:p>
+        </w:tc>
+        <w:tc>
+          <w:tcPr/>
+          <w:p>
+            <w:pPr>
+              <w:pStyle w:val="Compact"/>
+            </w:pPr>
+            <w:r>
+              <w:t xml:space="preserve">52</w:t>
+            </w:r>
+          </w:p>
+        </w:tc>
+        <w:tc>
+          <w:tcPr/>
+          <w:p>
+            <w:pPr>
+              <w:pStyle w:val="Compact"/>
+            </w:pPr>
+            <w:r>
+              <w:t xml:space="preserve">58</w:t>
             </w:r>
           </w:p>
         </w:tc>
@@ -7898,29 +8013,29 @@
               <w:pStyle w:val="Compact"/>
             </w:pPr>
             <w:r>
-              <w:t xml:space="preserve">27</w:t>
-            </w:r>
-          </w:p>
-        </w:tc>
-        <w:tc>
-          <w:tcPr/>
-          <w:p>
-            <w:pPr>
-              <w:pStyle w:val="Compact"/>
-            </w:pPr>
-            <w:r>
-              <w:t xml:space="preserve">1 922</w:t>
-            </w:r>
-          </w:p>
-        </w:tc>
-        <w:tc>
-          <w:tcPr/>
-          <w:p>
-            <w:pPr>
-              <w:pStyle w:val="Compact"/>
-            </w:pPr>
-            <w:r>
-              <w:t xml:space="preserve">1 949</w:t>
+              <w:t xml:space="preserve">42</w:t>
+            </w:r>
+          </w:p>
+        </w:tc>
+        <w:tc>
+          <w:tcPr/>
+          <w:p>
+            <w:pPr>
+              <w:pStyle w:val="Compact"/>
+            </w:pPr>
+            <w:r>
+              <w:t xml:space="preserve">2 900</w:t>
+            </w:r>
+          </w:p>
+        </w:tc>
+        <w:tc>
+          <w:tcPr/>
+          <w:p>
+            <w:pPr>
+              <w:pStyle w:val="Compact"/>
+            </w:pPr>
+            <w:r>
+              <w:t xml:space="preserve">2 942</w:t>
             </w:r>
           </w:p>
         </w:tc>
@@ -7948,29 +8063,29 @@
               <w:pStyle w:val="Compact"/>
             </w:pPr>
             <w:r>
-              <w:t xml:space="preserve">27</w:t>
-            </w:r>
-          </w:p>
-        </w:tc>
-        <w:tc>
-          <w:tcPr/>
-          <w:p>
-            <w:pPr>
-              <w:pStyle w:val="Compact"/>
-            </w:pPr>
-            <w:r>
-              <w:t xml:space="preserve">1 922</w:t>
-            </w:r>
-          </w:p>
-        </w:tc>
-        <w:tc>
-          <w:tcPr/>
-          <w:p>
-            <w:pPr>
-              <w:pStyle w:val="Compact"/>
-            </w:pPr>
-            <w:r>
-              <w:t xml:space="preserve">1 949</w:t>
+              <w:t xml:space="preserve">48</w:t>
+            </w:r>
+          </w:p>
+        </w:tc>
+        <w:tc>
+          <w:tcPr/>
+          <w:p>
+            <w:pPr>
+              <w:pStyle w:val="Compact"/>
+            </w:pPr>
+            <w:r>
+              <w:t xml:space="preserve">2 952</w:t>
+            </w:r>
+          </w:p>
+        </w:tc>
+        <w:tc>
+          <w:tcPr/>
+          <w:p>
+            <w:pPr>
+              <w:pStyle w:val="Compact"/>
+            </w:pPr>
+            <w:r>
+              <w:t xml:space="preserve">3 000</w:t>
             </w:r>
           </w:p>
         </w:tc>
@@ -7997,7 +8112,7 @@
         <w:t xml:space="preserve"> </w:t>
       </w:r>
       <w:r>
-        <w:t xml:space="preserve">= 27 (indexer fixes),</w:t>
+        <w:t xml:space="preserve">= 42 (indexer fixes),</w:t>
       </w:r>
       <w:r>
         <w:t xml:space="preserve"> </w:t>
@@ -8013,7 +8128,7 @@
         <w:t xml:space="preserve"> </w:t>
       </w:r>
       <w:r>
-        <w:t xml:space="preserve">= 0 (indexer breaks); an exact two-sided McNemar test gives</w:t>
+        <w:t xml:space="preserve">= 52 (indexer breaks); a two-sided McNemar test gives</w:t>
       </w:r>
       <w:r>
         <w:t xml:space="preserve"> </w:t>
@@ -8023,10 +8138,18 @@
           <w:b/>
           <w:bCs/>
         </w:rPr>
-        <w:t xml:space="preserve">p = 1.5 × 10⁻⁸</w:t>
-      </w:r>
-      <w:r>
-        <w:t xml:space="preserve">. (Marginal match counts differ: indexer 46 / 2 883, learned 0 / 1 949, because 19 further indexer matches fall on structures the learned arm could not score; these do not enter the paired test.) The single-seed 1.0 % learned-head figure in Table 2 is within run-to-run noise of zero; across three fresh seeds the learned lattice head matched nothing. The gain does</w:t>
+        <w:t xml:space="preserve">p = 0.35</w:t>
+      </w:r>
+      <w:r>
+        <w:t xml:space="preserve">: the two lattice sources tie on match rate. The submitted version reported the opposite: with v21 the learned head matched 0 of 1 949 scored structure-seeds against the indexer’s 46 of 2 883, 27 fixed and none broken (p = 1.5 × 10⁻⁸). That lead was a property of the defective checkpoint (§3.4): paired on the same seeds, the retrain gains 32 learned-head structures and loses none (p = 4.7 × 10⁻¹⁰), while the indexer arm moves by 12 gained and 10 lost (p = 0.83). The claim that the control improves on the learned head is withdrawn as a general statement. What survives is the per-system pattern: the indexer still fixes hexagonal (16 fixed, 0 broken) and tetragonal (7, 2) structures, the systems where its cell error sits below the 0.5 Å knee (§5.5), but the corrected learned head wins the cubic cases (18 fixed, 47 broken; learned 52 / 714, indexer 23 / 714, oracle 96 / 714). The indexer’s cells remain far closer to the truth where the match rates tie (pattern Pearson 0.41 against 0.18; RMSD median 0.035 against 0.232 Å), so in the cubic cases the match rate saturates on coordinate decoding rather than on the cell. On the stricter all-correct metric the indexer fixes 6 and breaks 0 (p = 0.03).</w:t>
+      </w:r>
+    </w:p>
+    <w:p>
+      <w:pPr>
+        <w:pStyle w:val="BodyText"/>
+      </w:pPr>
+      <w:r>
+        <w:t xml:space="preserve">What neither lattice source does is close the gap to the oracle:</w:t>
       </w:r>
       <w:r>
         <w:t xml:space="preserve"> </w:t>
@@ -8036,114 +8159,13 @@
           <w:b/>
           <w:bCs/>
         </w:rPr>
-        <w:t xml:space="preserve">not</w:t>
-      </w:r>
-      <w:r>
-        <w:t xml:space="preserve"> </w:t>
-      </w:r>
-      <w:r>
-        <w:t xml:space="preserve">carry to the stricter all-correct metric: there the discordant cells are</w:t>
-      </w:r>
-      <w:r>
-        <w:t xml:space="preserve"> </w:t>
-      </w:r>
-      <w:r>
-        <w:rPr>
-          <w:i/>
-          <w:iCs/>
-        </w:rPr>
-        <w:t xml:space="preserve">b</w:t>
-      </w:r>
-      <w:r>
-        <w:t xml:space="preserve"> </w:t>
-      </w:r>
-      <w:r>
-        <w:t xml:space="preserve">= 4,</w:t>
-      </w:r>
-      <w:r>
-        <w:t xml:space="preserve"> </w:t>
-      </w:r>
-      <w:r>
-        <w:rPr>
-          <w:i/>
-          <w:iCs/>
-        </w:rPr>
-        <w:t xml:space="preserve">c</w:t>
-      </w:r>
-      <w:r>
-        <w:t xml:space="preserve"> </w:t>
-      </w:r>
-      <w:r>
-        <w:t xml:space="preserve">= 0 (exact McNemar</w:t>
-      </w:r>
-      <w:r>
-        <w:t xml:space="preserve"> </w:t>
-      </w:r>
-      <w:r>
-        <w:rPr>
-          <w:b/>
-          <w:bCs/>
-        </w:rPr>
-        <w:t xml:space="preserve">p = 0.13</w:t>
-      </w:r>
-      <w:r>
-        <w:t xml:space="preserve">): the indexer fixes the cell but not the space group. So the control reproducibly improves match rate over the learned lattice head. This is the expected outcome for a classical algorithm handed the crystal system, and we read it as a sanity check on the diagnosis rather than as a result about PXRD inversion. The</w:t>
-      </w:r>
-      <w:r>
-        <w:t xml:space="preserve"> </w:t>
-      </w:r>
-      <w:r>
-        <w:rPr>
-          <w:i/>
-          <w:iCs/>
-        </w:rPr>
-        <w:t xml:space="preserve">mechanism</w:t>
-      </w:r>
-      <w:r>
-        <w:t xml:space="preserve"> </w:t>
-      </w:r>
-      <w:r>
-        <w:t xml:space="preserve">(§5.5, §5.6) is that its gains come entirely from high-symmetry systems where the indexer’s cell error falls below the 0.5 Å sensitivity knee, with low-symmetry contributing nothing.</w:t>
-      </w:r>
-    </w:p>
-    <w:p>
-      <w:pPr>
-        <w:pStyle w:val="BodyText"/>
-      </w:pPr>
-      <w:r>
-        <w:t xml:space="preserve">What the indexer does</w:t>
-      </w:r>
-      <w:r>
-        <w:t xml:space="preserve"> </w:t>
-      </w:r>
-      <w:r>
-        <w:rPr>
-          <w:i/>
-          <w:iCs/>
-        </w:rPr>
-        <w:t xml:space="preserve">not</w:t>
-      </w:r>
-      <w:r>
-        <w:t xml:space="preserve"> </w:t>
-      </w:r>
-      <w:r>
-        <w:t xml:space="preserve">do is close the gap to the oracle. We re-ran the oracle at three seeds, firming the single-seed 5.6 % to</w:t>
-      </w:r>
-      <w:r>
-        <w:t xml:space="preserve"> </w:t>
-      </w:r>
-      <w:r>
-        <w:rPr>
-          <w:b/>
-          <w:bCs/>
-        </w:rPr>
-        <w:t xml:space="preserve">4.5 % [3.8, 5.3]</w:t>
-      </w:r>
-      <w:r>
-        <w:t xml:space="preserve"> </w:t>
-      </w:r>
-      <w:r>
-        <w:t xml:space="preserve">(135 / 3 000 pooled), still disjoint from the indexer’s 1.6 % [1.2, 2.1]. The indexer → oracle gap (1.6 → 4.5 %) is itself significant (disjoint CIs) and isolates the lattice-attributable error: even with a perfect lattice, match caps at 4.5 %, so coordinate prediction is the dominant limiter while lattice error explains the 1.6 → 4.5 % shortfall. The indexer’s per-system MAE (1.45 Å overall, dominated by mono 1.76 Å and triclinic NaN) sits above the 0.5 Å knee; closing the rest requires fixing the low-symmetry path (GSAS-II remains experimental).</w:t>
+        <w:t xml:space="preserve">5.5 % [4.7, 6.4]</w:t>
+      </w:r>
+      <w:r>
+        <w:t xml:space="preserve"> </w:t>
+      </w:r>
+      <w:r>
+        <w:t xml:space="preserve">at three seeds (165 / 3 000; 4.5 % [3.8, 5.3] with the submitted checkpoint, unpaired p = 0.08). Paired against the learned head it fixes 134 structures and breaks 27 (p = 3 × 10⁻¹⁸), and against the indexer the interval is disjoint. This is the effect that replicates across checkpoints and seeds: even with a perfect lattice, match caps at 5.5 %, so coordinate prediction is the dominant limiter while lattice error explains the 1.9 → 5.5 % shortfall. The indexer’s per-system MAE (1.45 Å overall, dominated by mono 1.76 Å and triclinic NaN) sits above the 0.5 Å knee; closing the rest requires fixing the low-symmetry path (GSAS-II remains experimental).</w:t>
       </w:r>
     </w:p>
     <w:bookmarkStart w:id="32" w:name="fig:indexer"/>
@@ -8156,7 +8178,7 @@
           <wp:inline>
             <wp:extent cx="5334000" cy="2423900"/>
             <wp:effectExtent b="0" l="0" r="0" t="0"/>
-            <wp:docPr descr="Figure 3. Per-system indexer performance. Strict and consistent indexing rates (a) and length MAE (b) on n = 1 000. High-symmetry systems (hex, ortho) sit below the 0.5 Å knee; trig and mono blow up; triclinic is unindexable in this implementation. The overall 1.45 Å MAE hides two regimes, and explains why the indexer’s significant match-rate gain (§5.2) is concentrated entirely in the high-symmetry systems." title="" id="30" name="Picture"/>
+            <wp:docPr descr="Figure 3. Per-system indexer performance. (a) Strict indexing rate with the crystal system given (blue) and with the system unknown (orange; acceptance rule of §3.5), and the consistent rate with the system given (light blue), on n = 1 000; dashed line, overall strict rate given / unknown. (b) Length MAE with the system given. High-symmetry systems (hex, ortho) sit below the 0.5 Å knee; trig and mono blow up; triclinic is unindexable in this implementation. Removing the crystal system costs a few points in every system except monoclinic and never changes the regime. The overall 1.45 Å MAE hides two regimes, and explains why the indexer’s paired gains over the learned head (§5.2) are confined to the hexagonal and tetragonal systems." title="" id="30" name="Picture"/>
             <a:graphic>
               <a:graphicData uri="http://schemas.openxmlformats.org/drawingml/2006/picture">
                 <pic:pic>
@@ -8209,7 +8231,7 @@
         <w:t xml:space="preserve"> </w:t>
       </w:r>
       <w:r>
-        <w:t xml:space="preserve">Strict and consistent indexing rates (a) and length MAE (b) on n = 1 000. High-symmetry systems (hex, ortho) sit below the 0.5 Å knee; trig and mono blow up; triclinic is unindexable in this implementation. The overall 1.45 Å MAE hides two regimes, and explains why the indexer’s significant match-rate gain (§5.2) is concentrated entirely in the high-symmetry systems.</w:t>
+        <w:t xml:space="preserve">(a) Strict indexing rate with the crystal system given (blue) and with the system unknown (orange; acceptance rule of §3.5), and the consistent rate with the system given (light blue), on n = 1 000; dashed line, overall strict rate given / unknown. (b) Length MAE with the system given. High-symmetry systems (hex, ortho) sit below the 0.5 Å knee; trig and mono blow up; triclinic is unindexable in this implementation. Removing the crystal system costs a few points in every system except monoclinic and never changes the regime. The overall 1.45 Å MAE hides two regimes, and explains why the indexer’s paired gains over the learned head (§5.2) are confined to the hexagonal and tetragonal systems.</w:t>
       </w:r>
     </w:p>
     <w:bookmarkEnd w:id="32"/>
@@ -8289,7 +8311,7 @@
         <w:t xml:space="preserve"> </w:t>
       </w:r>
       <w:r>
-        <w:t xml:space="preserve">Reproduced head-to-head on MP-20 test (StructureMatcher ltol 0.2, stol 0.3, angle_tol 5°). The PXRD-Diff row uses the classical indexer, which is supplied with the true crystal system; the external models receive the pattern and composition only. The rows set the scale of the diagnostic model and are not a competitiveness claim.</w:t>
+        <w:t xml:space="preserve">Reproduced head-to-head on MP-20 test (StructureMatcher ltol 0.2, stol 0.3, angle_tol 5°). The first PXRD-Diff row is the learned head, which receives the pattern and composition only, the same information as the external models; the second is the classical-indexer control, which is additionally supplied with the true crystal system. Both are the v22 checkpoint at three seeds (§5.2). The rows set the scale of the diagnostic model and are not a competitiveness claim.</w:t>
       </w:r>
     </w:p>
     <w:tbl>
@@ -8386,40 +8408,40 @@
               <w:pStyle w:val="Compact"/>
             </w:pPr>
             <w:r>
-              <w:t xml:space="preserve">PXRD-Diff (v21 + indexer control, crystal system given)</w:t>
-            </w:r>
-          </w:p>
-        </w:tc>
-        <w:tc>
-          <w:tcPr/>
-          <w:p>
-            <w:pPr>
-              <w:pStyle w:val="Compact"/>
-            </w:pPr>
-            <w:r>
-              <w:t xml:space="preserve">1 000</w:t>
-            </w:r>
-          </w:p>
-        </w:tc>
-        <w:tc>
-          <w:tcPr/>
-          <w:p>
-            <w:pPr>
-              <w:pStyle w:val="Compact"/>
-            </w:pPr>
-            <w:r>
-              <w:t xml:space="preserve">1.6 [1.0, 2.6]</w:t>
-            </w:r>
-          </w:p>
-        </w:tc>
-        <w:tc>
-          <w:tcPr/>
-          <w:p>
-            <w:pPr>
-              <w:pStyle w:val="Compact"/>
-            </w:pPr>
-            <w:r>
-              <w:t xml:space="preserve">0.1 [0.0, 0.6]</w:t>
+              <w:t xml:space="preserve">PXRD-Diff (v22, learned head; three seeds pooled)</w:t>
+            </w:r>
+          </w:p>
+        </w:tc>
+        <w:tc>
+          <w:tcPr/>
+          <w:p>
+            <w:pPr>
+              <w:pStyle w:val="Compact"/>
+            </w:pPr>
+            <w:r>
+              <w:t xml:space="preserve">3 000</w:t>
+            </w:r>
+          </w:p>
+        </w:tc>
+        <w:tc>
+          <w:tcPr/>
+          <w:p>
+            <w:pPr>
+              <w:pStyle w:val="Compact"/>
+            </w:pPr>
+            <w:r>
+              <w:t xml:space="preserve">1.9 [1.5, 2.5]</w:t>
+            </w:r>
+          </w:p>
+        </w:tc>
+        <w:tc>
+          <w:tcPr/>
+          <w:p>
+            <w:pPr>
+              <w:pStyle w:val="Compact"/>
+            </w:pPr>
+            <w:r>
+              <w:t xml:space="preserve">0.0 [0.0, 0.1]</w:t>
             </w:r>
           </w:p>
         </w:tc>
@@ -8441,7 +8463,75 @@
               <w:pStyle w:val="Compact"/>
             </w:pPr>
             <w:r>
-              <w:t xml:space="preserve">0.125</w:t>
+              <w:t xml:space="preserve">0.232</w:t>
+            </w:r>
+          </w:p>
+        </w:tc>
+      </w:tr>
+      <w:tr>
+        <w:tc>
+          <w:tcPr/>
+          <w:p>
+            <w:pPr>
+              <w:pStyle w:val="Compact"/>
+            </w:pPr>
+            <w:r>
+              <w:t xml:space="preserve">PXRD-Diff + indexer control, crystal system given (v22; three seeds pooled)</w:t>
+            </w:r>
+          </w:p>
+        </w:tc>
+        <w:tc>
+          <w:tcPr/>
+          <w:p>
+            <w:pPr>
+              <w:pStyle w:val="Compact"/>
+            </w:pPr>
+            <w:r>
+              <w:t xml:space="preserve">3 000</w:t>
+            </w:r>
+          </w:p>
+        </w:tc>
+        <w:tc>
+          <w:tcPr/>
+          <w:p>
+            <w:pPr>
+              <w:pStyle w:val="Compact"/>
+            </w:pPr>
+            <w:r>
+              <w:t xml:space="preserve">1.6 [1.2, 2.1]</w:t>
+            </w:r>
+          </w:p>
+        </w:tc>
+        <w:tc>
+          <w:tcPr/>
+          <w:p>
+            <w:pPr>
+              <w:pStyle w:val="Compact"/>
+            </w:pPr>
+            <w:r>
+              <w:t xml:space="preserve">0.2 [0.1, 0.4]</w:t>
+            </w:r>
+          </w:p>
+        </w:tc>
+        <w:tc>
+          <w:tcPr/>
+          <w:p>
+            <w:pPr>
+              <w:pStyle w:val="Compact"/>
+            </w:pPr>
+            <w:r>
+              <w:t xml:space="preserve">0.3</w:t>
+            </w:r>
+          </w:p>
+        </w:tc>
+        <w:tc>
+          <w:tcPr/>
+          <w:p>
+            <w:pPr>
+              <w:pStyle w:val="Compact"/>
+            </w:pPr>
+            <w:r>
+              <w:t xml:space="preserve">0.035</w:t>
             </w:r>
           </w:p>
         </w:tc>
@@ -8692,7 +8782,7 @@
         <w:t xml:space="preserve"> </w:t>
       </w:r>
       <w:r>
-        <w:t xml:space="preserve">ranks deCIFer ≫ PXRDnet &gt; DGpt &gt; PXRD-Diff. deCIFer, a concurrent autoregressive CIF-token model conditioned on XRD + composition, is the strongest external reference at 73.8 % match / 69.5 % all-correct (n = 300). Its all-correct nearly equals its match: when it recovers structure it almost always recovers the space group too, the same CIF-token signature seen in DGpt. PXRDnet’s lead over DGpt is consistent with its 35 k-op latent optimisation, whereas DGpt is one forward pass. PXRD-Diff, at 1.6 %, sits an order of magnitude below all three, as expected for a 3.7 M-parameter diagnostic model. A more interesting pattern is that the</w:t>
+        <w:t xml:space="preserve">ranks deCIFer ≫ PXRDnet &gt; DGpt &gt; PXRD-Diff. deCIFer, a concurrent autoregressive CIF-token model conditioned on XRD + composition, is the strongest external reference at 73.8 % match / 69.5 % all-correct (n = 300); its all-correct nearly equals its match, the same CIF-token signature seen in DGpt. PXRDnet’s lead over DGpt is consistent with its 35 k-op latent optimisation, whereas DGpt is one forward pass. PXRD-Diff, at 1.9 %, sits an order of magnitude below all three, as expected for a 3.7 M-parameter diagnostic model. The</w:t>
       </w:r>
       <w:r>
         <w:t xml:space="preserve"> </w:t>
@@ -8708,7 +8798,7 @@
         <w:t xml:space="preserve"> </w:t>
       </w:r>
       <w:r>
-        <w:t xml:space="preserve">ordering need not follow match rate: DGpt’s all-correct (15.9 % [13.8, 18.3]) exceeds its space-group-loose match by little, while PXRDnet’s drops from 30 % match to 5 % all-correct, i.e. PXRDnet matches structure under loose tolerances but rarely recovers the space group, whereas DGpt’s CIF-token output appears to encode symmetry.</w:t>
+        <w:t xml:space="preserve">ordering need not follow match rate: DGpt’s all-correct (15.9 % [13.8, 18.3]) sits close to its match, while PXRDnet’s drops from 30 % match to 5 % all-correct, i.e. PXRDnet matches structure under loose tolerances but rarely recovers the space group, whereas DGpt’s CIF-token output appears to encode symmetry.</w:t>
       </w:r>
       <w:r>
         <w:t xml:space="preserve"> </w:t>
@@ -8724,47 +8814,7 @@
         <w:t xml:space="preserve"> </w:t>
       </w:r>
       <w:r>
-        <w:t xml:space="preserve">At n = 20 the PXRDnet all-correct estimate (1/20) carries a 95 % CI of [0.9, 23.6], which overlaps DGpt’s [13.8, 18.3]; the apparent</w:t>
-      </w:r>
-      <w:r>
-        <w:t xml:space="preserve"> </w:t>
-      </w:r>
-      <w:r>
-        <w:t xml:space="preserve">“reversal”</w:t>
-      </w:r>
-      <w:r>
-        <w:t xml:space="preserve"> </w:t>
-      </w:r>
-      <w:r>
-        <w:t xml:space="preserve">is</w:t>
-      </w:r>
-      <w:r>
-        <w:t xml:space="preserve"> </w:t>
-      </w:r>
-      <w:r>
-        <w:rPr>
-          <w:i/>
-          <w:iCs/>
-        </w:rPr>
-        <w:t xml:space="preserve">not</w:t>
-      </w:r>
-      <w:r>
-        <w:t xml:space="preserve"> </w:t>
-      </w:r>
-      <w:r>
-        <w:t xml:space="preserve">statistically established and would require n ≈ 100–200 to confirm. If it holds, the implication is consequential: published single-number</w:t>
-      </w:r>
-      <w:r>
-        <w:t xml:space="preserve"> </w:t>
-      </w:r>
-      <w:r>
-        <w:t xml:space="preserve">“match rates”</w:t>
-      </w:r>
-      <w:r>
-        <w:t xml:space="preserve"> </w:t>
-      </w:r>
-      <w:r>
-        <w:t xml:space="preserve">would conflate structure recovery with symmetry recovery, which is precisely why we surface it despite the underpowered sample, and why §6 frames it as motivation for future measurement rather than a claim.</w:t>
+        <w:t xml:space="preserve">At n = 20 the PXRDnet all-correct estimate (1/20) carries a 95 % CI of [0.9, 23.6], which overlaps DGpt’s [13.8, 18.3]; confirming the reversal would require n ≈ 100–200. §6 says why it would matter.</w:t>
       </w:r>
       <w:r>
         <w:t xml:space="preserve"> </w:t>
@@ -8798,7 +8848,7 @@
         <w:t xml:space="preserve"> </w:t>
       </w:r>
       <w:r>
-        <w:t xml:space="preserve">All four systems are given the composition (§3.1). The PXRD-Diff row additionally gives its indexer the true crystal system (§3.5), so on prior information PXRD-Diff is favoured, not handicapped. On the pattern itself the asymmetry runs the other way. DiffractGPT is conditioned on a</w:t>
+        <w:t xml:space="preserve">All four systems are given the composition (§3.1). The learned-head row of PXRD-Diff receives nothing else; the indexer-control row additionally gives its indexer the true crystal system (§3.5), so on prior information that row is favoured. On the pattern itself the asymmetry runs the other way: DiffractGPT is conditioned on a</w:t>
       </w:r>
       <w:r>
         <w:t xml:space="preserve"> </w:t>
@@ -8826,7 +8876,7 @@
         <w:t xml:space="preserve">;</w:t>
       </w:r>
       <w:r>
-        <w:t xml:space="preserve">-separated string), an order of magnitude lower resolution than PXRD-Diff’s 4 251-bin 0.02° input, yet it still reaches 18.9 %. So the external models do not win by seeing more of the pattern. The differences that matter are</w:t>
+        <w:t xml:space="preserve">-separated string), an order of magnitude lower resolution than PXRD-Diff’s 4 251-bin 0.02° input, yet it still reaches 18.9 %, so the external models do not win by seeing more of the pattern. The differences that matter are</w:t>
       </w:r>
       <w:r>
         <w:t xml:space="preserve"> </w:t>
@@ -8858,7 +8908,7 @@
         <w:t xml:space="preserve"> </w:t>
       </w:r>
       <w:r>
-        <w:t xml:space="preserve">(PXRDnet’s ~35 k-op latent optimisation vs our single DDIM pass). Table 3 therefore shows the expected gap between a deliberately small diagnostic model and production-scale systems (§6). It is reported to set the scale, not to rank PXRD-Diff among them.</w:t>
+        <w:t xml:space="preserve">(PXRDnet’s ~35 k-op latent optimisation vs our single DDIM pass). Table 3 shows the expected gap between a deliberately small diagnostic model and production-scale systems; it sets the scale and does not rank PXRD-Diff among them (§6).</w:t>
       </w:r>
     </w:p>
     <w:bookmarkStart w:id="37" w:name="fig:threeway"/>
@@ -8871,7 +8921,7 @@
           <wp:inline>
             <wp:extent cx="5334000" cy="2210966"/>
             <wp:effectExtent b="0" l="0" r="0" t="0"/>
-            <wp:docPr descr="Figure 4. Three-way headline comparison. Match rate, all-correct, and pattern-Pearson on the same MP-20 test materials scored through our StructureMatcher harness, with 95 % Wilson CIs. PXRD-Diff, a diagnostic model whose indexer is supplied with the crystal system, sits an order of magnitude below the external systems on match rate and above them on per-pattern Pearson. Note the wide PXRDnet (n = 20) intervals: the DGpt &gt; PXRDnet all-correct ordering is a hypothesis, not an established result (§5.3, §6)." title="" id="35" name="Picture"/>
+            <wp:docPr descr="Figure 4. Three-way headline comparison. Match rate, all-correct, and pattern-Pearson on the same MP-20 test materials scored through our StructureMatcher harness, with 95 % Wilson CIs. PXRD-Diff is the corrected v22 checkpoint with its learned lattice head, no prior beyond composition, three seeds pooled (n = 3 × 1 000); its indexer control reaches 1.6 % and its true-lattice oracle 5.5 % (§5.2). It sits an order of magnitude below the external systems on match rate and above them on per-pattern Pearson (0.18 against 0.02 and 0.16). Note the wide PXRDnet (n = 20) intervals: the DGpt &gt; PXRDnet all-correct ordering is a hypothesis, not an established result (§5.3, §6)." title="" id="35" name="Picture"/>
             <a:graphic>
               <a:graphicData uri="http://schemas.openxmlformats.org/drawingml/2006/picture">
                 <pic:pic>
@@ -8949,7 +8999,7 @@
         <w:t xml:space="preserve"> </w:t>
       </w:r>
       <w:r>
-        <w:t xml:space="preserve">harness, with 95 % Wilson CIs. PXRD-Diff, a diagnostic model whose indexer is supplied with the crystal system, sits an order of magnitude below the external systems on match rate and above them on per-pattern Pearson. Note the wide PXRDnet (n = 20) intervals: the DGpt &gt; PXRDnet all-correct ordering is a hypothesis, not an established result (§5.3, §6).</w:t>
+        <w:t xml:space="preserve">harness, with 95 % Wilson CIs. PXRD-Diff is the corrected v22 checkpoint with its learned lattice head, no prior beyond composition, three seeds pooled (n = 3 × 1 000); its indexer control reaches 1.6 % and its true-lattice oracle 5.5 % (§5.2). It sits an order of magnitude below the external systems on match rate and above them on per-pattern Pearson (0.18 against 0.02 and 0.16). Note the wide PXRDnet (n = 20) intervals: the DGpt &gt; PXRDnet all-correct ordering is a hypothesis, not an established result (§5.3, §6).</w:t>
       </w:r>
     </w:p>
     <w:bookmarkEnd w:id="37"/>
@@ -8968,7 +9018,7 @@
         <w:t xml:space="preserve"> </w:t>
       </w:r>
       <w:r>
-        <w:t xml:space="preserve">PXRDnet n = 20 has a 95 % Wilson CI of roughly ±20 pp on every rate; n = 200 would need ~33 days of RTX 5090 rental at ~4 GPU-hr/material. Patterns are simulated through each model’s own preprocessing (different bins, 2θ vs Q, broadening): material_ids are identical, pattern inputs are not bit-identical; §7 bounds this.</w:t>
+        <w:t xml:space="preserve">PXRDnet’s n = 20 intervals (roughly ±20 pp) and the preprocessing differences between the three pipelines (identical material_ids, pattern inputs not bit-identical) are bounded in §7.</w:t>
       </w:r>
     </w:p>
     <w:bookmarkEnd w:id="38"/>
@@ -9245,7 +9295,7 @@
         <w:t xml:space="preserve">et al.</w:t>
       </w:r>
       <w:r>
-        <w:t xml:space="preserve">, 2023). The embedding therefore carried a label, not a constraint. Atomic coordinates were still generated freely, and nothing in the loss or the sampler enforced the fixed or symmetry-related coordinates that a Wyckoff position implies. The embedding learns (5 404 of 6 912 entries non-zero), but match drops from 2.5 % to 2.1 % and lattice prediction destabilises (lattice loss ~0.6 vs ~0.02; Figure 5). We suspect the inflated atom-feature norm shifts the lattice-pool input distribution. The negative result is narrow. It shows that a space-group-agnostic label token does not help and may hurt training dynamics. It says nothing about whether symmetry information imposed as a constraint, on the coordinates or on the space group, would help; that experiment was not run.</w:t>
+        <w:t xml:space="preserve">, 2023), so the embedding carried a label, not a constraint, and nothing in the loss or the sampler enforced the fixed or symmetry-related coordinates a Wyckoff position implies. The embedding learns (5 404 of 6 912 entries non-zero), but match drops from 2.5 % to 2.1 % and lattice prediction destabilises (lattice loss ~0.6 vs ~0.02; Figure 5), presumably because the inflated atom-feature norm shifts the lattice-pool input distribution. The negative result is narrow: a space-group-agnostic label token does not help and may hurt training dynamics; whether symmetry imposed as a constraint, on the coordinates or on the space group, would help was not tested.</w:t>
       </w:r>
     </w:p>
     <w:bookmarkStart w:id="42" w:name="fig:training"/>
@@ -9388,13 +9438,13 @@
       </w:r>
     </w:p>
     <w:bookmarkEnd w:id="43"/>
-    <w:bookmarkStart w:id="44" w:name="encoder-bottleneck-perturbation-study"/>
+    <w:bookmarkStart w:id="44" w:name="lattice-perturbation-study"/>
     <w:p>
       <w:pPr>
         <w:pStyle w:val="Heading2"/>
       </w:pPr>
       <w:r>
-        <w:t xml:space="preserve">5.5 Encoder-bottleneck perturbation study</w:t>
+        <w:t xml:space="preserve">5.5 Lattice-perturbation study</w:t>
       </w:r>
     </w:p>
     <w:p>
@@ -9467,7 +9517,7 @@
         <w:t xml:space="preserve"> </w:t>
       </w:r>
       <w:r>
-        <w:t xml:space="preserve">survive conversion to absolute scale: when the aux head’s own lattice is substituted into the sampler it recovers only 1.2 % (§5.6), because its 1.1 Å length MAE shifts every Bragg reflection by ~15 %. So the global encoding carries crystal-system and relative-spacing structure but not absolute d-spacings at the &lt;0.5 Å precision the knee demands; the evidence points to the pooled encoding, not merely the denoiser’s use of it.</w:t>
+        <w:t xml:space="preserve">survive conversion to absolute scale: when the aux head’s own lattice is substituted into the sampler it recovers only 1.2 % (§5.6), because its 1.1 Å length MAE shifts every Bragg reflection by ~15 %. So the lattice head delivers crystal-system and relative-spacing structure but not absolute d-spacings at the &lt;0.5 Å precision the knee demands; §5.6 shows that giving the head the peak positions does not repair this.</w:t>
       </w:r>
     </w:p>
     <w:p>
@@ -9475,7 +9525,7 @@
         <w:pStyle w:val="BodyText"/>
       </w:pPr>
       <w:r>
-        <w:t xml:space="preserve">Perturbing the sampler-supplied lattice by Å of cell-length error, v21 at n = 200: match decays 5.6 % (Δ=0) → 2.0 % (0.5 Å) → 0.5 % (1.0 Å) → 0 % (≥1.5 Å), steeper than linear with a knee at ~0.5 Å. This matches the indexer’s per-system MAE: high-symmetry systems (hex, ortho; MAE ≤ 1.0 Å) lift; low-symmetry (mono, tri; MAE ≥ 1.5 Å) do not. §5.2’s indexer lift is</w:t>
+        <w:t xml:space="preserve">Perturbing the sampler-supplied lattice by Å of cell-length error, v21 at n = 200: match decays 5.6 % (Δ=0) → 2.0 % (0.5 Å) → 0.5 % (1.0 Å) → 0 % (≥1.5 Å), steeper than linear with a knee at ~0.5 Å. This matches the indexer’s per-system MAE: high-symmetry systems (hex, ortho; MAE ≤ 1.0 Å) lift; low-symmetry (mono, tri; MAE ≥ 1.5 Å) do not. §5.2’s per-system indexer gains are</w:t>
       </w:r>
       <w:r>
         <w:t xml:space="preserve"> </w:t>
@@ -9488,17 +9538,17 @@
         <w:t xml:space="preserve">predictable</w:t>
       </w:r>
       <w:r>
-        <w:t xml:space="preserve">: it works where it can.</w:t>
+        <w:t xml:space="preserve">: they occur where the cell error is below the knee.</w:t>
       </w:r>
     </w:p>
     <w:bookmarkEnd w:id="44"/>
-    <w:bookmarkStart w:id="45" w:name="Xe14ee5fe759b907ea0190421ae7272432ef5613"/>
+    <w:bookmarkStart w:id="45" w:name="X57009b34a40e3731f8839f16dc9a7e37dbb44bd"/>
     <w:p>
       <w:pPr>
         <w:pStyle w:val="Heading2"/>
       </w:pPr>
       <w:r>
-        <w:t xml:space="preserve">5.6 Why the learned lattice fails: a pooling bottleneck, not a head bottleneck</w:t>
+        <w:t xml:space="preserve">5.6 Why the learned lattice fails: neither the head nor the pooling repairs the scale</w:t>
       </w:r>
     </w:p>
     <w:p>
@@ -9685,7 +9735,24 @@
         <w:t xml:space="preserve"> </w:t>
       </w:r>
       <w:r>
-        <w:t xml:space="preserve">Bounding the head (softplus lengths, sigmoid-scaled angles), raising the aux weight 0.5 → 5.0, and warm-starting 30 k further steps leaves the MAE essentially unchanged (a ≈ 1.11 Å, α ≈ 14°). The error behaves like a property of the</w:t>
+        <w:t xml:space="preserve">Bounding the head (softplus lengths, sigmoid-scaled angles), raising the aux weight 0.5 → 5.0, and warm-starting 30 k further steps leaves the MAE essentially unchanged (a ≈ 1.11 Å, α ≈ 14°). No head reading</w:t>
+      </w:r>
+      <w:r>
+        <w:t xml:space="preserve"> </w:t>
+      </w:r>
+      <m:oMath>
+        <m:r>
+          <m:rPr>
+            <m:sty m:val="bi"/>
+          </m:rPr>
+          <m:t>g</m:t>
+        </m:r>
+      </m:oMath>
+      <w:r>
+        <w:t xml:space="preserve"> </w:t>
+      </w:r>
+      <w:r>
+        <w:t xml:space="preserve">recovers the absolute scale. The submitted version read this as a property of the</w:t>
       </w:r>
       <w:r>
         <w:t xml:space="preserve"> </w:t>
@@ -9698,10 +9765,7 @@
         <w:t xml:space="preserve">pooled global encoding</w:t>
       </w:r>
       <w:r>
-        <w:t xml:space="preserve"> </w:t>
-      </w:r>
-      <w:r>
-        <w:t xml:space="preserve">rather than of the head: the</w:t>
+        <w:t xml:space="preserve">, on the grounds that the</w:t>
       </w:r>
       <w:r>
         <w:t xml:space="preserve"> </w:t>
@@ -9716,24 +9780,7 @@
         <w:t xml:space="preserve"> </w:t>
       </w:r>
       <w:r>
-        <w:t xml:space="preserve">collapse that §3.2 already identified for coordinates would discard the peak-position fidelity Bragg’s-law decoding needs to fix absolute lengths, and no head reading</w:t>
-      </w:r>
-      <w:r>
-        <w:t xml:space="preserve"> </w:t>
-      </w:r>
-      <m:oMath>
-        <m:r>
-          <m:rPr>
-            <m:sty m:val="bi"/>
-          </m:rPr>
-          <m:t>g</m:t>
-        </m:r>
-      </m:oMath>
-      <w:r>
-        <w:t xml:space="preserve"> </w:t>
-      </w:r>
-      <w:r>
-        <w:t xml:space="preserve">recovers it. The controlled ablation below is designed to test that reading directly.</w:t>
+        <w:t xml:space="preserve">collapse §3.2 identified for coordinates would also discard the peak-position fidelity Bragg’s-law decoding needs; the controlled ablation below tests that reading and does not support it.</w:t>
       </w:r>
     </w:p>
     <w:p>
@@ -9769,7 +9816,7 @@
         <w:t xml:space="preserve">phase5b6_results/</w:t>
       </w:r>
       <w:r>
-        <w:t xml:space="preserve">) but not the absolute scale. The classical autoindexer succeeds exactly where the encoder fails because it reads peak</w:t>
+        <w:t xml:space="preserve">) but not the absolute scale. The autoindexer succeeds where every learned head fails because it assigns Miller indices to peak</w:t>
       </w:r>
       <w:r>
         <w:t xml:space="preserve"> </w:t>
@@ -9785,7 +9832,7 @@
         <w:t xml:space="preserve"> </w:t>
       </w:r>
       <w:r>
-        <w:t xml:space="preserve">directly rather than a pooled summary; this is why §5.2’s lift lives entirely in the high-symmetry systems where peak positions over-determine the cell, and why head-side fixes (Phase 5 here, top-K rerank in §5.4) cannot substitute for it. If the pooling ablation below confirms this reading, the architectural implication is concrete: the next gain must come from the encoder (explicit d-spacing/peak extraction or per-peak attention in place of global pooling), not from a better lattice head or a better denoiser.</w:t>
+        <w:t xml:space="preserve">by explicit search rather than regressing six numbers from a summary, which is why its paired gains in §5.2 lie in the high-symmetry systems where peak positions over-determine the cell, and why head-side fixes (Phase 5 here, top-K rerank in §5.4) cannot substitute for it. The ablation below asks whether it is the summary, rather than the regression, that fails.</w:t>
       </w:r>
     </w:p>
     <w:p>
@@ -9803,7 +9850,7 @@
         <w:t xml:space="preserve"> </w:t>
       </w:r>
       <w:r>
-        <w:t xml:space="preserve">The two experiments above vary the head and its supervision while holding the encoder fixed. They show that no head reading</w:t>
+        <w:t xml:space="preserve">The two experiments above vary the head and its supervision with the encoder fixed; they do not by themselves isolate global average pooling as the cause, since the encoder, the information content of its representation, the head parameterisation and optimisation difficulty remain confounded, as one referee noted. To separate them, a controlled ablation holds the encoder, the denoiser, the training objective and the schedule fixed and changes only how the auxiliary head reads the encoder: (i) the global average pool</w:t>
       </w:r>
       <w:r>
         <w:t xml:space="preserve"> </w:t>
@@ -9820,7 +9867,7 @@
         <w:t xml:space="preserve"> </w:t>
       </w:r>
       <w:r>
-        <w:t xml:space="preserve">recovers the absolute scale. They do not by themselves isolate global average pooling as the cause: the encoder architecture, the information content of the learned representation, the head parameterisation and optimisation difficulty remain confounded, as one referee noted. To separate them, a controlled ablation holds the encoder, the denoiser, the training objective and the schedule fixed and changes only how the auxiliary head reads the encoder: (i) the global average pool</w:t>
+        <w:t xml:space="preserve">of the submitted version; (ii) a position-aware pooling that retains the 2θ coordinate of each feature; (iii) explicit peak-position features extracted from the input pattern and concatenated to</w:t>
       </w:r>
       <w:r>
         <w:t xml:space="preserve"> </w:t>
@@ -9834,24 +9881,1046 @@
         </m:r>
       </m:oMath>
       <w:r>
-        <w:t xml:space="preserve"> </w:t>
-      </w:r>
-      <w:r>
-        <w:t xml:space="preserve">of the submitted version; (ii) a position-aware pooling that retains the 2θ coordinate of each feature; (iii) explicit peak-position features extracted from the input pattern and concatenated to</w:t>
-      </w:r>
-      <w:r>
-        <w:t xml:space="preserve"> </w:t>
-      </w:r>
-      <m:oMath>
-        <m:r>
-          <m:rPr>
-            <m:sty m:val="bi"/>
-          </m:rPr>
-          <m:t>g</m:t>
-        </m:r>
-      </m:oMath>
-      <w:r>
-        <w:t xml:space="preserve">. If absolute d-spacings are lost at the pooling stage, variants (ii) and (iii) should reduce the ~1.1 Å length error while (i) does not. [PENDING C2: length and angle MAE of the aux head, and end-to-end match, for the three variants at matched training budget; state whether the ordering is (ii), (iii) below (i).] Until that result is in hand, the pooling explanation rests on the two head-side experiments and should be read as the best-supported hypothesis, not as a demonstrated cause.</w:t>
+        <w:t xml:space="preserve">. If absolute d-spacings are lost at the pooling stage, variants (ii) and (iii) should reduce the ~1.1 Å length error while (i) does not. Table 4 gives the result on both encoders.</w:t>
+      </w:r>
+    </w:p>
+    <w:p>
+      <w:pPr>
+        <w:pStyle w:val="BodyText"/>
+      </w:pPr>
+      <w:r>
+        <w:rPr>
+          <w:b/>
+          <w:bCs/>
+        </w:rPr>
+        <w:t xml:space="preserve">Table 4.</w:t>
+      </w:r>
+      <w:r>
+        <w:t xml:space="preserve"> </w:t>
+      </w:r>
+      <w:r>
+        <w:t xml:space="preserve">Controlled pooling ablation (n = 1 000 MP-20 test). Three heads trained under an identical loss, AdamW 10⁻³, batch 64, sigmoid-bounded outputs, on a frozen encoder: the submitted v21 encoder at three epochs and the retrained v22 encoder (§5.2) at ten. Length and angle MAE are means over (a, b, c) and (α, β, γ);</w:t>
+      </w:r>
+      <w:r>
+        <w:t xml:space="preserve"> </w:t>
+      </w:r>
+      <w:r>
+        <w:t xml:space="preserve">“&lt; 0.5 Å”</w:t>
+      </w:r>
+      <w:r>
+        <w:t xml:space="preserve"> </w:t>
+      </w:r>
+      <w:r>
+        <w:t xml:space="preserve">is the fraction of structures whose mean length error lies below the knee of §5.5; the last column substitutes the head’s cells into the sampler at three seeds (n = 3 000 structure-seeds; the full pipeline reaches 1.9 % and the indexer 1.6 %, Table 2). The checkpoint rows are the head trained jointly for 100 k steps, without retraining.</w:t>
+      </w:r>
+    </w:p>
+    <w:tbl>
+      <w:tblPr>
+        <w:tblStyle w:val="Table"/>
+        <w:tblW w:type="pct" w:w="5000"/>
+        <w:tblLayout w:type="fixed"/>
+        <w:tblLook w:firstRow="1" w:lastRow="0" w:firstColumn="0" w:lastColumn="0" w:noHBand="0" w:noVBand="0" w:val="0020"/>
+      </w:tblPr>
+      <w:tblGrid>
+        <w:gridCol w:w="990"/>
+        <w:gridCol w:w="990"/>
+        <w:gridCol w:w="990"/>
+        <w:gridCol w:w="990"/>
+        <w:gridCol w:w="990"/>
+        <w:gridCol w:w="990"/>
+        <w:gridCol w:w="990"/>
+        <w:gridCol w:w="990"/>
+      </w:tblGrid>
+      <w:tr>
+        <w:trPr>
+          <w:tblHeader w:val="on"/>
+        </w:trPr>
+        <w:tc>
+          <w:tcPr/>
+          <w:p>
+            <w:pPr>
+              <w:pStyle w:val="Compact"/>
+            </w:pPr>
+            <w:r>
+              <w:t xml:space="preserve">Head</w:t>
+            </w:r>
+          </w:p>
+        </w:tc>
+        <w:tc>
+          <w:tcPr/>
+          <w:p>
+            <w:pPr>
+              <w:pStyle w:val="Compact"/>
+            </w:pPr>
+            <w:r>
+              <w:t xml:space="preserve">Params</w:t>
+            </w:r>
+          </w:p>
+        </w:tc>
+        <w:tc>
+          <w:tcPr/>
+          <w:p>
+            <w:pPr>
+              <w:pStyle w:val="Compact"/>
+            </w:pPr>
+            <w:r>
+              <w:t xml:space="preserve">Encoder, epochs</w:t>
+            </w:r>
+          </w:p>
+        </w:tc>
+        <w:tc>
+          <w:tcPr/>
+          <w:p>
+            <w:pPr>
+              <w:pStyle w:val="Compact"/>
+            </w:pPr>
+            <w:r>
+              <w:t xml:space="preserve">Length MAE / Å</w:t>
+            </w:r>
+          </w:p>
+        </w:tc>
+        <w:tc>
+          <w:tcPr/>
+          <w:p>
+            <w:pPr>
+              <w:pStyle w:val="Compact"/>
+            </w:pPr>
+            <w:r>
+              <w:t xml:space="preserve">Angle MAE / °</w:t>
+            </w:r>
+          </w:p>
+        </w:tc>
+        <w:tc>
+          <w:tcPr/>
+          <w:p>
+            <w:pPr>
+              <w:pStyle w:val="Compact"/>
+            </w:pPr>
+            <w:r>
+              <w:t xml:space="preserve">Median length error / Å</w:t>
+            </w:r>
+          </w:p>
+        </w:tc>
+        <w:tc>
+          <w:tcPr/>
+          <w:p>
+            <w:pPr>
+              <w:pStyle w:val="Compact"/>
+            </w:pPr>
+            <w:r>
+              <w:t xml:space="preserve">&lt; 0.5 Å</w:t>
+            </w:r>
+          </w:p>
+        </w:tc>
+        <w:tc>
+          <w:tcPr/>
+          <w:p>
+            <w:pPr>
+              <w:pStyle w:val="Compact"/>
+            </w:pPr>
+            <w:r>
+              <w:t xml:space="preserve">End-to-end match % [95 % CI]</w:t>
+            </w:r>
+          </w:p>
+        </w:tc>
+      </w:tr>
+      <w:tr>
+        <w:tc>
+          <w:tcPr/>
+          <w:p>
+            <w:pPr>
+              <w:pStyle w:val="Compact"/>
+            </w:pPr>
+            <w:r>
+              <w:t xml:space="preserve">Checkpoint aux head</w:t>
+            </w:r>
+          </w:p>
+        </w:tc>
+        <w:tc>
+          <w:tcPr/>
+          <w:p>
+            <w:pPr>
+              <w:pStyle w:val="Compact"/>
+            </w:pPr>
+            <w:r>
+              <w:t xml:space="preserve">–</w:t>
+            </w:r>
+          </w:p>
+        </w:tc>
+        <w:tc>
+          <w:tcPr/>
+          <w:p>
+            <w:pPr>
+              <w:pStyle w:val="Compact"/>
+            </w:pPr>
+            <w:r>
+              <w:t xml:space="preserve">v21, –</w:t>
+            </w:r>
+          </w:p>
+        </w:tc>
+        <w:tc>
+          <w:tcPr/>
+          <w:p>
+            <w:pPr>
+              <w:pStyle w:val="Compact"/>
+            </w:pPr>
+            <w:r>
+              <w:t xml:space="preserve">1.32</w:t>
+            </w:r>
+          </w:p>
+        </w:tc>
+        <w:tc>
+          <w:tcPr/>
+          <w:p>
+            <w:pPr>
+              <w:pStyle w:val="Compact"/>
+            </w:pPr>
+            <w:r>
+              <w:t xml:space="preserve">15.6</w:t>
+            </w:r>
+          </w:p>
+        </w:tc>
+        <w:tc>
+          <w:tcPr/>
+          <w:p>
+            <w:pPr>
+              <w:pStyle w:val="Compact"/>
+            </w:pPr>
+            <w:r>
+              <w:t xml:space="preserve">0.90</w:t>
+            </w:r>
+          </w:p>
+        </w:tc>
+        <w:tc>
+          <w:tcPr/>
+          <w:p>
+            <w:pPr>
+              <w:pStyle w:val="Compact"/>
+            </w:pPr>
+            <w:r>
+              <w:t xml:space="preserve">0.33</w:t>
+            </w:r>
+          </w:p>
+        </w:tc>
+        <w:tc>
+          <w:tcPr/>
+          <w:p>
+            <w:pPr>
+              <w:pStyle w:val="Compact"/>
+            </w:pPr>
+            <w:r>
+              <w:t xml:space="preserve">–</w:t>
+            </w:r>
+          </w:p>
+        </w:tc>
+      </w:tr>
+      <w:tr>
+        <w:tc>
+          <w:tcPr/>
+          <w:p>
+            <w:pPr>
+              <w:pStyle w:val="Compact"/>
+            </w:pPr>
+            <w:r>
+              <w:t xml:space="preserve">(i) global average pool</w:t>
+            </w:r>
+            <w:r>
+              <w:t xml:space="preserve"> </w:t>
+            </w:r>
+            <m:oMath>
+              <m:r>
+                <m:rPr>
+                  <m:sty m:val="bi"/>
+                </m:rPr>
+                <m:t>g</m:t>
+              </m:r>
+            </m:oMath>
+          </w:p>
+        </w:tc>
+        <w:tc>
+          <w:tcPr/>
+          <w:p>
+            <w:pPr>
+              <w:pStyle w:val="Compact"/>
+            </w:pPr>
+            <w:r>
+              <w:t xml:space="preserve">67 k</w:t>
+            </w:r>
+          </w:p>
+        </w:tc>
+        <w:tc>
+          <w:tcPr/>
+          <w:p>
+            <w:pPr>
+              <w:pStyle w:val="Compact"/>
+            </w:pPr>
+            <w:r>
+              <w:t xml:space="preserve">v21, 3</w:t>
+            </w:r>
+          </w:p>
+        </w:tc>
+        <w:tc>
+          <w:tcPr/>
+          <w:p>
+            <w:pPr>
+              <w:pStyle w:val="Compact"/>
+            </w:pPr>
+            <w:r>
+              <w:t xml:space="preserve">1.29</w:t>
+            </w:r>
+          </w:p>
+        </w:tc>
+        <w:tc>
+          <w:tcPr/>
+          <w:p>
+            <w:pPr>
+              <w:pStyle w:val="Compact"/>
+            </w:pPr>
+            <w:r>
+              <w:t xml:space="preserve">16.0</w:t>
+            </w:r>
+          </w:p>
+        </w:tc>
+        <w:tc>
+          <w:tcPr/>
+          <w:p>
+            <w:pPr>
+              <w:pStyle w:val="Compact"/>
+            </w:pPr>
+            <w:r>
+              <w:t xml:space="preserve">0.87</w:t>
+            </w:r>
+          </w:p>
+        </w:tc>
+        <w:tc>
+          <w:tcPr/>
+          <w:p>
+            <w:pPr>
+              <w:pStyle w:val="Compact"/>
+            </w:pPr>
+            <w:r>
+              <w:t xml:space="preserve">0.29</w:t>
+            </w:r>
+          </w:p>
+        </w:tc>
+        <w:tc>
+          <w:tcPr/>
+          <w:p>
+            <w:pPr>
+              <w:pStyle w:val="Compact"/>
+            </w:pPr>
+            <w:r>
+              <w:t xml:space="preserve">–</w:t>
+            </w:r>
+          </w:p>
+        </w:tc>
+      </w:tr>
+      <w:tr>
+        <w:tc>
+          <w:tcPr/>
+          <w:p>
+            <w:pPr>
+              <w:pStyle w:val="Compact"/>
+            </w:pPr>
+            <w:r>
+              <w:t xml:space="preserve">(ii) position-aware attention pooling</w:t>
+            </w:r>
+          </w:p>
+        </w:tc>
+        <w:tc>
+          <w:tcPr/>
+          <w:p>
+            <w:pPr>
+              <w:pStyle w:val="Compact"/>
+            </w:pPr>
+            <w:r>
+              <w:t xml:space="preserve">531 k</w:t>
+            </w:r>
+          </w:p>
+        </w:tc>
+        <w:tc>
+          <w:tcPr/>
+          <w:p>
+            <w:pPr>
+              <w:pStyle w:val="Compact"/>
+            </w:pPr>
+            <w:r>
+              <w:t xml:space="preserve">v21, 3</w:t>
+            </w:r>
+          </w:p>
+        </w:tc>
+        <w:tc>
+          <w:tcPr/>
+          <w:p>
+            <w:pPr>
+              <w:pStyle w:val="Compact"/>
+            </w:pPr>
+            <w:r>
+              <w:t xml:space="preserve">1.31</w:t>
+            </w:r>
+          </w:p>
+        </w:tc>
+        <w:tc>
+          <w:tcPr/>
+          <w:p>
+            <w:pPr>
+              <w:pStyle w:val="Compact"/>
+            </w:pPr>
+            <w:r>
+              <w:t xml:space="preserve">16.4</w:t>
+            </w:r>
+          </w:p>
+        </w:tc>
+        <w:tc>
+          <w:tcPr/>
+          <w:p>
+            <w:pPr>
+              <w:pStyle w:val="Compact"/>
+            </w:pPr>
+            <w:r>
+              <w:t xml:space="preserve">0.94</w:t>
+            </w:r>
+          </w:p>
+        </w:tc>
+        <w:tc>
+          <w:tcPr/>
+          <w:p>
+            <w:pPr>
+              <w:pStyle w:val="Compact"/>
+            </w:pPr>
+            <w:r>
+              <w:t xml:space="preserve">0.24</w:t>
+            </w:r>
+          </w:p>
+        </w:tc>
+        <w:tc>
+          <w:tcPr/>
+          <w:p>
+            <w:pPr>
+              <w:pStyle w:val="Compact"/>
+            </w:pPr>
+            <w:r>
+              <w:t xml:space="preserve">–</w:t>
+            </w:r>
+          </w:p>
+        </w:tc>
+      </w:tr>
+      <w:tr>
+        <w:tc>
+          <w:tcPr/>
+          <w:p>
+            <w:pPr>
+              <w:pStyle w:val="Compact"/>
+            </w:pPr>
+            <w:r>
+              <w:t xml:space="preserve">(iii) explicit peak features +</w:t>
+            </w:r>
+            <w:r>
+              <w:t xml:space="preserve"> </w:t>
+            </w:r>
+            <m:oMath>
+              <m:r>
+                <m:rPr>
+                  <m:sty m:val="bi"/>
+                </m:rPr>
+                <m:t>g</m:t>
+              </m:r>
+            </m:oMath>
+          </w:p>
+        </w:tc>
+        <w:tc>
+          <w:tcPr/>
+          <w:p>
+            <w:pPr>
+              <w:pStyle w:val="Compact"/>
+            </w:pPr>
+            <w:r>
+              <w:t xml:space="preserve">209 k</w:t>
+            </w:r>
+          </w:p>
+        </w:tc>
+        <w:tc>
+          <w:tcPr/>
+          <w:p>
+            <w:pPr>
+              <w:pStyle w:val="Compact"/>
+            </w:pPr>
+            <w:r>
+              <w:t xml:space="preserve">v21, 3</w:t>
+            </w:r>
+          </w:p>
+        </w:tc>
+        <w:tc>
+          <w:tcPr/>
+          <w:p>
+            <w:pPr>
+              <w:pStyle w:val="Compact"/>
+            </w:pPr>
+            <w:r>
+              <w:t xml:space="preserve">1.28</w:t>
+            </w:r>
+          </w:p>
+        </w:tc>
+        <w:tc>
+          <w:tcPr/>
+          <w:p>
+            <w:pPr>
+              <w:pStyle w:val="Compact"/>
+            </w:pPr>
+            <w:r>
+              <w:t xml:space="preserve">16.1</w:t>
+            </w:r>
+          </w:p>
+        </w:tc>
+        <w:tc>
+          <w:tcPr/>
+          <w:p>
+            <w:pPr>
+              <w:pStyle w:val="Compact"/>
+            </w:pPr>
+            <w:r>
+              <w:t xml:space="preserve">0.88</w:t>
+            </w:r>
+          </w:p>
+        </w:tc>
+        <w:tc>
+          <w:tcPr/>
+          <w:p>
+            <w:pPr>
+              <w:pStyle w:val="Compact"/>
+            </w:pPr>
+            <w:r>
+              <w:t xml:space="preserve">0.28</w:t>
+            </w:r>
+          </w:p>
+        </w:tc>
+        <w:tc>
+          <w:tcPr/>
+          <w:p>
+            <w:pPr>
+              <w:pStyle w:val="Compact"/>
+            </w:pPr>
+            <w:r>
+              <w:t xml:space="preserve">–</w:t>
+            </w:r>
+          </w:p>
+        </w:tc>
+      </w:tr>
+      <w:tr>
+        <w:tc>
+          <w:tcPr/>
+          <w:p>
+            <w:pPr>
+              <w:pStyle w:val="Compact"/>
+            </w:pPr>
+            <w:r>
+              <w:t xml:space="preserve">Checkpoint aux head</w:t>
+            </w:r>
+          </w:p>
+        </w:tc>
+        <w:tc>
+          <w:tcPr/>
+          <w:p>
+            <w:pPr>
+              <w:pStyle w:val="Compact"/>
+            </w:pPr>
+            <w:r>
+              <w:t xml:space="preserve">–</w:t>
+            </w:r>
+          </w:p>
+        </w:tc>
+        <w:tc>
+          <w:tcPr/>
+          <w:p>
+            <w:pPr>
+              <w:pStyle w:val="Compact"/>
+            </w:pPr>
+            <w:r>
+              <w:t xml:space="preserve">v22, –</w:t>
+            </w:r>
+          </w:p>
+        </w:tc>
+        <w:tc>
+          <w:tcPr/>
+          <w:p>
+            <w:pPr>
+              <w:pStyle w:val="Compact"/>
+            </w:pPr>
+            <w:r>
+              <w:t xml:space="preserve">1.28</w:t>
+            </w:r>
+          </w:p>
+        </w:tc>
+        <w:tc>
+          <w:tcPr/>
+          <w:p>
+            <w:pPr>
+              <w:pStyle w:val="Compact"/>
+            </w:pPr>
+            <w:r>
+              <w:t xml:space="preserve">15.0</w:t>
+            </w:r>
+          </w:p>
+        </w:tc>
+        <w:tc>
+          <w:tcPr/>
+          <w:p>
+            <w:pPr>
+              <w:pStyle w:val="Compact"/>
+            </w:pPr>
+            <w:r>
+              <w:t xml:space="preserve">0.90</w:t>
+            </w:r>
+          </w:p>
+        </w:tc>
+        <w:tc>
+          <w:tcPr/>
+          <w:p>
+            <w:pPr>
+              <w:pStyle w:val="Compact"/>
+            </w:pPr>
+            <w:r>
+              <w:t xml:space="preserve">0.31</w:t>
+            </w:r>
+          </w:p>
+        </w:tc>
+        <w:tc>
+          <w:tcPr/>
+          <w:p>
+            <w:pPr>
+              <w:pStyle w:val="Compact"/>
+            </w:pPr>
+            <w:r>
+              <w:t xml:space="preserve">–</w:t>
+            </w:r>
+          </w:p>
+        </w:tc>
+      </w:tr>
+      <w:tr>
+        <w:tc>
+          <w:tcPr/>
+          <w:p>
+            <w:pPr>
+              <w:pStyle w:val="Compact"/>
+            </w:pPr>
+            <w:r>
+              <w:t xml:space="preserve">(i) global average pool</w:t>
+            </w:r>
+            <w:r>
+              <w:t xml:space="preserve"> </w:t>
+            </w:r>
+            <m:oMath>
+              <m:r>
+                <m:rPr>
+                  <m:sty m:val="bi"/>
+                </m:rPr>
+                <m:t>g</m:t>
+              </m:r>
+            </m:oMath>
+          </w:p>
+        </w:tc>
+        <w:tc>
+          <w:tcPr/>
+          <w:p>
+            <w:pPr>
+              <w:pStyle w:val="Compact"/>
+            </w:pPr>
+            <w:r>
+              <w:t xml:space="preserve">67 k</w:t>
+            </w:r>
+          </w:p>
+        </w:tc>
+        <w:tc>
+          <w:tcPr/>
+          <w:p>
+            <w:pPr>
+              <w:pStyle w:val="Compact"/>
+            </w:pPr>
+            <w:r>
+              <w:t xml:space="preserve">v22, 10</w:t>
+            </w:r>
+          </w:p>
+        </w:tc>
+        <w:tc>
+          <w:tcPr/>
+          <w:p>
+            <w:pPr>
+              <w:pStyle w:val="Compact"/>
+            </w:pPr>
+            <w:r>
+              <w:t xml:space="preserve">1.29</w:t>
+            </w:r>
+          </w:p>
+        </w:tc>
+        <w:tc>
+          <w:tcPr/>
+          <w:p>
+            <w:pPr>
+              <w:pStyle w:val="Compact"/>
+            </w:pPr>
+            <w:r>
+              <w:t xml:space="preserve">15.5</w:t>
+            </w:r>
+          </w:p>
+        </w:tc>
+        <w:tc>
+          <w:tcPr/>
+          <w:p>
+            <w:pPr>
+              <w:pStyle w:val="Compact"/>
+            </w:pPr>
+            <w:r>
+              <w:t xml:space="preserve">0.91</w:t>
+            </w:r>
+          </w:p>
+        </w:tc>
+        <w:tc>
+          <w:tcPr/>
+          <w:p>
+            <w:pPr>
+              <w:pStyle w:val="Compact"/>
+            </w:pPr>
+            <w:r>
+              <w:t xml:space="preserve">0.28</w:t>
+            </w:r>
+          </w:p>
+        </w:tc>
+        <w:tc>
+          <w:tcPr/>
+          <w:p>
+            <w:pPr>
+              <w:pStyle w:val="Compact"/>
+            </w:pPr>
+            <w:r>
+              <w:t xml:space="preserve">0.7 [0.5, 1.1]</w:t>
+            </w:r>
+          </w:p>
+        </w:tc>
+      </w:tr>
+      <w:tr>
+        <w:tc>
+          <w:tcPr/>
+          <w:p>
+            <w:pPr>
+              <w:pStyle w:val="Compact"/>
+            </w:pPr>
+            <w:r>
+              <w:t xml:space="preserve">(ii) position-aware attention pooling</w:t>
+            </w:r>
+          </w:p>
+        </w:tc>
+        <w:tc>
+          <w:tcPr/>
+          <w:p>
+            <w:pPr>
+              <w:pStyle w:val="Compact"/>
+            </w:pPr>
+            <w:r>
+              <w:t xml:space="preserve">531 k</w:t>
+            </w:r>
+          </w:p>
+        </w:tc>
+        <w:tc>
+          <w:tcPr/>
+          <w:p>
+            <w:pPr>
+              <w:pStyle w:val="Compact"/>
+            </w:pPr>
+            <w:r>
+              <w:t xml:space="preserve">v22, 10</w:t>
+            </w:r>
+          </w:p>
+        </w:tc>
+        <w:tc>
+          <w:tcPr/>
+          <w:p>
+            <w:pPr>
+              <w:pStyle w:val="Compact"/>
+            </w:pPr>
+            <w:r>
+              <w:t xml:space="preserve">1.21</w:t>
+            </w:r>
+          </w:p>
+        </w:tc>
+        <w:tc>
+          <w:tcPr/>
+          <w:p>
+            <w:pPr>
+              <w:pStyle w:val="Compact"/>
+            </w:pPr>
+            <w:r>
+              <w:t xml:space="preserve">15.4</w:t>
+            </w:r>
+          </w:p>
+        </w:tc>
+        <w:tc>
+          <w:tcPr/>
+          <w:p>
+            <w:pPr>
+              <w:pStyle w:val="Compact"/>
+            </w:pPr>
+            <w:r>
+              <w:t xml:space="preserve">0.88</w:t>
+            </w:r>
+          </w:p>
+        </w:tc>
+        <w:tc>
+          <w:tcPr/>
+          <w:p>
+            <w:pPr>
+              <w:pStyle w:val="Compact"/>
+            </w:pPr>
+            <w:r>
+              <w:t xml:space="preserve">0.29</w:t>
+            </w:r>
+          </w:p>
+        </w:tc>
+        <w:tc>
+          <w:tcPr/>
+          <w:p>
+            <w:pPr>
+              <w:pStyle w:val="Compact"/>
+            </w:pPr>
+            <w:r>
+              <w:t xml:space="preserve">0.5 [0.3, 0.9]</w:t>
+            </w:r>
+          </w:p>
+        </w:tc>
+      </w:tr>
+      <w:tr>
+        <w:tc>
+          <w:tcPr/>
+          <w:p>
+            <w:pPr>
+              <w:pStyle w:val="Compact"/>
+            </w:pPr>
+            <w:r>
+              <w:t xml:space="preserve">(ii) position-aware attention pooling</w:t>
+            </w:r>
+          </w:p>
+        </w:tc>
+        <w:tc>
+          <w:tcPr/>
+          <w:p>
+            <w:pPr>
+              <w:pStyle w:val="Compact"/>
+            </w:pPr>
+            <w:r>
+              <w:t xml:space="preserve">531 k</w:t>
+            </w:r>
+          </w:p>
+        </w:tc>
+        <w:tc>
+          <w:tcPr/>
+          <w:p>
+            <w:pPr>
+              <w:pStyle w:val="Compact"/>
+            </w:pPr>
+            <w:r>
+              <w:t xml:space="preserve">v22, 30</w:t>
+            </w:r>
+          </w:p>
+        </w:tc>
+        <w:tc>
+          <w:tcPr/>
+          <w:p>
+            <w:pPr>
+              <w:pStyle w:val="Compact"/>
+            </w:pPr>
+            <w:r>
+              <w:t xml:space="preserve">1.12</w:t>
+            </w:r>
+          </w:p>
+        </w:tc>
+        <w:tc>
+          <w:tcPr/>
+          <w:p>
+            <w:pPr>
+              <w:pStyle w:val="Compact"/>
+            </w:pPr>
+            <w:r>
+              <w:t xml:space="preserve">14.6</w:t>
+            </w:r>
+          </w:p>
+        </w:tc>
+        <w:tc>
+          <w:tcPr/>
+          <w:p>
+            <w:pPr>
+              <w:pStyle w:val="Compact"/>
+            </w:pPr>
+            <w:r>
+              <w:t xml:space="preserve">0.75</w:t>
+            </w:r>
+          </w:p>
+        </w:tc>
+        <w:tc>
+          <w:tcPr/>
+          <w:p>
+            <w:pPr>
+              <w:pStyle w:val="Compact"/>
+            </w:pPr>
+            <w:r>
+              <w:t xml:space="preserve">0.36</w:t>
+            </w:r>
+          </w:p>
+        </w:tc>
+        <w:tc>
+          <w:tcPr/>
+          <w:p>
+            <w:pPr>
+              <w:pStyle w:val="Compact"/>
+            </w:pPr>
+            <w:r>
+              <w:t xml:space="preserve">0.8 [0.5, 1.2]</w:t>
+            </w:r>
+          </w:p>
+        </w:tc>
+      </w:tr>
+      <w:tr>
+        <w:tc>
+          <w:tcPr/>
+          <w:p>
+            <w:pPr>
+              <w:pStyle w:val="Compact"/>
+            </w:pPr>
+            <w:r>
+              <w:t xml:space="preserve">(iii) explicit peak features +</w:t>
+            </w:r>
+            <w:r>
+              <w:t xml:space="preserve"> </w:t>
+            </w:r>
+            <m:oMath>
+              <m:r>
+                <m:rPr>
+                  <m:sty m:val="bi"/>
+                </m:rPr>
+                <m:t>g</m:t>
+              </m:r>
+            </m:oMath>
+          </w:p>
+        </w:tc>
+        <w:tc>
+          <w:tcPr/>
+          <w:p>
+            <w:pPr>
+              <w:pStyle w:val="Compact"/>
+            </w:pPr>
+            <w:r>
+              <w:t xml:space="preserve">209 k</w:t>
+            </w:r>
+          </w:p>
+        </w:tc>
+        <w:tc>
+          <w:tcPr/>
+          <w:p>
+            <w:pPr>
+              <w:pStyle w:val="Compact"/>
+            </w:pPr>
+            <w:r>
+              <w:t xml:space="preserve">v22, 10</w:t>
+            </w:r>
+          </w:p>
+        </w:tc>
+        <w:tc>
+          <w:tcPr/>
+          <w:p>
+            <w:pPr>
+              <w:pStyle w:val="Compact"/>
+            </w:pPr>
+            <w:r>
+              <w:t xml:space="preserve">1.28</w:t>
+            </w:r>
+          </w:p>
+        </w:tc>
+        <w:tc>
+          <w:tcPr/>
+          <w:p>
+            <w:pPr>
+              <w:pStyle w:val="Compact"/>
+            </w:pPr>
+            <w:r>
+              <w:t xml:space="preserve">15.4</w:t>
+            </w:r>
+          </w:p>
+        </w:tc>
+        <w:tc>
+          <w:tcPr/>
+          <w:p>
+            <w:pPr>
+              <w:pStyle w:val="Compact"/>
+            </w:pPr>
+            <w:r>
+              <w:t xml:space="preserve">0.90</w:t>
+            </w:r>
+          </w:p>
+        </w:tc>
+        <w:tc>
+          <w:tcPr/>
+          <w:p>
+            <w:pPr>
+              <w:pStyle w:val="Compact"/>
+            </w:pPr>
+            <w:r>
+              <w:t xml:space="preserve">0.30</w:t>
+            </w:r>
+          </w:p>
+        </w:tc>
+        <w:tc>
+          <w:tcPr/>
+          <w:p>
+            <w:pPr>
+              <w:pStyle w:val="Compact"/>
+            </w:pPr>
+            <w:r>
+              <w:t xml:space="preserve">1.2 [0.9, 1.7]</w:t>
+            </w:r>
+          </w:p>
+        </w:tc>
+      </w:tr>
+    </w:tbl>
+    <w:p>
+      <w:pPr>
+        <w:pStyle w:val="BodyText"/>
+      </w:pPr>
+      <w:r>
+        <w:t xml:space="preserve">The prediction is not borne out on either encoder. On v21 the three arms lie within 0.03 Å of one another (~2 % of the error). On v22, with ten epochs, arms (i) and (iii) converge by the sixth epoch to 1.29 and 1.28 Å, and arm (ii) reaches 1.21 Å at ten epochs and 1.12 Å at thirty, where it is converged (flat over the last six epochs), a 13 % reduction. Every arm sits more than 2.2× above the 0.5 Å knee, and arm (i) reproduces the checkpoint head on both encoders, so the budget suffices to match the baseline. End to end, the substituted cells recover 0.7 %, 0.5 % and 1.2 % for (i), (ii) and (iii), each below the 1.9 % of the full pipeline (paired McNemar p = 7 × 10⁻⁷, 3 × 10⁻⁹ and 8 × 10⁻³) and the indexer’s 1.6 %, with pattern Pearson 0.08 in every arm; the head-level gain of arm (ii) does not carry through: its converged thirty-epoch cells recover 0.8 % [0.5, 1.2] (24 / 3 000, 22 of them cubic), level with arm (i). Every match obtained through a regression head is a cubic structure (18, 16 and 34 of the 22, 16 and 37), the one-parameter case; none is hexagonal or tetragonal, where the indexer’s search succeeds (§5.2). Restoring absolute peak positions to the head does not repair the absolute scale, and the submitted reading that global pooling discards the d-spacing information is withdrawn. Arm (iii) is decisive: it receives the same peak positions the autoindexer reads, yet a head trained to regress six cell parameters does not turn them into a cell, because that requires assigning Miller indices to peaks, a combinatorial step the autoindexer performs by explicit search and a pointwise-loss regressor does not learn here. This revised reading is the best-supported one, not a demonstrated cause; it accounts for every head-side failure (the two experiments above, the top-K rerank of §5.4), for the space-group head’s success on relative features, and for the indexer succeeding exactly where the assignment is over-determined (§5.2). The next gain must come from obtaining the cell by search, or from a model that performs the peak-to-index assignment explicitly, not from a different pooling, a better head or a better denoiser. Two caveats remain: the encoder is frozen, so an encoder trained from scratch under position-aware pooling could behave differently (not run); and the heads are trained on the frozen encoder’s features rather than jointly, so a jointly trained position-aware head is untested. Runs:</w:t>
+      </w:r>
+      <w:r>
+        <w:t xml:space="preserve"> </w:t>
+      </w:r>
+      <w:r>
+        <w:rPr>
+          <w:rStyle w:val="VerbatimChar"/>
+        </w:rPr>
+        <w:t xml:space="preserve">paper/phase15_results/pooling_ablation_v21/</w:t>
+      </w:r>
+      <w:r>
+        <w:t xml:space="preserve">,</w:t>
+      </w:r>
+      <w:r>
+        <w:t xml:space="preserve"> </w:t>
+      </w:r>
+      <w:r>
+        <w:rPr>
+          <w:rStyle w:val="VerbatimChar"/>
+        </w:rPr>
+        <w:t xml:space="preserve">pooling_ablation_v22/</w:t>
+      </w:r>
+      <w:r>
+        <w:t xml:space="preserve">,</w:t>
+      </w:r>
+      <w:r>
+        <w:t xml:space="preserve"> </w:t>
+      </w:r>
+      <w:r>
+        <w:rPr>
+          <w:rStyle w:val="VerbatimChar"/>
+        </w:rPr>
+        <w:t xml:space="preserve">v22_pool_*</w:t>
+      </w:r>
+      <w:r>
+        <w:t xml:space="preserve">.</w:t>
       </w:r>
     </w:p>
     <w:bookmarkEnd w:id="45"/>
@@ -10150,7 +11219,7 @@
         <w:t xml:space="preserve"> </w:t>
       </w:r>
       <w:r>
-        <w:t xml:space="preserve">scores on the predicted structures; the indexer; the oracle; the perturbation study; the aux-head substitution of §5.6; and the external baselines. The module was corrected and re-validated (mean Pearson 0.952 → 0.988 over 1000 structures). The affected runs were retrained [PENDING C1: which runs, and the resulting changes to Tables 1 and 2 and to §5.4].</w:t>
+        <w:t xml:space="preserve">scores on the predicted structures; the indexer; the oracle; the perturbation study; the aux-head substitution of §5.6; and the external baselines. The module was corrected and re-validated (mean Pearson 0.952 → 0.988 over 1000 structures). The production checkpoint was retrained from scratch with the corrected module and the fix of (b), under otherwise identical settings (v22; final EMA loss 0.602 against 0.726); Tables 2, 2a and 3 and Figs 4 and 5 now report it at three seeds, and §5.2 gives the paired before/after accounting (learned head 0 / 1 949 → 58 / 3 000, indexer 46 / 2 883 → 48 / 3 000, oracle 135 → 165 / 3 000; the indexer’s lead became a tie). The Phase-4 rows of Table 1 and the §5.4 experiments were not rerun (~18 GPU-hours for the six configurations at three seeds); they keep their exploratory labels.</w:t>
       </w:r>
     </w:p>
     <w:p>
@@ -10192,7 +11261,7 @@
         <w:t xml:space="preserve"> </w:t>
       </w:r>
       <w:r>
-        <w:t xml:space="preserve">When the classical indexer returned no cell, the sampling script substituted the true lattice and the pattern was scored as if indexed. This affected 39 of the 1000 test patterns in every indexer run, 117 structure-seeds over three seeds. Recomputing from the released per-structure records, none of the 117 fallback structure-seeds matched, so the published McNemar cells (27 fixed, 0 broken) and the all-correct cells (4, 0) are unchanged. The match rate is now reported on the 2 883 indexed structure-seeds only: 46 / 2 883 = 1.6 % [1.2, 2.1], in place of 46 / 3 000 = 1.5 % [1.2, 2.0]. The script now scores unindexed patterns as misses and records their count. The top-K rerank experiment of §5.4 used the same fallback; because the fallback rows did not match, its 1.0 % result can only be lower, and its conclusion (no improvement) stands.</w:t>
+        <w:t xml:space="preserve">When the classical indexer returned no cell, the sampling script substituted the true lattice and the pattern was scored as if indexed. This affected 39 of the 1000 test patterns in every indexer run, 117 structure-seeds over three seeds. Recomputing from the released per-structure records, none of the 117 fallback structure-seeds matched, so the submitted McNemar cells (27 fixed, 0 broken) and the all-correct cells (4, 0) were unchanged by the fallback; the submitted match rate becomes 46 / 2 883 = 1.6 % [1.2, 2.1] on the indexed structure-seeds, in place of 46 / 3 000 = 1.5 % [1.2, 2.0]. (Those v21 cells are superseded by the v22 retrain of (a), which is what §5.2 now reports.) The script now scores unindexed patterns as misses and records their count. The top-K rerank experiment of §5.4 used the same fallback; because the fallback rows did not match, its 1.0 % result can only be lower, and its conclusion (no improvement) stands.</w:t>
       </w:r>
     </w:p>
     <w:p>
@@ -10321,7 +11390,7 @@
           <w:b/>
           <w:bCs/>
         </w:rPr>
-        <w:t xml:space="preserve">Encoder bottleneck (the robust result).</w:t>
+        <w:t xml:space="preserve">Lattice-recovery bottleneck (the robust result).</w:t>
       </w:r>
       <w:r>
         <w:t xml:space="preserve"> </w:t>
@@ -10373,7 +11442,7 @@
         <w:t xml:space="preserve"> </w:t>
       </w:r>
       <w:r>
-        <w:t xml:space="preserve">structure, but it is a relative fit: feeding the aux head’s own lattice to the sampler recovers only 1.2 % (§5.6), and stronger constrained-head supervision does not move its ~1.1 Å error. The evidence therefore points to the global pooling that discards absolute peak-position fidelity, rather than to the denoiser’s use of an otherwise-adequate signal; the controlled ablation of §5.6 tests this directly [PENDING C2: one clause with its outcome]. The disjoint oracle-vs-indexer CIs (§5.2) make the lattice’s role the paper’s statistically firmest claim. The Q-space autoindexer, which reads peak positions directly, recovers part of the 4.5 % oracle ceiling on the high-symmetry subset; top-K rerank and gradient guidance fail because they operate</w:t>
+        <w:t xml:space="preserve">structure, but it is a relative fit: feeding the aux head’s own lattice to the sampler recovers only 1.2 % (§5.6), and neither stronger constrained supervision nor restoring absolute peak positions to the head moves its ~1.1 Å error, so the pooling reading of the submitted version is withdrawn in favour of the regression formulation (§5.6). The paired oracle-vs-learned-head test (134 fixed, 27 broken, p = 3 × 10⁻¹⁸; §5.2) is the paper’s statistically firmest claim and the one result that replicates across the submitted and the corrected checkpoint. The Q-space autoindexer, which reads peak positions directly, recovers part of the 5.5 % oracle ceiling on the hexagonal and tetragonal subset; with the corrected checkpoint it no longer leads the learned head in aggregate, but its cells stay far closer to the truth (Pearson 0.41 against 0.18). Top-K rerank and gradient guidance fail because they operate</w:t>
       </w:r>
       <w:r>
         <w:t xml:space="preserve"> </w:t>
@@ -10389,7 +11458,7 @@
         <w:t xml:space="preserve"> </w:t>
       </w:r>
       <w:r>
-        <w:t xml:space="preserve">the encoder commits to a bad lattice prior, while the indexer bypasses that decision. (The oracle ceiling is itself only 4.5 %, so even a perfect lattice leaves coordinates as a co-limiter; see §8.)</w:t>
+        <w:t xml:space="preserve">the encoder commits to a bad lattice prior, while the indexer bypasses that decision. The oracle ceiling is itself only 5.5 %, so even a perfect lattice leaves coordinates as a co-limiter (§8).</w:t>
       </w:r>
     </w:p>
     <w:p>
@@ -10484,7 +11553,7 @@
         <w:t xml:space="preserve"> </w:t>
       </w:r>
       <w:r>
-        <w:t xml:space="preserve">recovery: DGpt’s CIF-token output appears to encode space group in a way PXRDnet’s coordinate decode does not. We stress that the underlying numbers cannot yet support this: PXRDnet’s all-correct CI [0.9, 23.6] at n = 20 overlaps DGpt’s, so the ordering is unconfirmed. We raise it as a</w:t>
+        <w:t xml:space="preserve">recovery: DGpt’s CIF-token output appears to encode space group in a way PXRDnet’s coordinate decode does not. The numbers cannot yet support this (PXRDnet’s all-correct CI [0.9, 23.6] at n = 20 overlaps DGpt’s), so we raise it as a</w:t>
       </w:r>
       <w:r>
         <w:t xml:space="preserve"> </w:t>
@@ -10500,7 +11569,7 @@
         <w:t xml:space="preserve"> </w:t>
       </w:r>
       <w:r>
-        <w:t xml:space="preserve">worth testing at adequate n, because if true it has a concrete consequence for the field: a single</w:t>
+        <w:t xml:space="preserve">worth testing at adequate n. If true, a single</w:t>
       </w:r>
       <w:r>
         <w:t xml:space="preserve"> </w:t>
@@ -10512,7 +11581,7 @@
         <w:t xml:space="preserve"> </w:t>
       </w:r>
       <w:r>
-        <w:t xml:space="preserve">reported under inconsistent tolerances would conflate structure recovery with symmetry recovery, and downstream crystallography (where the space group matters as much as the coordinates) would be mis-served by it. The contribution here is the shared harness that makes such a test possible, not the (underpowered) comparison itself.</w:t>
+        <w:t xml:space="preserve">reported under inconsistent tolerances would conflate structure recovery with symmetry recovery, and downstream crystallography, where the space group matters as much as the coordinates, would be mis-served by it. The contribution here is the shared harness that makes such a test possible, not the underpowered comparison itself.</w:t>
       </w:r>
     </w:p>
     <w:p>
@@ -10530,7 +11599,7 @@
         <w:t xml:space="preserve"> </w:t>
       </w:r>
       <w:r>
-        <w:t xml:space="preserve">At 1.6 % PXRD-Diff sits an order of magnitude below much larger systems, and that is the point of its size. Small models make the encoder bottleneck visible (capacity hides it) and make the indexer control trivial to wire in (larger models would need architecture-level surgery). The model is a diagnostic instrument, not a candidate solver. The recipe (encoder + Phase 4 fixes + Phase 9 indexer control) is 3.7 M parameters and runs inference in seconds.</w:t>
+        <w:t xml:space="preserve">At 1.9 % PXRD-Diff sits an order of magnitude below much larger systems, and that is the point of its size. Small models make the lattice-recovery bottleneck visible (capacity hides it) and make the indexer control trivial to wire in (larger models would need architecture-level surgery). The recipe (encoder + Phase 4 fixes + Phase 9 indexer control) is 3.7 M parameters and runs inference in seconds.</w:t>
       </w:r>
     </w:p>
     <w:p>
@@ -10639,7 +11708,7 @@
         <w:t xml:space="preserve"> </w:t>
       </w:r>
       <w:r>
-        <w:t xml:space="preserve">lift to a single-seed artifact. What does reproduce is the pattern-Pearson improvement (ε 0.359 vs x₀ 0.403, with disjoint ranges across both seeds), consistent with Table 1. The lattice-input fix remains load-bearing as a training-dynamics result (lattice loss 1.0 → 0.02), and the oracle-vs-indexer gap has disjoint CIs. The indexer-vs-learned-head comparison was rerun at three seeds and the lift confirmed significant by a paired McNemar test (p &lt; 10⁻⁴; §5.2), superseding the earlier underpowered unpaired test (p = 0.24). The oracle has since been multi-seeded: three seeds give 4.5 % [3.8, 5.3] pooled, firming the single-seed 5.6 %.</w:t>
+        <w:t xml:space="preserve">lift to a single-seed artifact. What does reproduce is the pattern-Pearson improvement (ε 0.359 vs x₀ 0.403, with disjoint ranges across both seeds), consistent with Table 1. The lattice-input fix remains load-bearing as a training-dynamics result (lattice loss 1.0 → 0.02), and the oracle-vs-learned-head gap is the effect that replicates (§5.2). The indexer-vs-learned-head comparison is the cautionary case: significant with the submitted checkpoint (27 fixed, 0 broken), a tie with the corrected one (42, 52; p = 0.35), so a paired test at three seeds protects against seed noise but not against a training defect that moves one arm (§5.2, §5.7).</w:t>
       </w:r>
     </w:p>
     <w:p>
@@ -10693,13 +11762,13 @@
           <w:i/>
           <w:iCs/>
         </w:rPr>
-        <w:t xml:space="preserve">Crystal system is given.</w:t>
-      </w:r>
-      <w:r>
-        <w:t xml:space="preserve"> </w:t>
-      </w:r>
-      <w:r>
-        <w:t xml:space="preserve">The de-Wolff fit (§3.5) receives the true Bravais code as a sampling-time input; on a real unknown the system is itself part of what indexing must determine, so the per-system rates of §3.5 are conditional on knowing the system. (ii)</w:t>
+        <w:t xml:space="preserve">Crystal system.</w:t>
+      </w:r>
+      <w:r>
+        <w:t xml:space="preserve"> </w:t>
+      </w:r>
+      <w:r>
+        <w:t xml:space="preserve">The main runs supply the true Bravais code to the de-Wolff fit (§3.5); the unknown-system run removes it at a cost of about five percentage points at the indexing stage (48.8 → 43.4 % strict) and six of 48 downstream matches (1.4 % against 1.6 %), so the assumption changes little at either stage. (ii)</w:t>
       </w:r>
       <w:r>
         <w:t xml:space="preserve"> </w:t>
@@ -10730,7 +11799,7 @@
         <w:t xml:space="preserve"> </w:t>
       </w:r>
       <w:r>
-        <w:t xml:space="preserve">simulations with no zero-point shift, sample-displacement error, or peak asymmetry, precisely the perturbations that drive real-world indexing failure. The 48.8 % native-indexer match and the downstream 1.6 % should be read as upper bounds under ideal peak positions and a known crystal system; the unknown-system run of §3.5 removes the second assumption [PENDING C3: one clause with its outcome]. A zero-shift/displacement robustness sweep (n = 300) confirms the concern: the indexer’s length-MAE rises from 1.24 Å on clean patterns past the v20 learned head’s 1.37 Å once displacement or zero-shift exceeds ~0.10°, so the indexer’s advantage over the learned head holds only for well-calibrated input.</w:t>
+        <w:t xml:space="preserve">simulations with no zero-point shift, sample-displacement error, or peak asymmetry, precisely the perturbations that drive real-world indexing failure. The 48.8 % native-indexer match and the downstream 1.6 % should be read as upper bounds under ideal peak positions. A zero-shift/displacement robustness sweep (n = 300) confirms the concern: the indexer’s length-MAE rises from 1.24 Å on clean patterns past the v20 learned head’s 1.37 Å once displacement or zero-shift exceeds ~0.10°, so the indexer’s cell-accuracy advantage over the learned head (§5.2) holds only for well-calibrated input.</w:t>
       </w:r>
     </w:p>
     <w:p>
@@ -10752,7 +11821,7 @@
         <w:t xml:space="preserve"> </w:t>
       </w:r>
       <w:r>
-        <w:t xml:space="preserve">Every pattern is an ideal simulation. Instrument profile, zero shift, sample displacement, preferred orientation and background all move or reshape peaks. Each would further degrade an encoder that already fails to fix absolute d-spacings on clean input. The encoder-bottleneck diagnosis is therefore a lower bound on the difficulty of real data, not an estimate of it. The 0.5 Å knee is a property of the sampler under clean cells; under real peak shifts its position may move, and the indexer’s own degradation past ~0.10° suggests the whole curve shifts towards smaller tolerable errors.</w:t>
+        <w:t xml:space="preserve">Every pattern is an ideal simulation. Instrument profile, zero shift, sample displacement, preferred orientation and background all move or reshape peaks. Each would further degrade an encoder that already fails to fix absolute d-spacings on clean input. The lattice-recovery bottleneck diagnosis is therefore a lower bound on the difficulty of real data, not an estimate of it. The 0.5 Å knee is a property of the sampler under clean cells; under real peak shifts its position may move, and the indexer’s own degradation past ~0.10° suggests the whole curve shifts towards smaller tolerable errors.</w:t>
       </w:r>
     </w:p>
     <w:p>
@@ -10851,7 +11920,7 @@
         <w:pStyle w:val="FirstParagraph"/>
       </w:pPr>
       <w:r>
-        <w:t xml:space="preserve">A 3.7 M-parameter conditional diffusion model, used as a diagnostic instrument, locates the dominant accessible failure in PXRD inversion at the pattern encoder. The encoder’s pooled representation supports a 0.007 normalised lattice-regression loss yet delivers a ~1.1 Å absolute cell error that no head reading it, however constrained, reduces. The evidence points to global pooling as the stage that discards absolute d-spacings [PENDING C2: one clause with the pooling-ablation outcome]. A true-lattice oracle caps match at 4.5 % [3.8, 5.3] (three seeds), so coordinate prediction remains a co-limiter. A classical Q-space autoindexer, supplied with the true crystal system, serves as a control: it reaches 1.6 % [1.2, 2.1] where the learned head recovers nothing (three-seed paired McNemar p &lt; 10⁻⁴), and only in the high-symmetry systems below the 0.5 Å knee. Re-scored on one</w:t>
+        <w:t xml:space="preserve">A 3.7 M-parameter conditional diffusion model, used as a diagnostic instrument, locates the dominant accessible failure in PXRD inversion in the recovery of the unit cell from the pattern, upstream of the denoiser. The encoder’s pooled representation supports a 0.007 normalised lattice-regression loss yet delivers a ~1.1 Å absolute cell error that no head reading it reduces, whether constrained, position-aware or handed explicit peak positions; the pooling reading is withdrawn and the evidence points to the regression formulation, which leaves the peak-to-index assignment unsolved. A true-lattice oracle caps match at 5.5 % [4.7, 6.4] (three seeds) against 1.9 % [1.5, 2.5] for the learned head (paired McNemar p = 3 × 10⁻¹⁸), so coordinate prediction remains a co-limiter. A classical Q-space autoindexer, supplied with the true crystal system, serves as a control: it reaches 1.6 % [1.2, 2.1] and, with the corrected checkpoint, ties the learned head at three seeds (42 fixed, 52 broken, p = 0.35), its gains confined to the hexagonal and tetragonal systems below the 0.5 Å knee. Re-scored on one</w:t>
       </w:r>
       <w:r>
         <w:t xml:space="preserve"> </w:t>
@@ -10866,7 +11935,7 @@
         <w:t xml:space="preserve"> </w:t>
       </w:r>
       <w:r>
-        <w:t xml:space="preserve">harness, deCIFer reaches 73.8 % / 69.5 %, DGpt 18.9 % / 15.9 % and PXRDnet 30.0 % / 5.0 % (match / all-correct). These set the scale of the diagnostic model and are not a ranking claim. The apparent divergence in their space-group recovery is a measurement hypothesis the n = 20 PXRDnet sample cannot yet confirm, but the shared harness now makes it testable. A code audit corrected three implementation errors, and every affected number was recomputed or re-run [PENDING C1: one clause on whether the retrained numbers changed]. The lattice-input fix is load-bearing; the x₀-residual switch improves pattern-Pearson but its single-seed match-rate lift did not replicate (§7); the remaining interventions are documented as failures, with the Wyckoff-letter result now read narrowly. Code, checkpoints, all per-phase JSONs, per-structure records, both indexer paths and the differentiable Bragg module are released.</w:t>
+        <w:t xml:space="preserve">harness, deCIFer reaches 73.8 % / 69.5 %, DGpt 18.9 % / 15.9 % and PXRDnet 30.0 % / 5.0 % (match / all-correct); these set the scale of the diagnostic model and are not a ranking claim, and the apparent divergence in their space-group recovery is a measurement hypothesis the n = 20 PXRDnet sample cannot yet confirm. A code audit corrected three implementation errors; retraining the production checkpoint under the corrected loss raised the learned head from 0 to 1.9 % and removed the indexer’s aggregate lead of the submitted version, leaving the oracle gap as the result that replicates. The lattice-input fix is load-bearing; the x₀-residual switch improves pattern-Pearson but its single-seed match-rate lift did not replicate (§7); the remaining interventions are documented as failures. Code, checkpoints, all per-phase JSONs, per-structure records, both indexer paths and the differentiable Bragg module are released.</w:t>
       </w:r>
     </w:p>
     <w:p>
@@ -11317,7 +12386,7 @@
         <w:pStyle w:val="BodyText"/>
       </w:pPr>
       <w:r>
-        <w:t xml:space="preserve">Favre-Nicolin, V. &amp; Černý, R. (2002).</w:t>
+        <w:t xml:space="preserve">de Wolff, P. M. (1968).</w:t>
       </w:r>
       <w:r>
         <w:t xml:space="preserve"> </w:t>
@@ -11337,10 +12406,10 @@
           <w:b/>
           <w:bCs/>
         </w:rPr>
-        <w:t xml:space="preserve">35</w:t>
-      </w:r>
-      <w:r>
-        <w:t xml:space="preserve">, 734–743. DOI: 10.1107/S0021889802015236.</w:t>
+        <w:t xml:space="preserve">1</w:t>
+      </w:r>
+      <w:r>
+        <w:t xml:space="preserve">, 108–113. DOI: 10.1107/S002188986800508X.</w:t>
       </w:r>
     </w:p>
     <w:p>
@@ -11348,7 +12417,7 @@
         <w:pStyle w:val="BodyText"/>
       </w:pPr>
       <w:r>
-        <w:t xml:space="preserve">Guo, G., Saidi, T. L., Terban, M. W., Valsecchi, M., Billinge, S. J. L. &amp; Lipson, H. (2025).</w:t>
+        <w:t xml:space="preserve">Favre-Nicolin, V. &amp; Černý, R. (2002).</w:t>
       </w:r>
       <w:r>
         <w:t xml:space="preserve"> </w:t>
@@ -11358,7 +12427,7 @@
           <w:i/>
           <w:iCs/>
         </w:rPr>
-        <w:t xml:space="preserve">Nat. Mater.</w:t>
+        <w:t xml:space="preserve">J. Appl. Cryst.</w:t>
       </w:r>
       <w:r>
         <w:t xml:space="preserve"> </w:t>
@@ -11368,37 +12437,10 @@
           <w:b/>
           <w:bCs/>
         </w:rPr>
-        <w:t xml:space="preserve">24</w:t>
-      </w:r>
-      <w:r>
-        <w:t xml:space="preserve">, 1726–1734. DOI: 10.1038/s41563-025-02220-y (Author Correction: 10.1038/s41563-025-02301-y; preprint arXiv:2406.10796). Reproduced from HF checkpoint</w:t>
-      </w:r>
-      <w:r>
-        <w:t xml:space="preserve"> </w:t>
-      </w:r>
-      <w:r>
-        <w:rPr>
-          <w:rStyle w:val="VerbatimChar"/>
-        </w:rPr>
-        <w:t xml:space="preserve">therealgabeguo/cdvae_xrd_sinc100</w:t>
-      </w:r>
-      <w:r>
-        <w:t xml:space="preserve"> </w:t>
-      </w:r>
-      <w:r>
-        <w:t xml:space="preserve">and code at</w:t>
-      </w:r>
-      <w:r>
-        <w:t xml:space="preserve"> </w:t>
-      </w:r>
-      <w:r>
-        <w:rPr>
-          <w:rStyle w:val="VerbatimChar"/>
-        </w:rPr>
-        <w:t xml:space="preserve">github.com/gabeguo/cdvae_xrd</w:t>
-      </w:r>
-      <w:r>
-        <w:t xml:space="preserve">.</w:t>
+        <w:t xml:space="preserve">35</w:t>
+      </w:r>
+      <w:r>
+        <w:t xml:space="preserve">, 734–743. DOI: 10.1107/S0021889802015236.</w:t>
       </w:r>
     </w:p>
     <w:p>
@@ -11406,15 +12448,7 @@
         <w:pStyle w:val="BodyText"/>
       </w:pPr>
       <w:r>
-        <w:t xml:space="preserve">Guo, J. &amp; Schwalbe-Koda, D. (2026). Generative inversion of spectroscopic data for amorphous structure elucidation. arXiv:2603.23210.</w:t>
-      </w:r>
-    </w:p>
-    <w:p>
-      <w:pPr>
-        <w:pStyle w:val="BodyText"/>
-      </w:pPr>
-      <w:r>
-        <w:t xml:space="preserve">Jiao, R., Huang, W., Lin, P., Han, J., Chen, P., Lu, Y. &amp; Liu, Y. (2023). Crystal structure prediction by joint equivariant diffusion.</w:t>
+        <w:t xml:space="preserve">Guo, G., Saidi, T. L., Terban, M. W., Valsecchi, M., Billinge, S. J. L. &amp; Lipson, H. (2025).</w:t>
       </w:r>
       <w:r>
         <w:t xml:space="preserve"> </w:t>
@@ -11424,10 +12458,47 @@
           <w:i/>
           <w:iCs/>
         </w:rPr>
-        <w:t xml:space="preserve">Advances in Neural Information Processing Systems</w:t>
-      </w:r>
-      <w:r>
-        <w:t xml:space="preserve">, Vol. 36.</w:t>
+        <w:t xml:space="preserve">Nat. Mater.</w:t>
+      </w:r>
+      <w:r>
+        <w:t xml:space="preserve"> </w:t>
+      </w:r>
+      <w:r>
+        <w:rPr>
+          <w:b/>
+          <w:bCs/>
+        </w:rPr>
+        <w:t xml:space="preserve">24</w:t>
+      </w:r>
+      <w:r>
+        <w:t xml:space="preserve">, 1726–1734. DOI: 10.1038/s41563-025-02220-y (Author Correction: 10.1038/s41563-025-02301-y; preprint arXiv:2406.10796). Reproduced from HF checkpoint</w:t>
+      </w:r>
+      <w:r>
+        <w:t xml:space="preserve"> </w:t>
+      </w:r>
+      <w:r>
+        <w:rPr>
+          <w:rStyle w:val="VerbatimChar"/>
+        </w:rPr>
+        <w:t xml:space="preserve">therealgabeguo/cdvae_xrd_sinc100</w:t>
+      </w:r>
+      <w:r>
+        <w:t xml:space="preserve"> </w:t>
+      </w:r>
+      <w:r>
+        <w:t xml:space="preserve">and code at</w:t>
+      </w:r>
+      <w:r>
+        <w:t xml:space="preserve"> </w:t>
+      </w:r>
+      <w:r>
+        <w:rPr>
+          <w:rStyle w:val="VerbatimChar"/>
+        </w:rPr>
+        <w:t xml:space="preserve">github.com/gabeguo/cdvae_xrd</w:t>
+      </w:r>
+      <w:r>
+        <w:t xml:space="preserve">.</w:t>
       </w:r>
     </w:p>
     <w:p>
@@ -11435,7 +12506,15 @@
         <w:pStyle w:val="BodyText"/>
       </w:pPr>
       <w:r>
-        <w:t xml:space="preserve">Johansen, F. L., Friis-Jensen, U., Dam, E. B., Jensen, K. M. Ø., Mercado, R. &amp; Selvan, R. (2025). deCIFer: crystal structure prediction from powder diffraction data using autoregressive language models.</w:t>
+        <w:t xml:space="preserve">Guo, J. &amp; Schwalbe-Koda, D. (2026). Generative inversion of spectroscopic data for amorphous structure elucidation. arXiv:2603.23210.</w:t>
+      </w:r>
+    </w:p>
+    <w:p>
+      <w:pPr>
+        <w:pStyle w:val="BodyText"/>
+      </w:pPr>
+      <w:r>
+        <w:t xml:space="preserve">Jiao, R., Huang, W., Lin, P., Han, J., Chen, P., Lu, Y. &amp; Liu, Y. (2023). Crystal structure prediction by joint equivariant diffusion.</w:t>
       </w:r>
       <w:r>
         <w:t xml:space="preserve"> </w:t>
@@ -11445,13 +12524,10 @@
           <w:i/>
           <w:iCs/>
         </w:rPr>
-        <w:t xml:space="preserve">Transactions on Machine Learning Research</w:t>
-      </w:r>
-      <w:r>
-        <w:t xml:space="preserve"> </w:t>
-      </w:r>
-      <w:r>
-        <w:t xml:space="preserve">(arXiv:2502.02189).</w:t>
+        <w:t xml:space="preserve">Advances in Neural Information Processing Systems</w:t>
+      </w:r>
+      <w:r>
+        <w:t xml:space="preserve">, Vol. 36.</w:t>
       </w:r>
     </w:p>
     <w:p>
@@ -11459,7 +12535,7 @@
         <w:pStyle w:val="BodyText"/>
       </w:pPr>
       <w:r>
-        <w:t xml:space="preserve">Lai, Q., Xu, F., Yao, L., Gao, Z., Liu, S., Wang, H., Lu, S., He, D., Wang, L., Zhang, L., Wang, C. &amp; Ke, G. (2025).</w:t>
+        <w:t xml:space="preserve">Johansen, F. L., Friis-Jensen, U., Dam, E. B., Jensen, K. M. Ø., Mercado, R. &amp; Selvan, R. (2025). deCIFer: crystal structure prediction from powder diffraction data using autoregressive language models.</w:t>
       </w:r>
       <w:r>
         <w:t xml:space="preserve"> </w:t>
@@ -11469,6 +12545,30 @@
           <w:i/>
           <w:iCs/>
         </w:rPr>
+        <w:t xml:space="preserve">Transactions on Machine Learning Research</w:t>
+      </w:r>
+      <w:r>
+        <w:t xml:space="preserve"> </w:t>
+      </w:r>
+      <w:r>
+        <w:t xml:space="preserve">(arXiv:2502.02189).</w:t>
+      </w:r>
+    </w:p>
+    <w:p>
+      <w:pPr>
+        <w:pStyle w:val="BodyText"/>
+      </w:pPr>
+      <w:r>
+        <w:t xml:space="preserve">Lai, Q., Xu, F., Yao, L., Gao, Z., Liu, S., Wang, H., Lu, S., He, D., Wang, L., Zhang, L., Wang, C. &amp; Ke, G. (2025).</w:t>
+      </w:r>
+      <w:r>
+        <w:t xml:space="preserve"> </w:t>
+      </w:r>
+      <w:r>
+        <w:rPr>
+          <w:i/>
+          <w:iCs/>
+        </w:rPr>
         <w:t xml:space="preserve">Adv. Sci.</w:t>
       </w:r>
       <w:r>
@@ -11750,6 +12850,37 @@
       </w:r>
       <w:r>
         <w:t xml:space="preserve">.</w:t>
+      </w:r>
+    </w:p>
+    <w:p>
+      <w:pPr>
+        <w:pStyle w:val="BodyText"/>
+      </w:pPr>
+      <w:r>
+        <w:t xml:space="preserve">Werner, P.-E., Eriksson, L. &amp; Westdahl, M. (1985).</w:t>
+      </w:r>
+      <w:r>
+        <w:t xml:space="preserve"> </w:t>
+      </w:r>
+      <w:r>
+        <w:rPr>
+          <w:i/>
+          <w:iCs/>
+        </w:rPr>
+        <w:t xml:space="preserve">J. Appl. Cryst.</w:t>
+      </w:r>
+      <w:r>
+        <w:t xml:space="preserve"> </w:t>
+      </w:r>
+      <w:r>
+        <w:rPr>
+          <w:b/>
+          <w:bCs/>
+        </w:rPr>
+        <w:t xml:space="preserve">18</w:t>
+      </w:r>
+      <w:r>
+        <w:t xml:space="preserve">, 367–370. DOI: 10.1107/S0021889885010512.</w:t>
       </w:r>
     </w:p>
     <w:p>
@@ -12684,11 +13815,68 @@
               <w:pStyle w:val="Compact"/>
             </w:pPr>
             <w:r>
+              <w:t xml:space="preserve">v21</w:t>
+            </w:r>
+          </w:p>
+        </w:tc>
+        <w:tc>
+          <w:tcPr/>
+          <w:p>
+            <w:pPr>
+              <w:pStyle w:val="Compact"/>
+            </w:pPr>
+            <w:r>
+              <w:t xml:space="preserve">3.7 M</w:t>
+            </w:r>
+          </w:p>
+        </w:tc>
+        <w:tc>
+          <w:tcPr/>
+          <w:p>
+            <w:pPr>
+              <w:pStyle w:val="Compact"/>
+            </w:pPr>
+            <w:r>
+              <w:t xml:space="preserve">Phase 9 final: v13 architecture + Phase 9 retrain + indexer drop-in support (submitted version; trained with the §5.7 (a) and (b) defects)</w:t>
+            </w:r>
+          </w:p>
+        </w:tc>
+        <w:tc>
+          <w:tcPr/>
+          <w:p>
+            <w:pPr>
+              <w:pStyle w:val="Compact"/>
+            </w:pPr>
+            <w:r>
+              <w:t xml:space="preserve">0 % (learned head), 1.6 % (indexer, crystal system given), 4.5 % (true-lat oracle), all 3-seed</w:t>
+            </w:r>
+          </w:p>
+        </w:tc>
+        <w:tc>
+          <w:tcPr/>
+          <w:p>
+            <w:pPr>
+              <w:pStyle w:val="Compact"/>
+            </w:pPr>
+            <w:r>
+              <w:t xml:space="preserve">§5.7</w:t>
+            </w:r>
+          </w:p>
+        </w:tc>
+      </w:tr>
+      <w:tr>
+        <w:tc>
+          <w:tcPr/>
+          <w:p>
+            <w:pPr>
+              <w:pStyle w:val="Compact"/>
+            </w:pPr>
+            <w:r>
               <w:rPr>
                 <w:b/>
                 <w:bCs/>
               </w:rPr>
-              <w:t xml:space="preserve">v21</w:t>
+              <w:t xml:space="preserve">v22</w:t>
             </w:r>
           </w:p>
         </w:tc>
@@ -12714,7 +13902,7 @@
               <w:pStyle w:val="Compact"/>
             </w:pPr>
             <w:r>
-              <w:t xml:space="preserve">Phase 9 final: v13 architecture + Phase 9 retrain + indexer drop-in support</w:t>
+              <w:t xml:space="preserve">v21 configuration retrained from scratch with the corrected form factor and the corrected x₀-mode Debye loss (§5.7)</w:t>
             </w:r>
           </w:p>
         </w:tc>
@@ -12729,18 +13917,18 @@
                 <w:b/>
                 <w:bCs/>
               </w:rPr>
-              <w:t xml:space="preserve">1.6 % match (no-true-lat, indexer); 4.5 % (true-lat oracle, 3-seed)</w:t>
-            </w:r>
-          </w:p>
-        </w:tc>
-        <w:tc>
-          <w:tcPr/>
-          <w:p>
-            <w:pPr>
-              <w:pStyle w:val="Compact"/>
-            </w:pPr>
-            <w:r>
-              <w:t xml:space="preserve">Tables 2, 3</w:t>
+              <w:t xml:space="preserve">1.9 % (learned head), 1.6 % (indexer, crystal system given), 5.5 % (true-lat oracle), all 3-seed</w:t>
+            </w:r>
+          </w:p>
+        </w:tc>
+        <w:tc>
+          <w:tcPr/>
+          <w:p>
+            <w:pPr>
+              <w:pStyle w:val="Compact"/>
+            </w:pPr>
+            <w:r>
+              <w:t xml:space="preserve">Tables 2, 2a, 3</w:t>
             </w:r>
           </w:p>
         </w:tc>

</xml_diff>

<commit_message>
JAC R1 pre-upload audit: §5.5 perturbation numbers corrected to the released record (+§5.7e), knee → working tolerance, §5.4 defect caveat, sampling-seed statements, regression reading hedged, Fig. 4 redrawn with Wilson CIs + deCIFer, captions matched to figures, abstract 463→270 words; pdf/docx rebuilt
</commit_message>
<xml_diff>
--- a/paper/paper.docx
+++ b/paper/paper.docx
@@ -65,7 +65,7 @@
         <w:t xml:space="preserve"> </w:t>
       </w:r>
       <w:r>
-        <w:t xml:space="preserve">A deliberately small conditional diffusion model for powder-diffraction structure inversion is used as a diagnostic instrument. A controlled ablation shows that restoring absolute peak positions to the lattice head, by position-aware pooling or by explicit d-spacings, does not reduce its ~1.3 Å cell error; the evidence points to the regression formulation of lattice recovery, not to the pooling stage. A classical autoindexer, supplied with the true crystal system, serves as a control; three external generative models are re-scored on one shared evaluation harness; and a code audit prompted by review corrects three implementation errors. Retraining with the corrected loss lifts the learned head from 0 to 1.9 %, level with the control, while the true-lattice oracle stays at 5.5 %, so the gap to the oracle is the effect that replicates.</w:t>
+        <w:t xml:space="preserve">A deliberately small conditional diffusion model for powder-diffraction structure inversion is used as a diagnostic instrument: a true-lattice oracle lifts its match rate from 1.9 to 5.5 %, while a controlled ablation shows that restoring absolute peak positions to the auxiliary lattice head reduces the cell error by at most 13 % and closes none of that gap. A classical autoindexer serves as a control, three external models are re-scored on one harness, and a review-prompted code audit corrects three implementation errors.</w:t>
       </w:r>
     </w:p>
     <w:p>
@@ -89,7 +89,7 @@
         <w:pStyle w:val="FirstParagraph"/>
       </w:pPr>
       <w:r>
-        <w:t xml:space="preserve">Inverting a one-dimensional powder X-ray diffraction (PXRD) pattern to a three-dimensional crystal structure remains an open problem. Recent generative approaches report results under mutually incompatible protocols, and their failure modes are seldom catalogued. This paper is a diagnostic study. PXRD-Diff, a 3.7 M-parameter conditional diffusion model trained on the CDVAE MP-20 split, is kept deliberately small so that its failure modes are visible; it is not proposed as a competitive inversion tool. DiffractGPT, PXRDnet and deCIFer are re-scored through the same pymatgen StructureMatcher harness and reach 18.9 %, 30.0 % and 73.8 % match respectively; PXRD-Diff reaches 1.9 %. The central finding is mechanistic. The learned PXRD encoder reaches a 0.007 normalised auxiliary lattice-regression loss in isolation, yet substituting that head’s own lattice into the sampler recovers only 1.2 % of structures, because its ~1.1 Å length error shifts every Bragg peak by ~15 %. Stronger, constrained supervision of the head does not reduce that error. A controlled ablation on the frozen encoder shows that restoring absolute peak positions to the head, by position-aware attention pooling or by explicit d-spacing features, leaves the error unchanged (1.28–1.31 Å across three arms, against 1.32 Å for the checkpoint’s own head), so the earlier reading that global pooling discards the d-spacings is withdrawn. The evidence now points to the regression formulation itself: a head handed the same d-spacings the autoindexer reads does not perform the peak-to-index assignment that turns them into a cell. A perturbation study locates a sharp sensitivity knee at ~0.5 Å cell error. A true-lattice oracle lifts match to 5.5 % at n = 1000 (three seeds; 95 % Wilson confidence interval [4.7, 6.4]), against 1.9 % [1.5, 2.5] for the learned head (paired McNemar p &lt; 10⁻¹⁷). As a classical control, a Q-space autoindexer that is supplied with the true crystal system replaces the learned lattice head and reaches 1.6 % [1.2, 2.1] (1.4 % without the crystal system); its cells are far closer to the truth (pattern Pearson 0.41 against 0.18), yet at three seeds it ties the learned head on match rate (42 fixed, 52 broken, p = 0.35), fixing hexagonal and tetragonal structures and losing cubic ones. A code audit prompted by review found and corrected three implementation errors, including an atomic form factor evaluated in the wrong convention and a Debye loss evaluated on the wrong tensor. The corrected simulator agrees with pymatgen at a median Pearson correlation of 0.999 over 1000 structures. Retraining the production checkpoint with the corrections raised the learned head from 0 to 1.9 % and removed the indexer’s aggregate lead reported in the submitted version; the oracle gap is the result that replicates. The contributions are the lattice-recovery bottleneck diagnosis, a four-item failure catalogue, the shared evaluation harness and the audited, released code.</w:t>
+        <w:t xml:space="preserve">Inverting a one-dimensional powder X-ray diffraction (PXRD) pattern to a crystal structure remains an open problem. This paper is a diagnostic study. PXRD-Diff, a 3.7 M-parameter conditional diffusion model trained on the MP-20 split of the CDVAE benchmark, is kept deliberately small so that its failures are visible; it is not proposed as a competitive tool. On one pymatgen StructureMatcher harness, DiffractGPT, PXRDnet and deCIFer reach 18.9, 30.0 and 73.8 % match; PXRD-Diff reaches 1.9 %. The central finding is a paired oracle gap that replicates across checkpoints and seeds: a true-lattice oracle lifts match to 5.5 % (n = 1000, three sampling seeds on one trained checkpoint; 95 % Wilson interval [4.7, 6.4]) against 1.9 % [1.5, 2.5] for the learned lattice (paired McNemar p = 3 × 10⁻¹⁸), and pattern agreement falls tenfold once the cell-length error reaches ~0.4 Å. The encoder’s auxiliary head fits the lattice to a 0.007 normalised training loss yet leaves a 1.1–1.3 Å test error, and a controlled ablation on the frozen encoder shows that handing it absolute peak positions, by position-aware pooling or explicit d-spacings, reduces that error by at most 13 % and recovers no more structures end to end. The submitted reading that global pooling discards the d-spacings is withdrawn (§5.6). A classical autoindexer given the true crystal system reaches 1.6 % [1.2, 2.1] (1.4 % without it) and is not distinguishable from the learned head (p = 0.35). A code audit prompted by review corrected three implementation errors; retraining with them raised the learned head from 0 to 1.9 % and removed the indexer’s lead of the submitted version.</w:t>
       </w:r>
     </w:p>
     <w:p>
@@ -132,7 +132,7 @@
         <w:pStyle w:val="FirstParagraph"/>
       </w:pPr>
       <w:r>
-        <w:t xml:space="preserve">PXRD is the most common structural-characterization measurement in solid-state chemistry. The forward problem is solved by 1920s structure-factor physics and a one-line</w:t>
+        <w:t xml:space="preserve">PXRD is the most common structural-characterisation measurement in solid-state chemistry. The forward problem is solved by 1920s structure-factor physics and a one-line</w:t>
       </w:r>
       <w:r>
         <w:t xml:space="preserve"> </w:t>
@@ -215,7 +215,7 @@
         <w:t xml:space="preserve">PXRD-Diff</w:t>
       </w:r>
       <w:r>
-        <w:t xml:space="preserve">) and use it as a diagnostic instrument. Its size is a design choice: a 3.7 M-parameter model exposes a lattice-recovery bottleneck that capacity would hide. It is not proposed as an alternative to the larger systems it is compared with. Contributions:</w:t>
+        <w:t xml:space="preserve">) and use it as a diagnostic instrument. Its size is a design choice: a 3.7 M-parameter model exposes a lattice-recovery failure that the larger systems of Table 3 evidently do not share, whether through capacity, architecture, training data or inference compute (not separated here). It is not proposed as an alternative to the larger systems it is compared with. Contributions:</w:t>
       </w:r>
     </w:p>
     <w:p>
@@ -237,7 +237,20 @@
         <w:t xml:space="preserve"> </w:t>
       </w:r>
       <w:r>
-        <w:t xml:space="preserve">3.7 M parameters, trains on a single RTX 5090 in ~1.5 h on CDVAE MP-20. A PyTorch port of the</w:t>
+        <w:t xml:space="preserve">3.7 M parameters, trains on a single RTX 5090 in ~1.9 h on the MP-20 split of the CDVAE benchmark (Crystal Diffusion Variational Autoencoder; Xie</w:t>
+      </w:r>
+      <w:r>
+        <w:t xml:space="preserve"> </w:t>
+      </w:r>
+      <w:r>
+        <w:rPr>
+          <w:i/>
+          <w:iCs/>
+        </w:rPr>
+        <w:t xml:space="preserve">et al.</w:t>
+      </w:r>
+      <w:r>
+        <w:t xml:space="preserve">, 2022). A PyTorch port of the</w:t>
       </w:r>
       <w:r>
         <w:t xml:space="preserve"> </w:t>
@@ -274,7 +287,7 @@
         <w:t xml:space="preserve"> </w:t>
       </w:r>
       <w:r>
-        <w:t xml:space="preserve">A perturbation study (§5.5) locates a sharp ~0.5 Å sensitivity knee. A true-lattice oracle lifts match to</w:t>
+        <w:t xml:space="preserve">A true-lattice oracle lifts match to</w:t>
       </w:r>
       <w:r>
         <w:t xml:space="preserve"> </w:t>
@@ -290,7 +303,7 @@
         <w:t xml:space="preserve"> </w:t>
       </w:r>
       <w:r>
-        <w:t xml:space="preserve">at n = 1000 (three seeds; Wilson 95 % CI [4.7, 6.4]) from 1.9 % [1.5, 2.5] for the learned head (paired McNemar p &lt; 10⁻¹⁷). The encoder reaches a 0.007</w:t>
+        <w:t xml:space="preserve">at n = 1000 (three sampling seeds on one trained checkpoint; Wilson 95 % CI [4.7, 6.4]) from 1.9 % [1.5, 2.5] for the learned head (paired McNemar p = 3 × 10⁻¹⁸), and a perturbation study (§5.5) shows that recovery is not graceful: pattern agreement falls tenfold by ~0.4 Å of cell-length error, so ~0.5 Å is used as a working tolerance. The encoder’s auxiliary head reaches a 0.007</w:t>
       </w:r>
       <w:r>
         <w:t xml:space="preserve"> </w:t>
@@ -306,7 +319,7 @@
         <w:t xml:space="preserve"> </w:t>
       </w:r>
       <w:r>
-        <w:t xml:space="preserve">aux lattice loss, yet its head’s lattice recovers only 1.2 % end to end, a ~1.1 Å error well above the knee (§5.6). A controlled pooling ablation (§5.6) finds that neither position-aware pooling nor explicit peak-position features reduce that error, so the evidence points to the regression formulation rather than to the pooled encoding. The 5.5 % oracle ceiling shows coordinates remain a co-bottleneck.</w:t>
+        <w:t xml:space="preserve">training loss, yet its lattice recovers only 1.2 % end to end, a 1.1 Å error well above that tolerance (§5.6). A controlled pooling ablation (§5.6) finds that neither position-aware pooling nor explicit peak-position features reduce the error by more than 13 % or recover more structures end to end, so the best-supported reading, offered as a hypothesis, is the regression formulation rather than the pooled encoding. The 5.5 % oracle ceiling shows coordinates remain a co-limiter.</w:t>
       </w:r>
     </w:p>
     <w:p>
@@ -328,7 +341,7 @@
         <w:t xml:space="preserve"> </w:t>
       </w:r>
       <w:r>
-        <w:t xml:space="preserve">A Q-space autoindexer, supplied with the true crystal system, replaces the learned lattice head at sampling time and reaches 1.6 % [1.2, 2.1]. With the submitted checkpoint the learned head recovered nothing and the indexer’s lead was significant (27 fixed, 0 broken); with the checkpoint retrained under the corrected loss the two tie at three seeds (42 fixed, 52 broken, p = 0.35), the indexer winning the hexagonal and tetragonal structures below the 0.5 Å knee and the learned head the cubic ones (§5.2). This is a sanity check on the diagnosis, not a method: a fifty-year-old algorithm given extra prior information is expected to match or beat the learned head. Without the crystal system the indexer indexes 43.4 % of cells against 48.8 % and recovers 1.4 % [1.0, 1.9] downstream (§3.5).</w:t>
+        <w:t xml:space="preserve">A Q-space autoindexer, supplied with the true crystal system, replaces the learned lattice head at sampling time and reaches 1.6 % [1.2, 2.1]. With the submitted checkpoint the learned head recovered nothing and the indexer’s lead was significant (27 fixed, 0 broken); with the checkpoint retrained under the corrected loss the two tie at three seeds (42 fixed, 52 broken, p = 0.35), the indexer fixing hexagonal and tetragonal structures and the learned head cubic ones, a post-hoc per-system split (§5.2). This is a sanity check on the diagnosis, not a method: a fifty-year-old algorithm given extra prior information is expected to match or beat the learned head. Without the crystal system the indexer indexes 43.4 % of cells against 48.8 % and recovers 1.4 % [1.0, 1.9] downstream (§3.5).</w:t>
       </w:r>
     </w:p>
     <w:p>
@@ -350,7 +363,7 @@
         <w:t xml:space="preserve"> </w:t>
       </w:r>
       <w:r>
-        <w:t xml:space="preserve">Top-K Debye rerank, Debye-gradient DDIM guidance, Wyckoff-letter embeddings and a distance-matrix aux loss all fail at n ≥ 200; the latter two combined (v14) underperform the bare ε baseline. The gradient-guidance failure agrees with independent work showing the PXRD loss landscape is too rough for gradient descent (Segal</w:t>
+        <w:t xml:space="preserve">Top-K Debye rerank, Debye-gradient guidance of the sampler, Wyckoff-letter embeddings and a distance-matrix aux loss did not improve match rate under the conditions tested: the two Debye-based interventions ran with the submitted simulator and were not rerun (§5.4, §5.7), and the Wyckoff and distance-loss runs are single-seed comparisons against a baseline later shown to be a high draw (§7). The robust signal is the order-of-magnitude lattice-loss destabilisation under the Wyckoff embedding, which is read narrowly: the embedding carried a label, not a constraint (§5.4). The gradient-guidance failure agrees with independent work showing the PXRD loss landscape is too rough for gradient descent (Segal</w:t>
       </w:r>
       <w:r>
         <w:t xml:space="preserve"> </w:t>
@@ -363,7 +376,7 @@
         <w:t xml:space="preserve">et al.</w:t>
       </w:r>
       <w:r>
-        <w:t xml:space="preserve">, 2025). The Wyckoff result is read narrowly: the embedding carried a label, not a constraint (§5.4).</w:t>
+        <w:t xml:space="preserve">, 2026).</w:t>
       </w:r>
     </w:p>
     <w:p>
@@ -385,7 +398,7 @@
         <w:t xml:space="preserve"> </w:t>
       </w:r>
       <w:r>
-        <w:t xml:space="preserve">DiffractGPT (Mistral-7B + LoRA), PXRDnet (CDVAE + XRD encoder) and deCIFer are re-scored on our harness:</w:t>
+        <w:t xml:space="preserve">DiffractGPT (Mistral-7B with low-rank adaptation, LoRA), PXRDnet (CDVAE + XRD encoder) and deCIFer are re-scored on our harness:</w:t>
       </w:r>
       <w:r>
         <w:t xml:space="preserve"> </w:t>
@@ -401,7 +414,7 @@
         <w:t xml:space="preserve"> </w:t>
       </w:r>
       <w:r>
-        <w:t xml:space="preserve">match (DGpt, n = 1000),</w:t>
+        <w:t xml:space="preserve">match (DiffractGPT, hereafter DGpt; n = 990 parseable of 1000),</w:t>
       </w:r>
       <w:r>
         <w:t xml:space="preserve"> </w:t>
@@ -455,7 +468,7 @@
         <w:t xml:space="preserve"> </w:t>
       </w:r>
       <w:r>
-        <w:t xml:space="preserve">Review of the released code identified three implementation errors: the atomic form factor was evaluated in the wrong convention, the Debye loss in x₀-residual mode was evaluated on the wrong tensor, and patterns the indexer could not index were silently given the true lattice. §5.7 reports each error, its effect on every published number, and what was re-run.</w:t>
+        <w:t xml:space="preserve">Review of the released code identified three implementation errors: the atomic form factor was evaluated in the wrong convention, the Debye loss in x₀-residual mode was evaluated on the wrong tensor, and patterns the indexer could not index were silently given the true lattice. A systematic text-versus-record check found two further discrepancies. §5.7 reports each item, its effect on every published number, and what was re-run.</w:t>
       </w:r>
     </w:p>
     <w:p>
@@ -547,7 +560,7 @@
         <w:t xml:space="preserve"> </w:t>
       </w:r>
       <w:r>
-        <w:t xml:space="preserve">DiffractGPT (Choudhary, 2025) is a fine-tuned Mistral-7B that decodes peak list + formula → CIF tokens. Crystalyze (Riesel</w:t>
+        <w:t xml:space="preserve">DiffractGPT (Choudhary, 2025) is a fine-tuned Mistral-7B that decodes peak list + formula → Crystallographic Information File (CIF) tokens. Crystalyze (Riesel</w:t>
       </w:r>
       <w:r>
         <w:t xml:space="preserve"> </w:t>
@@ -589,23 +602,7 @@
         <w:t xml:space="preserve"> </w:t>
       </w:r>
       <w:r>
-        <w:t xml:space="preserve">(~3.5 M decoder ops/material), published in</w:t>
-      </w:r>
-      <w:r>
-        <w:t xml:space="preserve"> </w:t>
-      </w:r>
-      <w:r>
-        <w:rPr>
-          <w:i/>
-          <w:iCs/>
-        </w:rPr>
-        <w:t xml:space="preserve">Nature Materials</w:t>
-      </w:r>
-      <w:r>
-        <w:t xml:space="preserve"> </w:t>
-      </w:r>
-      <w:r>
-        <w:t xml:space="preserve">in 2025. deCIFer (Johansen</w:t>
+        <w:t xml:space="preserve">(~3.5 M decoder ops/material). deCIFer (Johansen</w:t>
       </w:r>
       <w:r>
         <w:t xml:space="preserve"> </w:t>
@@ -1147,7 +1144,7 @@
         <w:t xml:space="preserve"> </w:t>
       </w:r>
       <w:r>
-        <w:t xml:space="preserve">parametrised by</w:t>
+        <w:t xml:space="preserve">parameterised by</w:t>
       </w:r>
       <w:r>
         <w:t xml:space="preserve"> </w:t>
@@ -2026,7 +2023,7 @@
         </m:sSup>
       </m:oMath>
       <w:r>
-        <w:t xml:space="preserve">. The lattice head is a small MLP applied to</w:t>
+        <w:t xml:space="preserve">. The lattice head is a small multilayer perceptron (MLP) applied to</w:t>
       </w:r>
       <w:r>
         <w:t xml:space="preserve"> </w:t>
@@ -2288,7 +2285,40 @@
         <w:t xml:space="preserve"> </w:t>
       </w:r>
       <w:r>
-        <w:t xml:space="preserve">alone, trained with an MSE loss against the (normalised) ground-truth lattice. Its purpose is purely diagnostic, to expose whether the encoder is learning any lattice-relevant representation, and its loss does not flow back into the denoiser.</w:t>
+        <w:t xml:space="preserve">alone, trained with an MSE loss against the (normalised) ground-truth lattice. Its purpose is purely diagnostic, to expose whether the encoder is learning any lattice-relevant representation, and its loss does not flow back into the denoiser. Throughout,</w:t>
+      </w:r>
+      <w:r>
+        <w:t xml:space="preserve"> </w:t>
+      </w:r>
+      <w:r>
+        <w:t xml:space="preserve">“learned head”</w:t>
+      </w:r>
+      <w:r>
+        <w:t xml:space="preserve"> </w:t>
+      </w:r>
+      <w:r>
+        <w:t xml:space="preserve">denotes the denoiser’s lattice channel, whose sampled cell the full pipeline uses;</w:t>
+      </w:r>
+      <w:r>
+        <w:t xml:space="preserve"> </w:t>
+      </w:r>
+      <w:r>
+        <w:t xml:space="preserve">“auxiliary head”</w:t>
+      </w:r>
+      <w:r>
+        <w:t xml:space="preserve"> </w:t>
+      </w:r>
+      <w:r>
+        <w:t xml:space="preserve">(or</w:t>
+      </w:r>
+      <w:r>
+        <w:t xml:space="preserve"> </w:t>
+      </w:r>
+      <w:r>
+        <w:t xml:space="preserve">“aux head”</w:t>
+      </w:r>
+      <w:r>
+        <w:t xml:space="preserve">) denotes this diagnostic regressor.</w:t>
       </w:r>
     </w:p>
     <w:bookmarkEnd w:id="13"/>
@@ -3139,7 +3169,7 @@
         <w:t xml:space="preserve"> </w:t>
       </w:r>
       <w:r>
-        <w:t xml:space="preserve">The submitted version of this paper evaluated the form factor as the bare sum</w:t>
+        <w:t xml:space="preserve">The submitted version evaluated the form factor as the bare sum</w:t>
       </w:r>
       <w:r>
         <w:t xml:space="preserve"> </w:t>
@@ -3230,7 +3260,7 @@
         <w:t xml:space="preserve"> </w:t>
       </w:r>
       <w:r>
-        <w:t xml:space="preserve">with the same coefficients. That expression is not the one the coefficients were fitted for. It gives the wrong element weighting: for silicon it returns</w:t>
+        <w:t xml:space="preserve">with the same coefficients, which is not the expression they were fitted for: it gives the wrong element weighting (for silicon</w:t>
       </w:r>
       <w:r>
         <w:t xml:space="preserve"> </w:t>
@@ -3268,7 +3298,7 @@
         <w:t xml:space="preserve"> </w:t>
       </w:r>
       <w:r>
-        <w:t xml:space="preserve">where the correct value is</w:t>
+        <w:t xml:space="preserve">where</w:t>
       </w:r>
       <w:r>
         <w:t xml:space="preserve"> </w:t>
@@ -3288,7 +3318,7 @@
         </m:r>
       </m:oMath>
       <w:r>
-        <w:t xml:space="preserve">, and it decays too quickly with</w:t>
+        <w:t xml:space="preserve">) and decays too quickly with</w:t>
       </w:r>
       <w:r>
         <w:t xml:space="preserve"> </w:t>
@@ -3299,7 +3329,7 @@
         </m:r>
       </m:oMath>
       <w:r>
-        <w:t xml:space="preserve">. Both referees who inspected the code identified the discrepancy. The module was corrected to the expression above and re-validated (below). The production checkpoint (v21) was retrained from scratch with the corrected module and the corrected x₀-mode loss of §3.4, under otherwise identical settings; the retrained checkpoint (v22) is the one behind Tables 2, 2a and 3 and Figs 4 and 5, and §5.2 and §5.7 give the effect. The exploratory Phase-4 rows of Table 1 were not retrained (§5.1).</w:t>
+        <w:t xml:space="preserve">. Both referees who inspected the code identified the discrepancy. The module was corrected and re-validated (below), and the production checkpoint was retrained from scratch with the corrected module and the corrected x₀-mode loss of §3.4 (v22, behind Tables 2, 2a and 3 and Fig. 4); §5.7(a) gives the accounting, and the exploratory Phase-4 rows of Table 1 were not retrained (§5.1).</w:t>
       </w:r>
     </w:p>
     <w:p>
@@ -3332,7 +3362,7 @@
         <w:t xml:space="preserve"> </w:t>
       </w:r>
       <w:r>
-        <w:t xml:space="preserve">reference, both on the 256-bin coarse grid. With the corrected form factor the mean is 0.988 and the median 0.999; 98.0 % of structures exceed 0.9. With the submitted version’s form factor the same structures give a mean of 0.952 and a median of 0.969; 90.7 % exceed 0.9. The correction improves the agreement for every one of the 1000 structures. On the first 50 structures the means are 0.939 (submitted form factor) and 0.974 (corrected). The submitted version reported 0.962 on 50 structures with the validation script’s default reflection range (</w:t>
+        <w:t xml:space="preserve">reference, both on the 256-bin coarse grid (Fig. 1). With the corrected form factor the mean is 0.988 and the median 0.999; 98.0 % of structures exceed 0.9. With the submitted version’s form factor the same structures give a mean of 0.952 and a median of 0.969; 90.7 % exceed 0.9. The corrected expression scores at least as high on every one of the 1000 structures. On the first 50 structures the means are 0.939 (submitted form factor) and 0.974 (corrected). The submitted version reported 0.962 on 50 structures with the validation script’s default reflection range (</w:t>
       </w:r>
       <m:oMath>
         <m:r>
@@ -3423,7 +3453,7 @@
         <w:t xml:space="preserve"> </w:t>
       </w:r>
       <w:r>
-        <w:t xml:space="preserve">training grid used above; Appendix C reproduces that value for the submitted expression (0.963 on the first 50, 0.960 on all 1000), gives 0.999 for the corrected expression at both sizes, and shows that the lower tail is a truncation effect of the</w:t>
+        <w:t xml:space="preserve">training grid used above. Appendix C reproduces that value for the submitted expression (0.963 on the first 50, 0.960 on all 1000), gives 0.999 for the corrected expression at both sizes, and shows that the lower tail is a truncation effect of the</w:t>
       </w:r>
       <w:r>
         <w:t xml:space="preserve"> </w:t>
@@ -3456,7 +3486,7 @@
           <wp:inline>
             <wp:extent cx="4135408" cy="2669925"/>
             <wp:effectExtent b="0" l="0" r="0" t="0"/>
-            <wp:docPr descr="Figure 1. Differentiable-simulator validation. Distribution of Pearson correlation between the PyTorch DiffPXRD module and pymatgen.XRDCalculator over the first 1000 MP-20 test structures, with the corrected form factor (mean 0.988, median 0.999) and with the form factor of the submitted version (mean 0.952, median 0.969). The correction improves every structure. The residual lower tail is dominated by layered structures with strong texture in the reference." title="" id="15" name="Picture"/>
+            <wp:docPr descr="Figure 1. Differentiable-simulator validation. Distribution of Pearson correlation between the PyTorch DiffPXRD module and pymatgen.XRDCalculator over the first 1000 MP-20 test structures, with the corrected form factor (mean 0.988, median 0.999) and with the form factor of the submitted version (mean 0.952, median 0.969). The corrected expression scores at least as high on every structure. The residual lower tail is a truncation effect of the |h|,|k|,|l| \le 5 reflection range on small cells (Appendix C)." title="" id="15" name="Picture"/>
             <a:graphic>
               <a:graphicData uri="http://schemas.openxmlformats.org/drawingml/2006/picture">
                 <pic:pic>
@@ -3524,7 +3554,84 @@
         <w:t xml:space="preserve"> </w:t>
       </w:r>
       <w:r>
-        <w:t xml:space="preserve">over the first 1000 MP-20 test structures, with the corrected form factor (mean 0.988, median 0.999) and with the form factor of the submitted version (mean 0.952, median 0.969). The correction improves every structure. The residual lower tail is dominated by layered structures with strong texture in the reference.</w:t>
+        <w:t xml:space="preserve">over the first 1000 MP-20 test structures, with the corrected form factor (mean 0.988, median 0.999) and with the form factor of the submitted version (mean 0.952, median 0.969). The corrected expression scores at least as high on every structure. The residual lower tail is a truncation effect of the</w:t>
+      </w:r>
+      <w:r>
+        <w:t xml:space="preserve"> </w:t>
+      </w:r>
+      <m:oMath>
+        <m:r>
+          <m:rPr>
+            <m:sty m:val="p"/>
+          </m:rPr>
+          <m:t>|</m:t>
+        </m:r>
+        <m:r>
+          <m:t>h</m:t>
+        </m:r>
+        <m:r>
+          <m:rPr>
+            <m:sty m:val="p"/>
+          </m:rPr>
+          <m:t>|</m:t>
+        </m:r>
+        <m:r>
+          <m:rPr>
+            <m:sty m:val="p"/>
+          </m:rPr>
+          <m:t>,</m:t>
+        </m:r>
+        <m:r>
+          <m:rPr>
+            <m:sty m:val="p"/>
+          </m:rPr>
+          <m:t>|</m:t>
+        </m:r>
+        <m:r>
+          <m:t>k</m:t>
+        </m:r>
+        <m:r>
+          <m:rPr>
+            <m:sty m:val="p"/>
+          </m:rPr>
+          <m:t>|</m:t>
+        </m:r>
+        <m:r>
+          <m:rPr>
+            <m:sty m:val="p"/>
+          </m:rPr>
+          <m:t>,</m:t>
+        </m:r>
+        <m:r>
+          <m:rPr>
+            <m:sty m:val="p"/>
+          </m:rPr>
+          <m:t>|</m:t>
+        </m:r>
+        <m:r>
+          <m:t>l</m:t>
+        </m:r>
+        <m:r>
+          <m:rPr>
+            <m:sty m:val="p"/>
+          </m:rPr>
+          <m:t>|</m:t>
+        </m:r>
+        <m:r>
+          <m:rPr>
+            <m:sty m:val="p"/>
+          </m:rPr>
+          <m:t>≤</m:t>
+        </m:r>
+        <m:r>
+          <m:t>5</m:t>
+        </m:r>
+      </m:oMath>
+      <w:r>
+        <w:t xml:space="preserve"> </w:t>
+      </w:r>
+      <w:r>
+        <w:t xml:space="preserve">reflection range on small cells (Appendix C).</w:t>
       </w:r>
     </w:p>
     <w:bookmarkEnd w:id="17"/>
@@ -3764,7 +3871,7 @@
         <w:pStyle w:val="FirstParagraph"/>
       </w:pPr>
       <w:r>
-        <w:t xml:space="preserve">We use a VP-SDE with cosine schedule (Nichol &amp; Dhariwal, 2021) for both channels:</w:t>
+        <w:t xml:space="preserve">We use a variance-preserving stochastic differential equation (VP-SDE) with cosine schedule (Nichol &amp; Dhariwal, 2021) for both channels:</w:t>
       </w:r>
     </w:p>
     <w:p>
@@ -4817,7 +4924,7 @@
         <w:t xml:space="preserve"> </w:t>
       </w:r>
       <w:r>
-        <w:t xml:space="preserve">estimate, which is wrong but at least bounded; ε-prediction with the same architecture had to learn the entire transform from random initialisation and never recovered. At single seed this change appeared to lift the headline match metric 3.5×; a multi-seed checkpoint sweep (§7) shows that match-rate lift does not replicate, but the parameterisation does reproducibly improve the pattern-Pearson (≈ 0.36 → 0.40, see §5.1).</w:t>
+        <w:t xml:space="preserve">estimate, which is wrong but at least bounded; ε-prediction with the same architecture had to learn the entire transform from random initialisation and never recovered. At single seed this change appeared to lift the headline match metric 2.8×; a multi-seed checkpoint sweep (§7) shows that match-rate lift does not replicate, but the parameterisation does reproducibly improve the pattern-Pearson (≈ 0.36 → 0.40, see §5.1).</w:t>
       </w:r>
     </w:p>
     <w:p>
@@ -4941,7 +5048,7 @@
         </m:r>
       </m:oMath>
       <w:r>
-        <w:t xml:space="preserve">. The submitted code evaluated it on the residual</w:t>
+        <w:t xml:space="preserve">; the submitted code evaluated it on the residual</w:t>
       </w:r>
       <w:r>
         <w:t xml:space="preserve"> </w:t>
@@ -4977,7 +5084,7 @@
         <w:t xml:space="preserve"> </w:t>
       </w:r>
       <w:r>
-        <w:t xml:space="preserve">alone. For every x₀-residual run (v13, v14, v15, v16 and the Phase 9 checkpoint v21) the Debye term therefore compared the pattern of the wrong tensor with the target. The ε-mode runs v10 and v11 were unaffected, as were the coordinate and lattice losses and every evaluation-time number. The code is fixed. The production checkpoint was retrained with the corrected loss and the corrected simulator (v22, §3.3); its final EMA loss fell from 0.726 to 0.602, with the effect on the results in §5.2. The Phase-4 rows v13–v16 were not retrained and remain labelled exploratory single-seed runs carrying this defect (§5.1).</w:t>
+        <w:t xml:space="preserve">alone, so in every x₀-residual run (v13, v14, v15, v16 and the Phase 9 checkpoint v21) the Debye term compared the pattern of the wrong tensor with the target. The ε-mode runs v10 and v11 were unaffected, as were the coordinate and lattice losses and every evaluation-time number. The code is fixed and the production checkpoint was retrained with the corrected loss and the corrected simulator (v22, §3.3); its final exponential-moving-average (EMA) loss fell from 0.726 to 0.602. §5.7(b) gives the accounting; the Phase-4 rows v13–v16 were not retrained and remain labelled exploratory single-seed runs carrying this defect (§5.1).</w:t>
       </w:r>
     </w:p>
     <w:p>
@@ -5093,7 +5200,7 @@
           <w:b/>
           <w:bCs/>
         </w:rPr>
-        <w:t xml:space="preserve">Wyckoff-site embedding</w:t>
+        <w:t xml:space="preserve">Wyckoff-letter embedding</w:t>
       </w:r>
       <w:r>
         <w:t xml:space="preserve"> </w:t>
@@ -5163,7 +5270,7 @@
         <w:pStyle w:val="FirstParagraph"/>
       </w:pPr>
       <w:r>
-        <w:t xml:space="preserve">The lattice head described in §3.2 is the</w:t>
+        <w:t xml:space="preserve">The denoiser’s lattice head (§3.2) is the</w:t>
       </w:r>
       <w:r>
         <w:t xml:space="preserve"> </w:t>
@@ -5195,7 +5302,7 @@
         <w:t xml:space="preserve"> </w:t>
       </w:r>
       <w:r>
-        <w:t xml:space="preserve">d-spacing structure (Pearson 0.43 between predicted and target patterns at evaluation time, vs 0.97 between target and ground truth) but not the absolute scale. Classical autoindexing, which extracts peak positions, maps them to Q-space (Q = 4π sinθ/λ), and fits a unit cell by enumeration of (h,k,l) → Q²(h,k,l), has solved this sub-problem since the 1970s and runs on a CPU in milliseconds per pattern.</w:t>
+        <w:t xml:space="preserve">d-spacing structure (v13, Table 1: Pearson 0.43 between predicted and target patterns at evaluation time, vs 0.97 between target and ground truth) but not the absolute scale. Classical autoindexing, which extracts peak positions, maps them to Q-space (Q = 4π sinθ/λ), and fits a unit cell by enumeration of (h,k,l) → Q²(h,k,l), has solved this sub-problem since the 1970s and runs on a CPU in milliseconds per pattern.</w:t>
       </w:r>
     </w:p>
     <w:p>
@@ -5203,7 +5310,7 @@
         <w:pStyle w:val="BodyText"/>
       </w:pPr>
       <w:r>
-        <w:t xml:space="preserve">We implement a from-scratch Q-space autoindexer that takes (i) the same simulated PXRD pattern fed to the encoder and (ii) the true crystal system of the target structure, supplied as a Bravais code, and returns a candidate (a, b, c, α, β, γ). Item (ii) is prior information beyond the composition that the learned head receives; it makes the indexer an optimistic control rather than a fair competitor (§7; the unknown-system run below removes it). Peak picking uses a 1D local-maximum filter with a relative-intensity floor; the candidate Q-vector is fit by least squares to the de-Wolff dichotomy parameter form for each Bravais lattice. At sampling time we run the indexer first, substitute its output for the lattice channel of the diffusion sampler, and run DDIM only on the coordinate channel.</w:t>
+        <w:t xml:space="preserve">We implement a from-scratch Q-space autoindexer that takes (i) the same simulated PXRD pattern fed to the encoder and (ii) the true crystal system of the target structure, supplied as a Bravais code, and returns a candidate (a, b, c, α, β, γ). Item (ii) is prior information beyond the composition that the learned head receives; it makes the indexer an optimistic control rather than a fair competitor (§7; the unknown-system run below removes it). Peak picking uses a 1D local-maximum filter with a relative-intensity floor; the candidate Q-vector is fit by least squares to the de-Wolff dichotomy parameter form for each Bravais lattice. At sampling time we run the indexer first, substitute its output for the lattice channel of the diffusion sampler, and run the DDIM sampler (§3.6) only on the coordinate channel.</w:t>
       </w:r>
     </w:p>
     <w:p>
@@ -5221,7 +5328,7 @@
         <w:t xml:space="preserve"> </w:t>
       </w:r>
       <w:r>
-        <w:t xml:space="preserve">Native indexer overall: 48.8 % strict cell match, 1.45 Å mean cell-length MAE. Per crystal system: hexagonal 77.9 % / 0.53 Å, orthorhombic 59.8 % / 0.96 Å, trigonal 43.3 % / 4.62 Å, monoclinic 18.9 % / 1.76 Å, triclinic 0 %. The low-symmetry blowup (monoclinic and triclinic each have ≥ 4 free cell parameters and the de-Wolff search becomes hypothesis-capped) is the dominant remaining error. A GSAS-II (Toby &amp; Von Dreele, 2013) adapter (</w:t>
+        <w:t xml:space="preserve">Native indexer overall (Fig. 3): 48.8 % strict cell match, 1.45 Å mean absolute error (MAE) in cell length. Per crystal system: cubic 52.9 % / 1.14 Å, tetragonal 52.8 % / 0.96 Å, hexagonal 77.9 % / 0.53 Å, orthorhombic 59.8 % / 0.96 Å, trigonal 43.3 % / 4.62 Å, monoclinic 18.9 % / 1.76 Å, triclinic 0 %. The low-symmetry blowup (monoclinic and triclinic each have ≥ 4 free cell parameters and the de-Wolff search becomes hypothesis-capped) is the dominant remaining error. A GSAS-II (Toby &amp; Von Dreele, 2013) adapter (</w:t>
       </w:r>
       <w:r>
         <w:rPr>
@@ -5278,7 +5385,7 @@
         <w:t xml:space="preserve"> </w:t>
       </w:r>
       <w:r>
-        <w:t xml:space="preserve">At a referee’s request the indexer was also run with no crystal system supplied. Cubic, tetragonal, hexagonal/trigonal, orthorhombic and monoclinic cells are searched in that order, highest symmetry first, and a lattice type is accepted by the rule the classical programs use (de Wolff, 1968; Werner</w:t>
+        <w:t xml:space="preserve">At a referee’s request the indexer was also run with no crystal system supplied. Cubic, tetragonal, hexagonal/trigonal, orthorhombic and monoclinic cells are searched in that order, highest symmetry first. A lattice type is accepted by the rule the classical programs use (de Wolff, 1968; Werner</w:t>
       </w:r>
       <w:r>
         <w:t xml:space="preserve"> </w:t>
@@ -5291,7 +5398,15 @@
         <w:t xml:space="preserve">et al.</w:t>
       </w:r>
       <w:r>
-        <w:t xml:space="preserve">, 1985; Boultif &amp; Louër, 2004): the first type whose best cell indexes every observed line with M20 ≥ 10 is kept; if none does, the highest-M20 cell among those indexing every line; the reported system is the metric symmetry of the returned cell. On the same n = 1 000 this reaches</w:t>
+        <w:t xml:space="preserve">, 1985; Boultif &amp; Louër, 2004): the first type whose best cell indexes every observed line with M20 ≥ 10 is kept, and if none does, the highest-M20 cell among those indexing every line. The reported system is the metric symmetry of the returned cell.</w:t>
+      </w:r>
+    </w:p>
+    <w:p>
+      <w:pPr>
+        <w:pStyle w:val="BodyText"/>
+      </w:pPr>
+      <w:r>
+        <w:t xml:space="preserve">On the same n = 1000 this reaches</w:t>
       </w:r>
       <w:r>
         <w:t xml:space="preserve"> </w:t>
@@ -5307,7 +5422,15 @@
         <w:t xml:space="preserve"> </w:t>
       </w:r>
       <w:r>
-        <w:t xml:space="preserve">strict cell match [40.4, 46.5] with a 1.67 Å mean cell-length MAE, against 48.8 % [45.7, 51.9] and 1.45 Å with the system given, and it recovers the lattice type itself for 65.4 % of the patterns (68.1 % of the 961 that both modes index). Per crystal system, strict success with the system given → unknown: cubic 52.9 → 49.2 %, hexagonal 77.9 → 65.4 %, trigonal 43.3 → 30.9 %, tetragonal 52.8 → 46.7 %, orthorhombic 59.8 → 53.6 %, monoclinic 18.9 → 19.6 %. Paired on the same structures, removing the system loses 65 cells and gains 9 (McNemar p &lt; 10⁻¹⁰): under ideal peak positions the crystal-system prior is worth about five percentage points to the indexer, not the difference between working and failing. A first implementation that simply kept the highest M20 across lattice types reached only 24.3 %, choosing the correct system for 40.7 % of patterns and cubic for 12 of the 238 cubic structures. M20 carries no penalty for free parameters, so on a pattern with a handful of exactly placed lines a four-parameter monoclinic sub-cell out-scores the true cubic cell (ScAlRh₂, mp-867922: M20 = 2 182 against 1 231, both indexing every line). That run is released beside the final one (</w:t>
+        <w:t xml:space="preserve">strict cell match [40.4, 46.5] with a 1.67 Å mean cell-length MAE, against 48.8 % [45.7, 51.9] and 1.45 Å with the system given, and it recovers the lattice type itself for 65.4 % of the patterns (68.1 % of the 961 that both modes index). Per crystal system, strict success with the system given → unknown: cubic 52.9 → 49.2 %, hexagonal 77.9 → 65.4 %, trigonal 43.3 → 30.9 %, tetragonal 52.8 → 46.7 %, orthorhombic 59.8 → 53.6 %, monoclinic 18.9 → 19.6 %; two of the 39 triclinic structures, unindexed with the system given, are matched within tolerance by a higher-symmetry cell when the system is unknown. Paired on the same structures, removing the system loses 65 cells and gains 9 (McNemar p &lt; 10⁻¹⁰): under ideal peak positions the crystal-system prior is worth about five percentage points to the indexer, not the difference between working and failing.</w:t>
+      </w:r>
+    </w:p>
+    <w:p>
+      <w:pPr>
+        <w:pStyle w:val="BodyText"/>
+      </w:pPr>
+      <w:r>
+        <w:t xml:space="preserve">A first implementation that simply kept the highest M20 across lattice types reached only 24.3 %, choosing the correct system for 40.7 % of patterns and cubic for 12 of the 238 cubic structures. M20 carries no penalty for free parameters, so on a pattern with a handful of exactly placed lines a four-parameter monoclinic sub-cell out-scores the true cubic cell (ScAlRh₂, mp-867922: M20 = 2182 against 1231, both indexing every line). That run is released beside the final one (</w:t>
       </w:r>
       <w:r>
         <w:rPr>
@@ -5316,7 +5439,7 @@
         <w:t xml:space="preserve">--unknown-rule maxm20</w:t>
       </w:r>
       <w:r>
-        <w:t xml:space="preserve">) because the comparison is itself informative: the choice of acceptance rule (24.3 → 43.4 %) matters more than the prior it replaces (43.4 → 48.8 %). Substituted into the sampler at three seeds, these cells recover 1.4 % [1.0, 1.9] (42 / 3 000) against 1.6 % [1.2, 2.1] with the system given: six structures lost and none gained on the same seeds (McNemar p = 0.03), with identical pattern Pearson (0.41), and no significant difference from the learned head’s 1.9 % (36 fixed, 52 broken, p = 0.11). Table 2 carries this as its third row.</w:t>
+        <w:t xml:space="preserve">) because the comparison is itself informative: the choice of acceptance rule (24.3 → 43.4 %) matters more than the prior it replaces (43.4 → 48.8 %). Substituted into the sampler at three seeds, these cells recover 1.4 % [1.0, 1.9] (42 / 3000) against 1.6 % [1.2, 2.1] with the system given: six structures lost and none gained on the same seeds (McNemar p = 0.03), with identical pattern Pearson (0.41), and no significant difference from the learned head’s 1.9 % (36 fixed, 52 broken, p = 0.11). Table 2 carries this as its third row.</w:t>
       </w:r>
     </w:p>
     <w:p>
@@ -5342,7 +5465,7 @@
         <w:pStyle w:val="FirstParagraph"/>
       </w:pPr>
       <w:r>
-        <w:t xml:space="preserve">DDIM (Song</w:t>
+        <w:t xml:space="preserve">Denoising diffusion implicit model (DDIM) sampling (Song</w:t>
       </w:r>
       <w:r>
         <w:t xml:space="preserve"> </w:t>
@@ -5712,7 +5835,7 @@
         <w:t xml:space="preserve">et al.</w:t>
       </w:r>
       <w:r>
-        <w:t xml:space="preserve">, 2022) MP-20 split: 27 136 / 9 047 / 9 046 train/val/test, ≤ 20 atoms/conventional cell. Patterns simulated with</w:t>
+        <w:t xml:space="preserve">, 2022) MP-20 split: 27 136 / 9047 / 9046 train/val/test, ≤ 20 atoms/conventional cell. Patterns simulated with</w:t>
       </w:r>
       <w:r>
         <w:t xml:space="preserve"> </w:t>
@@ -5727,7 +5850,7 @@
         <w:t xml:space="preserve"> </w:t>
       </w:r>
       <w:r>
-        <w:t xml:space="preserve">(Cu Kα₁, λ = 1.54184 Å), max-normalised, 4 251 bins 5–90° / 0.02°; cached as</w:t>
+        <w:t xml:space="preserve">(Cu Kα₁, λ = 1.54184 Å), max-normalised, 4251 bins 5–90° / 0.02°; cached as</w:t>
       </w:r>
       <w:r>
         <w:t xml:space="preserve"> </w:t>
@@ -5965,13 +6088,63 @@
           <w:b/>
           <w:bCs/>
         </w:rPr>
-        <w:t xml:space="preserve">coordinate RMSD</w:t>
-      </w:r>
-      <w:r>
-        <w:t xml:space="preserve"> </w:t>
-      </w:r>
-      <w:r>
-        <w:t xml:space="preserve">on aligned, permuted atoms when matched. We also report space-group match at symprec</w:t>
+        <w:t xml:space="preserve">coordinate root-mean-square deviation (RMSD)</w:t>
+      </w:r>
+      <w:r>
+        <w:t xml:space="preserve"> </w:t>
+      </w:r>
+      <w:r>
+        <w:t xml:space="preserve">on aligned, permuted atoms when matched.</w:t>
+      </w:r>
+      <w:r>
+        <w:t xml:space="preserve"> </w:t>
+      </w:r>
+      <w:r>
+        <w:rPr>
+          <w:rStyle w:val="VerbatimChar"/>
+        </w:rPr>
+        <w:t xml:space="preserve">StructureMatcher</w:t>
+      </w:r>
+      <w:r>
+        <w:t xml:space="preserve"> </w:t>
+      </w:r>
+      <w:r>
+        <w:t xml:space="preserve">is run with</w:t>
+      </w:r>
+      <w:r>
+        <w:t xml:space="preserve"> </w:t>
+      </w:r>
+      <w:r>
+        <w:rPr>
+          <w:rStyle w:val="VerbatimChar"/>
+        </w:rPr>
+        <w:t xml:space="preserve">scale=True</w:t>
+      </w:r>
+      <w:r>
+        <w:t xml:space="preserve">, so the match rate is invariant to a uniform scaling of the cell and tests cell shape and coordinates; absolute scale enters through pattern Pearson and</w:t>
+      </w:r>
+      <w:r>
+        <w:t xml:space="preserve"> </w:t>
+      </w:r>
+      <m:oMath>
+        <m:sSub>
+          <m:e>
+            <m:r>
+              <m:t>R</m:t>
+            </m:r>
+          </m:e>
+          <m:sub>
+            <m:r>
+              <m:t>w</m:t>
+            </m:r>
+            <m:r>
+              <m:t>p</m:t>
+            </m:r>
+          </m:sub>
+        </m:sSub>
+      </m:oMath>
+      <w:r>
+        <w:t xml:space="preserve">. We also report space-group match at symprec</w:t>
       </w:r>
       <w:r>
         <w:t xml:space="preserve"> </w:t>
@@ -6234,7 +6407,7 @@
         </m:sSup>
       </m:oMath>
       <w:r>
-        <w:t xml:space="preserve">, grad-clip 1.0. Batch 64, ~24 epochs, single RTX 5090 (~1.5–1.7 h/run). 3.7 M parameters;</w:t>
+        <w:t xml:space="preserve">, grad-clip 1.0. Batch 64, ~236 epochs, single RTX 5090 (~1.7–1.9 h/run). 3.7 M parameters;</w:t>
       </w:r>
       <w:r>
         <w:t xml:space="preserve"> </w:t>
@@ -6275,7 +6448,7 @@
         <w:t xml:space="preserve"> </w:t>
       </w:r>
       <w:r>
-        <w:t xml:space="preserve">(~10 M) gave no benefit (§5.2). VP-SDE with</w:t>
+        <w:t xml:space="preserve">(~10 M) gave no benefit over the steps it ran (§5.1). VP-SDE with</w:t>
       </w:r>
       <w:r>
         <w:t xml:space="preserve"> </w:t>
@@ -6319,7 +6492,7 @@
         </m:r>
       </m:oMath>
       <w:r>
-        <w:t xml:space="preserve">. Total compute: ~35 GPU-hours, ~USD 25 on Vast.ai (Phase 4 ablation + Phase 9 v21 retrain + indexer/perturbation sweeps + DGpt n=1000 + PXRDnet n=20 + evaluation).</w:t>
+        <w:t xml:space="preserve">. Total compute before the revision: ~35 GPU-hours, ~USD 25 on Vast.ai (Phase 4 ablation + Phase 9 v21 retrain + indexer/perturbation sweeps + DGpt n = 1000 + PXRDnet n = 20 + evaluation); the revision runs of §5.2, §5.6 and §3.5 added about 5.5 GPU-hours (Acknowledgements).</w:t>
       </w:r>
     </w:p>
     <w:p>
@@ -6344,7 +6517,7 @@
         <w:pStyle w:val="FirstParagraph"/>
       </w:pPr>
       <w:r>
-        <w:t xml:space="preserve">Order: Phase 4 architectural ablation (§5.1) → Phase 9 indexer drop-in (§5.2) → reproduced baselines (§5.3) → failure catalogue (§5.4) → lattice-perturbation study (§5.5).</w:t>
+        <w:t xml:space="preserve">Order: Phase 4 architectural ablation (§5.1) → classical indexer control (§5.2) → reproduced baselines (§5.3) → failure catalogue (§5.4) → lattice-perturbation study (§5.5) → pooling ablation (§5.6) → code audit (§5.7).</w:t>
       </w:r>
     </w:p>
     <w:bookmarkStart w:id="28" w:name="Xadaaeed9a4d3d9b8a4dfaf721f122e0603fe773"/>
@@ -6361,7 +6534,7 @@
         <w:pStyle w:val="FirstParagraph"/>
       </w:pPr>
       <w:r>
-        <w:t xml:space="preserve">Table 1: seven runs sweeping the Debye loss, the lattice-input fix, x₀-residual, and two extensions (Wyckoff, distance loss), all on n = 1 000 MP-20 test with true lattice substituted. Every row is a single training seed. The table is exploratory: it guided the design, and only the ε-vs-x₀-residual contrast was later replicated across seeds (§7). Runs v11 and v13–v16 were trained with the submitted version’s simulator, and v13–v16 with the x₀-mode Debye defect (§3.3, §3.4). These rows were not retrained: only the production checkpoint was (v22, §5.2), and Table 1 is retained as the exploratory, single-seed record it always was, with the defects it carries stated here rather than corrected.</w:t>
+        <w:t xml:space="preserve">Table 1 (Fig. 2): six runs sweeping the Debye loss, the lattice-input fix, x₀-residual, and two extensions (Wyckoff, distance loss), all on n = 1000 MP-20 test with true lattice substituted. Every row is a single training seed. The table is exploratory: it guided the design, and only the ε-vs-x₀-residual contrast was later replicated across seeds (§7). Runs v11 and v13–v16 were trained with the submitted version’s simulator, and v13–v16 with the x₀-mode Debye defect (§3.3, §3.4). These rows were not retrained: only the production checkpoint was (v22, §5.2), and Table 1 is retained as the exploratory, single-seed record it always was, with the defects it carries stated here rather than corrected.</w:t>
       </w:r>
     </w:p>
     <w:p>
@@ -6379,7 +6552,7 @@
         <w:t xml:space="preserve"> </w:t>
       </w:r>
       <w:r>
-        <w:t xml:space="preserve">Phase 4 coordinate-only ablation, MP-20 test (n = 1 000, true lattice substituted). Single seed per row; exploratory.</w:t>
+        <w:t xml:space="preserve">Phase 4 coordinate-only ablation, MP-20 test (n = 1000, true lattice substituted). Single seed per row; exploratory.</w:t>
       </w:r>
     </w:p>
     <w:tbl>
@@ -7071,7 +7244,7 @@
           <wp:inline>
             <wp:extent cx="5334000" cy="2223878"/>
             <wp:effectExtent b="0" l="0" r="0" t="0"/>
-            <wp:docPr descr="Figure 2. Phase 4 architectural ablation (single seed per run; exploratory). Match rate (a) and pattern Pearson (b) for the seven coordinate-only runs of Table 1 on MP-20 test (n = 1000, true lattice substituted). The ε → x₀-residual switch (v11 → v13) shows the largest single-seed match lift (panel a), but that match lift does not replicate across seeds; only the pattern-Pearson gain (panel b) does (§7); adding Wyckoff embeddings or a distance-matrix loss regresses below it." title="" id="25" name="Picture"/>
+            <wp:docPr descr="Figure 2. Phase 4 architectural ablation (single seed per run; exploratory). Match rate (a), pattern Pearson (b) and coordinate RMSD of matched structures (c) for the six coordinate-only runs of Table 1 on MP-20 test (n = 1000, true lattice substituted). The ε → x₀-residual switch (v11 → v13) shows the largest single-seed match lift (panel a), but that lift does not replicate across seeds; only the pattern-Pearson gain (panel b) does (§7). The Wyckoff and distance-loss runs land below v13, within single-seed noise." title="" id="25" name="Picture"/>
             <a:graphic>
               <a:graphicData uri="http://schemas.openxmlformats.org/drawingml/2006/picture">
                 <pic:pic>
@@ -7124,7 +7297,7 @@
         <w:t xml:space="preserve"> </w:t>
       </w:r>
       <w:r>
-        <w:t xml:space="preserve">Match rate (a) and pattern Pearson (b) for the seven coordinate-only runs of Table 1 on MP-20 test (n = 1000, true lattice substituted). The ε → x₀-residual switch (v11 → v13) shows the largest single-seed match lift (panel a), but that match lift does not replicate across seeds; only the pattern-Pearson gain (panel b) does (§7); adding Wyckoff embeddings or a distance-matrix loss regresses below it.</w:t>
+        <w:t xml:space="preserve">Match rate (a), pattern Pearson (b) and coordinate RMSD of matched structures (c) for the six coordinate-only runs of Table 1 on MP-20 test (n = 1000, true lattice substituted). The ε → x₀-residual switch (v11 → v13) shows the largest single-seed match lift (panel a), but that lift does not replicate across seeds; only the pattern-Pearson gain (panel b) does (§7). The Wyckoff and distance-loss runs land below v13, within single-seed noise.</w:t>
       </w:r>
     </w:p>
     <w:bookmarkEnd w:id="27"/>
@@ -7235,7 +7408,7 @@
         <w:t xml:space="preserve"> </w:t>
       </w:r>
       <w:r>
-        <w:t xml:space="preserve">at fixed Debye λ = 1 (v11 → v13) lifted single-seed match 0.9 % → 2.5 %, but a multi-seed checkpoint sweep (two seeds × five checkpoints, 20k–100k) found ε and x₀-residual indistinguishable on match rate (§7), so the 3.5× match lift was a single-seed fluctuation. The x₀-residual parameterisation does reproducibly improve pattern-Pearson (0.36 → 0.40), the part of the Phase-4 signal that survives. Capacity is not the bottleneck: a 10.1 M-parameter run (</w:t>
+        <w:t xml:space="preserve">at fixed Debye λ = 1 (v11 → v13) lifted single-seed match 0.9 % → 2.5 %, but a multi-seed checkpoint sweep (two seeds × five checkpoints, 20 k–100 k) found ε and x₀-residual indistinguishable on match rate (§7), so the 2.8× match lift was a single-seed fluctuation. The x₀-residual parameterisation does reproducibly improve pattern-Pearson (0.36 → 0.40), the part of the Phase-4 signal that survives. Capacity is not obviously the limiter: a 10.1 M-parameter run (</w:t>
       </w:r>
       <m:oMath>
         <m:r>
@@ -7284,7 +7457,7 @@
         <w:t xml:space="preserve">gpu_v12</w:t>
       </w:r>
       <w:r>
-        <w:t xml:space="preserve">) stayed at the same ~1.0 coord-loss plateau as v10. Under the full pipeline (sampled lattice), v13 drops to 1.2 % at n = 256; the Phase 9 checkpoint reaches 5.5 % under oracle (v22, three seeds; the submitted v21 gave 4.5 %) but only 1.9 % under the full pipeline. §5.2 attacks that gap.</w:t>
+        <w:t xml:space="preserve">) showed the same ~1.0 coord-loss plateau as v10 over its first 18 k steps before it was stopped; a full-length run was not made. Under the full pipeline (sampled lattice), v13’s own rate falls to 1.2 % at n = 256; the Phase 9 checkpoint reaches 5.5 % under oracle (v22, three seeds; the submitted v21 gave 4.5 %) but only 1.9 % under the full pipeline. §5.2 attacks that gap.</w:t>
       </w:r>
     </w:p>
     <w:bookmarkEnd w:id="28"/>
@@ -7302,7 +7475,7 @@
         <w:pStyle w:val="FirstParagraph"/>
       </w:pPr>
       <w:r>
-        <w:t xml:space="preserve">Table 2 compares four lattice sources on the same n = 1 000 at three seeds with the v22 checkpoint (the v21 configuration retrained under the corrected simulator and x₀-mode Debye loss, §3.3, §3.4, §5.7); the rows differ only in the lattice the sampler conditions on. The indexer rows are controls with extra prior information (§3.5). The submitted version’s v21 numbers are retained in §5.7.</w:t>
+        <w:t xml:space="preserve">Table 2 compares four lattice sources on the same n = 1000 at three sampling seeds with the v22 checkpoint (the v21 configuration retrained under the corrected simulator and x₀-mode Debye loss, §3.3, §3.4, §5.7); the rows differ only in the lattice the sampler conditions on. The indexer rows are controls with extra prior information (§3.5). The submitted version’s v21 numbers are retained in §5.7.</w:t>
       </w:r>
     </w:p>
     <w:p>
@@ -7320,7 +7493,7 @@
         <w:t xml:space="preserve"> </w:t>
       </w:r>
       <w:r>
-        <w:t xml:space="preserve">Phase 9 lattice-source comparison (n = 1 000 MP-20 test × three seeds, 3 000 structure-seeds pooled, v22 checkpoint). The indexer receives the true crystal system; the 117 structure-seeds it cannot index are scored as misses. Match % with 95 % Wilson CI; the other columns are means over seeds.</w:t>
+        <w:t xml:space="preserve">Phase 9 lattice-source comparison (n = 1000 MP-20 test × three sampling seeds on the single v22 training run, 3000 structure-seeds pooled). The indexer receives the true crystal system; the 117 structure-seeds it cannot index are scored as misses. Match % with 95 % Wilson CI; the other columns are means over seeds.</w:t>
       </w:r>
     </w:p>
     <w:tbl>
@@ -7773,7 +7946,7 @@
         <w:t xml:space="preserve"> </w:t>
       </w:r>
       <w:r>
-        <w:t xml:space="preserve">Because both arms see the same materials, a paired McNemar test on per-structure outcomes, not overlapping Wilson intervals, decides whether two lattice sources differ. Every source was run at three seeds (n = 1 000 each), differing only in the lattice channel; with v22 every arm scores all 3 000 structure-seeds (the submitted v21 checkpoint sampled degenerate cells that hung</w:t>
+        <w:t xml:space="preserve">Because both arms see the same materials, a paired McNemar test on per-structure outcomes, not overlapping Wilson intervals, decides whether two lattice sources differ. Every source was run at three seeds (n = 1000 each); with v22 every arm scores all 3000 structure-seeds (the submitted v21 checkpoint sampled degenerate cells that hung</w:t>
       </w:r>
       <w:r>
         <w:t xml:space="preserve"> </w:t>
@@ -7794,7 +7967,7 @@
         <w:t xml:space="preserve">spglib</w:t>
       </w:r>
       <w:r>
-        <w:t xml:space="preserve">, leaving 1 949 scorable learned-head rows). The indexer recovers</w:t>
+        <w:t xml:space="preserve">, leaving 1949 scorable learned-head rows). The indexer recovers</w:t>
       </w:r>
       <w:r>
         <w:t xml:space="preserve"> </w:t>
@@ -8024,18 +8197,18 @@
               <w:pStyle w:val="Compact"/>
             </w:pPr>
             <w:r>
-              <w:t xml:space="preserve">2 900</w:t>
-            </w:r>
-          </w:p>
-        </w:tc>
-        <w:tc>
-          <w:tcPr/>
-          <w:p>
-            <w:pPr>
-              <w:pStyle w:val="Compact"/>
-            </w:pPr>
-            <w:r>
-              <w:t xml:space="preserve">2 942</w:t>
+              <w:t xml:space="preserve">2900</w:t>
+            </w:r>
+          </w:p>
+        </w:tc>
+        <w:tc>
+          <w:tcPr/>
+          <w:p>
+            <w:pPr>
+              <w:pStyle w:val="Compact"/>
+            </w:pPr>
+            <w:r>
+              <w:t xml:space="preserve">2942</w:t>
             </w:r>
           </w:p>
         </w:tc>
@@ -8074,18 +8247,18 @@
               <w:pStyle w:val="Compact"/>
             </w:pPr>
             <w:r>
-              <w:t xml:space="preserve">2 952</w:t>
-            </w:r>
-          </w:p>
-        </w:tc>
-        <w:tc>
-          <w:tcPr/>
-          <w:p>
-            <w:pPr>
-              <w:pStyle w:val="Compact"/>
-            </w:pPr>
-            <w:r>
-              <w:t xml:space="preserve">3 000</w:t>
+              <w:t xml:space="preserve">2952</w:t>
+            </w:r>
+          </w:p>
+        </w:tc>
+        <w:tc>
+          <w:tcPr/>
+          <w:p>
+            <w:pPr>
+              <w:pStyle w:val="Compact"/>
+            </w:pPr>
+            <w:r>
+              <w:t xml:space="preserve">3000</w:t>
             </w:r>
           </w:p>
         </w:tc>
@@ -8141,7 +8314,15 @@
         <w:t xml:space="preserve">p = 0.35</w:t>
       </w:r>
       <w:r>
-        <w:t xml:space="preserve">: the two lattice sources tie on match rate. The submitted version reported the opposite: with v21 the learned head matched 0 of 1 949 scored structure-seeds against the indexer’s 46 of 2 883, 27 fixed and none broken (p = 1.5 × 10⁻⁸). That lead was a property of the defective checkpoint (§3.4): paired on the same seeds, the retrain gains 32 learned-head structures and loses none (p = 4.7 × 10⁻¹⁰), while the indexer arm moves by 12 gained and 10 lost (p = 0.83). The claim that the control improves on the learned head is withdrawn as a general statement. What survives is the per-system pattern: the indexer still fixes hexagonal (16 fixed, 0 broken) and tetragonal (7, 2) structures, the systems where its cell error sits below the 0.5 Å knee (§5.5), but the corrected learned head wins the cubic cases (18 fixed, 47 broken; learned 52 / 714, indexer 23 / 714, oracle 96 / 714). The indexer’s cells remain far closer to the truth where the match rates tie (pattern Pearson 0.41 against 0.18; RMSD median 0.035 against 0.232 Å), so in the cubic cases the match rate saturates on coordinate decoding rather than on the cell. On the stricter all-correct metric the indexer fixes 6 and breaks 0 (p = 0.03).</w:t>
+        <w:t xml:space="preserve">: the two lattice sources are not distinguishable on match rate. The submitted version reported the opposite: with v21 the learned head matched 0 of 1949 scored structure-seeds against the indexer’s 46 of 2883, 27 fixed and none broken (p = 1.5 × 10⁻⁸). That lead did not survive retraining under the corrected loss (§3.4): paired on the same seeds, the retrain gains 32 learned-head structures and loses none (p = 4.7 × 10⁻¹⁰), while the indexer arm moves by 12 gained and 10 lost (p = 0.83). v21 and v22 are one training run each, so this attribution rests on the two corrections being the only change between them; the correction and training-seed variance are not separated (§7). The claim that the control improves on the learned head is withdrawn as a general statement.</w:t>
+      </w:r>
+    </w:p>
+    <w:p>
+      <w:pPr>
+        <w:pStyle w:val="BodyText"/>
+      </w:pPr>
+      <w:r>
+        <w:t xml:space="preserve">What survives is a per-system pattern, identified post hoc. The indexer still fixes hexagonal (16 fixed, 0 broken) and tetragonal (7, 2) structures, the systems where its cell error is smallest (0.53 and 0.96 Å; §3.5), but the corrected learned head wins the cubic cases (18 fixed, 47 broken; learned 52 / 714, indexer 23 / 714, oracle 96 / 714), where the indexer’s error is the largest among the high-symmetry systems (1.14 Å); orthorhombic cells, indexed as accurately as tetragonal ones, show no gain. Where the indexer does index a cell, its downstream pattern agreement is higher (Pearson 0.41 against 0.18) and its matched structures closer (RMSD median 0.035 against 0.232 Å, over different matched subsets). On the stricter all-correct metric the indexer fixes 6 and breaks 0 (p = 0.03).</w:t>
       </w:r>
     </w:p>
     <w:p>
@@ -8165,7 +8346,7 @@
         <w:t xml:space="preserve"> </w:t>
       </w:r>
       <w:r>
-        <w:t xml:space="preserve">at three seeds (165 / 3 000; 4.5 % [3.8, 5.3] with the submitted checkpoint, unpaired p = 0.08). Paired against the learned head it fixes 134 structures and breaks 27 (p = 3 × 10⁻¹⁸), and against the indexer the interval is disjoint. This is the effect that replicates across checkpoints and seeds: even with a perfect lattice, match caps at 5.5 %, so coordinate prediction is the dominant limiter while lattice error explains the 1.9 → 5.5 % shortfall. The indexer’s per-system MAE (1.45 Å overall, dominated by mono 1.76 Å and triclinic NaN) sits above the 0.5 Å knee; closing the rest requires fixing the low-symmetry path (GSAS-II remains experimental).</w:t>
+        <w:t xml:space="preserve">at three seeds (165 / 3000; 4.5 % [3.8, 5.3] with the submitted checkpoint, unpaired p = 0.08). Paired against the learned head it fixes 134 structures and breaks 27 (p = 3 × 10⁻¹⁸), and against the indexer the interval is disjoint. This is the effect that replicates across checkpoints and seeds: the cell explains the 1.9 → 5.5 % shortfall, and coordinates cap the rest, since even a perfect lattice leaves match at 5.5 %. The indexer’s per-system MAE (1.45 Å overall, dominated by mono 1.76 Å and triclinic NaN) sits above the ~0.5 Å tolerance of §5.5; closing the rest requires fixing the low-symmetry path (GSAS-II remains experimental).</w:t>
       </w:r>
     </w:p>
     <w:bookmarkStart w:id="32" w:name="fig:indexer"/>
@@ -8178,7 +8359,7 @@
           <wp:inline>
             <wp:extent cx="5334000" cy="2423900"/>
             <wp:effectExtent b="0" l="0" r="0" t="0"/>
-            <wp:docPr descr="Figure 3. Per-system indexer performance. (a) Strict indexing rate with the crystal system given (blue) and with the system unknown (orange; acceptance rule of §3.5), and the consistent rate with the system given (light blue), on n = 1 000; dashed line, overall strict rate given / unknown. (b) Length MAE with the system given. High-symmetry systems (hex, ortho) sit below the 0.5 Å knee; trig and mono blow up; triclinic is unindexable in this implementation. Removing the crystal system costs a few points in every system except monoclinic and never changes the regime. The overall 1.45 Å MAE hides two regimes, and explains why the indexer’s paired gains over the learned head (§5.2) are confined to the hexagonal and tetragonal systems." title="" id="30" name="Picture"/>
+            <wp:docPr descr="Figure 3. Per-system indexer performance. (a) Strict indexing rate with the crystal system given (blue) and with the system unknown (orange; acceptance rule of §3.5), and the consistent rate with the system given (light blue: the returned cell indexes at least 90 % of the observed lines, whether or not it is the reference cell), on n = 1000; dashed line, overall strict rate with the system given (48.8 %; 43.4 % unknown). (b) Cell-length MAE with the system given; dotted line, the v20 learned head of §7 (1.37 Å). Hexagonal, tetragonal and orthorhombic cells carry mean length errors of 1 Å or less, trigonal and monoclinic errors exceed 1.7 Å, and triclinic cells are not indexed with the system given (two of 39 are matched by a higher-symmetry cell when it is unknown). Removing the crystal system costs a few points in every system except monoclinic and triclinic and never changes the regime." title="" id="30" name="Picture"/>
             <a:graphic>
               <a:graphicData uri="http://schemas.openxmlformats.org/drawingml/2006/picture">
                 <pic:pic>
@@ -8231,7 +8412,7 @@
         <w:t xml:space="preserve"> </w:t>
       </w:r>
       <w:r>
-        <w:t xml:space="preserve">(a) Strict indexing rate with the crystal system given (blue) and with the system unknown (orange; acceptance rule of §3.5), and the consistent rate with the system given (light blue), on n = 1 000; dashed line, overall strict rate given / unknown. (b) Length MAE with the system given. High-symmetry systems (hex, ortho) sit below the 0.5 Å knee; trig and mono blow up; triclinic is unindexable in this implementation. Removing the crystal system costs a few points in every system except monoclinic and never changes the regime. The overall 1.45 Å MAE hides two regimes, and explains why the indexer’s paired gains over the learned head (§5.2) are confined to the hexagonal and tetragonal systems.</w:t>
+        <w:t xml:space="preserve">(a) Strict indexing rate with the crystal system given (blue) and with the system unknown (orange; acceptance rule of §3.5), and the consistent rate with the system given (light blue: the returned cell indexes at least 90 % of the observed lines, whether or not it is the reference cell), on n = 1000; dashed line, overall strict rate with the system given (48.8 %; 43.4 % unknown). (b) Cell-length MAE with the system given; dotted line, the v20 learned head of §7 (1.37 Å). Hexagonal, tetragonal and orthorhombic cells carry mean length errors of 1 Å or less, trigonal and monoclinic errors exceed 1.7 Å, and triclinic cells are not indexed with the system given (two of 39 are matched by a higher-symmetry cell when it is unknown). Removing the crystal system costs a few points in every system except monoclinic and triclinic and never changes the regime.</w:t>
       </w:r>
     </w:p>
     <w:bookmarkEnd w:id="32"/>
@@ -8259,7 +8440,7 @@
         <w:t xml:space="preserve">knc6/diffractgpt_mistral_chemical_formula</w:t>
       </w:r>
       <w:r>
-        <w:t xml:space="preserve">) at n = 1 000, PXRDnet (</w:t>
+        <w:t xml:space="preserve">) at n = 1000 (990 parseable outputs), PXRDnet (</w:t>
       </w:r>
       <w:r>
         <w:rPr>
@@ -8268,7 +8449,7 @@
         <w:t xml:space="preserve">therealgabeguo/cdvae_xrd_sinc100</w:t>
       </w:r>
       <w:r>
-        <w:t xml:space="preserve">) at n = 20 (limited by ~4 GPU-hr/material), and deCIFer (deCIFer_v1, conditioned on XRD + composition) at n = 300 re-scored on</w:t>
+        <w:t xml:space="preserve">) at n = 20 (limited by ~4 GPU-hr/material), and deCIFer (deCIFer_v1, conditioned on XRD + composition) at n = 300 (298 parseable) re-scored on</w:t>
       </w:r>
       <w:r>
         <w:t xml:space="preserve"> </w:t>
@@ -8293,7 +8474,7 @@
         <w:t xml:space="preserve"> </w:t>
       </w:r>
       <w:r>
-        <w:t xml:space="preserve">harness at matching tolerances. Crystalyze’s checkpoint download is inactive; cite-but-not-reproduced.</w:t>
+        <w:t xml:space="preserve">harness at matching tolerances. Crystalyze’s checkpoint download is inactive; cite-but-not-reproduced. Unparseable external outputs are excluded from those denominators, whereas PXRD-Diff’s own unindexed patterns count as misses (§4).</w:t>
       </w:r>
     </w:p>
     <w:p>
@@ -8311,7 +8492,7 @@
         <w:t xml:space="preserve"> </w:t>
       </w:r>
       <w:r>
-        <w:t xml:space="preserve">Reproduced head-to-head on MP-20 test (StructureMatcher ltol 0.2, stol 0.3, angle_tol 5°). The first PXRD-Diff row is the learned head, which receives the pattern and composition only, the same information as the external models; the second is the classical-indexer control, which is additionally supplied with the true crystal system. Both are the v22 checkpoint at three seeds (§5.2). The rows set the scale of the diagnostic model and are not a competitiveness claim.</w:t>
+        <w:t xml:space="preserve">Reproduced head-to-head on MP-20 test (StructureMatcher ltol 0.2, stol 0.3, angle_tol 5°). The first PXRD-Diff row is the learned head, which receives the pattern and composition only, as the external models do; the second is the indexer control, additionally supplied with the true crystal system (§3.5). Both are the v22 checkpoint at three sampling seeds (§5.2). n is the number of scored structures; unparseable external outputs are excluded (DGpt 10 of 1000, deCIFer 2 of 300). The rows set the scale of the diagnostic model and are not a competitiveness claim.</w:t>
       </w:r>
     </w:p>
     <w:tbl>
@@ -8419,7 +8600,7 @@
               <w:pStyle w:val="Compact"/>
             </w:pPr>
             <w:r>
-              <w:t xml:space="preserve">3 000</w:t>
+              <w:t xml:space="preserve">3000</w:t>
             </w:r>
           </w:p>
         </w:tc>
@@ -8487,7 +8668,7 @@
               <w:pStyle w:val="Compact"/>
             </w:pPr>
             <w:r>
-              <w:t xml:space="preserve">3 000</w:t>
+              <w:t xml:space="preserve">3000</w:t>
             </w:r>
           </w:p>
         </w:tc>
@@ -8555,7 +8736,7 @@
               <w:pStyle w:val="Compact"/>
             </w:pPr>
             <w:r>
-              <w:t xml:space="preserve">1 000</w:t>
+              <w:t xml:space="preserve">990</w:t>
             </w:r>
           </w:p>
         </w:tc>
@@ -8782,7 +8963,7 @@
         <w:t xml:space="preserve"> </w:t>
       </w:r>
       <w:r>
-        <w:t xml:space="preserve">ranks deCIFer ≫ PXRDnet &gt; DGpt &gt; PXRD-Diff. deCIFer, a concurrent autoregressive CIF-token model conditioned on XRD + composition, is the strongest external reference at 73.8 % match / 69.5 % all-correct (n = 300); its all-correct nearly equals its match, the same CIF-token signature seen in DGpt. PXRDnet’s lead over DGpt is consistent with its 35 k-op latent optimisation, whereas DGpt is one forward pass. PXRD-Diff, at 1.9 %, sits an order of magnitude below all three, as expected for a 3.7 M-parameter diagnostic model. The</w:t>
+        <w:t xml:space="preserve">(Fig. 4) ranks deCIFer ≫ {PXRDnet, DGpt} &gt; PXRD-Diff. deCIFer, a concurrent autoregressive CIF-token model conditioned on XRD + composition, is the strongest external reference at 73.8 % match / 69.5 % all-correct (n = 298); its all-correct nearly equals its match, the same CIF-token signature seen in DGpt. PXRDnet and DGpt are not separated at n = 20. PXRD-Diff, at 1.9 %, sits an order of magnitude below all three, as expected for a 3.7 M-parameter diagnostic model. The</w:t>
       </w:r>
       <w:r>
         <w:t xml:space="preserve"> </w:t>
@@ -8814,7 +8995,7 @@
         <w:t xml:space="preserve"> </w:t>
       </w:r>
       <w:r>
-        <w:t xml:space="preserve">At n = 20 the PXRDnet all-correct estimate (1/20) carries a 95 % CI of [0.9, 23.6], which overlaps DGpt’s [13.8, 18.3]; confirming the reversal would require n ≈ 100–200. §6 says why it would matter.</w:t>
+        <w:t xml:space="preserve">At n = 20 the PXRDnet all-correct estimate (1/20) carries a 95 % CI of [0.9, 23.6], which overlaps DGpt’s [13.8, 18.3]; confirming the reversal would require n ≈ 100–200. At the looser symprec = 0.2 the gap narrows (PXRDnet 25 %, DGpt 21.4 %), so the divergence may reflect coordinate noise in a diffusion decode defeating tight symmetry detection rather than a failure to recover symmetry. §6 says why it would matter.</w:t>
       </w:r>
       <w:r>
         <w:t xml:space="preserve"> </w:t>
@@ -8876,7 +9057,7 @@
         <w:t xml:space="preserve">;</w:t>
       </w:r>
       <w:r>
-        <w:t xml:space="preserve">-separated string), an order of magnitude lower resolution than PXRD-Diff’s 4 251-bin 0.02° input, yet it still reaches 18.9 %, so the external models do not win by seeing more of the pattern. The differences that matter are</w:t>
+        <w:t xml:space="preserve">-separated string), an order of magnitude lower resolution than PXRD-Diff’s 4251-bin 0.02° input, yet it still reaches 18.9 %, so the external models do not win by seeing more of the pattern. The most conspicuous differences are</w:t>
       </w:r>
       <w:r>
         <w:t xml:space="preserve"> </w:t>
@@ -8892,7 +9073,7 @@
         <w:t xml:space="preserve"> </w:t>
       </w:r>
       <w:r>
-        <w:t xml:space="preserve">(DiffractGPT is a 7 B-parameter LLM; PXRD-Diff is 3.7 M, three orders of magnitude) and</w:t>
+        <w:t xml:space="preserve">(DiffractGPT is a 7 B-parameter large language model; PXRD-Diff is 3.7 M, three orders of magnitude) and</w:t>
       </w:r>
       <w:r>
         <w:t xml:space="preserve"> </w:t>
@@ -8908,7 +9089,7 @@
         <w:t xml:space="preserve"> </w:t>
       </w:r>
       <w:r>
-        <w:t xml:space="preserve">(PXRDnet’s ~35 k-op latent optimisation vs our single DDIM pass). Table 3 shows the expected gap between a deliberately small diagnostic model and production-scale systems; it sets the scale and does not rank PXRD-Diff among them (§6).</w:t>
+        <w:t xml:space="preserve">(PXRDnet’s ~35 k-op latent optimisation vs our single DDIM pass); training data, output representation and any overlap between the external models’ training sets and MP-20 test are not controlled here.</w:t>
       </w:r>
     </w:p>
     <w:bookmarkStart w:id="37" w:name="fig:threeway"/>
@@ -8921,7 +9102,7 @@
           <wp:inline>
             <wp:extent cx="5334000" cy="2210966"/>
             <wp:effectExtent b="0" l="0" r="0" t="0"/>
-            <wp:docPr descr="Figure 4. Three-way headline comparison. Match rate, all-correct, and pattern-Pearson on the same MP-20 test materials scored through our StructureMatcher harness, with 95 % Wilson CIs. PXRD-Diff is the corrected v22 checkpoint with its learned lattice head, no prior beyond composition, three seeds pooled (n = 3 × 1 000); its indexer control reaches 1.6 % and its true-lattice oracle 5.5 % (§5.2). It sits an order of magnitude below the external systems on match rate and above them on per-pattern Pearson (0.18 against 0.02 and 0.16). Note the wide PXRDnet (n = 20) intervals: the DGpt &gt; PXRDnet all-correct ordering is a hypothesis, not an established result (§5.3, §6)." title="" id="35" name="Picture"/>
+            <wp:docPr descr="Figure 4. Head-to-head on one harness. Match rate, all-correct and pattern Pearson on MP-20 test materials scored through our StructureMatcher harness; error bars are 95 % Wilson intervals. PXRD-Diff is the v22 checkpoint with its learned lattice head, no prior beyond composition, three sampling seeds pooled (n = 3 × 1000); its indexer control reaches 1.6 % and its true-lattice oracle 5.5 % (§5.2). It sits an order of magnitude below the external systems on match rate; its pattern Pearson (0.18) lies between DGpt’s 0.02 and deCIFer’s 0.55. The PXRDnet (n = 20) intervals are wide: the DGpt &gt; PXRDnet all-correct ordering is a hypothesis, not an established result (§5.3, §6)." title="" id="35" name="Picture"/>
             <a:graphic>
               <a:graphicData uri="http://schemas.openxmlformats.org/drawingml/2006/picture">
                 <pic:pic>
@@ -8968,13 +9149,13 @@
           <w:b/>
           <w:bCs/>
         </w:rPr>
-        <w:t xml:space="preserve">Figure 4. Three-way headline comparison.</w:t>
-      </w:r>
-      <w:r>
-        <w:t xml:space="preserve"> </w:t>
-      </w:r>
-      <w:r>
-        <w:t xml:space="preserve">Match rate, all-correct, and pattern-Pearson on the same MP-20 test materials scored through</w:t>
+        <w:t xml:space="preserve">Figure 4. Head-to-head on one harness.</w:t>
+      </w:r>
+      <w:r>
+        <w:t xml:space="preserve"> </w:t>
+      </w:r>
+      <w:r>
+        <w:t xml:space="preserve">Match rate, all-correct and pattern Pearson on MP-20 test materials scored through</w:t>
       </w:r>
       <w:r>
         <w:t xml:space="preserve"> </w:t>
@@ -8999,7 +9180,7 @@
         <w:t xml:space="preserve"> </w:t>
       </w:r>
       <w:r>
-        <w:t xml:space="preserve">harness, with 95 % Wilson CIs. PXRD-Diff is the corrected v22 checkpoint with its learned lattice head, no prior beyond composition, three seeds pooled (n = 3 × 1 000); its indexer control reaches 1.6 % and its true-lattice oracle 5.5 % (§5.2). It sits an order of magnitude below the external systems on match rate and above them on per-pattern Pearson (0.18 against 0.02 and 0.16). Note the wide PXRDnet (n = 20) intervals: the DGpt &gt; PXRDnet all-correct ordering is a hypothesis, not an established result (§5.3, §6).</w:t>
+        <w:t xml:space="preserve">harness; error bars are 95 % Wilson intervals. PXRD-Diff is the v22 checkpoint with its learned lattice head, no prior beyond composition, three sampling seeds pooled (n = 3 × 1000); its indexer control reaches 1.6 % and its true-lattice oracle 5.5 % (§5.2). It sits an order of magnitude below the external systems on match rate; its pattern Pearson (0.18) lies between DGpt’s 0.02 and deCIFer’s 0.55. The PXRDnet (n = 20) intervals are wide: the DGpt &gt; PXRDnet all-correct ordering is a hypothesis, not an established result (§5.3, §6).</w:t>
       </w:r>
     </w:p>
     <w:bookmarkEnd w:id="37"/>
@@ -9052,7 +9233,7 @@
         <w:pStyle w:val="FirstParagraph"/>
       </w:pPr>
       <w:r>
-        <w:t xml:space="preserve">Four interventions failed at n ≥ 200; one paragraph each.</w:t>
+        <w:t xml:space="preserve">Four interventions did not improve match rate under the conditions tested (n ≥ 200); one paragraph each. The two Debye-based interventions ran with the submitted form factor (§5.7(a)), and the rerank additionally with the indexer fallback (§5.7(c)); neither was rerun, so both are recorded as failures of the submitted implementation, not of the corrected one. The Wyckoff and distance-loss runs are single seeds compared against v13, whose 2.51 % §7 shows to be a high draw.</w:t>
       </w:r>
     </w:p>
     <w:p>
@@ -9070,7 +9251,7 @@
         <w:t xml:space="preserve"> </w:t>
       </w:r>
       <w:r>
-        <w:t xml:space="preserve">Top-5 indexer candidates reranked by Debye loss: match 1.6 % → 1.0 %, all-correct 0.1 % → 0.0 % at n = 1 000. The indexer surfaces more wrong cells faster than rerank can filter.</w:t>
+        <w:t xml:space="preserve">Top-5 indexer candidates reranked by Debye loss: match 1.6 % → 1.0 %, all-correct 0.1 % → 0.0 % at n = 1000. The indexer surfaces more wrong cells faster than rerank can filter.</w:t>
       </w:r>
     </w:p>
     <w:p>
@@ -9249,7 +9430,7 @@
           <w:b/>
           <w:bCs/>
         </w:rPr>
-        <w:t xml:space="preserve">Wyckoff-letter embeddings (v15, n = 1 000).</w:t>
+        <w:t xml:space="preserve">Wyckoff-letter embeddings (v15, n = 1000).</w:t>
       </w:r>
       <w:r>
         <w:t xml:space="preserve"> </w:t>
@@ -9295,7 +9476,7 @@
         <w:t xml:space="preserve">et al.</w:t>
       </w:r>
       <w:r>
-        <w:t xml:space="preserve">, 2023), so the embedding carried a label, not a constraint, and nothing in the loss or the sampler enforced the fixed or symmetry-related coordinates a Wyckoff position implies. The embedding learns (5 404 of 6 912 entries non-zero), but match drops from 2.5 % to 2.1 % and lattice prediction destabilises (lattice loss ~0.6 vs ~0.02; Figure 5), presumably because the inflated atom-feature norm shifts the lattice-pool input distribution. The negative result is narrow: a space-group-agnostic label token does not help and may hurt training dynamics; whether symmetry imposed as a constraint, on the coordinates or on the space group, would help was not tested.</w:t>
+        <w:t xml:space="preserve">, 2023), so the embedding carried a label, not a constraint, and nothing in the loss or the sampler enforced the fixed or symmetry-related coordinates a Wyckoff position implies. The embedding learns (5404 of 6912 entries non-zero), but match drops from 2.5 % to 2.1 % and lattice prediction destabilises (lattice loss ~0.6 vs ~0.02; Fig. 5), presumably because the inflated atom-feature norm shifts the lattice-pool input distribution. The negative result is narrow: a space-group-agnostic label token does not help and may hurt training dynamics; whether symmetry imposed as a constraint, on the coordinates or on the space group, would help was not tested.</w:t>
       </w:r>
     </w:p>
     <w:bookmarkStart w:id="42" w:name="fig:training"/>
@@ -9308,7 +9489,7 @@
           <wp:inline>
             <wp:extent cx="5334000" cy="2276539"/>
             <wp:effectExtent b="0" l="0" r="0" t="0"/>
-            <wp:docPr descr="Figure 5. Wyckoff embedding destabilises lattice prediction. Lattice (a) and coordinate (b) training-loss curves for the distance-aux run (v16) vs the Wyckoff-embedding run (v15). Adding the Wyckoff embedding inflates the lattice loss by an order of magnitude (~0.6 vs ~0.02) while leaving the coordinate loss largely unchanged; the failure is localised to the lattice channel." title="" id="40" name="Picture"/>
+            <wp:docPr descr="Figure 5. Wyckoff embedding destabilises lattice prediction. Lattice (a) and coordinate (b) training-loss curves for the distance-aux run (v16), the Wyckoff-embedding run (v15) and their combination (v14), one run each. Adding the Wyckoff embedding inflates the lattice loss by an order of magnitude (~0.6 vs ~0.02) while leaving the coordinate loss largely unchanged; the failure is localised to the lattice channel." title="" id="40" name="Picture"/>
             <a:graphic>
               <a:graphicData uri="http://schemas.openxmlformats.org/drawingml/2006/picture">
                 <pic:pic>
@@ -9361,7 +9542,7 @@
         <w:t xml:space="preserve"> </w:t>
       </w:r>
       <w:r>
-        <w:t xml:space="preserve">Lattice (a) and coordinate (b) training-loss curves for the distance-aux run (v16) vs the Wyckoff-embedding run (v15). Adding the Wyckoff embedding inflates the lattice loss by an order of magnitude (~0.6 vs ~0.02) while leaving the coordinate loss largely unchanged; the failure is localised to the lattice channel.</w:t>
+        <w:t xml:space="preserve">Lattice (a) and coordinate (b) training-loss curves for the distance-aux run (v16), the Wyckoff-embedding run (v15) and their combination (v14), one run each. Adding the Wyckoff embedding inflates the lattice loss by an order of magnitude (~0.6 vs ~0.02) while leaving the coordinate loss largely unchanged; the failure is localised to the lattice channel.</w:t>
       </w:r>
     </w:p>
     <w:bookmarkEnd w:id="42"/>
@@ -9374,7 +9555,7 @@
           <w:b/>
           <w:bCs/>
         </w:rPr>
-        <w:t xml:space="preserve">Distance-matrix aux loss (v16, n = 1 000).</w:t>
+        <w:t xml:space="preserve">Distance-matrix aux loss (v16, n = 1000).</w:t>
       </w:r>
       <w:r>
         <w:t xml:space="preserve"> </w:t>
@@ -9416,7 +9597,7 @@
         <w:t xml:space="preserve"> </w:t>
       </w:r>
       <w:r>
-        <w:t xml:space="preserve">(largest stable). Loss decreases (final ~2.0 vs ~10 random) but match drops 2.5 % → 1.8 %; biases features toward absolute-distance reconstruction rather than the relative updates diffusion needs.</w:t>
+        <w:t xml:space="preserve">(largest stable). Loss decreases (final ~2.0 vs ~10 random) but match drops 2.5 % → 1.8 %; biases features towards absolute-distance reconstruction rather than the relative updates diffusion needs.</w:t>
       </w:r>
     </w:p>
     <w:p>
@@ -9434,7 +9615,7 @@
         <w:t xml:space="preserve"> </w:t>
       </w:r>
       <w:r>
-        <w:t xml:space="preserve">Wyckoff + distance loss together collapses to 0.8 %, below the bare ε baseline; the two interact destructively, no clean theoretical explanation.</w:t>
+        <w:t xml:space="preserve">Wyckoff + distance loss together falls to 0.8 % (single seed), below the bare ε baseline; no clean explanation.</w:t>
       </w:r>
     </w:p>
     <w:bookmarkEnd w:id="43"/>
@@ -9452,7 +9633,7 @@
         <w:pStyle w:val="FirstParagraph"/>
       </w:pPr>
       <w:r>
-        <w:t xml:space="preserve">Best predicted-vs-target Pearson is 0.43; the same model with</w:t>
+        <w:t xml:space="preserve">Best predicted-vs-target Pearson is 0.43 (v13, Table 1); the same model with</w:t>
       </w:r>
       <w:r>
         <w:t xml:space="preserve"> </w:t>
@@ -9468,7 +9649,90 @@
         <w:t xml:space="preserve"> </w:t>
       </w:r>
       <w:r>
-        <w:t xml:space="preserve">coordinates plugged into the differentiable simulator hits 0.97; the encoder + denoiser leaves ~0.5 of pattern-space agreement on the table. The aux head (sees</w:t>
+        <w:t xml:space="preserve">coordinates plugged into the differentiable simulator hits 0.97, so the encoder + denoiser leaves about half of the pattern-space agreement on the table. This section measures how much cell error the sampler tolerates; §5.6 asks whether the lattice is the part that is lost.</w:t>
+      </w:r>
+    </w:p>
+    <w:p>
+      <w:pPr>
+        <w:pStyle w:val="BodyText"/>
+      </w:pPr>
+      <w:r>
+        <w:t xml:space="preserve">Perturbing the true cell by Gaussian noise on the lengths (σ_ang = 0; v21, n = 300 per level, single sampling seed;</w:t>
+      </w:r>
+      <w:r>
+        <w:t xml:space="preserve"> </w:t>
+      </w:r>
+      <w:r>
+        <w:rPr>
+          <w:rStyle w:val="VerbatimChar"/>
+        </w:rPr>
+        <w:t xml:space="preserve">paper/phase9_results/cell_perturb_sensitivity.json</w:t>
+      </w:r>
+      <w:r>
+        <w:t xml:space="preserve">): at zero error match is 2.0 % (6 / 300) and pattern Pearson 0.52; at a realised length error of 0.40 Å match is 0.33 % (1 / 300) and Pearson 0.05; at 0.80 Å, 0.33 % and 0.04; from 0.99 Å upwards, 0 %. Recovery is therefore not graceful, but with six matches at zero error the match curve cannot resolve a knee; the tenfold fall in pattern agreement by 0.4 Å is the resolved signal, and ~0.5 Å is used throughout as a working tolerance rather than a located threshold. The indexer’s per-system errors sit on both sides of it: hexagonal 0.53 Å, tetragonal and orthorhombic 0.96 Å, cubic 1.14 Å, monoclinic 1.76 Å and trigonal 4.62 Å (Fig. 3), which is consistent with the indexer’s paired gains falling in the hexagonal and tetragonal systems (§5.2), though orthorhombic cells of equal accuracy show none.</w:t>
+      </w:r>
+    </w:p>
+    <w:bookmarkEnd w:id="44"/>
+    <w:bookmarkStart w:id="45" w:name="X57009b34a40e3731f8839f16dc9a7e37dbb44bd"/>
+    <w:p>
+      <w:pPr>
+        <w:pStyle w:val="Heading2"/>
+      </w:pPr>
+      <w:r>
+        <w:t xml:space="preserve">5.6 Why the learned lattice fails: neither the head nor the pooling repairs the scale</w:t>
+      </w:r>
+    </w:p>
+    <w:p>
+      <w:pPr>
+        <w:pStyle w:val="FirstParagraph"/>
+      </w:pPr>
+      <w:r>
+        <w:t xml:space="preserve">The natural reading of the 0.007 aux loss, that the lattice is already recoverable from the encoder and only the denoiser is at fault, is testable, and the tests below do not support it. Two experiments (released as</w:t>
+      </w:r>
+      <w:r>
+        <w:t xml:space="preserve"> </w:t>
+      </w:r>
+      <w:r>
+        <w:rPr>
+          <w:rStyle w:val="VerbatimChar"/>
+        </w:rPr>
+        <w:t xml:space="preserve">paper/phase5_results/</w:t>
+      </w:r>
+      <w:r>
+        <w:t xml:space="preserve"> </w:t>
+      </w:r>
+      <w:r>
+        <w:t xml:space="preserve">and</w:t>
+      </w:r>
+      <w:r>
+        <w:t xml:space="preserve"> </w:t>
+      </w:r>
+      <w:r>
+        <w:rPr>
+          <w:rStyle w:val="VerbatimChar"/>
+        </w:rPr>
+        <w:t xml:space="preserve">paper/phase5b6_results/</w:t>
+      </w:r>
+      <w:r>
+        <w:t xml:space="preserve">) promote the auxiliary head from a training-time regulariser to the inference-time lattice source and measure what it actually delivers.</w:t>
+      </w:r>
+    </w:p>
+    <w:p>
+      <w:pPr>
+        <w:pStyle w:val="BodyText"/>
+      </w:pPr>
+      <w:r>
+        <w:rPr>
+          <w:b/>
+          <w:bCs/>
+        </w:rPr>
+        <w:t xml:space="preserve">Aux head as lattice predictor (no retrain).</w:t>
+      </w:r>
+      <w:r>
+        <w:t xml:space="preserve"> </w:t>
+      </w:r>
+      <w:r>
+        <w:t xml:space="preserve">Substituting the v13 aux head’s predicted</w:t>
       </w:r>
       <w:r>
         <w:t xml:space="preserve"> </w:t>
@@ -9476,6 +9740,140 @@
       <m:oMath>
         <m:r>
           <m:rPr>
+            <m:sty m:val="p"/>
+          </m:rPr>
+          <m:t>(</m:t>
+        </m:r>
+        <m:r>
+          <m:t>a</m:t>
+        </m:r>
+        <m:r>
+          <m:rPr>
+            <m:sty m:val="p"/>
+          </m:rPr>
+          <m:t>,</m:t>
+        </m:r>
+        <m:r>
+          <m:t>b</m:t>
+        </m:r>
+        <m:r>
+          <m:rPr>
+            <m:sty m:val="p"/>
+          </m:rPr>
+          <m:t>,</m:t>
+        </m:r>
+        <m:r>
+          <m:t>c</m:t>
+        </m:r>
+        <m:r>
+          <m:rPr>
+            <m:sty m:val="p"/>
+          </m:rPr>
+          <m:t>,</m:t>
+        </m:r>
+        <m:r>
+          <m:t>α</m:t>
+        </m:r>
+        <m:r>
+          <m:rPr>
+            <m:sty m:val="p"/>
+          </m:rPr>
+          <m:t>,</m:t>
+        </m:r>
+        <m:r>
+          <m:t>β</m:t>
+        </m:r>
+        <m:r>
+          <m:rPr>
+            <m:sty m:val="p"/>
+          </m:rPr>
+          <m:t>,</m:t>
+        </m:r>
+        <m:r>
+          <m:t>γ</m:t>
+        </m:r>
+        <m:r>
+          <m:rPr>
+            <m:sty m:val="p"/>
+          </m:rPr>
+          <m:t>)</m:t>
+        </m:r>
+      </m:oMath>
+      <w:r>
+        <w:t xml:space="preserve"> </w:t>
+      </w:r>
+      <w:r>
+        <w:t xml:space="preserve">for the sampled lattice channel at n = 1000 gives a length MAE of (1.12, 1.02, 1.38) Å and an angle MAE of (13.0°, 11.9°, 17.6°) at</w:t>
+      </w:r>
+      <w:r>
+        <w:t xml:space="preserve"> </w:t>
+      </w:r>
+      <w:r>
+        <w:rPr>
+          <w:b/>
+          <w:bCs/>
+        </w:rPr>
+        <w:t xml:space="preserve">99.8 %</w:t>
+      </w:r>
+      <w:r>
+        <w:t xml:space="preserve"> </w:t>
+      </w:r>
+      <w:r>
+        <w:t xml:space="preserve">cell validity, far better conditioned than the diffusion sampler, whose predicted cells were near-0 % valid for v13 (the v22 sampler’s cells are all valid, §5.2), but still ~15 % relative length error. End to end this recovers</w:t>
+      </w:r>
+      <w:r>
+        <w:t xml:space="preserve"> </w:t>
+      </w:r>
+      <w:r>
+        <w:rPr>
+          <w:b/>
+          <w:bCs/>
+        </w:rPr>
+        <w:t xml:space="preserve">1.2 %</w:t>
+      </w:r>
+      <w:r>
+        <w:t xml:space="preserve"> </w:t>
+      </w:r>
+      <w:r>
+        <w:t xml:space="preserve">match (1.3 % with Phase 4 ensembling + coordinate refinement) and 0.0 % all-correct, with pattern Pearson collapsing to</w:t>
+      </w:r>
+      <w:r>
+        <w:t xml:space="preserve"> </w:t>
+      </w:r>
+      <w:r>
+        <w:rPr>
+          <w:b/>
+          <w:bCs/>
+        </w:rPr>
+        <w:t xml:space="preserve">0.013</w:t>
+      </w:r>
+      <w:r>
+        <w:t xml:space="preserve">: a 15 % length error shifts every Bragg reflection by a similar fraction in 2θ, so the simulated pattern no longer overlaps the target.</w:t>
+      </w:r>
+    </w:p>
+    <w:p>
+      <w:pPr>
+        <w:pStyle w:val="BodyText"/>
+      </w:pPr>
+      <w:r>
+        <w:rPr>
+          <w:b/>
+          <w:bCs/>
+        </w:rPr>
+        <w:t xml:space="preserve">Stronger, constrained supervision (retrain).</w:t>
+      </w:r>
+      <w:r>
+        <w:t xml:space="preserve"> </w:t>
+      </w:r>
+      <w:r>
+        <w:t xml:space="preserve">Bounding the head (softplus lengths, sigmoid-scaled angles), raising the aux weight 0.5 → 5.0, and warm-starting 30 k further steps leaves the MAE essentially unchanged (a ≈ 1.11 Å, α ≈ 14°). No head reading</w:t>
+      </w:r>
+      <w:r>
+        <w:t xml:space="preserve"> </w:t>
+      </w:r>
+      <m:oMath>
+        <m:r>
+          <m:rPr>
             <m:sty m:val="bi"/>
           </m:rPr>
           <m:t>g</m:t>
@@ -9485,7 +9883,7 @@
         <w:t xml:space="preserve"> </w:t>
       </w:r>
       <w:r>
-        <w:t xml:space="preserve">only) reaches a 0.007</w:t>
+        <w:t xml:space="preserve">recovers the absolute scale. The submitted version read this as a property of the</w:t>
       </w:r>
       <w:r>
         <w:t xml:space="preserve"> </w:t>
@@ -9495,95 +9893,126 @@
           <w:i/>
           <w:iCs/>
         </w:rPr>
-        <w:t xml:space="preserve">normalised</w:t>
-      </w:r>
-      <w:r>
-        <w:t xml:space="preserve"> </w:t>
-      </w:r>
-      <w:r>
-        <w:t xml:space="preserve">lattice-regression loss, but that figure is a relative fit that does</w:t>
-      </w:r>
-      <w:r>
-        <w:t xml:space="preserve"> </w:t>
-      </w:r>
+        <w:t xml:space="preserve">pooled global encoding</w:t>
+      </w:r>
+      <w:r>
+        <w:t xml:space="preserve">, on the grounds that the</w:t>
+      </w:r>
+      <w:r>
+        <w:t xml:space="preserve"> </w:t>
+      </w:r>
+      <w:r>
+        <w:rPr>
+          <w:rStyle w:val="VerbatimChar"/>
+        </w:rPr>
+        <w:t xml:space="preserve">AdaptiveAvgPool1d(1)</w:t>
+      </w:r>
+      <w:r>
+        <w:t xml:space="preserve"> </w:t>
+      </w:r>
+      <w:r>
+        <w:t xml:space="preserve">collapse §3.2 identified for coordinates would also discard the peak-position fidelity Bragg’s-law decoding needs; the controlled ablation below tests that reading and does not support it. The 0.007 figure is a training-batch loss; on test the same head has a 1.3 Å length error (Table 4). A generalisation gap of the encoder features is therefore an alternative to the regression reading below that a frozen-encoder ablation cannot exclude; the head’s training-set MAE, not reported here, would separate them, and a direct comparison with the convolutional lattice-parameter regressor of Chitturi</w:t>
+      </w:r>
+      <w:r>
+        <w:t xml:space="preserve"> </w:t>
+      </w:r>
+      <w:r>
+        <w:rPr>
+          <w:i/>
+          <w:iCs/>
+        </w:rPr>
+        <w:t xml:space="preserve">et al.</w:t>
+      </w:r>
+      <w:r>
+        <w:t xml:space="preserve"> </w:t>
+      </w:r>
+      <w:r>
+        <w:t xml:space="preserve">(2021) on comparable cells is the natural external test.</w:t>
+      </w:r>
+    </w:p>
+    <w:p>
+      <w:pPr>
+        <w:pStyle w:val="BodyText"/>
+      </w:pPr>
+      <w:r>
+        <w:t xml:space="preserve">This reconciles the diagnosis with the indexer result. The 0.007 normalised aux loss is a</w:t>
+      </w:r>
+      <w:r>
+        <w:t xml:space="preserve"> </w:t>
+      </w:r>
+      <w:r>
+        <w:rPr>
+          <w:i/>
+          <w:iCs/>
+        </w:rPr>
+        <w:t xml:space="preserve">relative</w:t>
+      </w:r>
+      <w:r>
+        <w:t xml:space="preserve"> </w:t>
+      </w:r>
+      <w:r>
+        <w:t xml:space="preserve">fit, enough to place the crystal system (a space-group head on the same encoder reaches 39 % top-1 / 71 % top-5 across 230 classes, released under</w:t>
+      </w:r>
+      <w:r>
+        <w:t xml:space="preserve"> </w:t>
+      </w:r>
+      <w:r>
+        <w:rPr>
+          <w:rStyle w:val="VerbatimChar"/>
+        </w:rPr>
+        <w:t xml:space="preserve">phase5b6_results/</w:t>
+      </w:r>
+      <w:r>
+        <w:t xml:space="preserve">) but not the absolute scale. The autoindexer fixes the hexagonal and tetragonal cases, where peak positions over-determine the cell; we read the contrast with the regression heads as a difference between explicit index assignment and pointwise regression (a hypothesis), consistent with the head-side fixes of Phase 5 here and the top-K rerank of §5.4 not helping. The ablation below asks whether it is the summary, rather than the regression, that fails.</w:t>
+      </w:r>
+    </w:p>
+    <w:p>
+      <w:pPr>
+        <w:pStyle w:val="BodyText"/>
+      </w:pPr>
       <w:r>
         <w:rPr>
           <w:b/>
           <w:bCs/>
         </w:rPr>
-        <w:t xml:space="preserve">not</w:t>
-      </w:r>
-      <w:r>
-        <w:t xml:space="preserve"> </w:t>
-      </w:r>
-      <w:r>
-        <w:t xml:space="preserve">survive conversion to absolute scale: when the aux head’s own lattice is substituted into the sampler it recovers only 1.2 % (§5.6), because its 1.1 Å length MAE shifts every Bragg reflection by ~15 %. So the lattice head delivers crystal-system and relative-spacing structure but not absolute d-spacings at the &lt;0.5 Å precision the knee demands; §5.6 shows that giving the head the peak positions does not repair this.</w:t>
-      </w:r>
-    </w:p>
-    <w:p>
-      <w:pPr>
-        <w:pStyle w:val="BodyText"/>
-      </w:pPr>
-      <w:r>
-        <w:t xml:space="preserve">Perturbing the sampler-supplied lattice by Å of cell-length error, v21 at n = 200: match decays 5.6 % (Δ=0) → 2.0 % (0.5 Å) → 0.5 % (1.0 Å) → 0 % (≥1.5 Å), steeper than linear with a knee at ~0.5 Å. This matches the indexer’s per-system MAE: high-symmetry systems (hex, ortho; MAE ≤ 1.0 Å) lift; low-symmetry (mono, tri; MAE ≥ 1.5 Å) do not. §5.2’s per-system indexer gains are</w:t>
-      </w:r>
-      <w:r>
-        <w:t xml:space="preserve"> </w:t>
-      </w:r>
-      <w:r>
-        <w:rPr>
-          <w:i/>
-          <w:iCs/>
-        </w:rPr>
-        <w:t xml:space="preserve">predictable</w:t>
-      </w:r>
-      <w:r>
-        <w:t xml:space="preserve">: they occur where the cell error is below the knee.</w:t>
-      </w:r>
-    </w:p>
-    <w:bookmarkEnd w:id="44"/>
-    <w:bookmarkStart w:id="45" w:name="X57009b34a40e3731f8839f16dc9a7e37dbb44bd"/>
-    <w:p>
-      <w:pPr>
-        <w:pStyle w:val="Heading2"/>
-      </w:pPr>
-      <w:r>
-        <w:t xml:space="preserve">5.6 Why the learned lattice fails: neither the head nor the pooling repairs the scale</w:t>
-      </w:r>
-    </w:p>
-    <w:p>
-      <w:pPr>
-        <w:pStyle w:val="FirstParagraph"/>
-      </w:pPr>
-      <w:r>
-        <w:t xml:space="preserve">The natural reading of the 0.007 aux loss, that the lattice is already recoverable from the encoder and only the denoiser is at fault, is testable, and it is wrong. Two experiments (released as</w:t>
-      </w:r>
-      <w:r>
-        <w:t xml:space="preserve"> </w:t>
-      </w:r>
-      <w:r>
-        <w:rPr>
-          <w:rStyle w:val="VerbatimChar"/>
-        </w:rPr>
-        <w:t xml:space="preserve">paper/phase5_results/</w:t>
-      </w:r>
-      <w:r>
-        <w:t xml:space="preserve"> </w:t>
-      </w:r>
-      <w:r>
-        <w:t xml:space="preserve">and</w:t>
-      </w:r>
-      <w:r>
-        <w:t xml:space="preserve"> </w:t>
-      </w:r>
-      <w:r>
-        <w:rPr>
-          <w:rStyle w:val="VerbatimChar"/>
-        </w:rPr>
-        <w:t xml:space="preserve">paper/phase5b6_results/</w:t>
-      </w:r>
-      <w:r>
-        <w:t xml:space="preserve">) promote the auxiliary head from a training-time regulariser to the inference-time lattice source and measure what it actually delivers.</w:t>
+        <w:t xml:space="preserve">Controlled pooling ablation.</w:t>
+      </w:r>
+      <w:r>
+        <w:t xml:space="preserve"> </w:t>
+      </w:r>
+      <w:r>
+        <w:t xml:space="preserve">The two experiments above vary the head and its supervision with the encoder fixed. They do not by themselves isolate global average pooling as the cause: the encoder, the information content of its representation, the head parameterisation and optimisation difficulty remain confounded, as one referee noted. To separate them, a controlled ablation holds the encoder, the denoiser, the training objective and the schedule fixed and changes only how the auxiliary head reads the encoder: (i) the global average pool</w:t>
+      </w:r>
+      <w:r>
+        <w:t xml:space="preserve"> </w:t>
+      </w:r>
+      <m:oMath>
+        <m:r>
+          <m:rPr>
+            <m:sty m:val="bi"/>
+          </m:rPr>
+          <m:t>g</m:t>
+        </m:r>
+      </m:oMath>
+      <w:r>
+        <w:t xml:space="preserve"> </w:t>
+      </w:r>
+      <w:r>
+        <w:t xml:space="preserve">of the submitted version; (ii) a position-aware pooling that retains the 2θ coordinate of each feature; (iii) explicit peak-position features extracted from the input pattern and concatenated to</w:t>
+      </w:r>
+      <w:r>
+        <w:t xml:space="preserve"> </w:t>
+      </w:r>
+      <m:oMath>
+        <m:r>
+          <m:rPr>
+            <m:sty m:val="bi"/>
+          </m:rPr>
+          <m:t>g</m:t>
+        </m:r>
+      </m:oMath>
+      <w:r>
+        <w:t xml:space="preserve">. If absolute d-spacings are lost at the pooling stage, variants (ii) and (iii) should reduce the ~1.1 Å length error while (i) does not. Table 4 gives the result on both encoders.</w:t>
       </w:r>
     </w:p>
     <w:p>
@@ -9595,311 +10024,13 @@
           <w:b/>
           <w:bCs/>
         </w:rPr>
-        <w:t xml:space="preserve">Aux head as lattice predictor (no retrain).</w:t>
-      </w:r>
-      <w:r>
-        <w:t xml:space="preserve"> </w:t>
-      </w:r>
-      <w:r>
-        <w:t xml:space="preserve">Substituting the v13 aux head’s predicted</w:t>
-      </w:r>
-      <w:r>
-        <w:t xml:space="preserve"> </w:t>
-      </w:r>
-      <m:oMath>
-        <m:r>
-          <m:rPr>
-            <m:sty m:val="p"/>
-          </m:rPr>
-          <m:t>(</m:t>
-        </m:r>
-        <m:r>
-          <m:t>a</m:t>
-        </m:r>
-        <m:r>
-          <m:rPr>
-            <m:sty m:val="p"/>
-          </m:rPr>
-          <m:t>,</m:t>
-        </m:r>
-        <m:r>
-          <m:t>b</m:t>
-        </m:r>
-        <m:r>
-          <m:rPr>
-            <m:sty m:val="p"/>
-          </m:rPr>
-          <m:t>,</m:t>
-        </m:r>
-        <m:r>
-          <m:t>c</m:t>
-        </m:r>
-        <m:r>
-          <m:rPr>
-            <m:sty m:val="p"/>
-          </m:rPr>
-          <m:t>,</m:t>
-        </m:r>
-        <m:r>
-          <m:t>α</m:t>
-        </m:r>
-        <m:r>
-          <m:rPr>
-            <m:sty m:val="p"/>
-          </m:rPr>
-          <m:t>,</m:t>
-        </m:r>
-        <m:r>
-          <m:t>β</m:t>
-        </m:r>
-        <m:r>
-          <m:rPr>
-            <m:sty m:val="p"/>
-          </m:rPr>
-          <m:t>,</m:t>
-        </m:r>
-        <m:r>
-          <m:t>γ</m:t>
-        </m:r>
-        <m:r>
-          <m:rPr>
-            <m:sty m:val="p"/>
-          </m:rPr>
-          <m:t>)</m:t>
-        </m:r>
-      </m:oMath>
-      <w:r>
-        <w:t xml:space="preserve"> </w:t>
-      </w:r>
-      <w:r>
-        <w:t xml:space="preserve">for the sampled lattice channel at n = 1 000 gives a length MAE of (1.12, 1.02, 1.38) Å and an angle MAE of (13.0°, 11.9°, 17.6°) at</w:t>
-      </w:r>
-      <w:r>
-        <w:t xml:space="preserve"> </w:t>
-      </w:r>
-      <w:r>
-        <w:rPr>
-          <w:b/>
-          <w:bCs/>
-        </w:rPr>
-        <w:t xml:space="preserve">99.8 %</w:t>
-      </w:r>
-      <w:r>
-        <w:t xml:space="preserve"> </w:t>
-      </w:r>
-      <w:r>
-        <w:t xml:space="preserve">cell validity, far better conditioned than the diffusion sampler, whose predicted cells are near-0 % valid, but still ~15 % relative length error. End-to-end this recovers</w:t>
-      </w:r>
-      <w:r>
-        <w:t xml:space="preserve"> </w:t>
-      </w:r>
-      <w:r>
-        <w:rPr>
-          <w:b/>
-          <w:bCs/>
-        </w:rPr>
-        <w:t xml:space="preserve">1.2 %</w:t>
-      </w:r>
-      <w:r>
-        <w:t xml:space="preserve"> </w:t>
-      </w:r>
-      <w:r>
-        <w:t xml:space="preserve">match (1.3 % with Phase 4 ensembling + coordinate refinement) and 0.0 % all-correct, with pattern Pearson collapsing to</w:t>
-      </w:r>
-      <w:r>
-        <w:t xml:space="preserve"> </w:t>
-      </w:r>
-      <w:r>
-        <w:rPr>
-          <w:b/>
-          <w:bCs/>
-        </w:rPr>
-        <w:t xml:space="preserve">0.013</w:t>
-      </w:r>
-      <w:r>
-        <w:t xml:space="preserve">: a 15 % length error shifts every Bragg reflection by a similar fraction in 2θ, so the simulated pattern no longer overlaps the target.</w:t>
-      </w:r>
-    </w:p>
-    <w:p>
-      <w:pPr>
-        <w:pStyle w:val="BodyText"/>
-      </w:pPr>
-      <w:r>
-        <w:rPr>
-          <w:b/>
-          <w:bCs/>
-        </w:rPr>
-        <w:t xml:space="preserve">Stronger, constrained supervision (retrain).</w:t>
-      </w:r>
-      <w:r>
-        <w:t xml:space="preserve"> </w:t>
-      </w:r>
-      <w:r>
-        <w:t xml:space="preserve">Bounding the head (softplus lengths, sigmoid-scaled angles), raising the aux weight 0.5 → 5.0, and warm-starting 30 k further steps leaves the MAE essentially unchanged (a ≈ 1.11 Å, α ≈ 14°). No head reading</w:t>
-      </w:r>
-      <w:r>
-        <w:t xml:space="preserve"> </w:t>
-      </w:r>
-      <m:oMath>
-        <m:r>
-          <m:rPr>
-            <m:sty m:val="bi"/>
-          </m:rPr>
-          <m:t>g</m:t>
-        </m:r>
-      </m:oMath>
-      <w:r>
-        <w:t xml:space="preserve"> </w:t>
-      </w:r>
-      <w:r>
-        <w:t xml:space="preserve">recovers the absolute scale. The submitted version read this as a property of the</w:t>
-      </w:r>
-      <w:r>
-        <w:t xml:space="preserve"> </w:t>
-      </w:r>
-      <w:r>
-        <w:rPr>
-          <w:i/>
-          <w:iCs/>
-        </w:rPr>
-        <w:t xml:space="preserve">pooled global encoding</w:t>
-      </w:r>
-      <w:r>
-        <w:t xml:space="preserve">, on the grounds that the</w:t>
-      </w:r>
-      <w:r>
-        <w:t xml:space="preserve"> </w:t>
-      </w:r>
-      <w:r>
-        <w:rPr>
-          <w:rStyle w:val="VerbatimChar"/>
-        </w:rPr>
-        <w:t xml:space="preserve">AdaptiveAvgPool1d(1)</w:t>
-      </w:r>
-      <w:r>
-        <w:t xml:space="preserve"> </w:t>
-      </w:r>
-      <w:r>
-        <w:t xml:space="preserve">collapse §3.2 identified for coordinates would also discard the peak-position fidelity Bragg’s-law decoding needs; the controlled ablation below tests that reading and does not support it.</w:t>
-      </w:r>
-    </w:p>
-    <w:p>
-      <w:pPr>
-        <w:pStyle w:val="BodyText"/>
-      </w:pPr>
-      <w:r>
-        <w:t xml:space="preserve">This reconciles the diagnosis with the indexer result. The 0.007 normalised aux loss is a</w:t>
-      </w:r>
-      <w:r>
-        <w:t xml:space="preserve"> </w:t>
-      </w:r>
-      <w:r>
-        <w:rPr>
-          <w:i/>
-          <w:iCs/>
-        </w:rPr>
-        <w:t xml:space="preserve">relative</w:t>
-      </w:r>
-      <w:r>
-        <w:t xml:space="preserve"> </w:t>
-      </w:r>
-      <w:r>
-        <w:t xml:space="preserve">fit, enough to place the crystal system (a space-group head on the same encoder reaches 39 % top-1 / 71 % top-5 across 230 classes, released under</w:t>
-      </w:r>
-      <w:r>
-        <w:t xml:space="preserve"> </w:t>
-      </w:r>
-      <w:r>
-        <w:rPr>
-          <w:rStyle w:val="VerbatimChar"/>
-        </w:rPr>
-        <w:t xml:space="preserve">phase5b6_results/</w:t>
-      </w:r>
-      <w:r>
-        <w:t xml:space="preserve">) but not the absolute scale. The autoindexer succeeds where every learned head fails because it assigns Miller indices to peak</w:t>
-      </w:r>
-      <w:r>
-        <w:t xml:space="preserve"> </w:t>
-      </w:r>
-      <w:r>
-        <w:rPr>
-          <w:i/>
-          <w:iCs/>
-        </w:rPr>
-        <w:t xml:space="preserve">positions</w:t>
-      </w:r>
-      <w:r>
-        <w:t xml:space="preserve"> </w:t>
-      </w:r>
-      <w:r>
-        <w:t xml:space="preserve">by explicit search rather than regressing six numbers from a summary, which is why its paired gains in §5.2 lie in the high-symmetry systems where peak positions over-determine the cell, and why head-side fixes (Phase 5 here, top-K rerank in §5.4) cannot substitute for it. The ablation below asks whether it is the summary, rather than the regression, that fails.</w:t>
-      </w:r>
-    </w:p>
-    <w:p>
-      <w:pPr>
-        <w:pStyle w:val="BodyText"/>
-      </w:pPr>
-      <w:r>
-        <w:rPr>
-          <w:b/>
-          <w:bCs/>
-        </w:rPr>
-        <w:t xml:space="preserve">Controlled pooling ablation.</w:t>
-      </w:r>
-      <w:r>
-        <w:t xml:space="preserve"> </w:t>
-      </w:r>
-      <w:r>
-        <w:t xml:space="preserve">The two experiments above vary the head and its supervision with the encoder fixed; they do not by themselves isolate global average pooling as the cause, since the encoder, the information content of its representation, the head parameterisation and optimisation difficulty remain confounded, as one referee noted. To separate them, a controlled ablation holds the encoder, the denoiser, the training objective and the schedule fixed and changes only how the auxiliary head reads the encoder: (i) the global average pool</w:t>
-      </w:r>
-      <w:r>
-        <w:t xml:space="preserve"> </w:t>
-      </w:r>
-      <m:oMath>
-        <m:r>
-          <m:rPr>
-            <m:sty m:val="bi"/>
-          </m:rPr>
-          <m:t>g</m:t>
-        </m:r>
-      </m:oMath>
-      <w:r>
-        <w:t xml:space="preserve"> </w:t>
-      </w:r>
-      <w:r>
-        <w:t xml:space="preserve">of the submitted version; (ii) a position-aware pooling that retains the 2θ coordinate of each feature; (iii) explicit peak-position features extracted from the input pattern and concatenated to</w:t>
-      </w:r>
-      <w:r>
-        <w:t xml:space="preserve"> </w:t>
-      </w:r>
-      <m:oMath>
-        <m:r>
-          <m:rPr>
-            <m:sty m:val="bi"/>
-          </m:rPr>
-          <m:t>g</m:t>
-        </m:r>
-      </m:oMath>
-      <w:r>
-        <w:t xml:space="preserve">. If absolute d-spacings are lost at the pooling stage, variants (ii) and (iii) should reduce the ~1.1 Å length error while (i) does not. Table 4 gives the result on both encoders.</w:t>
-      </w:r>
-    </w:p>
-    <w:p>
-      <w:pPr>
-        <w:pStyle w:val="BodyText"/>
-      </w:pPr>
-      <w:r>
-        <w:rPr>
-          <w:b/>
-          <w:bCs/>
-        </w:rPr>
         <w:t xml:space="preserve">Table 4.</w:t>
       </w:r>
       <w:r>
         <w:t xml:space="preserve"> </w:t>
       </w:r>
       <w:r>
-        <w:t xml:space="preserve">Controlled pooling ablation (n = 1 000 MP-20 test). Three heads trained under an identical loss, AdamW 10⁻³, batch 64, sigmoid-bounded outputs, on a frozen encoder: the submitted v21 encoder at three epochs and the retrained v22 encoder (§5.2) at ten. Length and angle MAE are means over (a, b, c) and (α, β, γ);</w:t>
+        <w:t xml:space="preserve">Controlled pooling ablation (n = 1000 MP-20 test). Three heads trained under an identical loss, AdamW 10⁻³, batch 64, sigmoid-bounded outputs, on a frozen encoder: the submitted v21 encoder at three epochs and the retrained v22 encoder (§5.2) at ten, one training seed per head. Length and angle MAE are means over (a, b, c) and (α, β, γ);</w:t>
       </w:r>
       <w:r>
         <w:t xml:space="preserve"> </w:t>
@@ -9911,7 +10042,7 @@
         <w:t xml:space="preserve"> </w:t>
       </w:r>
       <w:r>
-        <w:t xml:space="preserve">is the fraction of structures whose mean length error lies below the knee of §5.5; the last column substitutes the head’s cells into the sampler at three seeds (n = 3 000 structure-seeds; the full pipeline reaches 1.9 % and the indexer 1.6 %, Table 2). The checkpoint rows are the head trained jointly for 100 k steps, without retraining.</w:t>
+        <w:t xml:space="preserve">is the fraction of structures whose mean length error lies below the ~0.5 Å tolerance of §5.5; the last column substitutes the head’s cells into the sampler at three seeds (n = 3000 structure-seeds; the full pipeline reaches 1.9 % and the indexer 1.6 %, Table 2). The checkpoint rows are the head trained jointly for 100 k steps, without retraining.</w:t>
       </w:r>
     </w:p>
     <w:tbl>
@@ -10884,7 +11015,31 @@
         <w:pStyle w:val="BodyText"/>
       </w:pPr>
       <w:r>
-        <w:t xml:space="preserve">The prediction is not borne out on either encoder. On v21 the three arms lie within 0.03 Å of one another (~2 % of the error). On v22, with ten epochs, arms (i) and (iii) converge by the sixth epoch to 1.29 and 1.28 Å, and arm (ii) reaches 1.21 Å at ten epochs and 1.12 Å at thirty, where it is converged (flat over the last six epochs), a 13 % reduction. Every arm sits more than 2.2× above the 0.5 Å knee, and arm (i) reproduces the checkpoint head on both encoders, so the budget suffices to match the baseline. End to end, the substituted cells recover 0.7 %, 0.5 % and 1.2 % for (i), (ii) and (iii), each below the 1.9 % of the full pipeline (paired McNemar p = 7 × 10⁻⁷, 3 × 10⁻⁹ and 8 × 10⁻³) and the indexer’s 1.6 %, with pattern Pearson 0.08 in every arm; the head-level gain of arm (ii) does not carry through: its converged thirty-epoch cells recover 0.8 % [0.5, 1.2] (24 / 3 000, 22 of them cubic), level with arm (i). Every match obtained through a regression head is a cubic structure (18, 16 and 34 of the 22, 16 and 37), the one-parameter case; none is hexagonal or tetragonal, where the indexer’s search succeeds (§5.2). Restoring absolute peak positions to the head does not repair the absolute scale, and the submitted reading that global pooling discards the d-spacing information is withdrawn. Arm (iii) is decisive: it receives the same peak positions the autoindexer reads, yet a head trained to regress six cell parameters does not turn them into a cell, because that requires assigning Miller indices to peaks, a combinatorial step the autoindexer performs by explicit search and a pointwise-loss regressor does not learn here. This revised reading is the best-supported one, not a demonstrated cause; it accounts for every head-side failure (the two experiments above, the top-K rerank of §5.4), for the space-group head’s success on relative features, and for the indexer succeeding exactly where the assignment is over-determined (§5.2). The next gain must come from obtaining the cell by search, or from a model that performs the peak-to-index assignment explicitly, not from a different pooling, a better head or a better denoiser. Two caveats remain: the encoder is frozen, so an encoder trained from scratch under position-aware pooling could behave differently (not run); and the heads are trained on the frozen encoder’s features rather than jointly, so a jointly trained position-aware head is untested. Runs:</w:t>
+        <w:t xml:space="preserve">The prediction is not borne out on either encoder. On v21 the three arms lie within 0.03 Å of one another (~2 % of the error). On v22, with ten epochs, arms (i) and (iii) converge by the seventh epoch to 1.29 and 1.28 Å, and arm (ii) reaches 1.21 Å at ten epochs and 1.12 Å at thirty, where it is converged (flat over the last six epochs), a 13 % reduction. Every arm sits more than 2.2× above the ~0.5 Å tolerance of §5.5, and arm (i) reproduces the checkpoint head on both encoders, so the budget suffices to match the baseline. Each head is one training seed, so differences of a few hundredths of an ångström between arms are not resolved.</w:t>
+      </w:r>
+    </w:p>
+    <w:p>
+      <w:pPr>
+        <w:pStyle w:val="BodyText"/>
+      </w:pPr>
+      <w:r>
+        <w:t xml:space="preserve">End to end, the substituted cells recover 0.7 %, 0.5 % and 1.2 % for (i), (ii) and (iii), each below the 1.9 % of the full pipeline (paired McNemar p = 7 × 10⁻⁷, 3 × 10⁻⁹ and 8 × 10⁻³) and the indexer’s 1.6 %, with pattern Pearson 0.08 in every arm. The head-level gain of arm (ii) does not carry through: its converged thirty-epoch cells recover 0.8 % [0.5, 1.2] (24 / 3000, 22 of them cubic), level with arm (i). Nearly every match obtained through a regression head is a cubic structure (18 of 22, 16 of 16 and 34 of 37), the one-parameter case; none is hexagonal and one (in the thirty-epoch arm) is tetragonal, the systems where the indexer’s search succeeds (§5.2).</w:t>
+      </w:r>
+    </w:p>
+    <w:p>
+      <w:pPr>
+        <w:pStyle w:val="BodyText"/>
+      </w:pPr>
+      <w:r>
+        <w:t xml:space="preserve">Restoring absolute peak positions to the head therefore does not repair the absolute scale, and the submitted reading that global pooling discards the d-spacing information is withdrawn. Arm (iii) is the informative one: it receives the same peak positions the autoindexer reads, yet a head trained to regress six cell parameters did not turn them into a cell here. We read this as the peak-to-index assignment, a combinatorial step the autoindexer performs by explicit search, not being learned by a pointwise-loss regressor. This reading is the best-supported one, not a demonstrated cause: it accounts for every head-side failure (the two experiments above, the top-K rerank of §5.4), for the space-group head’s success on relative features and for the indexer succeeding exactly where the assignment is over-determined (§5.2), but the generalisation-gap alternative raised above is not excluded. On this evidence the more promising route to the cell is search, or a model that performs the assignment explicitly, rather than a different pooling or a better head; once the cell is fixed, the denoiser is the limiter (§5.2).</w:t>
+      </w:r>
+    </w:p>
+    <w:p>
+      <w:pPr>
+        <w:pStyle w:val="BodyText"/>
+      </w:pPr>
+      <w:r>
+        <w:t xml:space="preserve">Three caveats remain: the encoder is frozen, so an encoder trained from scratch under position-aware pooling could behave differently (not run); the heads are trained on the frozen encoder’s features rather than jointly, so a jointly trained position-aware head is untested; and each arm is a single training seed. Runs:</w:t>
       </w:r>
       <w:r>
         <w:t xml:space="preserve"> </w:t>
@@ -10938,7 +11093,7 @@
         <w:pStyle w:val="FirstParagraph"/>
       </w:pPr>
       <w:r>
-        <w:t xml:space="preserve">Review of the released code, prompted by two referees, identified three implementation errors. Each is listed with its effect on the numbers in this paper.</w:t>
+        <w:t xml:space="preserve">Review of the released code, prompted by two referees, identified three implementation errors and, in the systematic check the referees asked for, two discrepancies between the text and the released records (items d and e). The check compared each equation of §3 with the function implementing it, each setting of §4 with the arguments stored in the released checkpoints, and each quoted result with its released record. Each item is listed with its effect on the numbers in this paper.</w:t>
       </w:r>
     </w:p>
     <w:p>
@@ -11219,7 +11374,7 @@
         <w:t xml:space="preserve"> </w:t>
       </w:r>
       <w:r>
-        <w:t xml:space="preserve">scores on the predicted structures; the indexer; the oracle; the perturbation study; the aux-head substitution of §5.6; and the external baselines. The module was corrected and re-validated (mean Pearson 0.952 → 0.988 over 1000 structures). The production checkpoint was retrained from scratch with the corrected module and the fix of (b), under otherwise identical settings (v22; final EMA loss 0.602 against 0.726); Tables 2, 2a and 3 and Figs 4 and 5 now report it at three seeds, and §5.2 gives the paired before/after accounting (learned head 0 / 1 949 → 58 / 3 000, indexer 46 / 2 883 → 48 / 3 000, oracle 135 → 165 / 3 000; the indexer’s lead became a tie). The Phase-4 rows of Table 1 and the §5.4 experiments were not rerun (~18 GPU-hours for the six configurations at three seeds); they keep their exploratory labels.</w:t>
+        <w:t xml:space="preserve">scores on the predicted structures; the indexer; the oracle; the perturbation study; the aux-head substitution of §5.6; and the external baselines. The module was corrected and re-validated (mean Pearson 0.952 → 0.988 over 1000 structures). The production checkpoint was retrained from scratch with the corrected module and the fix of (b), under otherwise identical settings (v22; final EMA loss 0.602 against 0.726); Tables 2, 2a and 3 and Fig. 4 now report it at three seeds, and §5.2 gives the paired before/after accounting (learned head 0 / 1949 → 58 / 3000, indexer 46 / 3000 → 48 / 3000, oracle 135 → 165 / 3000; the indexer’s lead became a tie). The Phase-4 rows of Table 1 and the §5.4 experiments were not rerun (~18 GPU-hours for the six configurations at three seeds); they keep their exploratory labels.</w:t>
       </w:r>
     </w:p>
     <w:p>
@@ -11261,7 +11416,7 @@
         <w:t xml:space="preserve"> </w:t>
       </w:r>
       <w:r>
-        <w:t xml:space="preserve">When the classical indexer returned no cell, the sampling script substituted the true lattice and the pattern was scored as if indexed. This affected 39 of the 1000 test patterns in every indexer run, 117 structure-seeds over three seeds. Recomputing from the released per-structure records, none of the 117 fallback structure-seeds matched, so the submitted McNemar cells (27 fixed, 0 broken) and the all-correct cells (4, 0) were unchanged by the fallback; the submitted match rate becomes 46 / 2 883 = 1.6 % [1.2, 2.1] on the indexed structure-seeds, in place of 46 / 3 000 = 1.5 % [1.2, 2.0]. (Those v21 cells are superseded by the v22 retrain of (a), which is what §5.2 now reports.) The script now scores unindexed patterns as misses and records their count. The top-K rerank experiment of §5.4 used the same fallback; because the fallback rows did not match, its 1.0 % result can only be lower, and its conclusion (no improvement) stands.</w:t>
+        <w:t xml:space="preserve">When the classical indexer returned no cell, the sampling script substituted the true lattice and the pattern was scored as if indexed. This affected 39 of the 1000 test patterns in every indexer run, 117 structure-seeds over three seeds. Recomputing from the released per-structure records, none of the 117 fallback structure-seeds matched, so the submitted McNemar cells (27 fixed, 0 broken) and the all-correct cells (4, 0) were unchanged by the fallback. The submitted match rate becomes 46 / 2883 = 1.6 % [1.2, 2.1] on the indexed structure-seeds, in place of 46 / 3000 = 1.5 % [1.2, 2.0]. The v21 checkpoint was not re-sampled under the corrected script; these figures are recomputed from the records of the submitted runs, and they are superseded by the v22 retrain of (a), which is what §5.2 now reports. The script now scores unindexed patterns as misses and records their count. The top-K rerank experiment of §5.4 used the same fallback; because the fallback rows did not match, its 1.0 % result can only be lower, and its conclusion (no improvement) stands.</w:t>
       </w:r>
     </w:p>
     <w:p>
@@ -11348,6 +11503,39 @@
     </w:p>
     <w:p>
       <w:pPr>
+        <w:numPr>
+          <w:ilvl w:val="0"/>
+          <w:numId w:val="1002"/>
+        </w:numPr>
+      </w:pPr>
+      <w:r>
+        <w:rPr>
+          <w:i/>
+          <w:iCs/>
+        </w:rPr>
+        <w:t xml:space="preserve">Perturbation-study figures.</w:t>
+      </w:r>
+      <w:r>
+        <w:t xml:space="preserve"> </w:t>
+      </w:r>
+      <w:r>
+        <w:t xml:space="preserve">The submitted §5.5 quoted match rates (5.6 → 2.0 → 0.5 → 0 % at n = 200) that do not correspond to the released record of that experiment, which is n = 300 per level with 6, 1, 1 and 0 matches (§5.5); the 5.6 % was the single-seed oracle figure later replaced by the three-seed 4.5 %. §5.5 now reports the record, and the</w:t>
+      </w:r>
+      <w:r>
+        <w:t xml:space="preserve"> </w:t>
+      </w:r>
+      <w:r>
+        <w:t xml:space="preserve">“knee”</w:t>
+      </w:r>
+      <w:r>
+        <w:t xml:space="preserve"> </w:t>
+      </w:r>
+      <w:r>
+        <w:t xml:space="preserve">of the submitted version is reworded as a working tolerance. No other number depends on it.</w:t>
+      </w:r>
+    </w:p>
+    <w:p>
+      <w:pPr>
         <w:pStyle w:val="FirstParagraph"/>
       </w:pPr>
       <w:r>
@@ -11442,7 +11630,7 @@
         <w:t xml:space="preserve"> </w:t>
       </w:r>
       <w:r>
-        <w:t xml:space="preserve">structure, but it is a relative fit: feeding the aux head’s own lattice to the sampler recovers only 1.2 % (§5.6), and neither stronger constrained supervision nor restoring absolute peak positions to the head moves its ~1.1 Å error, so the pooling reading of the submitted version is withdrawn in favour of the regression formulation (§5.6). The paired oracle-vs-learned-head test (134 fixed, 27 broken, p = 3 × 10⁻¹⁸; §5.2) is the paper’s statistically firmest claim and the one result that replicates across the submitted and the corrected checkpoint. The Q-space autoindexer, which reads peak positions directly, recovers part of the 5.5 % oracle ceiling on the hexagonal and tetragonal subset; with the corrected checkpoint it no longer leads the learned head in aggregate, but its cells stay far closer to the truth (Pearson 0.41 against 0.18). Top-K rerank and gradient guidance fail because they operate</w:t>
+        <w:t xml:space="preserve">structure, but it is a training-batch, relative fit: feeding the aux head’s own lattice to the sampler recovers only 1.2 % (§5.6), and neither stronger constrained supervision nor restoring absolute peak positions to the head reduces its 1.1–1.3 Å test error by more than 13 %, so the pooling reading of the submitted version is withdrawn in favour of the regression formulation, offered as a hypothesis beside a generalisation-gap alternative (§5.6). The paired oracle-vs-learned-head test (134 fixed, 27 broken, p = 3 × 10⁻¹⁸; §5.2) is the paper’s statistically firmest claim and the one result that replicates across the submitted and the corrected checkpoint. The Q-space autoindexer, which reads peak positions directly, recovers part of the 5.5 % oracle ceiling on the hexagonal and tetragonal subset; with the corrected checkpoint it no longer leads the learned head in aggregate, but where it indexes a cell its downstream pattern agreement is higher (Pearson 0.41 against 0.18). Top-K rerank failed because the then-defective Debye loss did not separate the correct cell from the indexer’s alternatives, and gradient guidance failed on a loss landscape too rough for descent (Segal</w:t>
       </w:r>
       <w:r>
         <w:t xml:space="preserve"> </w:t>
@@ -11452,13 +11640,10 @@
           <w:i/>
           <w:iCs/>
         </w:rPr>
-        <w:t xml:space="preserve">after</w:t>
-      </w:r>
-      <w:r>
-        <w:t xml:space="preserve"> </w:t>
-      </w:r>
-      <w:r>
-        <w:t xml:space="preserve">the encoder commits to a bad lattice prior, while the indexer bypasses that decision. The oracle ceiling is itself only 5.5 %, so even a perfect lattice leaves coordinates as a co-limiter (§8).</w:t>
+        <w:t xml:space="preserve">et al.</w:t>
+      </w:r>
+      <w:r>
+        <w:t xml:space="preserve">, 2026); neither was rerun with the corrected simulator (§5.7). The oracle ceiling is itself only 5.5 %, so even a perfect lattice leaves coordinates as a co-limiter (§8).</w:t>
       </w:r>
     </w:p>
     <w:p>
@@ -11599,7 +11784,7 @@
         <w:t xml:space="preserve"> </w:t>
       </w:r>
       <w:r>
-        <w:t xml:space="preserve">At 1.9 % PXRD-Diff sits an order of magnitude below much larger systems, and that is the point of its size. Small models make the lattice-recovery bottleneck visible (capacity hides it) and make the indexer control trivial to wire in (larger models would need architecture-level surgery). The recipe (encoder + Phase 4 fixes + Phase 9 indexer control) is 3.7 M parameters and runs inference in seconds.</w:t>
+        <w:t xml:space="preserve">At 1.9 % PXRD-Diff sits an order of magnitude below much larger systems, and that is the point of its size. A small model makes the lattice-recovery failure visible and the indexer control trivial to wire in; it trains in under two hours and runs inference in seconds, so every experiment here can be repeated.</w:t>
       </w:r>
     </w:p>
     <w:p>
@@ -11660,7 +11845,7 @@
         <w:t xml:space="preserve"> </w:t>
       </w:r>
       <w:r>
-        <w:t xml:space="preserve">The Phase 4 ablations in Table 1 are single-seed. A multi-seed checkpoint sweep of the ε-vs-x₀-residual contrast (two seeds × five checkpoints, 20k–100k, true-lattice n = 1000) shows the reported 3.5×</w:t>
+        <w:t xml:space="preserve">The Phase 4 ablations in Table 1 are single-seed. A multi-seed checkpoint sweep of the ε-vs-x₀-residual contrast (two seeds × five checkpoints, 20 k–100 k, true-lattice n = 1000) shows the reported 2.8×</w:t>
       </w:r>
       <w:r>
         <w:t xml:space="preserve"> </w:t>
@@ -11708,7 +11893,7 @@
         <w:t xml:space="preserve"> </w:t>
       </w:r>
       <w:r>
-        <w:t xml:space="preserve">lift to a single-seed artifact. What does reproduce is the pattern-Pearson improvement (ε 0.359 vs x₀ 0.403, with disjoint ranges across both seeds), consistent with Table 1. The lattice-input fix remains load-bearing as a training-dynamics result (lattice loss 1.0 → 0.02), and the oracle-vs-learned-head gap is the effect that replicates (§5.2). The indexer-vs-learned-head comparison is the cautionary case: significant with the submitted checkpoint (27 fixed, 0 broken), a tie with the corrected one (42, 52; p = 0.35), so a paired test at three seeds protects against seed noise but not against a training defect that moves one arm (§5.2, §5.7).</w:t>
+        <w:t xml:space="preserve">lift to a single-seed artefact. What does reproduce is the pattern-Pearson improvement (ε 0.359 vs x₀ 0.403, with disjoint ranges across both seeds), consistent with Table 1. The lattice-input fix remains load-bearing as a training-dynamics result (lattice loss 1.0 → 0.02), and the oracle-vs-learned-head gap is the effect that replicates (§5.2). The indexer-vs-learned-head comparison is the cautionary case: significant with the submitted checkpoint (27 fixed, 0 broken), a tie with the corrected one (42, 52; p = 0.35), so a paired test at three sampling seeds protects against sampling noise but not against a training defect, or a training-seed draw, that moves one arm (§5.2, §5.7). Each checkpoint (v21, v22) is a single training run; the three seeds of §5.2 and §5.6 are sampling seeds, so training-seed variance of the production model was not measured.</w:t>
       </w:r>
     </w:p>
     <w:p>
@@ -11730,7 +11915,7 @@
         <w:t xml:space="preserve"> </w:t>
       </w:r>
       <w:r>
-        <w:t xml:space="preserve">PXRDnet n = 20 has a 95 % Wilson CI of ≈ ±20 pp; the DGpt &gt; PXRDnet all-correct ordering (§5.3/§6) is therefore a hypothesis, not a result. n = 200 needs ~33 days RTX 5090. Crystalyze checkpoint download is inactive (verified 2026-06-01); cited but unreproduced. Patterns are not bit-identical across the three preprocessors (PXRD-Diff 4 251-bin 2θ, DGpt 300-bin 2θ, PXRDnet 4 096-bin Q with sinc² broadening): structures match, patterns do not; we did not quantify the residual preprocessing effect on match rate, and a matched-vs-native re-scoring on a structure subset is the natural check.</w:t>
+        <w:t xml:space="preserve">PXRDnet n = 20 has a 95 % Wilson CI of ≈ ±20 pp; the DGpt &gt; PXRDnet all-correct ordering (§5.3/§6) is therefore a hypothesis, not a result. n = 200 needs ~33 days RTX 5090. Crystalyze checkpoint download is inactive (verified 2026-06-01); cited but unreproduced. Patterns are not bit-identical across the three preprocessors (PXRD-Diff 4251-bin 2θ, DGpt 300-bin 2θ, PXRDnet 4096-bin Q with sinc² broadening): structures match, patterns do not; we did not quantify the residual preprocessing effect on match rate, and a matched-vs-native re-scoring on a structure subset is the natural check. Parse failures are excluded from the external denominators (DGpt 10 of 1000, deCIFer 2 of 300), whereas PXRD-Diff’s unindexed patterns count as misses; overlap between the external models’ training sets and MP-20 test was not assessed.</w:t>
       </w:r>
     </w:p>
     <w:p>
@@ -11799,7 +11984,7 @@
         <w:t xml:space="preserve"> </w:t>
       </w:r>
       <w:r>
-        <w:t xml:space="preserve">simulations with no zero-point shift, sample-displacement error, or peak asymmetry, precisely the perturbations that drive real-world indexing failure. The 48.8 % native-indexer match and the downstream 1.6 % should be read as upper bounds under ideal peak positions. A zero-shift/displacement robustness sweep (n = 300) confirms the concern: the indexer’s length-MAE rises from 1.24 Å on clean patterns past the v20 learned head’s 1.37 Å once displacement or zero-shift exceeds ~0.10°, so the indexer’s cell-accuracy advantage over the learned head (§5.2) holds only for well-calibrated input.</w:t>
+        <w:t xml:space="preserve">simulations with no zero-point shift, sample-displacement error, or peak asymmetry, precisely the perturbations that drive real-world indexing failure. The 48.8 % native-indexer match and the downstream 1.6 % should be read as upper bounds under ideal peak positions. A zero-shift/displacement robustness sweep (n = 300, v20 checkpoint, run before the audit) confirms the concern: the indexer’s length-MAE rises from 1.24 Å on those clean patterns (a 300-structure subset; 1.45 Å on the full n = 1000) past the v20 learned head’s 1.37 Å once displacement or zero-shift exceeds ~0.10°, so the indexer’s exact cells on high-symmetry patterns depend on well-calibrated input.</w:t>
       </w:r>
     </w:p>
     <w:p>
@@ -11821,7 +12006,7 @@
         <w:t xml:space="preserve"> </w:t>
       </w:r>
       <w:r>
-        <w:t xml:space="preserve">Every pattern is an ideal simulation. Instrument profile, zero shift, sample displacement, preferred orientation and background all move or reshape peaks. Each would further degrade an encoder that already fails to fix absolute d-spacings on clean input. The lattice-recovery bottleneck diagnosis is therefore a lower bound on the difficulty of real data, not an estimate of it. The 0.5 Å knee is a property of the sampler under clean cells; under real peak shifts its position may move, and the indexer’s own degradation past ~0.10° suggests the whole curve shifts towards smaller tolerable errors.</w:t>
+        <w:t xml:space="preserve">Every pattern is an ideal simulation. Instrument profile, zero shift, sample displacement, preferred orientation and background all move or reshape peaks. Each would further degrade an encoder that already fails to fix absolute d-spacings on clean input. The lattice-recovery bottleneck diagnosis is therefore a lower bound on the difficulty of real data, not an estimate of it. The ~0.5 Å tolerance is a property of the sampler under clean cells; under real peak shifts it may move, and the indexer’s own degradation past ~0.10° suggests the whole curve shifts towards smaller tolerable errors.</w:t>
       </w:r>
     </w:p>
     <w:p>
@@ -11837,43 +12022,13 @@
           <w:b/>
           <w:bCs/>
         </w:rPr>
-        <w:t xml:space="preserve">Indexer (low-symmetry path).</w:t>
-      </w:r>
-      <w:r>
-        <w:t xml:space="preserve"> </w:t>
-      </w:r>
-      <w:r>
-        <w:t xml:space="preserve">GSAS-II low-symmetry path hangs in</w:t>
-      </w:r>
-      <w:r>
-        <w:t xml:space="preserve"> </w:t>
-      </w:r>
-      <w:r>
-        <w:rPr>
-          <w:rStyle w:val="VerbatimChar"/>
-        </w:rPr>
-        <w:t xml:space="preserve">findBestCell</w:t>
-      </w:r>
-      <w:r>
-        <w:t xml:space="preserve"> </w:t>
-      </w:r>
-      <w:r>
-        <w:t xml:space="preserve">on real MP-20 mono/tri patterns; shipped behind</w:t>
-      </w:r>
-      <w:r>
-        <w:t xml:space="preserve"> </w:t>
-      </w:r>
-      <w:r>
-        <w:rPr>
-          <w:rStyle w:val="VerbatimChar"/>
-        </w:rPr>
-        <w:t xml:space="preserve">--use-gsas</w:t>
-      </w:r>
-      <w:r>
-        <w:t xml:space="preserve"> </w:t>
-      </w:r>
-      <w:r>
-        <w:t xml:space="preserve">but experimental.</w:t>
+        <w:t xml:space="preserve">Perturbation study and ablation heads.</w:t>
+      </w:r>
+      <w:r>
+        <w:t xml:space="preserve"> </w:t>
+      </w:r>
+      <w:r>
+        <w:t xml:space="preserve">The perturbation study (§5.5) is v21, n = 300 per level, single sampling seed, and was not rerun on v22; the Table 4 heads are one training seed each with no interval on their MAE; the 0.007 aux loss is a training-batch value and the head’s training-set error was not measured; an encoder trained from scratch under position-aware pooling was not run.</w:t>
       </w:r>
     </w:p>
     <w:p>
@@ -11889,6 +12044,124 @@
           <w:b/>
           <w:bCs/>
         </w:rPr>
+        <w:t xml:space="preserve">Match metric.</w:t>
+      </w:r>
+      <w:r>
+        <w:t xml:space="preserve"> </w:t>
+      </w:r>
+      <w:r>
+        <w:rPr>
+          <w:rStyle w:val="VerbatimChar"/>
+        </w:rPr>
+        <w:t xml:space="preserve">StructureMatcher</w:t>
+      </w:r>
+      <w:r>
+        <w:t xml:space="preserve"> </w:t>
+      </w:r>
+      <w:r>
+        <w:t xml:space="preserve">is run with</w:t>
+      </w:r>
+      <w:r>
+        <w:t xml:space="preserve"> </w:t>
+      </w:r>
+      <w:r>
+        <w:rPr>
+          <w:rStyle w:val="VerbatimChar"/>
+        </w:rPr>
+        <w:t xml:space="preserve">scale=True</w:t>
+      </w:r>
+      <w:r>
+        <w:t xml:space="preserve">, so the headline match rate is invariant to a uniform scaling of the cell and tests cell shape and coordinates; the absolute scale that the lattice discussion concerns enters the results through pattern Pearson and</w:t>
+      </w:r>
+      <w:r>
+        <w:t xml:space="preserve"> </w:t>
+      </w:r>
+      <m:oMath>
+        <m:sSub>
+          <m:e>
+            <m:r>
+              <m:t>R</m:t>
+            </m:r>
+          </m:e>
+          <m:sub>
+            <m:r>
+              <m:t>w</m:t>
+            </m:r>
+            <m:r>
+              <m:t>p</m:t>
+            </m:r>
+          </m:sub>
+        </m:sSub>
+      </m:oMath>
+      <w:r>
+        <w:t xml:space="preserve">, and through the anisotropic errors of the perturbation study.</w:t>
+      </w:r>
+    </w:p>
+    <w:p>
+      <w:pPr>
+        <w:pStyle w:val="Compact"/>
+        <w:numPr>
+          <w:ilvl w:val="0"/>
+          <w:numId w:val="1003"/>
+        </w:numPr>
+      </w:pPr>
+      <w:r>
+        <w:rPr>
+          <w:b/>
+          <w:bCs/>
+        </w:rPr>
+        <w:t xml:space="preserve">Indexer (low-symmetry path).</w:t>
+      </w:r>
+      <w:r>
+        <w:t xml:space="preserve"> </w:t>
+      </w:r>
+      <w:r>
+        <w:t xml:space="preserve">GSAS-II low-symmetry path hangs in</w:t>
+      </w:r>
+      <w:r>
+        <w:t xml:space="preserve"> </w:t>
+      </w:r>
+      <w:r>
+        <w:rPr>
+          <w:rStyle w:val="VerbatimChar"/>
+        </w:rPr>
+        <w:t xml:space="preserve">findBestCell</w:t>
+      </w:r>
+      <w:r>
+        <w:t xml:space="preserve"> </w:t>
+      </w:r>
+      <w:r>
+        <w:t xml:space="preserve">on real MP-20 mono/tri patterns; shipped behind</w:t>
+      </w:r>
+      <w:r>
+        <w:t xml:space="preserve"> </w:t>
+      </w:r>
+      <w:r>
+        <w:rPr>
+          <w:rStyle w:val="VerbatimChar"/>
+        </w:rPr>
+        <w:t xml:space="preserve">--use-gsas</w:t>
+      </w:r>
+      <w:r>
+        <w:t xml:space="preserve"> </w:t>
+      </w:r>
+      <w:r>
+        <w:t xml:space="preserve">but experimental.</w:t>
+      </w:r>
+    </w:p>
+    <w:p>
+      <w:pPr>
+        <w:pStyle w:val="Compact"/>
+        <w:numPr>
+          <w:ilvl w:val="0"/>
+          <w:numId w:val="1003"/>
+        </w:numPr>
+      </w:pPr>
+      <w:r>
+        <w:rPr>
+          <w:b/>
+          <w:bCs/>
+        </w:rPr>
         <w:t xml:space="preserve">Training.</w:t>
       </w:r>
       <w:r>
@@ -11920,7 +12193,7 @@
         <w:pStyle w:val="FirstParagraph"/>
       </w:pPr>
       <w:r>
-        <w:t xml:space="preserve">A 3.7 M-parameter conditional diffusion model, used as a diagnostic instrument, locates the dominant accessible failure in PXRD inversion in the recovery of the unit cell from the pattern, upstream of the denoiser. The encoder’s pooled representation supports a 0.007 normalised lattice-regression loss yet delivers a ~1.1 Å absolute cell error that no head reading it reduces, whether constrained, position-aware or handed explicit peak positions; the pooling reading is withdrawn and the evidence points to the regression formulation, which leaves the peak-to-index assignment unsolved. A true-lattice oracle caps match at 5.5 % [4.7, 6.4] (three seeds) against 1.9 % [1.5, 2.5] for the learned head (paired McNemar p = 3 × 10⁻¹⁸), so coordinate prediction remains a co-limiter. A classical Q-space autoindexer, supplied with the true crystal system, serves as a control: it reaches 1.6 % [1.2, 2.1] and, with the corrected checkpoint, ties the learned head at three seeds (42 fixed, 52 broken, p = 0.35), its gains confined to the hexagonal and tetragonal systems below the 0.5 Å knee. Re-scored on one</w:t>
+        <w:t xml:space="preserve">A 3.7 M-parameter conditional diffusion model, used as a diagnostic instrument, locates the largest correctable failure in this model’s PXRD inversion in the recovery of the unit cell from the pattern, upstream of the denoiser. The encoder’s pooled representation supports a 0.007 normalised lattice-regression training loss yet delivers a 1.1–1.3 Å absolute cell error that no head reading it reduces by more than 13 %, whether constrained, position-aware or handed explicit peak positions; the pooling reading is withdrawn, and we read the failure as one of the regression formulation, which leaves the peak-to-index assignment unsolved (a hypothesis, §5.6). A true-lattice oracle caps match at 5.5 % [4.7, 6.4] (three sampling seeds) against 1.9 % [1.5, 2.5] for the learned head (paired McNemar p = 3 × 10⁻¹⁸): the cell explains the 1.9 → 5.5 % shortfall, and coordinates cap the rest. A classical Q-space autoindexer, supplied with the true crystal system, serves as a control: it reaches 1.6 % [1.2, 2.1] and, with the corrected checkpoint, is not distinguishable from the learned head at three seeds (42 fixed, 52 broken, p = 0.35), its gains confined to the hexagonal and tetragonal systems where its cell error is smallest. Re-scored on one</w:t>
       </w:r>
       <w:r>
         <w:t xml:space="preserve"> </w:t>
@@ -11935,7 +12208,7 @@
         <w:t xml:space="preserve"> </w:t>
       </w:r>
       <w:r>
-        <w:t xml:space="preserve">harness, deCIFer reaches 73.8 % / 69.5 %, DGpt 18.9 % / 15.9 % and PXRDnet 30.0 % / 5.0 % (match / all-correct); these set the scale of the diagnostic model and are not a ranking claim, and the apparent divergence in their space-group recovery is a measurement hypothesis the n = 20 PXRDnet sample cannot yet confirm. A code audit corrected three implementation errors; retraining the production checkpoint under the corrected loss raised the learned head from 0 to 1.9 % and removed the indexer’s aggregate lead of the submitted version, leaving the oracle gap as the result that replicates. The lattice-input fix is load-bearing; the x₀-residual switch improves pattern-Pearson but its single-seed match-rate lift did not replicate (§7); the remaining interventions are documented as failures. Code, checkpoints, all per-phase JSONs, per-structure records, both indexer paths and the differentiable Bragg module are released.</w:t>
+        <w:t xml:space="preserve">harness, deCIFer reaches 73.8 % / 69.5 %, DGpt 18.9 % / 15.9 % and PXRDnet 30.0 % / 5.0 % (match / all-correct); these set the scale of the diagnostic model and are not a ranking claim, and the apparent divergence in their space-group recovery is a measurement hypothesis the n = 20 PXRDnet sample cannot yet confirm. A code audit corrected three implementation errors; retraining the production checkpoint under the corrected loss raised the learned head from 0 to 1.9 % and removed the indexer’s aggregate lead of the submitted version, leaving the oracle gap as the result that replicates. The lattice-input fix is load-bearing; the x₀-residual switch improves pattern-Pearson but its single-seed match-rate lift did not replicate (§7); the remaining interventions did not improve match rate under the conditions tested (§5.4). Code, checkpoints, all per-phase JSONs, per-structure records, both indexer paths and the differentiable Bragg module are released.</w:t>
       </w:r>
     </w:p>
     <w:p>
@@ -11946,13 +12219,13 @@
       </w:r>
     </w:p>
     <w:bookmarkEnd w:id="50"/>
-    <w:bookmarkStart w:id="51" w:name="acknowledgments"/>
+    <w:bookmarkStart w:id="51" w:name="acknowledgements"/>
     <w:p>
       <w:pPr>
         <w:pStyle w:val="Heading1"/>
       </w:pPr>
       <w:r>
-        <w:t xml:space="preserve">Acknowledgments</w:t>
+        <w:t xml:space="preserve">Acknowledgements</w:t>
       </w:r>
     </w:p>
     <w:p>
@@ -12011,7 +12284,7 @@
         <w:t xml:space="preserve">atomgptlab/atomgpt</w:t>
       </w:r>
       <w:r>
-        <w:t xml:space="preserve">) and PXRDnet (</w:t>
+        <w:t xml:space="preserve">), PXRDnet (</w:t>
       </w:r>
       <w:r>
         <w:rPr>
@@ -12020,7 +12293,7 @@
         <w:t xml:space="preserve">gabeguo/cdvae_xrd</w:t>
       </w:r>
       <w:r>
-        <w:t xml:space="preserve">) for releasing checkpoints and code that made the head-to-head reproduction in §5.3 possible. Compute was rented from Vast.ai; total spend was approximately USD 28 across roughly 35 GPU-hours on RTX 5090 instances (Phase 4 ablation, Phase 9 retrain + indexer sweeps, DiffractGPT n = 1 000 inference, PXRDnet n = 20 inference, and the revision’s retrain, pooling-ablation and unknown-system runs of §5.2, §5.6 and §3.5, about 5.5 GPU-hours).</w:t>
+        <w:t xml:space="preserve">) and deCIFer for releasing checkpoints and code that made the head-to-head reproduction in §5.3 possible. Compute was rented from Vast.ai; total spend was approximately USD 28 across roughly 40 GPU-hours on RTX 5090 instances (Phase 4 ablation, Phase 9 retrain + indexer sweeps, DiffractGPT n = 1000 inference, PXRDnet n = 20 inference, and the revision’s retrain, pooling-ablation and unknown-system runs of §5.2, §5.6 and §3.5, about 5.5 GPU-hours).</w:t>
       </w:r>
     </w:p>
     <w:bookmarkEnd w:id="51"/>
@@ -12106,10 +12379,7 @@
         </w:r>
       </w:hyperlink>
       <w:r>
-        <w:t xml:space="preserve"> </w:t>
-      </w:r>
-      <w:r>
-        <w:t xml:space="preserve">(DOI: 10.5281/zenodo.20738994). The MP-20 dataset is publicly available via the CDVAE benchmark. All experiments reproduce from a single requirements.txt and the scripts/ pipeline; per-structure evaluation flags are released to support paired re-analysis. The corrected simulator, the audit scripts of §5.7 and the per-structure records behind Table 2a are included.</w:t>
+        <w:t xml:space="preserve">. The MP-20 dataset is publicly available via the CDVAE benchmark. All experiments reproduce from a single requirements.txt and the scripts/ pipeline; per-structure evaluation flags are released to support paired re-analysis. The corrected simulator, the audit scripts of §5.7 and the per-structure records behind Table 2a are included.</w:t>
       </w:r>
     </w:p>
     <w:bookmarkEnd w:id="56"/>
@@ -12837,7 +13107,7 @@
         <w:t xml:space="preserve">46</w:t>
       </w:r>
       <w:r>
-        <w:t xml:space="preserve">, 544–549. Code:</w:t>
+        <w:t xml:space="preserve">, 544–549. DOI: 10.1107/S0021889813003531. Code:</w:t>
       </w:r>
       <w:r>
         <w:t xml:space="preserve"> </w:t>
@@ -12964,39 +13234,6 @@
       </w:r>
       <w:r>
         <w:t xml:space="preserve">, 624–632. DOI: 10.1038/s41586-025-08628-5.</w:t>
-      </w:r>
-    </w:p>
-    <w:p>
-      <w:pPr>
-        <w:pStyle w:val="BlockText"/>
-      </w:pPr>
-      <w:r>
-        <w:rPr>
-          <w:b/>
-          <w:bCs/>
-        </w:rPr>
-        <w:t xml:space="preserve">Author note on reproduced numbers.</w:t>
-      </w:r>
-      <w:r>
-        <w:t xml:space="preserve"> </w:t>
-      </w:r>
-      <w:r>
-        <w:t xml:space="preserve">The reproduced PXRDnet and DiffractGPT numbers in §5.3 are computed by the author on the released checkpoints through our shared</w:t>
-      </w:r>
-      <w:r>
-        <w:t xml:space="preserve"> </w:t>
-      </w:r>
-      <w:r>
-        <w:rPr>
-          <w:rStyle w:val="VerbatimChar"/>
-        </w:rPr>
-        <w:t xml:space="preserve">StructureMatcher</w:t>
-      </w:r>
-      <w:r>
-        <w:t xml:space="preserve"> </w:t>
-      </w:r>
-      <w:r>
-        <w:t xml:space="preserve">harness, not transcribed from the cited papers. The central claims depend only on these reproduced numbers under one common evaluation protocol, with confidence intervals stated throughout.</w:t>
       </w:r>
     </w:p>
     <w:p>
@@ -13285,7 +13522,7 @@
               <w:pStyle w:val="Compact"/>
             </w:pPr>
             <w:r>
-              <w:t xml:space="preserve">§5.2</w:t>
+              <w:t xml:space="preserve">Appendix B</w:t>
             </w:r>
           </w:p>
         </w:tc>
@@ -13342,7 +13579,7 @@
               <w:pStyle w:val="Compact"/>
             </w:pPr>
             <w:r>
-              <w:t xml:space="preserve">§5.2</w:t>
+              <w:t xml:space="preserve">Table 1</w:t>
             </w:r>
           </w:p>
         </w:tc>
@@ -13434,29 +13671,29 @@
               <w:pStyle w:val="Compact"/>
             </w:pPr>
             <w:r>
-              <w:t xml:space="preserve">Larger model (d=384, L=5), ε-prediction</w:t>
-            </w:r>
-          </w:p>
-        </w:tc>
-        <w:tc>
-          <w:tcPr/>
-          <w:p>
-            <w:pPr>
-              <w:pStyle w:val="Compact"/>
-            </w:pPr>
-            <w:r>
-              <w:t xml:space="preserve">Killed at 18 k; same plateau</w:t>
-            </w:r>
-          </w:p>
-        </w:tc>
-        <w:tc>
-          <w:tcPr/>
-          <w:p>
-            <w:pPr>
-              <w:pStyle w:val="Compact"/>
-            </w:pPr>
-            <w:r>
-              <w:t xml:space="preserve">§5.2</w:t>
+              <w:t xml:space="preserve">Larger model (d = 384, L = 5), ε-prediction</w:t>
+            </w:r>
+          </w:p>
+        </w:tc>
+        <w:tc>
+          <w:tcPr/>
+          <w:p>
+            <w:pPr>
+              <w:pStyle w:val="Compact"/>
+            </w:pPr>
+            <w:r>
+              <w:t xml:space="preserve">Stopped at 18 k; same plateau</w:t>
+            </w:r>
+          </w:p>
+        </w:tc>
+        <w:tc>
+          <w:tcPr/>
+          <w:p>
+            <w:pPr>
+              <w:pStyle w:val="Compact"/>
+            </w:pPr>
+            <w:r>
+              <w:t xml:space="preserve">§5.1</w:t>
             </w:r>
           </w:p>
         </w:tc>
@@ -13491,7 +13728,7 @@
               <w:pStyle w:val="Compact"/>
             </w:pPr>
             <w:r>
-              <w:t xml:space="preserve">x₀-residual + lat-fix + Debye λ=1</w:t>
+              <w:t xml:space="preserve">x₀-residual + lat-fix + Debye λ = 1</w:t>
             </w:r>
           </w:p>
         </w:tc>
@@ -13802,7 +14039,7 @@
               <w:pStyle w:val="Compact"/>
             </w:pPr>
             <w:r>
-              <w:t xml:space="preserve">§5.1</w:t>
+              <w:t xml:space="preserve">§7 (v20)</w:t>
             </w:r>
           </w:p>
         </w:tc>
@@ -13837,18 +14074,18 @@
               <w:pStyle w:val="Compact"/>
             </w:pPr>
             <w:r>
-              <w:t xml:space="preserve">Phase 9 final: v13 architecture + Phase 9 retrain + indexer drop-in support (submitted version; trained with the §5.7 (a) and (b) defects)</w:t>
-            </w:r>
-          </w:p>
-        </w:tc>
-        <w:tc>
-          <w:tcPr/>
-          <w:p>
-            <w:pPr>
-              <w:pStyle w:val="Compact"/>
-            </w:pPr>
-            <w:r>
-              <w:t xml:space="preserve">0 % (learned head), 1.6 % (indexer, crystal system given), 4.5 % (true-lat oracle), all 3-seed</w:t>
+              <w:t xml:space="preserve">Phase 9 final: v13 architecture + Phase 9 retrain + indexer-control support (submitted version; trained with the §5.7 (a) and (b) defects)</w:t>
+            </w:r>
+          </w:p>
+        </w:tc>
+        <w:tc>
+          <w:tcPr/>
+          <w:p>
+            <w:pPr>
+              <w:pStyle w:val="Compact"/>
+            </w:pPr>
+            <w:r>
+              <w:t xml:space="preserve">0 % (learned head), 1.6 % (indexer, crystal system given), 4.5 % (true-lattice oracle), all 3-seed</w:t>
             </w:r>
           </w:p>
         </w:tc>
@@ -13917,7 +14154,7 @@
                 <w:b/>
                 <w:bCs/>
               </w:rPr>
-              <w:t xml:space="preserve">1.9 % (learned head), 1.6 % (indexer, crystal system given), 5.5 % (true-lat oracle), all 3-seed</w:t>
+              <w:t xml:space="preserve">1.9 % (learned head), 1.6 % (indexer, crystal system given), 5.5 % (true-lattice oracle), all 3-seed</w:t>
             </w:r>
           </w:p>
         </w:tc>
@@ -15445,10 +15682,7 @@
         </m:r>
       </m:oMath>
       <w:r>
-        <w:t xml:space="preserve"> </w:t>
-      </w:r>
-      <w:r>
-        <w:t xml:space="preserve">and the agreement with</w:t>
+        <w:t xml:space="preserve">, agreement with the</w:t>
       </w:r>
       <w:r>
         <w:t xml:space="preserve"> </w:t>
@@ -15463,7 +15697,57 @@
         <w:t xml:space="preserve"> </w:t>
       </w:r>
       <w:r>
-        <w:t xml:space="preserve">on NaCl.</w:t>
+        <w:t xml:space="preserve">expression at further</w:t>
+      </w:r>
+      <w:r>
+        <w:t xml:space="preserve"> </w:t>
+      </w:r>
+      <m:oMath>
+        <m:r>
+          <m:rPr>
+            <m:sty m:val="p"/>
+          </m:rPr>
+          <m:t>(</m:t>
+        </m:r>
+        <m:r>
+          <m:t>Z</m:t>
+        </m:r>
+        <m:r>
+          <m:rPr>
+            <m:sty m:val="p"/>
+          </m:rPr>
+          <m:t>,</m:t>
+        </m:r>
+        <m:r>
+          <m:t>s</m:t>
+        </m:r>
+        <m:r>
+          <m:rPr>
+            <m:sty m:val="p"/>
+          </m:rPr>
+          <m:t>)</m:t>
+        </m:r>
+      </m:oMath>
+      <w:r>
+        <w:t xml:space="preserve"> </w:t>
+      </w:r>
+      <w:r>
+        <w:t xml:space="preserve">points, rejection of the legacy convention, and agreement with</w:t>
+      </w:r>
+      <w:r>
+        <w:t xml:space="preserve"> </w:t>
+      </w:r>
+      <w:r>
+        <w:rPr>
+          <w:rStyle w:val="VerbatimChar"/>
+        </w:rPr>
+        <w:t xml:space="preserve">XRDCalculator</w:t>
+      </w:r>
+      <w:r>
+        <w:t xml:space="preserve"> </w:t>
+      </w:r>
+      <w:r>
+        <w:t xml:space="preserve">on NaCl (Pearson &gt; 0.99).</w:t>
       </w:r>
     </w:p>
     <w:bookmarkEnd w:id="61"/>
@@ -15485,7 +15769,7 @@
         </w:numPr>
       </w:pPr>
       <w:r>
-        <w:t xml:space="preserve">Hyperparameters specified (§4.3)</w:t>
+        <w:t xml:space="preserve">Hyperparameters specified (§4, Implementation)</w:t>
       </w:r>
     </w:p>
     <w:p>
@@ -15497,7 +15781,7 @@
         </w:numPr>
       </w:pPr>
       <w:r>
-        <w:t xml:space="preserve">Datasets and splits specified (§4.1; canonical CDVAE MP-20)</w:t>
+        <w:t xml:space="preserve">Datasets and splits specified (§4, Dataset; canonical CDVAE MP-20)</w:t>
       </w:r>
     </w:p>
     <w:p>
@@ -15509,7 +15793,7 @@
         </w:numPr>
       </w:pPr>
       <w:r>
-        <w:t xml:space="preserve">Evaluation protocol specified (§4.2)</w:t>
+        <w:t xml:space="preserve">Evaluation protocol specified (§4, Evaluation)</w:t>
       </w:r>
     </w:p>
     <w:p>
@@ -15521,7 +15805,7 @@
         </w:numPr>
       </w:pPr>
       <w:r>
-        <w:t xml:space="preserve">Random seed: single seed (42) per run; pilot variance ≈ 0.5 % match-rate absolute</w:t>
+        <w:t xml:space="preserve">Random seeds: training seed 42 for every run (one training run per configuration); sampling seeds 0, 1, 2 for §5.2, §5.6 and Table 3; pilot variance ≈ 0.5 % match-rate absolute</w:t>
       </w:r>
     </w:p>
     <w:p>

</xml_diff>

<commit_message>
JAC R1: Data and Code Availability cites the Zenodo concept DOI and the new version reserved for this revision (10.5281/zenodo.22973311)
</commit_message>
<xml_diff>
--- a/paper/paper.docx
+++ b/paper/paper.docx
@@ -12351,7 +12351,7 @@
       </w:r>
     </w:p>
     <w:bookmarkEnd w:id="54"/>
-    <w:bookmarkStart w:id="56" w:name="data-and-code-availability"/>
+    <w:bookmarkStart w:id="57" w:name="data-and-code-availability"/>
     <w:p>
       <w:pPr>
         <w:pStyle w:val="Heading1"/>
@@ -12365,7 +12365,7 @@
         <w:pStyle w:val="FirstParagraph"/>
       </w:pPr>
       <w:r>
-        <w:t xml:space="preserve">Source code, trained checkpoints, and all per-phase training/evaluation logs are openly available in the GitHub repository at https://github.com/fronkt/pxrd-diff and archived at Zenodo:</w:t>
+        <w:t xml:space="preserve">Source code, trained checkpoints, and all per-phase training/evaluation logs are openly available in the GitHub repository at https://github.com/fronkt/pxrd-diff and archived at Zenodo under the concept DOI</w:t>
       </w:r>
       <w:r>
         <w:t xml:space="preserve"> </w:t>
@@ -12375,15 +12375,29 @@
           <w:rPr>
             <w:rStyle w:val="Hyperlink"/>
           </w:rPr>
-          <w:t xml:space="preserve">https://doi.org/10.5281/zenodo.20738994</w:t>
+          <w:t xml:space="preserve">10.5281/zenodo.20738993</w:t>
         </w:r>
       </w:hyperlink>
       <w:r>
+        <w:t xml:space="preserve">, which resolves to the latest version; the version archived for this revision (source at the revised commit, the corrected v22 checkpoint, the submitted v21 checkpoint and the pooling-ablation heads) is</w:t>
+      </w:r>
+      <w:r>
+        <w:t xml:space="preserve"> </w:t>
+      </w:r>
+      <w:hyperlink r:id="rId56">
+        <w:r>
+          <w:rPr>
+            <w:rStyle w:val="Hyperlink"/>
+          </w:rPr>
+          <w:t xml:space="preserve">10.5281/zenodo.22973311</w:t>
+        </w:r>
+      </w:hyperlink>
+      <w:r>
         <w:t xml:space="preserve">. The MP-20 dataset is publicly available via the CDVAE benchmark. All experiments reproduce from a single requirements.txt and the scripts/ pipeline; per-structure evaluation flags are released to support paired re-analysis. The corrected simulator, the audit scripts of §5.7 and the per-structure records behind Table 2a are included.</w:t>
       </w:r>
     </w:p>
-    <w:bookmarkEnd w:id="56"/>
-    <w:bookmarkStart w:id="57" w:name="ethics-declaration"/>
+    <w:bookmarkEnd w:id="57"/>
+    <w:bookmarkStart w:id="58" w:name="ethics-declaration"/>
     <w:p>
       <w:pPr>
         <w:pStyle w:val="Heading1"/>
@@ -12407,8 +12421,8 @@
         </w:pict>
       </w:r>
     </w:p>
-    <w:bookmarkEnd w:id="57"/>
-    <w:bookmarkStart w:id="58" w:name="references"/>
+    <w:bookmarkEnd w:id="58"/>
+    <w:bookmarkStart w:id="59" w:name="references"/>
     <w:p>
       <w:pPr>
         <w:pStyle w:val="Heading1"/>
@@ -13243,8 +13257,8 @@
         </w:pict>
       </w:r>
     </w:p>
-    <w:bookmarkEnd w:id="58"/>
-    <w:bookmarkStart w:id="63" w:name="appendix"/>
+    <w:bookmarkEnd w:id="59"/>
+    <w:bookmarkStart w:id="64" w:name="appendix"/>
     <w:p>
       <w:pPr>
         <w:pStyle w:val="Heading1"/>
@@ -13253,7 +13267,7 @@
         <w:t xml:space="preserve">Appendix</w:t>
       </w:r>
     </w:p>
-    <w:bookmarkStart w:id="59" w:name="a.-full-ablation-history"/>
+    <w:bookmarkStart w:id="60" w:name="a.-full-ablation-history"/>
     <w:p>
       <w:pPr>
         <w:pStyle w:val="Heading2"/>
@@ -14171,8 +14185,8 @@
         </w:tc>
       </w:tr>
     </w:tbl>
-    <w:bookmarkEnd w:id="59"/>
-    <w:bookmarkStart w:id="60" w:name="b.-hyperparameter-sensitivity"/>
+    <w:bookmarkEnd w:id="60"/>
+    <w:bookmarkStart w:id="61" w:name="b.-hyperparameter-sensitivity"/>
     <w:p>
       <w:pPr>
         <w:pStyle w:val="Heading2"/>
@@ -14219,8 +14233,8 @@
         <w:t xml:space="preserve">showed (256, 3) as a reasonable Pareto point. The Debye loss weight was swept {0, 0.1, 1, 10} in early ε-prediction runs (v6–v9) without measurable effect on match rate; we re-fixed it at 1.0 for the x₀-residual runs by analogy.</w:t>
       </w:r>
     </w:p>
-    <w:bookmarkEnd w:id="60"/>
-    <w:bookmarkStart w:id="61" w:name="X984f5037fa8fa240d4e7791708ee54c226ae797"/>
+    <w:bookmarkEnd w:id="61"/>
+    <w:bookmarkStart w:id="62" w:name="X984f5037fa8fa240d4e7791708ee54c226ae797"/>
     <w:p>
       <w:pPr>
         <w:pStyle w:val="Heading2"/>
@@ -15750,8 +15764,8 @@
         <w:t xml:space="preserve">on NaCl (Pearson &gt; 0.99).</w:t>
       </w:r>
     </w:p>
-    <w:bookmarkEnd w:id="61"/>
-    <w:bookmarkStart w:id="62" w:name="d.-reproducibility-checklist"/>
+    <w:bookmarkEnd w:id="62"/>
+    <w:bookmarkStart w:id="63" w:name="d.-reproducibility-checklist"/>
     <w:p>
       <w:pPr>
         <w:pStyle w:val="Heading2"/>
@@ -15832,8 +15846,8 @@
         <w:t xml:space="preserve">Code, checkpoints, logs, and full training scripts released</w:t>
       </w:r>
     </w:p>
-    <w:bookmarkEnd w:id="62"/>
     <w:bookmarkEnd w:id="63"/>
+    <w:bookmarkEnd w:id="64"/>
     <w:sectPr>
       <w:footnotePr>
         <w:numRestart w:val="eachSect"/>

</xml_diff>